<commit_message>
Phase 1: Setup Authentication, Models and Django Channels
</commit_message>
<xml_diff>
--- a/TaiLieuDacTa.docx
+++ b/TaiLieuDacTa.docx
@@ -1,6 +1,6 @@
 
 <file path=word/document.xml><?xml version="1.0" encoding="utf-8"?>
-<w:document xmlns:wpc="http://schemas.microsoft.com/office/word/2010/wordprocessingCanvas" xmlns:cx="http://schemas.microsoft.com/office/drawing/2014/chartex" xmlns:cx1="http://schemas.microsoft.com/office/drawing/2015/9/8/chartex" xmlns:cx2="http://schemas.microsoft.com/office/drawing/2015/10/21/chartex" xmlns:cx3="http://schemas.microsoft.com/office/drawing/2016/5/9/chartex" xmlns:cx4="http://schemas.microsoft.com/office/drawing/2016/5/10/chartex" xmlns:cx5="http://schemas.microsoft.com/office/drawing/2016/5/11/chartex" xmlns:cx6="http://schemas.microsoft.com/office/drawing/2016/5/12/chartex" xmlns:cx7="http://schemas.microsoft.com/office/drawing/2016/5/13/chartex" xmlns:cx8="http://schemas.microsoft.com/office/drawing/2016/5/14/chartex" xmlns:mc="http://schemas.openxmlformats.org/markup-compatibility/2006" xmlns:aink="http://schemas.microsoft.com/office/drawing/2016/ink" xmlns:am3d="http://schemas.microsoft.com/office/drawing/2017/model3d" xmlns:o="urn:schemas-microsoft-com:office:office" xmlns:oel="http://schemas.microsoft.com/office/2019/extlst" xmlns:r="http://schemas.openxmlformats.org/officeDocument/2006/relationships" xmlns:m="http://schemas.openxmlformats.org/officeDocument/2006/math" xmlns:v="urn:schemas-microsoft-com:vml" xmlns:wp14="http://schemas.microsoft.com/office/word/2010/wordprocessingDrawing" xmlns:wp="http://schemas.openxmlformats.org/drawingml/2006/wordprocessingDrawing" xmlns:w10="urn:schemas-microsoft-com:office:word" xmlns:w="http://schemas.openxmlformats.org/wordprocessingml/2006/main" xmlns:w14="http://schemas.microsoft.com/office/word/2010/wordml" xmlns:w15="http://schemas.microsoft.com/office/word/2012/wordml" xmlns:w16cex="http://schemas.microsoft.com/office/word/2018/wordml/cex" xmlns:w16cid="http://schemas.microsoft.com/office/word/2016/wordml/cid" xmlns:w16="http://schemas.microsoft.com/office/word/2018/wordml" xmlns:w16du="http://schemas.microsoft.com/office/word/2023/wordml/word16du" xmlns:w16sdtdh="http://schemas.microsoft.com/office/word/2020/wordml/sdtdatahash" xmlns:w16sdtfl="http://schemas.microsoft.com/office/word/2024/wordml/sdtformatlock" xmlns:w16se="http://schemas.microsoft.com/office/word/2015/wordml/symex" xmlns:wpg="http://schemas.microsoft.com/office/word/2010/wordprocessingGroup" xmlns:wpi="http://schemas.microsoft.com/office/word/2010/wordprocessingInk" xmlns:wne="http://schemas.microsoft.com/office/word/2006/wordml" xmlns:wps="http://schemas.microsoft.com/office/word/2010/wordprocessingShape" mc:Ignorable="w14 w15 w16se w16cid w16 w16cex w16sdtdh w16sdtfl w16du wp14">
+<w:document xmlns:wpc="http://schemas.microsoft.com/office/word/2010/wordprocessingCanvas" xmlns:cx="http://schemas.microsoft.com/office/drawing/2014/chartex" xmlns:cx1="http://schemas.microsoft.com/office/drawing/2015/9/8/chartex" xmlns:cx2="http://schemas.microsoft.com/office/drawing/2015/10/21/chartex" xmlns:cx3="http://schemas.microsoft.com/office/drawing/2016/5/9/chartex" xmlns:cx4="http://schemas.microsoft.com/office/drawing/2016/5/10/chartex" xmlns:cx5="http://schemas.microsoft.com/office/drawing/2016/5/11/chartex" xmlns:cx6="http://schemas.microsoft.com/office/drawing/2016/5/12/chartex" xmlns:cx7="http://schemas.microsoft.com/office/drawing/2016/5/13/chartex" xmlns:cx8="http://schemas.microsoft.com/office/drawing/2016/5/14/chartex" xmlns:mc="http://schemas.openxmlformats.org/markup-compatibility/2006" xmlns:aink="http://schemas.microsoft.com/office/drawing/2016/ink" xmlns:am3d="http://schemas.microsoft.com/office/drawing/2017/model3d" xmlns:o="urn:schemas-microsoft-com:office:office" xmlns:oel="http://schemas.microsoft.com/office/2019/extlst" xmlns:r="http://schemas.openxmlformats.org/officeDocument/2006/relationships" xmlns:m="http://schemas.openxmlformats.org/officeDocument/2006/math" xmlns:v="urn:schemas-microsoft-com:vml" xmlns:wp14="http://schemas.microsoft.com/office/word/2010/wordprocessingDrawing" xmlns:wp="http://schemas.openxmlformats.org/drawingml/2006/wordprocessingDrawing" xmlns:w10="urn:schemas-microsoft-com:office:word" xmlns:w="http://schemas.openxmlformats.org/wordprocessingml/2006/main" xmlns:w14="http://schemas.microsoft.com/office/word/2010/wordml" xmlns:w15="http://schemas.microsoft.com/office/word/2012/wordml" xmlns:w16cei="http://schemas.microsoft.com/office/word/2026/wordml/cei" xmlns:w16cex="http://schemas.microsoft.com/office/word/2018/wordml/cex" xmlns:w16cid="http://schemas.microsoft.com/office/word/2016/wordml/cid" xmlns:w16="http://schemas.microsoft.com/office/word/2018/wordml" xmlns:w16du="http://schemas.microsoft.com/office/word/2023/wordml/word16du" xmlns:w16sdtdh="http://schemas.microsoft.com/office/word/2020/wordml/sdtdatahash" xmlns:w16sdtfl="http://schemas.microsoft.com/office/word/2024/wordml/sdtformatlock" xmlns:w16se="http://schemas.microsoft.com/office/word/2015/wordml/symex" xmlns:wpg="http://schemas.microsoft.com/office/word/2010/wordprocessingGroup" xmlns:wpi="http://schemas.microsoft.com/office/word/2010/wordprocessingInk" xmlns:wne="http://schemas.microsoft.com/office/word/2006/wordml" xmlns:wps="http://schemas.microsoft.com/office/word/2010/wordprocessingShape" mc:Ignorable="w14 w15 w16se w16cid w16 w16cex w16sdtdh w16sdtfl w16du wp14">
   <w:body>
     <w:p>
       <w:pPr>
@@ -332,6 +332,1583 @@
       </w:r>
       <w:r>
         <w:t xml:space="preserve"> phải chạy trên môi trường HTTPS mới xin được quyền truy cập camera/mic.</w:t>
+      </w:r>
+    </w:p>
+    <w:p>
+      <w:r>
+        <w:br w:type="page"/>
+      </w:r>
+    </w:p>
+    <w:p>
+      <w:pPr>
+        <w:numPr>
+          <w:ilvl w:val="0"/>
+          <w:numId w:val="6"/>
+        </w:numPr>
+        <w:rPr>
+          <w:b/>
+          <w:bCs/>
+        </w:rPr>
+      </w:pPr>
+      <w:r>
+        <w:rPr>
+          <w:b/>
+          <w:bCs/>
+        </w:rPr>
+        <w:lastRenderedPageBreak/>
+        <w:t>TÀI LIỆU ĐẶC TẢ DỰ ÁN: WAVEMEET</w:t>
+      </w:r>
+    </w:p>
+    <w:p>
+      <w:pPr>
+        <w:rPr>
+          <w:b/>
+          <w:bCs/>
+        </w:rPr>
+      </w:pPr>
+      <w:r>
+        <w:rPr>
+          <w:b/>
+          <w:bCs/>
+        </w:rPr>
+        <w:t>1. Tổng quan dự án (Project Overview)</w:t>
+      </w:r>
+    </w:p>
+    <w:p>
+      <w:pPr>
+        <w:numPr>
+          <w:ilvl w:val="0"/>
+          <w:numId w:val="6"/>
+        </w:numPr>
+      </w:pPr>
+      <w:r>
+        <w:rPr>
+          <w:b/>
+          <w:bCs/>
+        </w:rPr>
+        <w:t>Tên dự án:</w:t>
+      </w:r>
+      <w:r>
+        <w:t xml:space="preserve"> WaveMeet</w:t>
+      </w:r>
+    </w:p>
+    <w:p>
+      <w:pPr>
+        <w:numPr>
+          <w:ilvl w:val="0"/>
+          <w:numId w:val="6"/>
+        </w:numPr>
+      </w:pPr>
+      <w:r>
+        <w:rPr>
+          <w:b/>
+          <w:bCs/>
+        </w:rPr>
+        <w:t>Mô tả:</w:t>
+      </w:r>
+      <w:r>
+        <w:t xml:space="preserve"> Nền tảng giao tiếp video và âm thanh thời gian thực (Real-time communication) dựa trên kiến trúc Peer-to-Peer (P2P).</w:t>
+      </w:r>
+    </w:p>
+    <w:p>
+      <w:pPr>
+        <w:numPr>
+          <w:ilvl w:val="0"/>
+          <w:numId w:val="6"/>
+        </w:numPr>
+      </w:pPr>
+      <w:r>
+        <w:rPr>
+          <w:b/>
+          <w:bCs/>
+        </w:rPr>
+        <w:t>Mục tiêu hệ thống:</w:t>
+      </w:r>
+      <w:r>
+        <w:t xml:space="preserve"> Cung cấp một hệ thống máy chủ tín hiệu (Signaling Server) mạnh mẽ để thiết lập kết nối, đồng thời kiến trúc API cần được thiết kế mở để sau này có thể dễ dàng phát triển thêm ứng dụng di động độc lập (sử dụng Dart/Flutter với thư viện flutter_webrtc) gọi trực tiếp vào backend này.</w:t>
+      </w:r>
+    </w:p>
+    <w:p>
+      <w:pPr>
+        <w:rPr>
+          <w:b/>
+          <w:bCs/>
+        </w:rPr>
+      </w:pPr>
+      <w:r>
+        <w:rPr>
+          <w:b/>
+          <w:bCs/>
+        </w:rPr>
+        <w:t>2. Đặc tả Chức năng (Functional Requirements)</w:t>
+      </w:r>
+    </w:p>
+    <w:p>
+      <w:r>
+        <w:t>Hệ thống được chia thành 4 nhóm tính năng chính từ cơ bản đến nâng cao:</w:t>
+      </w:r>
+    </w:p>
+    <w:p>
+      <w:pPr>
+        <w:rPr>
+          <w:b/>
+          <w:bCs/>
+        </w:rPr>
+      </w:pPr>
+      <w:r>
+        <w:rPr>
+          <w:b/>
+          <w:bCs/>
+        </w:rPr>
+        <w:t>Nhóm 1: Tính năng Cốt lõi (Video &amp; Audio)</w:t>
+      </w:r>
+    </w:p>
+    <w:p>
+      <w:pPr>
+        <w:numPr>
+          <w:ilvl w:val="0"/>
+          <w:numId w:val="7"/>
+        </w:numPr>
+      </w:pPr>
+      <w:r>
+        <w:rPr>
+          <w:b/>
+          <w:bCs/>
+        </w:rPr>
+        <w:t>Tạo và Tham gia phòng (Room Management):</w:t>
+      </w:r>
+      <w:r>
+        <w:t xml:space="preserve"> Người dùng có thể tạo một phòng họp mới (tạo ra một Room ID độc nhất) hoặc nhập Room ID để tham gia phòng có sẵn. Tích hợp tính năng sao chép link phòng nhanh.</w:t>
+      </w:r>
+    </w:p>
+    <w:p>
+      <w:pPr>
+        <w:numPr>
+          <w:ilvl w:val="0"/>
+          <w:numId w:val="7"/>
+        </w:numPr>
+      </w:pPr>
+      <w:r>
+        <w:rPr>
+          <w:b/>
+          <w:bCs/>
+        </w:rPr>
+        <w:t>Luồng Media P2P:</w:t>
+      </w:r>
+      <w:r>
+        <w:t xml:space="preserve"> Truyền phát luồng video và audio trực tiếp giữa các người dùng thông qua WebRTC với độ trễ thấp (Low-latency).</w:t>
+      </w:r>
+    </w:p>
+    <w:p>
+      <w:pPr>
+        <w:numPr>
+          <w:ilvl w:val="0"/>
+          <w:numId w:val="7"/>
+        </w:numPr>
+      </w:pPr>
+      <w:r>
+        <w:rPr>
+          <w:b/>
+          <w:bCs/>
+        </w:rPr>
+        <w:t>Điều khiển thiết bị:</w:t>
+      </w:r>
+      <w:r>
+        <w:t xml:space="preserve"> Nút Bật/Tắt Microphone và Bật/Tắt Camera. Hệ thống tự động phát hiện nếu người dùng không có thiết bị thu âm/ghi hình.</w:t>
+      </w:r>
+    </w:p>
+    <w:p>
+      <w:pPr>
+        <w:numPr>
+          <w:ilvl w:val="0"/>
+          <w:numId w:val="7"/>
+        </w:numPr>
+      </w:pPr>
+      <w:r>
+        <w:rPr>
+          <w:b/>
+          <w:bCs/>
+        </w:rPr>
+        <w:t>Hiển thị Grid View:</w:t>
+      </w:r>
+      <w:r>
+        <w:t xml:space="preserve"> Tự động chia lại bố cục màn hình (chia lưới 1x1, 2x2, 3x3) tùy thuộc vào số lượng người tham gia trong phòng.</w:t>
+      </w:r>
+    </w:p>
+    <w:p>
+      <w:pPr>
+        <w:rPr>
+          <w:b/>
+          <w:bCs/>
+        </w:rPr>
+      </w:pPr>
+      <w:r>
+        <w:rPr>
+          <w:b/>
+          <w:bCs/>
+        </w:rPr>
+        <w:t>Nhóm 2: Tương tác Thời gian thực (Real-time Interaction)</w:t>
+      </w:r>
+    </w:p>
+    <w:p>
+      <w:pPr>
+        <w:numPr>
+          <w:ilvl w:val="0"/>
+          <w:numId w:val="8"/>
+        </w:numPr>
+      </w:pPr>
+      <w:r>
+        <w:rPr>
+          <w:b/>
+          <w:bCs/>
+        </w:rPr>
+        <w:t>Kênh Chat Văn bản:</w:t>
+      </w:r>
+      <w:r>
+        <w:t xml:space="preserve"> Một khung chat (Text Chat) đồng bộ trong phòng họp sử dụng WebSockets. Lịch sử tin nhắn chỉ tồn tại trong phiên họp.</w:t>
+      </w:r>
+    </w:p>
+    <w:p>
+      <w:pPr>
+        <w:numPr>
+          <w:ilvl w:val="0"/>
+          <w:numId w:val="8"/>
+        </w:numPr>
+      </w:pPr>
+      <w:r>
+        <w:rPr>
+          <w:b/>
+          <w:bCs/>
+        </w:rPr>
+        <w:t>Chia sẻ màn hình (Screen Sharing):</w:t>
+      </w:r>
+      <w:r>
+        <w:t xml:space="preserve"> Cho phép người dùng chuyển đổi luồng video từ Camera sang màn hình máy tính cá nhân hoặc một cửa sổ ứng dụng cụ thể (sử dụng API getDisplayMedia).</w:t>
+      </w:r>
+    </w:p>
+    <w:p>
+      <w:pPr>
+        <w:numPr>
+          <w:ilvl w:val="0"/>
+          <w:numId w:val="8"/>
+        </w:numPr>
+      </w:pPr>
+      <w:r>
+        <w:rPr>
+          <w:b/>
+          <w:bCs/>
+        </w:rPr>
+        <w:t>Reactions:</w:t>
+      </w:r>
+      <w:r>
+        <w:t xml:space="preserve"> Bắn các biểu tượng cảm xúc (Emoji) bay lên màn hình để tương tác mà không cần bật mic.</w:t>
+      </w:r>
+    </w:p>
+    <w:p>
+      <w:pPr>
+        <w:rPr>
+          <w:b/>
+          <w:bCs/>
+        </w:rPr>
+      </w:pPr>
+      <w:r>
+        <w:rPr>
+          <w:b/>
+          <w:bCs/>
+        </w:rPr>
+        <w:lastRenderedPageBreak/>
+        <w:t>Nhóm 3: Quản lý Người dùng &amp; Trạng thái</w:t>
+      </w:r>
+    </w:p>
+    <w:p>
+      <w:pPr>
+        <w:numPr>
+          <w:ilvl w:val="0"/>
+          <w:numId w:val="9"/>
+        </w:numPr>
+      </w:pPr>
+      <w:r>
+        <w:rPr>
+          <w:b/>
+          <w:bCs/>
+        </w:rPr>
+        <w:t>Hệ thống Tài khoản (Authentication):</w:t>
+      </w:r>
+      <w:r>
+        <w:t xml:space="preserve"> Đăng ký/Đăng nhập. (Nâng cao: Tích hợp OAuth2 Đăng nhập bằng Google).</w:t>
+      </w:r>
+    </w:p>
+    <w:p>
+      <w:pPr>
+        <w:numPr>
+          <w:ilvl w:val="0"/>
+          <w:numId w:val="9"/>
+        </w:numPr>
+      </w:pPr>
+      <w:r>
+        <w:rPr>
+          <w:b/>
+          <w:bCs/>
+        </w:rPr>
+        <w:t>Danh sách Bạn bè:</w:t>
+      </w:r>
+      <w:r>
+        <w:t xml:space="preserve"> Gửi lời mời kết bạn, hiển thị danh sách bạn bè đang Online/Offline.</w:t>
+      </w:r>
+    </w:p>
+    <w:p>
+      <w:pPr>
+        <w:numPr>
+          <w:ilvl w:val="0"/>
+          <w:numId w:val="9"/>
+        </w:numPr>
+      </w:pPr>
+      <w:r>
+        <w:rPr>
+          <w:b/>
+          <w:bCs/>
+        </w:rPr>
+        <w:t>Host Control (Quyền Quản trị phòng):</w:t>
+      </w:r>
+      <w:r>
+        <w:t xml:space="preserve"> Người tạo phòng có quyền Mute (Tắt mic) một cá nhân hoặc Mute All toàn bộ phòng để tránh nhiễu âm thanh.</w:t>
+      </w:r>
+    </w:p>
+    <w:p>
+      <w:pPr>
+        <w:rPr>
+          <w:b/>
+          <w:bCs/>
+        </w:rPr>
+      </w:pPr>
+      <w:r>
+        <w:rPr>
+          <w:b/>
+          <w:bCs/>
+        </w:rPr>
+        <w:t>Nhóm 4: Giao diện và Trải nghiệm Người dùng (UI/UX)</w:t>
+      </w:r>
+    </w:p>
+    <w:p>
+      <w:pPr>
+        <w:numPr>
+          <w:ilvl w:val="0"/>
+          <w:numId w:val="10"/>
+        </w:numPr>
+      </w:pPr>
+      <w:r>
+        <w:rPr>
+          <w:b/>
+          <w:bCs/>
+        </w:rPr>
+        <w:t>Theme Styling:</w:t>
+      </w:r>
+      <w:r>
+        <w:t xml:space="preserve"> Giao diện có thể áp dụng phong cách thiết kế Sakura hoặc Kawaii với tone màu chủ đạo là hồng pastel, kết hợp các thành phần UI bo góc mềm mại, mang lại dấu ấn cá nhân và sự tươi trẻ, khác biệt hoàn toàn với các nền tảng doanh nghiệp cứng nhắc.</w:t>
+      </w:r>
+    </w:p>
+    <w:p>
+      <w:pPr>
+        <w:numPr>
+          <w:ilvl w:val="0"/>
+          <w:numId w:val="10"/>
+        </w:numPr>
+      </w:pPr>
+      <w:r>
+        <w:rPr>
+          <w:b/>
+          <w:bCs/>
+        </w:rPr>
+        <w:t>Trạng thái kết nối:</w:t>
+      </w:r>
+      <w:r>
+        <w:t xml:space="preserve"> Hiển thị biểu tượng chất lượng mạng của từng người dùng trong phòng.</w:t>
+      </w:r>
+    </w:p>
+    <w:p>
+      <w:pPr>
+        <w:rPr>
+          <w:b/>
+          <w:bCs/>
+        </w:rPr>
+      </w:pPr>
+      <w:r>
+        <w:rPr>
+          <w:b/>
+          <w:bCs/>
+        </w:rPr>
+        <w:t>3. Cấu trúc Cơ sở dữ liệu (Database Schema)</w:t>
+      </w:r>
+    </w:p>
+    <w:p>
+      <w:r>
+        <w:t>Dữ liệu sẽ được quản lý bằng PostgreSQL, bao gồm các bảng cốt lõi sau:</w:t>
+      </w:r>
+    </w:p>
+    <w:tbl>
+      <w:tblPr>
+        <w:tblW w:w="0" w:type="auto"/>
+        <w:tblCellSpacing w:w="15" w:type="dxa"/>
+        <w:tblCellMar>
+          <w:top w:w="15" w:type="dxa"/>
+          <w:left w:w="15" w:type="dxa"/>
+          <w:bottom w:w="15" w:type="dxa"/>
+          <w:right w:w="15" w:type="dxa"/>
+        </w:tblCellMar>
+        <w:tblLook w:val="04A0" w:firstRow="1" w:lastRow="0" w:firstColumn="1" w:lastColumn="0" w:noHBand="0" w:noVBand="1"/>
+      </w:tblPr>
+      <w:tblGrid>
+        <w:gridCol w:w="2458"/>
+        <w:gridCol w:w="3458"/>
+        <w:gridCol w:w="3428"/>
+      </w:tblGrid>
+      <w:tr>
+        <w:trPr>
+          <w:tblHeader/>
+          <w:tblCellSpacing w:w="15" w:type="dxa"/>
+        </w:trPr>
+        <w:tc>
+          <w:tcPr>
+            <w:tcW w:w="0" w:type="auto"/>
+            <w:tcBorders>
+              <w:top w:val="single" w:sz="6" w:space="0" w:color="C4C7C5"/>
+              <w:left w:val="single" w:sz="6" w:space="0" w:color="C4C7C5"/>
+              <w:bottom w:val="single" w:sz="6" w:space="0" w:color="C4C7C5"/>
+              <w:right w:val="single" w:sz="6" w:space="0" w:color="C4C7C5"/>
+            </w:tcBorders>
+            <w:tcMar>
+              <w:top w:w="120" w:type="dxa"/>
+              <w:left w:w="180" w:type="dxa"/>
+              <w:bottom w:w="120" w:type="dxa"/>
+              <w:right w:w="180" w:type="dxa"/>
+            </w:tcMar>
+            <w:vAlign w:val="center"/>
+            <w:hideMark/>
+          </w:tcPr>
+          <w:p>
+            <w:r>
+              <w:rPr>
+                <w:b/>
+                <w:bCs/>
+              </w:rPr>
+              <w:t>Bảng (Table)</w:t>
+            </w:r>
+          </w:p>
+        </w:tc>
+        <w:tc>
+          <w:tcPr>
+            <w:tcW w:w="0" w:type="auto"/>
+            <w:tcBorders>
+              <w:top w:val="single" w:sz="6" w:space="0" w:color="C4C7C5"/>
+              <w:left w:val="single" w:sz="6" w:space="0" w:color="C4C7C5"/>
+              <w:bottom w:val="single" w:sz="6" w:space="0" w:color="C4C7C5"/>
+              <w:right w:val="single" w:sz="6" w:space="0" w:color="C4C7C5"/>
+            </w:tcBorders>
+            <w:tcMar>
+              <w:top w:w="120" w:type="dxa"/>
+              <w:left w:w="180" w:type="dxa"/>
+              <w:bottom w:w="120" w:type="dxa"/>
+              <w:right w:w="180" w:type="dxa"/>
+            </w:tcMar>
+            <w:vAlign w:val="center"/>
+            <w:hideMark/>
+          </w:tcPr>
+          <w:p>
+            <w:r>
+              <w:rPr>
+                <w:b/>
+                <w:bCs/>
+              </w:rPr>
+              <w:t>Trường dữ liệu (Fields)</w:t>
+            </w:r>
+          </w:p>
+        </w:tc>
+        <w:tc>
+          <w:tcPr>
+            <w:tcW w:w="0" w:type="auto"/>
+            <w:tcBorders>
+              <w:top w:val="single" w:sz="6" w:space="0" w:color="C4C7C5"/>
+              <w:left w:val="single" w:sz="6" w:space="0" w:color="C4C7C5"/>
+              <w:bottom w:val="single" w:sz="6" w:space="0" w:color="C4C7C5"/>
+              <w:right w:val="single" w:sz="6" w:space="0" w:color="C4C7C5"/>
+            </w:tcBorders>
+            <w:tcMar>
+              <w:top w:w="120" w:type="dxa"/>
+              <w:left w:w="180" w:type="dxa"/>
+              <w:bottom w:w="120" w:type="dxa"/>
+              <w:right w:w="180" w:type="dxa"/>
+            </w:tcMar>
+            <w:vAlign w:val="center"/>
+            <w:hideMark/>
+          </w:tcPr>
+          <w:p>
+            <w:r>
+              <w:rPr>
+                <w:b/>
+                <w:bCs/>
+              </w:rPr>
+              <w:t>Vai trò</w:t>
+            </w:r>
+          </w:p>
+        </w:tc>
+      </w:tr>
+      <w:tr>
+        <w:trPr>
+          <w:tblCellSpacing w:w="15" w:type="dxa"/>
+        </w:trPr>
+        <w:tc>
+          <w:tcPr>
+            <w:tcW w:w="0" w:type="auto"/>
+            <w:tcBorders>
+              <w:top w:val="single" w:sz="6" w:space="0" w:color="C4C7C5"/>
+              <w:left w:val="single" w:sz="6" w:space="0" w:color="C4C7C5"/>
+              <w:bottom w:val="single" w:sz="6" w:space="0" w:color="C4C7C5"/>
+              <w:right w:val="single" w:sz="6" w:space="0" w:color="C4C7C5"/>
+            </w:tcBorders>
+            <w:tcMar>
+              <w:top w:w="120" w:type="dxa"/>
+              <w:left w:w="180" w:type="dxa"/>
+              <w:bottom w:w="120" w:type="dxa"/>
+              <w:right w:w="180" w:type="dxa"/>
+            </w:tcMar>
+            <w:vAlign w:val="center"/>
+            <w:hideMark/>
+          </w:tcPr>
+          <w:p>
+            <w:r>
+              <w:rPr>
+                <w:b/>
+                <w:bCs/>
+              </w:rPr>
+              <w:t>User</w:t>
+            </w:r>
+          </w:p>
+        </w:tc>
+        <w:tc>
+          <w:tcPr>
+            <w:tcW w:w="0" w:type="auto"/>
+            <w:tcBorders>
+              <w:top w:val="single" w:sz="6" w:space="0" w:color="C4C7C5"/>
+              <w:left w:val="single" w:sz="6" w:space="0" w:color="C4C7C5"/>
+              <w:bottom w:val="single" w:sz="6" w:space="0" w:color="C4C7C5"/>
+              <w:right w:val="single" w:sz="6" w:space="0" w:color="C4C7C5"/>
+            </w:tcBorders>
+            <w:tcMar>
+              <w:top w:w="120" w:type="dxa"/>
+              <w:left w:w="180" w:type="dxa"/>
+              <w:bottom w:w="120" w:type="dxa"/>
+              <w:right w:w="180" w:type="dxa"/>
+            </w:tcMar>
+            <w:vAlign w:val="center"/>
+            <w:hideMark/>
+          </w:tcPr>
+          <w:p>
+            <w:r>
+              <w:t>id, username, email, password_hash, avatar_url, is_active</w:t>
+            </w:r>
+          </w:p>
+        </w:tc>
+        <w:tc>
+          <w:tcPr>
+            <w:tcW w:w="0" w:type="auto"/>
+            <w:tcBorders>
+              <w:top w:val="single" w:sz="6" w:space="0" w:color="C4C7C5"/>
+              <w:left w:val="single" w:sz="6" w:space="0" w:color="C4C7C5"/>
+              <w:bottom w:val="single" w:sz="6" w:space="0" w:color="C4C7C5"/>
+              <w:right w:val="single" w:sz="6" w:space="0" w:color="C4C7C5"/>
+            </w:tcBorders>
+            <w:tcMar>
+              <w:top w:w="120" w:type="dxa"/>
+              <w:left w:w="180" w:type="dxa"/>
+              <w:bottom w:w="120" w:type="dxa"/>
+              <w:right w:w="180" w:type="dxa"/>
+            </w:tcMar>
+            <w:vAlign w:val="center"/>
+            <w:hideMark/>
+          </w:tcPr>
+          <w:p>
+            <w:r>
+              <w:t>Lưu trữ thông tin định danh của người dùng.</w:t>
+            </w:r>
+          </w:p>
+        </w:tc>
+      </w:tr>
+      <w:tr>
+        <w:trPr>
+          <w:tblCellSpacing w:w="15" w:type="dxa"/>
+        </w:trPr>
+        <w:tc>
+          <w:tcPr>
+            <w:tcW w:w="0" w:type="auto"/>
+            <w:tcBorders>
+              <w:top w:val="single" w:sz="6" w:space="0" w:color="C4C7C5"/>
+              <w:left w:val="single" w:sz="6" w:space="0" w:color="C4C7C5"/>
+              <w:bottom w:val="single" w:sz="6" w:space="0" w:color="C4C7C5"/>
+              <w:right w:val="single" w:sz="6" w:space="0" w:color="C4C7C5"/>
+            </w:tcBorders>
+            <w:tcMar>
+              <w:top w:w="120" w:type="dxa"/>
+              <w:left w:w="180" w:type="dxa"/>
+              <w:bottom w:w="120" w:type="dxa"/>
+              <w:right w:w="180" w:type="dxa"/>
+            </w:tcMar>
+            <w:vAlign w:val="center"/>
+            <w:hideMark/>
+          </w:tcPr>
+          <w:p>
+            <w:r>
+              <w:rPr>
+                <w:b/>
+                <w:bCs/>
+              </w:rPr>
+              <w:t>Friendship</w:t>
+            </w:r>
+          </w:p>
+        </w:tc>
+        <w:tc>
+          <w:tcPr>
+            <w:tcW w:w="0" w:type="auto"/>
+            <w:tcBorders>
+              <w:top w:val="single" w:sz="6" w:space="0" w:color="C4C7C5"/>
+              <w:left w:val="single" w:sz="6" w:space="0" w:color="C4C7C5"/>
+              <w:bottom w:val="single" w:sz="6" w:space="0" w:color="C4C7C5"/>
+              <w:right w:val="single" w:sz="6" w:space="0" w:color="C4C7C5"/>
+            </w:tcBorders>
+            <w:tcMar>
+              <w:top w:w="120" w:type="dxa"/>
+              <w:left w:w="180" w:type="dxa"/>
+              <w:bottom w:w="120" w:type="dxa"/>
+              <w:right w:w="180" w:type="dxa"/>
+            </w:tcMar>
+            <w:vAlign w:val="center"/>
+            <w:hideMark/>
+          </w:tcPr>
+          <w:p>
+            <w:r>
+              <w:t>id, user_id_1, user_id_2, status, created_at</w:t>
+            </w:r>
+          </w:p>
+        </w:tc>
+        <w:tc>
+          <w:tcPr>
+            <w:tcW w:w="0" w:type="auto"/>
+            <w:tcBorders>
+              <w:top w:val="single" w:sz="6" w:space="0" w:color="C4C7C5"/>
+              <w:left w:val="single" w:sz="6" w:space="0" w:color="C4C7C5"/>
+              <w:bottom w:val="single" w:sz="6" w:space="0" w:color="C4C7C5"/>
+              <w:right w:val="single" w:sz="6" w:space="0" w:color="C4C7C5"/>
+            </w:tcBorders>
+            <w:tcMar>
+              <w:top w:w="120" w:type="dxa"/>
+              <w:left w:w="180" w:type="dxa"/>
+              <w:bottom w:w="120" w:type="dxa"/>
+              <w:right w:w="180" w:type="dxa"/>
+            </w:tcMar>
+            <w:vAlign w:val="center"/>
+            <w:hideMark/>
+          </w:tcPr>
+          <w:p>
+            <w:r>
+              <w:t>Quản lý mối quan hệ bạn bè (Pending, Accepted).</w:t>
+            </w:r>
+          </w:p>
+        </w:tc>
+      </w:tr>
+      <w:tr>
+        <w:trPr>
+          <w:tblCellSpacing w:w="15" w:type="dxa"/>
+        </w:trPr>
+        <w:tc>
+          <w:tcPr>
+            <w:tcW w:w="0" w:type="auto"/>
+            <w:tcBorders>
+              <w:top w:val="single" w:sz="6" w:space="0" w:color="C4C7C5"/>
+              <w:left w:val="single" w:sz="6" w:space="0" w:color="C4C7C5"/>
+              <w:bottom w:val="single" w:sz="6" w:space="0" w:color="C4C7C5"/>
+              <w:right w:val="single" w:sz="6" w:space="0" w:color="C4C7C5"/>
+            </w:tcBorders>
+            <w:tcMar>
+              <w:top w:w="120" w:type="dxa"/>
+              <w:left w:w="180" w:type="dxa"/>
+              <w:bottom w:w="120" w:type="dxa"/>
+              <w:right w:w="180" w:type="dxa"/>
+            </w:tcMar>
+            <w:vAlign w:val="center"/>
+            <w:hideMark/>
+          </w:tcPr>
+          <w:p>
+            <w:r>
+              <w:rPr>
+                <w:b/>
+                <w:bCs/>
+              </w:rPr>
+              <w:t>Room</w:t>
+            </w:r>
+          </w:p>
+        </w:tc>
+        <w:tc>
+          <w:tcPr>
+            <w:tcW w:w="0" w:type="auto"/>
+            <w:tcBorders>
+              <w:top w:val="single" w:sz="6" w:space="0" w:color="C4C7C5"/>
+              <w:left w:val="single" w:sz="6" w:space="0" w:color="C4C7C5"/>
+              <w:bottom w:val="single" w:sz="6" w:space="0" w:color="C4C7C5"/>
+              <w:right w:val="single" w:sz="6" w:space="0" w:color="C4C7C5"/>
+            </w:tcBorders>
+            <w:tcMar>
+              <w:top w:w="120" w:type="dxa"/>
+              <w:left w:w="180" w:type="dxa"/>
+              <w:bottom w:w="120" w:type="dxa"/>
+              <w:right w:w="180" w:type="dxa"/>
+            </w:tcMar>
+            <w:vAlign w:val="center"/>
+            <w:hideMark/>
+          </w:tcPr>
+          <w:p>
+            <w:r>
+              <w:t>id (UUID), name, host_id, created_at, is_active</w:t>
+            </w:r>
+          </w:p>
+        </w:tc>
+        <w:tc>
+          <w:tcPr>
+            <w:tcW w:w="0" w:type="auto"/>
+            <w:tcBorders>
+              <w:top w:val="single" w:sz="6" w:space="0" w:color="C4C7C5"/>
+              <w:left w:val="single" w:sz="6" w:space="0" w:color="C4C7C5"/>
+              <w:bottom w:val="single" w:sz="6" w:space="0" w:color="C4C7C5"/>
+              <w:right w:val="single" w:sz="6" w:space="0" w:color="C4C7C5"/>
+            </w:tcBorders>
+            <w:tcMar>
+              <w:top w:w="120" w:type="dxa"/>
+              <w:left w:w="180" w:type="dxa"/>
+              <w:bottom w:w="120" w:type="dxa"/>
+              <w:right w:w="180" w:type="dxa"/>
+            </w:tcMar>
+            <w:vAlign w:val="center"/>
+            <w:hideMark/>
+          </w:tcPr>
+          <w:p>
+            <w:r>
+              <w:t>Lưu trữ thông tin phòng họp. UUID giúp link phòng khó bị đoán.</w:t>
+            </w:r>
+          </w:p>
+        </w:tc>
+      </w:tr>
+      <w:tr>
+        <w:trPr>
+          <w:tblCellSpacing w:w="15" w:type="dxa"/>
+        </w:trPr>
+        <w:tc>
+          <w:tcPr>
+            <w:tcW w:w="0" w:type="auto"/>
+            <w:tcBorders>
+              <w:top w:val="single" w:sz="6" w:space="0" w:color="C4C7C5"/>
+              <w:left w:val="single" w:sz="6" w:space="0" w:color="C4C7C5"/>
+              <w:bottom w:val="single" w:sz="6" w:space="0" w:color="C4C7C5"/>
+              <w:right w:val="single" w:sz="6" w:space="0" w:color="C4C7C5"/>
+            </w:tcBorders>
+            <w:tcMar>
+              <w:top w:w="120" w:type="dxa"/>
+              <w:left w:w="180" w:type="dxa"/>
+              <w:bottom w:w="120" w:type="dxa"/>
+              <w:right w:w="180" w:type="dxa"/>
+            </w:tcMar>
+            <w:vAlign w:val="center"/>
+            <w:hideMark/>
+          </w:tcPr>
+          <w:p>
+            <w:r>
+              <w:rPr>
+                <w:b/>
+                <w:bCs/>
+              </w:rPr>
+              <w:lastRenderedPageBreak/>
+              <w:t>Participant</w:t>
+            </w:r>
+          </w:p>
+        </w:tc>
+        <w:tc>
+          <w:tcPr>
+            <w:tcW w:w="0" w:type="auto"/>
+            <w:tcBorders>
+              <w:top w:val="single" w:sz="6" w:space="0" w:color="C4C7C5"/>
+              <w:left w:val="single" w:sz="6" w:space="0" w:color="C4C7C5"/>
+              <w:bottom w:val="single" w:sz="6" w:space="0" w:color="C4C7C5"/>
+              <w:right w:val="single" w:sz="6" w:space="0" w:color="C4C7C5"/>
+            </w:tcBorders>
+            <w:tcMar>
+              <w:top w:w="120" w:type="dxa"/>
+              <w:left w:w="180" w:type="dxa"/>
+              <w:bottom w:w="120" w:type="dxa"/>
+              <w:right w:w="180" w:type="dxa"/>
+            </w:tcMar>
+            <w:vAlign w:val="center"/>
+            <w:hideMark/>
+          </w:tcPr>
+          <w:p>
+            <w:r>
+              <w:t>id, room_id, user_id, joined_at, left_at</w:t>
+            </w:r>
+          </w:p>
+        </w:tc>
+        <w:tc>
+          <w:tcPr>
+            <w:tcW w:w="0" w:type="auto"/>
+            <w:tcBorders>
+              <w:top w:val="single" w:sz="6" w:space="0" w:color="C4C7C5"/>
+              <w:left w:val="single" w:sz="6" w:space="0" w:color="C4C7C5"/>
+              <w:bottom w:val="single" w:sz="6" w:space="0" w:color="C4C7C5"/>
+              <w:right w:val="single" w:sz="6" w:space="0" w:color="C4C7C5"/>
+            </w:tcBorders>
+            <w:tcMar>
+              <w:top w:w="120" w:type="dxa"/>
+              <w:left w:w="180" w:type="dxa"/>
+              <w:bottom w:w="120" w:type="dxa"/>
+              <w:right w:w="180" w:type="dxa"/>
+            </w:tcMar>
+            <w:vAlign w:val="center"/>
+            <w:hideMark/>
+          </w:tcPr>
+          <w:p>
+            <w:r>
+              <w:t>Ghi nhận lịch sử người dùng đã tham gia vào phòng nào.</w:t>
+            </w:r>
+          </w:p>
+        </w:tc>
+      </w:tr>
+    </w:tbl>
+    <w:p>
+      <w:pPr>
+        <w:rPr>
+          <w:b/>
+          <w:bCs/>
+        </w:rPr>
+      </w:pPr>
+      <w:r>
+        <w:rPr>
+          <w:b/>
+          <w:bCs/>
+        </w:rPr>
+        <w:t>4. Đặc tả Kỹ thuật (Tech Stack &amp; Architecture)</w:t>
+      </w:r>
+    </w:p>
+    <w:p>
+      <w:pPr>
+        <w:numPr>
+          <w:ilvl w:val="0"/>
+          <w:numId w:val="11"/>
+        </w:numPr>
+      </w:pPr>
+      <w:r>
+        <w:rPr>
+          <w:b/>
+          <w:bCs/>
+        </w:rPr>
+        <w:t>Signaling Server:</w:t>
+      </w:r>
+      <w:r>
+        <w:t xml:space="preserve"> Sử dụng </w:t>
+      </w:r>
+      <w:r>
+        <w:rPr>
+          <w:b/>
+          <w:bCs/>
+        </w:rPr>
+        <w:t>Django Channels</w:t>
+      </w:r>
+      <w:r>
+        <w:t xml:space="preserve"> kết hợp với </w:t>
+      </w:r>
+      <w:r>
+        <w:rPr>
+          <w:b/>
+          <w:bCs/>
+        </w:rPr>
+        <w:t>Redis</w:t>
+      </w:r>
+      <w:r>
+        <w:t>. Server này đóng vai trò "người mai mối", giúp các client trao đổi thông tin cấu hình mạng (SDP) và địa chỉ IP (ICE Candidates) thông qua giao thức WebSockets trước khi luồng video thực sự bắt đầu.</w:t>
+      </w:r>
+    </w:p>
+    <w:p>
+      <w:pPr>
+        <w:numPr>
+          <w:ilvl w:val="0"/>
+          <w:numId w:val="11"/>
+        </w:numPr>
+      </w:pPr>
+      <w:r>
+        <w:rPr>
+          <w:b/>
+          <w:bCs/>
+        </w:rPr>
+        <w:t>Giao thức Media:</w:t>
+      </w:r>
+      <w:r>
+        <w:t xml:space="preserve"> </w:t>
+      </w:r>
+      <w:r>
+        <w:rPr>
+          <w:b/>
+          <w:bCs/>
+        </w:rPr>
+        <w:t>WebRTC</w:t>
+      </w:r>
+      <w:r>
+        <w:t xml:space="preserve"> (Xử lý hoàn toàn ở phía trình duyệt Frontend/Client).</w:t>
+      </w:r>
+    </w:p>
+    <w:p>
+      <w:pPr>
+        <w:numPr>
+          <w:ilvl w:val="0"/>
+          <w:numId w:val="11"/>
+        </w:numPr>
+      </w:pPr>
+      <w:r>
+        <w:rPr>
+          <w:b/>
+          <w:bCs/>
+        </w:rPr>
+        <w:t>NAT Traversal (Vượt tường lửa):</w:t>
+      </w:r>
+      <w:r>
+        <w:t xml:space="preserve"> Đây là mấu chốt kỹ thuật. Trong môi trường thực tế, các máy tính bị ẩn sau Router. Việc thiết lập và cấu hình các máy chủ </w:t>
+      </w:r>
+      <w:r>
+        <w:rPr>
+          <w:b/>
+          <w:bCs/>
+        </w:rPr>
+        <w:t>STUN</w:t>
+      </w:r>
+      <w:r>
+        <w:t xml:space="preserve"> (tìm IP Public) và </w:t>
+      </w:r>
+      <w:r>
+        <w:rPr>
+          <w:b/>
+          <w:bCs/>
+        </w:rPr>
+        <w:t>TURN</w:t>
+      </w:r>
+      <w:r>
+        <w:t xml:space="preserve"> (chuyển tiếp gói tin khi kết nối P2P thất bại) sẽ yêu cầu vận dụng các kiến thức vững chắc về giao thức mạng, định tuyến và phân tích topology.</w:t>
+      </w:r>
+    </w:p>
+    <w:p>
+      <w:pPr>
+        <w:numPr>
+          <w:ilvl w:val="0"/>
+          <w:numId w:val="11"/>
+        </w:numPr>
+      </w:pPr>
+      <w:r>
+        <w:rPr>
+          <w:b/>
+          <w:bCs/>
+        </w:rPr>
+        <w:t>Bảo mật:</w:t>
+      </w:r>
+      <w:r>
+        <w:t xml:space="preserve"> Bắt buộc sử dụng SSL/TLS (HTTPS và WSS - WebSocket Secure) vì trình duyệt sẽ chặn quyền truy cập Camera/Mic trên các trang không có chứng chỉ bảo mật.</w:t>
+      </w:r>
+    </w:p>
+    <w:p>
+      <w:pPr>
+        <w:rPr>
+          <w:b/>
+          <w:bCs/>
+        </w:rPr>
+      </w:pPr>
+      <w:r>
+        <w:rPr>
+          <w:b/>
+          <w:bCs/>
+        </w:rPr>
+        <w:t>5. Lộ trình Triển khai (Roadmap)</w:t>
+      </w:r>
+    </w:p>
+    <w:p>
+      <w:r>
+        <w:t>Thay vì làm tất cả cùng lúc, dự án nên chia theo các Sprint (Giai đoạn):</w:t>
+      </w:r>
+    </w:p>
+    <w:p>
+      <w:pPr>
+        <w:numPr>
+          <w:ilvl w:val="0"/>
+          <w:numId w:val="12"/>
+        </w:numPr>
+      </w:pPr>
+      <w:r>
+        <w:rPr>
+          <w:b/>
+          <w:bCs/>
+        </w:rPr>
+        <w:t>Phase 1 (Nền tảng):</w:t>
+      </w:r>
+      <w:r>
+        <w:t xml:space="preserve"> Xây dựng Authentication (Đăng nhập/Đăng ký) bằng Django. Cấu hình Django Channels và Redis.</w:t>
+      </w:r>
+    </w:p>
+    <w:p>
+      <w:pPr>
+        <w:numPr>
+          <w:ilvl w:val="0"/>
+          <w:numId w:val="12"/>
+        </w:numPr>
+      </w:pPr>
+      <w:r>
+        <w:rPr>
+          <w:b/>
+          <w:bCs/>
+        </w:rPr>
+        <w:t>Phase 2 (Signaling Base):</w:t>
+      </w:r>
+      <w:r>
+        <w:t xml:space="preserve"> Hoàn thiện tính năng Chat chữ realtime trong một Room để test sự ổn định của luồng WebSockets.</w:t>
+      </w:r>
+    </w:p>
+    <w:p>
+      <w:pPr>
+        <w:numPr>
+          <w:ilvl w:val="0"/>
+          <w:numId w:val="12"/>
+        </w:numPr>
+      </w:pPr>
+      <w:r>
+        <w:rPr>
+          <w:b/>
+          <w:bCs/>
+        </w:rPr>
+        <w:lastRenderedPageBreak/>
+        <w:t>Phase 3 (Core WebRTC):</w:t>
+      </w:r>
+      <w:r>
+        <w:t xml:space="preserve"> Viết script JavaScript tích hợp WebRTC để xin quyền Camera/Mic, sau đó gửi các gói tin ICE/SDP qua kênh WebSockets đã làm ở Phase 2. Mở thông luồng Video giữa 2 máy.</w:t>
+      </w:r>
+    </w:p>
+    <w:p>
+      <w:pPr>
+        <w:numPr>
+          <w:ilvl w:val="0"/>
+          <w:numId w:val="12"/>
+        </w:numPr>
+      </w:pPr>
+      <w:r>
+        <w:rPr>
+          <w:b/>
+          <w:bCs/>
+        </w:rPr>
+        <w:t>Phase 4 (Nâng cấp &amp; Scale):</w:t>
+      </w:r>
+      <w:r>
+        <w:t xml:space="preserve"> Thêm tính năng Share Screen, tinh chỉnh giao diện UI/UX và đẩy (Deploy) server lên môi trường cloud.</w:t>
+      </w:r>
+    </w:p>
+    <w:p>
+      <w:r>
+        <w:t>Bạn thấy tài liệu đặc tả này đã đủ độ bao quát chưa?</w:t>
+      </w:r>
+    </w:p>
+    <w:p>
+      <w:r>
+        <w:br w:type="page"/>
+      </w:r>
+    </w:p>
+    <w:p>
+      <w:pPr>
+        <w:numPr>
+          <w:ilvl w:val="0"/>
+          <w:numId w:val="13"/>
+        </w:numPr>
+        <w:rPr>
+          <w:b/>
+          <w:bCs/>
+        </w:rPr>
+      </w:pPr>
+      <w:r>
+        <w:rPr>
+          <w:b/>
+          <w:bCs/>
+        </w:rPr>
+        <w:lastRenderedPageBreak/>
+        <w:t>WaveMeet - Phase 1 Implementation Plan</w:t>
+      </w:r>
+    </w:p>
+    <w:p>
+      <w:r>
+        <w:t>Dựa vào tài liệu đặc tả của bạn, tôi đã chia dự án thành các Phase. Hiện tại, chúng ta sẽ tập trung vào </w:t>
+      </w:r>
+      <w:r>
+        <w:rPr>
+          <w:b/>
+          <w:bCs/>
+        </w:rPr>
+        <w:t>Phase 1: Nền tảng</w:t>
+      </w:r>
+      <w:r>
+        <w:t>, bao gồm việc thiết lập Authentication, Database Models và cấu hình Django Channels + Redis.</w:t>
+      </w:r>
+    </w:p>
+    <w:p>
+      <w:pPr>
+        <w:rPr>
+          <w:b/>
+          <w:bCs/>
+        </w:rPr>
+      </w:pPr>
+      <w:r>
+        <w:rPr>
+          <w:b/>
+          <w:bCs/>
+        </w:rPr>
+        <w:t>User Review Required</w:t>
+      </w:r>
+    </w:p>
+    <w:p>
+      <w:r>
+        <w:t>IMPORTANT</w:t>
+      </w:r>
+    </w:p>
+    <w:p>
+      <w:r>
+        <w:rPr>
+          <w:b/>
+          <w:bCs/>
+        </w:rPr>
+        <w:t>Cấu trúc Git &amp; Commit:</w:t>
+      </w:r>
+      <w:r>
+        <w:t> Bạn có muốn tôi thiết lập một git repository (git init) nếu chưa có, và tự động tạo commit sau khi hoàn thành Phase 1 không?</w:t>
+      </w:r>
+    </w:p>
+    <w:p>
+      <w:r>
+        <w:t>TIP</w:t>
+      </w:r>
+    </w:p>
+    <w:p>
+      <w:r>
+        <w:rPr>
+          <w:b/>
+          <w:bCs/>
+        </w:rPr>
+        <w:t>Giao diện (UI):</w:t>
+      </w:r>
+      <w:r>
+        <w:t> Bạn có muốn tôi sử dụng </w:t>
+      </w:r>
+      <w:r>
+        <w:rPr>
+          <w:b/>
+          <w:bCs/>
+        </w:rPr>
+        <w:t>Tailwind CSS</w:t>
+      </w:r>
+      <w:r>
+        <w:t> qua CDN để dựng khung giao diện Đăng ký / Đăng nhập theo phong cách </w:t>
+      </w:r>
+      <w:r>
+        <w:rPr>
+          <w:b/>
+          <w:bCs/>
+        </w:rPr>
+        <w:t>Sakura / Kawaii (hồng pastel, bo góc)</w:t>
+      </w:r>
+      <w:r>
+        <w:t> ngay trong Phase này không, hay chỉ cần dùng CSS thuần (Vanilla CSS)?</w:t>
+      </w:r>
+    </w:p>
+    <w:p>
+      <w:pPr>
+        <w:rPr>
+          <w:b/>
+          <w:bCs/>
+        </w:rPr>
+      </w:pPr>
+      <w:r>
+        <w:rPr>
+          <w:b/>
+          <w:bCs/>
+        </w:rPr>
+        <w:t>Open Questions</w:t>
+      </w:r>
+    </w:p>
+    <w:p>
+      <w:r>
+        <w:t>NOTE</w:t>
+      </w:r>
+    </w:p>
+    <w:p>
+      <w:pPr>
+        <w:numPr>
+          <w:ilvl w:val="0"/>
+          <w:numId w:val="13"/>
+        </w:numPr>
+      </w:pPr>
+      <w:r>
+        <w:rPr>
+          <w:b/>
+          <w:bCs/>
+        </w:rPr>
+        <w:t>Redis:</w:t>
+      </w:r>
+      <w:r>
+        <w:t> Bạn đã cài đặt Redis server trên máy tính chưa? (Django Channels cần Redis để hoạt động ở local). Nếu chưa, bạn có thể cài đặt thông qua Docker hoặc dùng InMemoryChannelLayer cho môi trường dev. Bạn muốn dùng cách nào cho môi trường dev?</w:t>
+      </w:r>
+    </w:p>
+    <w:p>
+      <w:pPr>
+        <w:numPr>
+          <w:ilvl w:val="0"/>
+          <w:numId w:val="13"/>
+        </w:numPr>
+      </w:pPr>
+      <w:r>
+        <w:rPr>
+          <w:b/>
+          <w:bCs/>
+        </w:rPr>
+        <w:t>Custom User Model:</w:t>
+      </w:r>
+      <w:r>
+        <w:t> Tôi sẽ tạo một custom user model thay thế cho User mặc định của Django để dễ dàng thêm các trường như avatar_url. Việc này cần làm ngay từ đầu trước khi chạy migrate.</w:t>
+      </w:r>
+    </w:p>
+    <w:p>
+      <w:pPr>
+        <w:rPr>
+          <w:b/>
+          <w:bCs/>
+        </w:rPr>
+      </w:pPr>
+      <w:r>
+        <w:rPr>
+          <w:b/>
+          <w:bCs/>
+        </w:rPr>
+        <w:t>Proposed Changes</w:t>
+      </w:r>
+    </w:p>
+    <w:p>
+      <w:r>
+        <w:t>1. Cấu hình Project &amp; Dependencies</w:t>
+      </w:r>
+    </w:p>
+    <w:p>
+      <w:r>
+        <w:t>Cài đặt các gói cần thiết: channels, daphne, channels_redis.</w:t>
+      </w:r>
+    </w:p>
+    <w:p>
+      <w:r>
+        <w:t>[MODIFY] wavemeet/settings.py</w:t>
+      </w:r>
+    </w:p>
+    <w:p>
+      <w:pPr>
+        <w:numPr>
+          <w:ilvl w:val="0"/>
+          <w:numId w:val="14"/>
+        </w:numPr>
+      </w:pPr>
+      <w:r>
+        <w:t>Thay đổi ASGI/WSGI application để sử dụng Daphne (Channels).</w:t>
+      </w:r>
+    </w:p>
+    <w:p>
+      <w:pPr>
+        <w:numPr>
+          <w:ilvl w:val="0"/>
+          <w:numId w:val="14"/>
+        </w:numPr>
+      </w:pPr>
+      <w:r>
+        <w:t>Thêm cấu hình CHANNEL_LAYERS cho Redis.</w:t>
+      </w:r>
+    </w:p>
+    <w:p>
+      <w:pPr>
+        <w:numPr>
+          <w:ilvl w:val="0"/>
+          <w:numId w:val="14"/>
+        </w:numPr>
+      </w:pPr>
+      <w:r>
+        <w:t>Chỉ định AUTH_USER_MODEL = 'chat.User'.</w:t>
+      </w:r>
+    </w:p>
+    <w:p>
+      <w:r>
+        <w:t>[MODIFY] wavemeet/asgi.py</w:t>
+      </w:r>
+    </w:p>
+    <w:p>
+      <w:pPr>
+        <w:numPr>
+          <w:ilvl w:val="0"/>
+          <w:numId w:val="15"/>
+        </w:numPr>
+      </w:pPr>
+      <w:r>
+        <w:lastRenderedPageBreak/>
+        <w:t>Cấu hình ASGI router cho WebSockets.</w:t>
+      </w:r>
+    </w:p>
+    <w:p>
+      <w:r>
+        <w:t>2. Database Models (App chat)</w:t>
+      </w:r>
+    </w:p>
+    <w:p>
+      <w:r>
+        <w:t>Tạo app chat (hiện tại thư mục chat đã có nhưng cần định nghĩa models).</w:t>
+      </w:r>
+    </w:p>
+    <w:p>
+      <w:r>
+        <w:t>[NEW/MODIFY] chat/models.py</w:t>
+      </w:r>
+    </w:p>
+    <w:p>
+      <w:pPr>
+        <w:numPr>
+          <w:ilvl w:val="0"/>
+          <w:numId w:val="16"/>
+        </w:numPr>
+      </w:pPr>
+      <w:r>
+        <w:rPr>
+          <w:b/>
+          <w:bCs/>
+        </w:rPr>
+        <w:t>User Model:</w:t>
+      </w:r>
+      <w:r>
+        <w:t> Kế thừa AbstractUser, thêm avatar_url.</w:t>
+      </w:r>
+    </w:p>
+    <w:p>
+      <w:pPr>
+        <w:numPr>
+          <w:ilvl w:val="0"/>
+          <w:numId w:val="16"/>
+        </w:numPr>
+      </w:pPr>
+      <w:r>
+        <w:rPr>
+          <w:b/>
+          <w:bCs/>
+        </w:rPr>
+        <w:t>Friendship Model:</w:t>
+      </w:r>
+      <w:r>
+        <w:t> Liên kết 2 User, có trạng thái (pending, accepted).</w:t>
+      </w:r>
+    </w:p>
+    <w:p>
+      <w:pPr>
+        <w:numPr>
+          <w:ilvl w:val="0"/>
+          <w:numId w:val="16"/>
+        </w:numPr>
+      </w:pPr>
+      <w:r>
+        <w:rPr>
+          <w:b/>
+          <w:bCs/>
+        </w:rPr>
+        <w:t>Room Model:</w:t>
+      </w:r>
+      <w:r>
+        <w:t> Sử dụng UUIDField cho id, liên kết host.</w:t>
+      </w:r>
+    </w:p>
+    <w:p>
+      <w:pPr>
+        <w:numPr>
+          <w:ilvl w:val="0"/>
+          <w:numId w:val="16"/>
+        </w:numPr>
+      </w:pPr>
+      <w:r>
+        <w:rPr>
+          <w:b/>
+          <w:bCs/>
+        </w:rPr>
+        <w:t>Participant Model:</w:t>
+      </w:r>
+      <w:r>
+        <w:t> Liên kết User và Room.</w:t>
+      </w:r>
+    </w:p>
+    <w:p>
+      <w:r>
+        <w:t>3. Authentication &amp; Views</w:t>
+      </w:r>
+    </w:p>
+    <w:p>
+      <w:r>
+        <w:t>[NEW] chat/views.py</w:t>
+      </w:r>
+    </w:p>
+    <w:p>
+      <w:pPr>
+        <w:numPr>
+          <w:ilvl w:val="0"/>
+          <w:numId w:val="17"/>
+        </w:numPr>
+      </w:pPr>
+      <w:r>
+        <w:t>Viết các View cho: register, login_view, logout_view, home (dashboard).</w:t>
+      </w:r>
+    </w:p>
+    <w:p>
+      <w:r>
+        <w:t>[NEW] chat/urls.py</w:t>
+      </w:r>
+    </w:p>
+    <w:p>
+      <w:pPr>
+        <w:numPr>
+          <w:ilvl w:val="0"/>
+          <w:numId w:val="18"/>
+        </w:numPr>
+      </w:pPr>
+      <w:r>
+        <w:t>Định tuyến URL cho các view trên.</w:t>
+      </w:r>
+    </w:p>
+    <w:p>
+      <w:r>
+        <w:t>[NEW] Giao diện HTML/CSS</w:t>
+      </w:r>
+    </w:p>
+    <w:p>
+      <w:pPr>
+        <w:numPr>
+          <w:ilvl w:val="0"/>
+          <w:numId w:val="19"/>
+        </w:numPr>
+      </w:pPr>
+      <w:r>
+        <w:t>chat/templates/chat/base.html (Khung giao diện chính)</w:t>
+      </w:r>
+    </w:p>
+    <w:p>
+      <w:pPr>
+        <w:numPr>
+          <w:ilvl w:val="0"/>
+          <w:numId w:val="19"/>
+        </w:numPr>
+      </w:pPr>
+      <w:r>
+        <w:t>chat/templates/chat/login.html</w:t>
+      </w:r>
+    </w:p>
+    <w:p>
+      <w:pPr>
+        <w:numPr>
+          <w:ilvl w:val="0"/>
+          <w:numId w:val="19"/>
+        </w:numPr>
+      </w:pPr>
+      <w:r>
+        <w:t>chat/templates/chat/register.html</w:t>
+      </w:r>
+    </w:p>
+    <w:p>
+      <w:pPr>
+        <w:numPr>
+          <w:ilvl w:val="0"/>
+          <w:numId w:val="19"/>
+        </w:numPr>
+      </w:pPr>
+      <w:r>
+        <w:t>Thiết kế theo phong cách Sakura (Màu hồng pastel, bo góc).</w:t>
+      </w:r>
+    </w:p>
+    <w:p>
+      <w:pPr>
+        <w:rPr>
+          <w:b/>
+          <w:bCs/>
+        </w:rPr>
+      </w:pPr>
+      <w:r>
+        <w:rPr>
+          <w:b/>
+          <w:bCs/>
+        </w:rPr>
+        <w:t>Verification Plan</w:t>
+      </w:r>
+    </w:p>
+    <w:p>
+      <w:r>
+        <w:t>Automated Tests</w:t>
+      </w:r>
+    </w:p>
+    <w:p>
+      <w:pPr>
+        <w:numPr>
+          <w:ilvl w:val="0"/>
+          <w:numId w:val="20"/>
+        </w:numPr>
+      </w:pPr>
+      <w:r>
+        <w:t>Kiểm tra syntax bằng python manage.py check.</w:t>
+      </w:r>
+    </w:p>
+    <w:p>
+      <w:pPr>
+        <w:numPr>
+          <w:ilvl w:val="0"/>
+          <w:numId w:val="20"/>
+        </w:numPr>
+      </w:pPr>
+      <w:r>
+        <w:t>Đảm bảo python manage.py makemigrations và migrate chạy thành công.</w:t>
+      </w:r>
+    </w:p>
+    <w:p>
+      <w:r>
+        <w:t>Manual Verification</w:t>
+      </w:r>
+    </w:p>
+    <w:p>
+      <w:pPr>
+        <w:numPr>
+          <w:ilvl w:val="0"/>
+          <w:numId w:val="21"/>
+        </w:numPr>
+      </w:pPr>
+      <w:r>
+        <w:t>Chạy server bằng lệnh python manage.py runserver (hoặc daphne).</w:t>
+      </w:r>
+    </w:p>
+    <w:p>
+      <w:pPr>
+        <w:numPr>
+          <w:ilvl w:val="0"/>
+          <w:numId w:val="21"/>
+        </w:numPr>
+      </w:pPr>
+      <w:r>
+        <w:t>Truy cập trình duyệt để test luồng Đăng ký và Đăng nhập.</w:t>
+      </w:r>
+    </w:p>
+    <w:p>
+      <w:pPr>
+        <w:numPr>
+          <w:ilvl w:val="0"/>
+          <w:numId w:val="21"/>
+        </w:numPr>
+      </w:pPr>
+      <w:r>
+        <w:t>Kiểm tra giao diện xem đã đúng phong cách Sakura/Kawaii chưa.</w:t>
       </w:r>
     </w:p>
     <w:p/>
@@ -346,7 +1923,7 @@
 </file>
 
 <file path=word/numbering.xml><?xml version="1.0" encoding="utf-8"?>
-<w:numbering xmlns:wpc="http://schemas.microsoft.com/office/word/2010/wordprocessingCanvas" xmlns:cx="http://schemas.microsoft.com/office/drawing/2014/chartex" xmlns:cx1="http://schemas.microsoft.com/office/drawing/2015/9/8/chartex" xmlns:cx2="http://schemas.microsoft.com/office/drawing/2015/10/21/chartex" xmlns:cx3="http://schemas.microsoft.com/office/drawing/2016/5/9/chartex" xmlns:cx4="http://schemas.microsoft.com/office/drawing/2016/5/10/chartex" xmlns:cx5="http://schemas.microsoft.com/office/drawing/2016/5/11/chartex" xmlns:cx6="http://schemas.microsoft.com/office/drawing/2016/5/12/chartex" xmlns:cx7="http://schemas.microsoft.com/office/drawing/2016/5/13/chartex" xmlns:cx8="http://schemas.microsoft.com/office/drawing/2016/5/14/chartex" xmlns:mc="http://schemas.openxmlformats.org/markup-compatibility/2006" xmlns:aink="http://schemas.microsoft.com/office/drawing/2016/ink" xmlns:am3d="http://schemas.microsoft.com/office/drawing/2017/model3d" xmlns:o="urn:schemas-microsoft-com:office:office" xmlns:oel="http://schemas.microsoft.com/office/2019/extlst" xmlns:r="http://schemas.openxmlformats.org/officeDocument/2006/relationships" xmlns:m="http://schemas.openxmlformats.org/officeDocument/2006/math" xmlns:v="urn:schemas-microsoft-com:vml" xmlns:wp14="http://schemas.microsoft.com/office/word/2010/wordprocessingDrawing" xmlns:wp="http://schemas.openxmlformats.org/drawingml/2006/wordprocessingDrawing" xmlns:w10="urn:schemas-microsoft-com:office:word" xmlns:w="http://schemas.openxmlformats.org/wordprocessingml/2006/main" xmlns:w14="http://schemas.microsoft.com/office/word/2010/wordml" xmlns:w15="http://schemas.microsoft.com/office/word/2012/wordml" xmlns:w16cex="http://schemas.microsoft.com/office/word/2018/wordml/cex" xmlns:w16cid="http://schemas.microsoft.com/office/word/2016/wordml/cid" xmlns:w16="http://schemas.microsoft.com/office/word/2018/wordml" xmlns:w16du="http://schemas.microsoft.com/office/word/2023/wordml/word16du" xmlns:w16sdtdh="http://schemas.microsoft.com/office/word/2020/wordml/sdtdatahash" xmlns:w16sdtfl="http://schemas.microsoft.com/office/word/2024/wordml/sdtformatlock" xmlns:w16se="http://schemas.microsoft.com/office/word/2015/wordml/symex" xmlns:wpg="http://schemas.microsoft.com/office/word/2010/wordprocessingGroup" xmlns:wpi="http://schemas.microsoft.com/office/word/2010/wordprocessingInk" xmlns:wne="http://schemas.microsoft.com/office/word/2006/wordml" xmlns:wps="http://schemas.microsoft.com/office/word/2010/wordprocessingShape" mc:Ignorable="w14 w15 w16se w16cid w16 w16cex w16sdtdh w16sdtfl w16du wp14">
+<w:numbering xmlns:wpc="http://schemas.microsoft.com/office/word/2010/wordprocessingCanvas" xmlns:cx="http://schemas.microsoft.com/office/drawing/2014/chartex" xmlns:cx1="http://schemas.microsoft.com/office/drawing/2015/9/8/chartex" xmlns:cx2="http://schemas.microsoft.com/office/drawing/2015/10/21/chartex" xmlns:cx3="http://schemas.microsoft.com/office/drawing/2016/5/9/chartex" xmlns:cx4="http://schemas.microsoft.com/office/drawing/2016/5/10/chartex" xmlns:cx5="http://schemas.microsoft.com/office/drawing/2016/5/11/chartex" xmlns:cx6="http://schemas.microsoft.com/office/drawing/2016/5/12/chartex" xmlns:cx7="http://schemas.microsoft.com/office/drawing/2016/5/13/chartex" xmlns:cx8="http://schemas.microsoft.com/office/drawing/2016/5/14/chartex" xmlns:mc="http://schemas.openxmlformats.org/markup-compatibility/2006" xmlns:aink="http://schemas.microsoft.com/office/drawing/2016/ink" xmlns:am3d="http://schemas.microsoft.com/office/drawing/2017/model3d" xmlns:o="urn:schemas-microsoft-com:office:office" xmlns:oel="http://schemas.microsoft.com/office/2019/extlst" xmlns:r="http://schemas.openxmlformats.org/officeDocument/2006/relationships" xmlns:m="http://schemas.openxmlformats.org/officeDocument/2006/math" xmlns:v="urn:schemas-microsoft-com:vml" xmlns:wp14="http://schemas.microsoft.com/office/word/2010/wordprocessingDrawing" xmlns:wp="http://schemas.openxmlformats.org/drawingml/2006/wordprocessingDrawing" xmlns:w10="urn:schemas-microsoft-com:office:word" xmlns:w="http://schemas.openxmlformats.org/wordprocessingml/2006/main" xmlns:w14="http://schemas.microsoft.com/office/word/2010/wordml" xmlns:w15="http://schemas.microsoft.com/office/word/2012/wordml" xmlns:w16cei="http://schemas.microsoft.com/office/word/2026/wordml/cei" xmlns:w16cex="http://schemas.microsoft.com/office/word/2018/wordml/cex" xmlns:w16cid="http://schemas.microsoft.com/office/word/2016/wordml/cid" xmlns:w16="http://schemas.microsoft.com/office/word/2018/wordml" xmlns:w16du="http://schemas.microsoft.com/office/word/2023/wordml/word16du" xmlns:w16sdtdh="http://schemas.microsoft.com/office/word/2020/wordml/sdtdatahash" xmlns:w16sdtfl="http://schemas.microsoft.com/office/word/2024/wordml/sdtformatlock" xmlns:w16se="http://schemas.microsoft.com/office/word/2015/wordml/symex" xmlns:wpg="http://schemas.microsoft.com/office/word/2010/wordprocessingGroup" xmlns:wpi="http://schemas.microsoft.com/office/word/2010/wordprocessingInk" xmlns:wne="http://schemas.microsoft.com/office/word/2006/wordml" xmlns:wps="http://schemas.microsoft.com/office/word/2010/wordprocessingShape" mc:Ignorable="w14 w15 w16se w16cid w16 w16cex w16sdtdh w16sdtfl w16du wp14">
   <w:abstractNum w:abstractNumId="0" w15:restartNumberingAfterBreak="0">
     <w:nsid w:val="078D6FCF"/>
     <w:multiLevelType w:val="multilevel"/>
@@ -497,6 +2074,453 @@
     </w:lvl>
   </w:abstractNum>
   <w:abstractNum w:abstractNumId="1" w15:restartNumberingAfterBreak="0">
+    <w:nsid w:val="12700AC3"/>
+    <w:multiLevelType w:val="multilevel"/>
+    <w:tmpl w:val="221AA528"/>
+    <w:lvl w:ilvl="0">
+      <w:start w:val="1"/>
+      <w:numFmt w:val="bullet"/>
+      <w:lvlText w:val=""/>
+      <w:lvlJc w:val="left"/>
+      <w:pPr>
+        <w:tabs>
+          <w:tab w:val="num" w:pos="720"/>
+        </w:tabs>
+        <w:ind w:left="720" w:hanging="360"/>
+      </w:pPr>
+      <w:rPr>
+        <w:rFonts w:ascii="Symbol" w:hAnsi="Symbol" w:hint="default"/>
+        <w:sz w:val="20"/>
+      </w:rPr>
+    </w:lvl>
+    <w:lvl w:ilvl="1" w:tentative="1">
+      <w:start w:val="1"/>
+      <w:numFmt w:val="bullet"/>
+      <w:lvlText w:val="o"/>
+      <w:lvlJc w:val="left"/>
+      <w:pPr>
+        <w:tabs>
+          <w:tab w:val="num" w:pos="1440"/>
+        </w:tabs>
+        <w:ind w:left="1440" w:hanging="360"/>
+      </w:pPr>
+      <w:rPr>
+        <w:rFonts w:ascii="Courier New" w:hAnsi="Courier New" w:hint="default"/>
+        <w:sz w:val="20"/>
+      </w:rPr>
+    </w:lvl>
+    <w:lvl w:ilvl="2" w:tentative="1">
+      <w:start w:val="1"/>
+      <w:numFmt w:val="bullet"/>
+      <w:lvlText w:val=""/>
+      <w:lvlJc w:val="left"/>
+      <w:pPr>
+        <w:tabs>
+          <w:tab w:val="num" w:pos="2160"/>
+        </w:tabs>
+        <w:ind w:left="2160" w:hanging="360"/>
+      </w:pPr>
+      <w:rPr>
+        <w:rFonts w:ascii="Wingdings" w:hAnsi="Wingdings" w:hint="default"/>
+        <w:sz w:val="20"/>
+      </w:rPr>
+    </w:lvl>
+    <w:lvl w:ilvl="3" w:tentative="1">
+      <w:start w:val="1"/>
+      <w:numFmt w:val="bullet"/>
+      <w:lvlText w:val=""/>
+      <w:lvlJc w:val="left"/>
+      <w:pPr>
+        <w:tabs>
+          <w:tab w:val="num" w:pos="2880"/>
+        </w:tabs>
+        <w:ind w:left="2880" w:hanging="360"/>
+      </w:pPr>
+      <w:rPr>
+        <w:rFonts w:ascii="Wingdings" w:hAnsi="Wingdings" w:hint="default"/>
+        <w:sz w:val="20"/>
+      </w:rPr>
+    </w:lvl>
+    <w:lvl w:ilvl="4" w:tentative="1">
+      <w:start w:val="1"/>
+      <w:numFmt w:val="bullet"/>
+      <w:lvlText w:val=""/>
+      <w:lvlJc w:val="left"/>
+      <w:pPr>
+        <w:tabs>
+          <w:tab w:val="num" w:pos="3600"/>
+        </w:tabs>
+        <w:ind w:left="3600" w:hanging="360"/>
+      </w:pPr>
+      <w:rPr>
+        <w:rFonts w:ascii="Wingdings" w:hAnsi="Wingdings" w:hint="default"/>
+        <w:sz w:val="20"/>
+      </w:rPr>
+    </w:lvl>
+    <w:lvl w:ilvl="5" w:tentative="1">
+      <w:start w:val="1"/>
+      <w:numFmt w:val="bullet"/>
+      <w:lvlText w:val=""/>
+      <w:lvlJc w:val="left"/>
+      <w:pPr>
+        <w:tabs>
+          <w:tab w:val="num" w:pos="4320"/>
+        </w:tabs>
+        <w:ind w:left="4320" w:hanging="360"/>
+      </w:pPr>
+      <w:rPr>
+        <w:rFonts w:ascii="Wingdings" w:hAnsi="Wingdings" w:hint="default"/>
+        <w:sz w:val="20"/>
+      </w:rPr>
+    </w:lvl>
+    <w:lvl w:ilvl="6" w:tentative="1">
+      <w:start w:val="1"/>
+      <w:numFmt w:val="bullet"/>
+      <w:lvlText w:val=""/>
+      <w:lvlJc w:val="left"/>
+      <w:pPr>
+        <w:tabs>
+          <w:tab w:val="num" w:pos="5040"/>
+        </w:tabs>
+        <w:ind w:left="5040" w:hanging="360"/>
+      </w:pPr>
+      <w:rPr>
+        <w:rFonts w:ascii="Wingdings" w:hAnsi="Wingdings" w:hint="default"/>
+        <w:sz w:val="20"/>
+      </w:rPr>
+    </w:lvl>
+    <w:lvl w:ilvl="7" w:tentative="1">
+      <w:start w:val="1"/>
+      <w:numFmt w:val="bullet"/>
+      <w:lvlText w:val=""/>
+      <w:lvlJc w:val="left"/>
+      <w:pPr>
+        <w:tabs>
+          <w:tab w:val="num" w:pos="5760"/>
+        </w:tabs>
+        <w:ind w:left="5760" w:hanging="360"/>
+      </w:pPr>
+      <w:rPr>
+        <w:rFonts w:ascii="Wingdings" w:hAnsi="Wingdings" w:hint="default"/>
+        <w:sz w:val="20"/>
+      </w:rPr>
+    </w:lvl>
+    <w:lvl w:ilvl="8" w:tentative="1">
+      <w:start w:val="1"/>
+      <w:numFmt w:val="bullet"/>
+      <w:lvlText w:val=""/>
+      <w:lvlJc w:val="left"/>
+      <w:pPr>
+        <w:tabs>
+          <w:tab w:val="num" w:pos="6480"/>
+        </w:tabs>
+        <w:ind w:left="6480" w:hanging="360"/>
+      </w:pPr>
+      <w:rPr>
+        <w:rFonts w:ascii="Wingdings" w:hAnsi="Wingdings" w:hint="default"/>
+        <w:sz w:val="20"/>
+      </w:rPr>
+    </w:lvl>
+  </w:abstractNum>
+  <w:abstractNum w:abstractNumId="2" w15:restartNumberingAfterBreak="0">
+    <w:nsid w:val="15C439B5"/>
+    <w:multiLevelType w:val="multilevel"/>
+    <w:tmpl w:val="46826754"/>
+    <w:lvl w:ilvl="0">
+      <w:start w:val="1"/>
+      <w:numFmt w:val="bullet"/>
+      <w:lvlText w:val=""/>
+      <w:lvlJc w:val="left"/>
+      <w:pPr>
+        <w:tabs>
+          <w:tab w:val="num" w:pos="720"/>
+        </w:tabs>
+        <w:ind w:left="720" w:hanging="360"/>
+      </w:pPr>
+      <w:rPr>
+        <w:rFonts w:ascii="Symbol" w:hAnsi="Symbol" w:hint="default"/>
+        <w:sz w:val="20"/>
+      </w:rPr>
+    </w:lvl>
+    <w:lvl w:ilvl="1" w:tentative="1">
+      <w:start w:val="1"/>
+      <w:numFmt w:val="bullet"/>
+      <w:lvlText w:val=""/>
+      <w:lvlJc w:val="left"/>
+      <w:pPr>
+        <w:tabs>
+          <w:tab w:val="num" w:pos="1440"/>
+        </w:tabs>
+        <w:ind w:left="1440" w:hanging="360"/>
+      </w:pPr>
+      <w:rPr>
+        <w:rFonts w:ascii="Symbol" w:hAnsi="Symbol" w:hint="default"/>
+        <w:sz w:val="20"/>
+      </w:rPr>
+    </w:lvl>
+    <w:lvl w:ilvl="2" w:tentative="1">
+      <w:start w:val="1"/>
+      <w:numFmt w:val="bullet"/>
+      <w:lvlText w:val=""/>
+      <w:lvlJc w:val="left"/>
+      <w:pPr>
+        <w:tabs>
+          <w:tab w:val="num" w:pos="2160"/>
+        </w:tabs>
+        <w:ind w:left="2160" w:hanging="360"/>
+      </w:pPr>
+      <w:rPr>
+        <w:rFonts w:ascii="Symbol" w:hAnsi="Symbol" w:hint="default"/>
+        <w:sz w:val="20"/>
+      </w:rPr>
+    </w:lvl>
+    <w:lvl w:ilvl="3" w:tentative="1">
+      <w:start w:val="1"/>
+      <w:numFmt w:val="bullet"/>
+      <w:lvlText w:val=""/>
+      <w:lvlJc w:val="left"/>
+      <w:pPr>
+        <w:tabs>
+          <w:tab w:val="num" w:pos="2880"/>
+        </w:tabs>
+        <w:ind w:left="2880" w:hanging="360"/>
+      </w:pPr>
+      <w:rPr>
+        <w:rFonts w:ascii="Symbol" w:hAnsi="Symbol" w:hint="default"/>
+        <w:sz w:val="20"/>
+      </w:rPr>
+    </w:lvl>
+    <w:lvl w:ilvl="4" w:tentative="1">
+      <w:start w:val="1"/>
+      <w:numFmt w:val="bullet"/>
+      <w:lvlText w:val=""/>
+      <w:lvlJc w:val="left"/>
+      <w:pPr>
+        <w:tabs>
+          <w:tab w:val="num" w:pos="3600"/>
+        </w:tabs>
+        <w:ind w:left="3600" w:hanging="360"/>
+      </w:pPr>
+      <w:rPr>
+        <w:rFonts w:ascii="Symbol" w:hAnsi="Symbol" w:hint="default"/>
+        <w:sz w:val="20"/>
+      </w:rPr>
+    </w:lvl>
+    <w:lvl w:ilvl="5" w:tentative="1">
+      <w:start w:val="1"/>
+      <w:numFmt w:val="bullet"/>
+      <w:lvlText w:val=""/>
+      <w:lvlJc w:val="left"/>
+      <w:pPr>
+        <w:tabs>
+          <w:tab w:val="num" w:pos="4320"/>
+        </w:tabs>
+        <w:ind w:left="4320" w:hanging="360"/>
+      </w:pPr>
+      <w:rPr>
+        <w:rFonts w:ascii="Symbol" w:hAnsi="Symbol" w:hint="default"/>
+        <w:sz w:val="20"/>
+      </w:rPr>
+    </w:lvl>
+    <w:lvl w:ilvl="6" w:tentative="1">
+      <w:start w:val="1"/>
+      <w:numFmt w:val="bullet"/>
+      <w:lvlText w:val=""/>
+      <w:lvlJc w:val="left"/>
+      <w:pPr>
+        <w:tabs>
+          <w:tab w:val="num" w:pos="5040"/>
+        </w:tabs>
+        <w:ind w:left="5040" w:hanging="360"/>
+      </w:pPr>
+      <w:rPr>
+        <w:rFonts w:ascii="Symbol" w:hAnsi="Symbol" w:hint="default"/>
+        <w:sz w:val="20"/>
+      </w:rPr>
+    </w:lvl>
+    <w:lvl w:ilvl="7" w:tentative="1">
+      <w:start w:val="1"/>
+      <w:numFmt w:val="bullet"/>
+      <w:lvlText w:val=""/>
+      <w:lvlJc w:val="left"/>
+      <w:pPr>
+        <w:tabs>
+          <w:tab w:val="num" w:pos="5760"/>
+        </w:tabs>
+        <w:ind w:left="5760" w:hanging="360"/>
+      </w:pPr>
+      <w:rPr>
+        <w:rFonts w:ascii="Symbol" w:hAnsi="Symbol" w:hint="default"/>
+        <w:sz w:val="20"/>
+      </w:rPr>
+    </w:lvl>
+    <w:lvl w:ilvl="8" w:tentative="1">
+      <w:start w:val="1"/>
+      <w:numFmt w:val="bullet"/>
+      <w:lvlText w:val=""/>
+      <w:lvlJc w:val="left"/>
+      <w:pPr>
+        <w:tabs>
+          <w:tab w:val="num" w:pos="6480"/>
+        </w:tabs>
+        <w:ind w:left="6480" w:hanging="360"/>
+      </w:pPr>
+      <w:rPr>
+        <w:rFonts w:ascii="Symbol" w:hAnsi="Symbol" w:hint="default"/>
+        <w:sz w:val="20"/>
+      </w:rPr>
+    </w:lvl>
+  </w:abstractNum>
+  <w:abstractNum w:abstractNumId="3" w15:restartNumberingAfterBreak="0">
+    <w:nsid w:val="1C54798F"/>
+    <w:multiLevelType w:val="multilevel"/>
+    <w:tmpl w:val="8612E53A"/>
+    <w:lvl w:ilvl="0">
+      <w:start w:val="1"/>
+      <w:numFmt w:val="bullet"/>
+      <w:lvlText w:val=""/>
+      <w:lvlJc w:val="left"/>
+      <w:pPr>
+        <w:tabs>
+          <w:tab w:val="num" w:pos="720"/>
+        </w:tabs>
+        <w:ind w:left="720" w:hanging="360"/>
+      </w:pPr>
+      <w:rPr>
+        <w:rFonts w:ascii="Symbol" w:hAnsi="Symbol" w:hint="default"/>
+        <w:sz w:val="20"/>
+      </w:rPr>
+    </w:lvl>
+    <w:lvl w:ilvl="1" w:tentative="1">
+      <w:start w:val="1"/>
+      <w:numFmt w:val="bullet"/>
+      <w:lvlText w:val="o"/>
+      <w:lvlJc w:val="left"/>
+      <w:pPr>
+        <w:tabs>
+          <w:tab w:val="num" w:pos="1440"/>
+        </w:tabs>
+        <w:ind w:left="1440" w:hanging="360"/>
+      </w:pPr>
+      <w:rPr>
+        <w:rFonts w:ascii="Courier New" w:hAnsi="Courier New" w:hint="default"/>
+        <w:sz w:val="20"/>
+      </w:rPr>
+    </w:lvl>
+    <w:lvl w:ilvl="2" w:tentative="1">
+      <w:start w:val="1"/>
+      <w:numFmt w:val="bullet"/>
+      <w:lvlText w:val=""/>
+      <w:lvlJc w:val="left"/>
+      <w:pPr>
+        <w:tabs>
+          <w:tab w:val="num" w:pos="2160"/>
+        </w:tabs>
+        <w:ind w:left="2160" w:hanging="360"/>
+      </w:pPr>
+      <w:rPr>
+        <w:rFonts w:ascii="Wingdings" w:hAnsi="Wingdings" w:hint="default"/>
+        <w:sz w:val="20"/>
+      </w:rPr>
+    </w:lvl>
+    <w:lvl w:ilvl="3" w:tentative="1">
+      <w:start w:val="1"/>
+      <w:numFmt w:val="bullet"/>
+      <w:lvlText w:val=""/>
+      <w:lvlJc w:val="left"/>
+      <w:pPr>
+        <w:tabs>
+          <w:tab w:val="num" w:pos="2880"/>
+        </w:tabs>
+        <w:ind w:left="2880" w:hanging="360"/>
+      </w:pPr>
+      <w:rPr>
+        <w:rFonts w:ascii="Wingdings" w:hAnsi="Wingdings" w:hint="default"/>
+        <w:sz w:val="20"/>
+      </w:rPr>
+    </w:lvl>
+    <w:lvl w:ilvl="4" w:tentative="1">
+      <w:start w:val="1"/>
+      <w:numFmt w:val="bullet"/>
+      <w:lvlText w:val=""/>
+      <w:lvlJc w:val="left"/>
+      <w:pPr>
+        <w:tabs>
+          <w:tab w:val="num" w:pos="3600"/>
+        </w:tabs>
+        <w:ind w:left="3600" w:hanging="360"/>
+      </w:pPr>
+      <w:rPr>
+        <w:rFonts w:ascii="Wingdings" w:hAnsi="Wingdings" w:hint="default"/>
+        <w:sz w:val="20"/>
+      </w:rPr>
+    </w:lvl>
+    <w:lvl w:ilvl="5" w:tentative="1">
+      <w:start w:val="1"/>
+      <w:numFmt w:val="bullet"/>
+      <w:lvlText w:val=""/>
+      <w:lvlJc w:val="left"/>
+      <w:pPr>
+        <w:tabs>
+          <w:tab w:val="num" w:pos="4320"/>
+        </w:tabs>
+        <w:ind w:left="4320" w:hanging="360"/>
+      </w:pPr>
+      <w:rPr>
+        <w:rFonts w:ascii="Wingdings" w:hAnsi="Wingdings" w:hint="default"/>
+        <w:sz w:val="20"/>
+      </w:rPr>
+    </w:lvl>
+    <w:lvl w:ilvl="6" w:tentative="1">
+      <w:start w:val="1"/>
+      <w:numFmt w:val="bullet"/>
+      <w:lvlText w:val=""/>
+      <w:lvlJc w:val="left"/>
+      <w:pPr>
+        <w:tabs>
+          <w:tab w:val="num" w:pos="5040"/>
+        </w:tabs>
+        <w:ind w:left="5040" w:hanging="360"/>
+      </w:pPr>
+      <w:rPr>
+        <w:rFonts w:ascii="Wingdings" w:hAnsi="Wingdings" w:hint="default"/>
+        <w:sz w:val="20"/>
+      </w:rPr>
+    </w:lvl>
+    <w:lvl w:ilvl="7" w:tentative="1">
+      <w:start w:val="1"/>
+      <w:numFmt w:val="bullet"/>
+      <w:lvlText w:val=""/>
+      <w:lvlJc w:val="left"/>
+      <w:pPr>
+        <w:tabs>
+          <w:tab w:val="num" w:pos="5760"/>
+        </w:tabs>
+        <w:ind w:left="5760" w:hanging="360"/>
+      </w:pPr>
+      <w:rPr>
+        <w:rFonts w:ascii="Wingdings" w:hAnsi="Wingdings" w:hint="default"/>
+        <w:sz w:val="20"/>
+      </w:rPr>
+    </w:lvl>
+    <w:lvl w:ilvl="8" w:tentative="1">
+      <w:start w:val="1"/>
+      <w:numFmt w:val="bullet"/>
+      <w:lvlText w:val=""/>
+      <w:lvlJc w:val="left"/>
+      <w:pPr>
+        <w:tabs>
+          <w:tab w:val="num" w:pos="6480"/>
+        </w:tabs>
+        <w:ind w:left="6480" w:hanging="360"/>
+      </w:pPr>
+      <w:rPr>
+        <w:rFonts w:ascii="Wingdings" w:hAnsi="Wingdings" w:hint="default"/>
+        <w:sz w:val="20"/>
+      </w:rPr>
+    </w:lvl>
+  </w:abstractNum>
+  <w:abstractNum w:abstractNumId="4" w15:restartNumberingAfterBreak="0">
     <w:nsid w:val="1F2637B1"/>
     <w:multiLevelType w:val="multilevel"/>
     <w:tmpl w:val="B6C2A822"/>
@@ -611,7 +2635,901 @@
       </w:rPr>
     </w:lvl>
   </w:abstractNum>
-  <w:abstractNum w:abstractNumId="2" w15:restartNumberingAfterBreak="0">
+  <w:abstractNum w:abstractNumId="5" w15:restartNumberingAfterBreak="0">
+    <w:nsid w:val="22432887"/>
+    <w:multiLevelType w:val="multilevel"/>
+    <w:tmpl w:val="09100B40"/>
+    <w:lvl w:ilvl="0">
+      <w:start w:val="1"/>
+      <w:numFmt w:val="bullet"/>
+      <w:lvlText w:val=""/>
+      <w:lvlJc w:val="left"/>
+      <w:pPr>
+        <w:tabs>
+          <w:tab w:val="num" w:pos="720"/>
+        </w:tabs>
+        <w:ind w:left="720" w:hanging="360"/>
+      </w:pPr>
+      <w:rPr>
+        <w:rFonts w:ascii="Symbol" w:hAnsi="Symbol" w:hint="default"/>
+        <w:sz w:val="20"/>
+      </w:rPr>
+    </w:lvl>
+    <w:lvl w:ilvl="1" w:tentative="1">
+      <w:start w:val="1"/>
+      <w:numFmt w:val="bullet"/>
+      <w:lvlText w:val="o"/>
+      <w:lvlJc w:val="left"/>
+      <w:pPr>
+        <w:tabs>
+          <w:tab w:val="num" w:pos="1440"/>
+        </w:tabs>
+        <w:ind w:left="1440" w:hanging="360"/>
+      </w:pPr>
+      <w:rPr>
+        <w:rFonts w:ascii="Courier New" w:hAnsi="Courier New" w:hint="default"/>
+        <w:sz w:val="20"/>
+      </w:rPr>
+    </w:lvl>
+    <w:lvl w:ilvl="2" w:tentative="1">
+      <w:start w:val="1"/>
+      <w:numFmt w:val="bullet"/>
+      <w:lvlText w:val=""/>
+      <w:lvlJc w:val="left"/>
+      <w:pPr>
+        <w:tabs>
+          <w:tab w:val="num" w:pos="2160"/>
+        </w:tabs>
+        <w:ind w:left="2160" w:hanging="360"/>
+      </w:pPr>
+      <w:rPr>
+        <w:rFonts w:ascii="Wingdings" w:hAnsi="Wingdings" w:hint="default"/>
+        <w:sz w:val="20"/>
+      </w:rPr>
+    </w:lvl>
+    <w:lvl w:ilvl="3" w:tentative="1">
+      <w:start w:val="1"/>
+      <w:numFmt w:val="bullet"/>
+      <w:lvlText w:val=""/>
+      <w:lvlJc w:val="left"/>
+      <w:pPr>
+        <w:tabs>
+          <w:tab w:val="num" w:pos="2880"/>
+        </w:tabs>
+        <w:ind w:left="2880" w:hanging="360"/>
+      </w:pPr>
+      <w:rPr>
+        <w:rFonts w:ascii="Wingdings" w:hAnsi="Wingdings" w:hint="default"/>
+        <w:sz w:val="20"/>
+      </w:rPr>
+    </w:lvl>
+    <w:lvl w:ilvl="4" w:tentative="1">
+      <w:start w:val="1"/>
+      <w:numFmt w:val="bullet"/>
+      <w:lvlText w:val=""/>
+      <w:lvlJc w:val="left"/>
+      <w:pPr>
+        <w:tabs>
+          <w:tab w:val="num" w:pos="3600"/>
+        </w:tabs>
+        <w:ind w:left="3600" w:hanging="360"/>
+      </w:pPr>
+      <w:rPr>
+        <w:rFonts w:ascii="Wingdings" w:hAnsi="Wingdings" w:hint="default"/>
+        <w:sz w:val="20"/>
+      </w:rPr>
+    </w:lvl>
+    <w:lvl w:ilvl="5" w:tentative="1">
+      <w:start w:val="1"/>
+      <w:numFmt w:val="bullet"/>
+      <w:lvlText w:val=""/>
+      <w:lvlJc w:val="left"/>
+      <w:pPr>
+        <w:tabs>
+          <w:tab w:val="num" w:pos="4320"/>
+        </w:tabs>
+        <w:ind w:left="4320" w:hanging="360"/>
+      </w:pPr>
+      <w:rPr>
+        <w:rFonts w:ascii="Wingdings" w:hAnsi="Wingdings" w:hint="default"/>
+        <w:sz w:val="20"/>
+      </w:rPr>
+    </w:lvl>
+    <w:lvl w:ilvl="6" w:tentative="1">
+      <w:start w:val="1"/>
+      <w:numFmt w:val="bullet"/>
+      <w:lvlText w:val=""/>
+      <w:lvlJc w:val="left"/>
+      <w:pPr>
+        <w:tabs>
+          <w:tab w:val="num" w:pos="5040"/>
+        </w:tabs>
+        <w:ind w:left="5040" w:hanging="360"/>
+      </w:pPr>
+      <w:rPr>
+        <w:rFonts w:ascii="Wingdings" w:hAnsi="Wingdings" w:hint="default"/>
+        <w:sz w:val="20"/>
+      </w:rPr>
+    </w:lvl>
+    <w:lvl w:ilvl="7" w:tentative="1">
+      <w:start w:val="1"/>
+      <w:numFmt w:val="bullet"/>
+      <w:lvlText w:val=""/>
+      <w:lvlJc w:val="left"/>
+      <w:pPr>
+        <w:tabs>
+          <w:tab w:val="num" w:pos="5760"/>
+        </w:tabs>
+        <w:ind w:left="5760" w:hanging="360"/>
+      </w:pPr>
+      <w:rPr>
+        <w:rFonts w:ascii="Wingdings" w:hAnsi="Wingdings" w:hint="default"/>
+        <w:sz w:val="20"/>
+      </w:rPr>
+    </w:lvl>
+    <w:lvl w:ilvl="8" w:tentative="1">
+      <w:start w:val="1"/>
+      <w:numFmt w:val="bullet"/>
+      <w:lvlText w:val=""/>
+      <w:lvlJc w:val="left"/>
+      <w:pPr>
+        <w:tabs>
+          <w:tab w:val="num" w:pos="6480"/>
+        </w:tabs>
+        <w:ind w:left="6480" w:hanging="360"/>
+      </w:pPr>
+      <w:rPr>
+        <w:rFonts w:ascii="Wingdings" w:hAnsi="Wingdings" w:hint="default"/>
+        <w:sz w:val="20"/>
+      </w:rPr>
+    </w:lvl>
+  </w:abstractNum>
+  <w:abstractNum w:abstractNumId="6" w15:restartNumberingAfterBreak="0">
+    <w:nsid w:val="28E33A62"/>
+    <w:multiLevelType w:val="multilevel"/>
+    <w:tmpl w:val="EE446BCE"/>
+    <w:lvl w:ilvl="0">
+      <w:start w:val="1"/>
+      <w:numFmt w:val="bullet"/>
+      <w:lvlText w:val=""/>
+      <w:lvlJc w:val="left"/>
+      <w:pPr>
+        <w:tabs>
+          <w:tab w:val="num" w:pos="720"/>
+        </w:tabs>
+        <w:ind w:left="720" w:hanging="360"/>
+      </w:pPr>
+      <w:rPr>
+        <w:rFonts w:ascii="Symbol" w:hAnsi="Symbol" w:hint="default"/>
+        <w:sz w:val="20"/>
+      </w:rPr>
+    </w:lvl>
+    <w:lvl w:ilvl="1" w:tentative="1">
+      <w:start w:val="1"/>
+      <w:numFmt w:val="bullet"/>
+      <w:lvlText w:val=""/>
+      <w:lvlJc w:val="left"/>
+      <w:pPr>
+        <w:tabs>
+          <w:tab w:val="num" w:pos="1440"/>
+        </w:tabs>
+        <w:ind w:left="1440" w:hanging="360"/>
+      </w:pPr>
+      <w:rPr>
+        <w:rFonts w:ascii="Symbol" w:hAnsi="Symbol" w:hint="default"/>
+        <w:sz w:val="20"/>
+      </w:rPr>
+    </w:lvl>
+    <w:lvl w:ilvl="2" w:tentative="1">
+      <w:start w:val="1"/>
+      <w:numFmt w:val="bullet"/>
+      <w:lvlText w:val=""/>
+      <w:lvlJc w:val="left"/>
+      <w:pPr>
+        <w:tabs>
+          <w:tab w:val="num" w:pos="2160"/>
+        </w:tabs>
+        <w:ind w:left="2160" w:hanging="360"/>
+      </w:pPr>
+      <w:rPr>
+        <w:rFonts w:ascii="Symbol" w:hAnsi="Symbol" w:hint="default"/>
+        <w:sz w:val="20"/>
+      </w:rPr>
+    </w:lvl>
+    <w:lvl w:ilvl="3" w:tentative="1">
+      <w:start w:val="1"/>
+      <w:numFmt w:val="bullet"/>
+      <w:lvlText w:val=""/>
+      <w:lvlJc w:val="left"/>
+      <w:pPr>
+        <w:tabs>
+          <w:tab w:val="num" w:pos="2880"/>
+        </w:tabs>
+        <w:ind w:left="2880" w:hanging="360"/>
+      </w:pPr>
+      <w:rPr>
+        <w:rFonts w:ascii="Symbol" w:hAnsi="Symbol" w:hint="default"/>
+        <w:sz w:val="20"/>
+      </w:rPr>
+    </w:lvl>
+    <w:lvl w:ilvl="4" w:tentative="1">
+      <w:start w:val="1"/>
+      <w:numFmt w:val="bullet"/>
+      <w:lvlText w:val=""/>
+      <w:lvlJc w:val="left"/>
+      <w:pPr>
+        <w:tabs>
+          <w:tab w:val="num" w:pos="3600"/>
+        </w:tabs>
+        <w:ind w:left="3600" w:hanging="360"/>
+      </w:pPr>
+      <w:rPr>
+        <w:rFonts w:ascii="Symbol" w:hAnsi="Symbol" w:hint="default"/>
+        <w:sz w:val="20"/>
+      </w:rPr>
+    </w:lvl>
+    <w:lvl w:ilvl="5" w:tentative="1">
+      <w:start w:val="1"/>
+      <w:numFmt w:val="bullet"/>
+      <w:lvlText w:val=""/>
+      <w:lvlJc w:val="left"/>
+      <w:pPr>
+        <w:tabs>
+          <w:tab w:val="num" w:pos="4320"/>
+        </w:tabs>
+        <w:ind w:left="4320" w:hanging="360"/>
+      </w:pPr>
+      <w:rPr>
+        <w:rFonts w:ascii="Symbol" w:hAnsi="Symbol" w:hint="default"/>
+        <w:sz w:val="20"/>
+      </w:rPr>
+    </w:lvl>
+    <w:lvl w:ilvl="6" w:tentative="1">
+      <w:start w:val="1"/>
+      <w:numFmt w:val="bullet"/>
+      <w:lvlText w:val=""/>
+      <w:lvlJc w:val="left"/>
+      <w:pPr>
+        <w:tabs>
+          <w:tab w:val="num" w:pos="5040"/>
+        </w:tabs>
+        <w:ind w:left="5040" w:hanging="360"/>
+      </w:pPr>
+      <w:rPr>
+        <w:rFonts w:ascii="Symbol" w:hAnsi="Symbol" w:hint="default"/>
+        <w:sz w:val="20"/>
+      </w:rPr>
+    </w:lvl>
+    <w:lvl w:ilvl="7" w:tentative="1">
+      <w:start w:val="1"/>
+      <w:numFmt w:val="bullet"/>
+      <w:lvlText w:val=""/>
+      <w:lvlJc w:val="left"/>
+      <w:pPr>
+        <w:tabs>
+          <w:tab w:val="num" w:pos="5760"/>
+        </w:tabs>
+        <w:ind w:left="5760" w:hanging="360"/>
+      </w:pPr>
+      <w:rPr>
+        <w:rFonts w:ascii="Symbol" w:hAnsi="Symbol" w:hint="default"/>
+        <w:sz w:val="20"/>
+      </w:rPr>
+    </w:lvl>
+    <w:lvl w:ilvl="8" w:tentative="1">
+      <w:start w:val="1"/>
+      <w:numFmt w:val="bullet"/>
+      <w:lvlText w:val=""/>
+      <w:lvlJc w:val="left"/>
+      <w:pPr>
+        <w:tabs>
+          <w:tab w:val="num" w:pos="6480"/>
+        </w:tabs>
+        <w:ind w:left="6480" w:hanging="360"/>
+      </w:pPr>
+      <w:rPr>
+        <w:rFonts w:ascii="Symbol" w:hAnsi="Symbol" w:hint="default"/>
+        <w:sz w:val="20"/>
+      </w:rPr>
+    </w:lvl>
+  </w:abstractNum>
+  <w:abstractNum w:abstractNumId="7" w15:restartNumberingAfterBreak="0">
+    <w:nsid w:val="39147671"/>
+    <w:multiLevelType w:val="multilevel"/>
+    <w:tmpl w:val="28FCAB92"/>
+    <w:lvl w:ilvl="0">
+      <w:start w:val="1"/>
+      <w:numFmt w:val="bullet"/>
+      <w:lvlText w:val=""/>
+      <w:lvlJc w:val="left"/>
+      <w:pPr>
+        <w:tabs>
+          <w:tab w:val="num" w:pos="720"/>
+        </w:tabs>
+        <w:ind w:left="720" w:hanging="360"/>
+      </w:pPr>
+      <w:rPr>
+        <w:rFonts w:ascii="Symbol" w:hAnsi="Symbol" w:hint="default"/>
+        <w:sz w:val="20"/>
+      </w:rPr>
+    </w:lvl>
+    <w:lvl w:ilvl="1" w:tentative="1">
+      <w:start w:val="1"/>
+      <w:numFmt w:val="bullet"/>
+      <w:lvlText w:val=""/>
+      <w:lvlJc w:val="left"/>
+      <w:pPr>
+        <w:tabs>
+          <w:tab w:val="num" w:pos="1440"/>
+        </w:tabs>
+        <w:ind w:left="1440" w:hanging="360"/>
+      </w:pPr>
+      <w:rPr>
+        <w:rFonts w:ascii="Symbol" w:hAnsi="Symbol" w:hint="default"/>
+        <w:sz w:val="20"/>
+      </w:rPr>
+    </w:lvl>
+    <w:lvl w:ilvl="2" w:tentative="1">
+      <w:start w:val="1"/>
+      <w:numFmt w:val="bullet"/>
+      <w:lvlText w:val=""/>
+      <w:lvlJc w:val="left"/>
+      <w:pPr>
+        <w:tabs>
+          <w:tab w:val="num" w:pos="2160"/>
+        </w:tabs>
+        <w:ind w:left="2160" w:hanging="360"/>
+      </w:pPr>
+      <w:rPr>
+        <w:rFonts w:ascii="Symbol" w:hAnsi="Symbol" w:hint="default"/>
+        <w:sz w:val="20"/>
+      </w:rPr>
+    </w:lvl>
+    <w:lvl w:ilvl="3" w:tentative="1">
+      <w:start w:val="1"/>
+      <w:numFmt w:val="bullet"/>
+      <w:lvlText w:val=""/>
+      <w:lvlJc w:val="left"/>
+      <w:pPr>
+        <w:tabs>
+          <w:tab w:val="num" w:pos="2880"/>
+        </w:tabs>
+        <w:ind w:left="2880" w:hanging="360"/>
+      </w:pPr>
+      <w:rPr>
+        <w:rFonts w:ascii="Symbol" w:hAnsi="Symbol" w:hint="default"/>
+        <w:sz w:val="20"/>
+      </w:rPr>
+    </w:lvl>
+    <w:lvl w:ilvl="4" w:tentative="1">
+      <w:start w:val="1"/>
+      <w:numFmt w:val="bullet"/>
+      <w:lvlText w:val=""/>
+      <w:lvlJc w:val="left"/>
+      <w:pPr>
+        <w:tabs>
+          <w:tab w:val="num" w:pos="3600"/>
+        </w:tabs>
+        <w:ind w:left="3600" w:hanging="360"/>
+      </w:pPr>
+      <w:rPr>
+        <w:rFonts w:ascii="Symbol" w:hAnsi="Symbol" w:hint="default"/>
+        <w:sz w:val="20"/>
+      </w:rPr>
+    </w:lvl>
+    <w:lvl w:ilvl="5" w:tentative="1">
+      <w:start w:val="1"/>
+      <w:numFmt w:val="bullet"/>
+      <w:lvlText w:val=""/>
+      <w:lvlJc w:val="left"/>
+      <w:pPr>
+        <w:tabs>
+          <w:tab w:val="num" w:pos="4320"/>
+        </w:tabs>
+        <w:ind w:left="4320" w:hanging="360"/>
+      </w:pPr>
+      <w:rPr>
+        <w:rFonts w:ascii="Symbol" w:hAnsi="Symbol" w:hint="default"/>
+        <w:sz w:val="20"/>
+      </w:rPr>
+    </w:lvl>
+    <w:lvl w:ilvl="6" w:tentative="1">
+      <w:start w:val="1"/>
+      <w:numFmt w:val="bullet"/>
+      <w:lvlText w:val=""/>
+      <w:lvlJc w:val="left"/>
+      <w:pPr>
+        <w:tabs>
+          <w:tab w:val="num" w:pos="5040"/>
+        </w:tabs>
+        <w:ind w:left="5040" w:hanging="360"/>
+      </w:pPr>
+      <w:rPr>
+        <w:rFonts w:ascii="Symbol" w:hAnsi="Symbol" w:hint="default"/>
+        <w:sz w:val="20"/>
+      </w:rPr>
+    </w:lvl>
+    <w:lvl w:ilvl="7" w:tentative="1">
+      <w:start w:val="1"/>
+      <w:numFmt w:val="bullet"/>
+      <w:lvlText w:val=""/>
+      <w:lvlJc w:val="left"/>
+      <w:pPr>
+        <w:tabs>
+          <w:tab w:val="num" w:pos="5760"/>
+        </w:tabs>
+        <w:ind w:left="5760" w:hanging="360"/>
+      </w:pPr>
+      <w:rPr>
+        <w:rFonts w:ascii="Symbol" w:hAnsi="Symbol" w:hint="default"/>
+        <w:sz w:val="20"/>
+      </w:rPr>
+    </w:lvl>
+    <w:lvl w:ilvl="8" w:tentative="1">
+      <w:start w:val="1"/>
+      <w:numFmt w:val="bullet"/>
+      <w:lvlText w:val=""/>
+      <w:lvlJc w:val="left"/>
+      <w:pPr>
+        <w:tabs>
+          <w:tab w:val="num" w:pos="6480"/>
+        </w:tabs>
+        <w:ind w:left="6480" w:hanging="360"/>
+      </w:pPr>
+      <w:rPr>
+        <w:rFonts w:ascii="Symbol" w:hAnsi="Symbol" w:hint="default"/>
+        <w:sz w:val="20"/>
+      </w:rPr>
+    </w:lvl>
+  </w:abstractNum>
+  <w:abstractNum w:abstractNumId="8" w15:restartNumberingAfterBreak="0">
+    <w:nsid w:val="4E402E0F"/>
+    <w:multiLevelType w:val="multilevel"/>
+    <w:tmpl w:val="6068E2C8"/>
+    <w:lvl w:ilvl="0">
+      <w:start w:val="1"/>
+      <w:numFmt w:val="bullet"/>
+      <w:lvlText w:val=""/>
+      <w:lvlJc w:val="left"/>
+      <w:pPr>
+        <w:tabs>
+          <w:tab w:val="num" w:pos="720"/>
+        </w:tabs>
+        <w:ind w:left="720" w:hanging="360"/>
+      </w:pPr>
+      <w:rPr>
+        <w:rFonts w:ascii="Symbol" w:hAnsi="Symbol" w:hint="default"/>
+        <w:sz w:val="20"/>
+      </w:rPr>
+    </w:lvl>
+    <w:lvl w:ilvl="1" w:tentative="1">
+      <w:start w:val="1"/>
+      <w:numFmt w:val="bullet"/>
+      <w:lvlText w:val=""/>
+      <w:lvlJc w:val="left"/>
+      <w:pPr>
+        <w:tabs>
+          <w:tab w:val="num" w:pos="1440"/>
+        </w:tabs>
+        <w:ind w:left="1440" w:hanging="360"/>
+      </w:pPr>
+      <w:rPr>
+        <w:rFonts w:ascii="Symbol" w:hAnsi="Symbol" w:hint="default"/>
+        <w:sz w:val="20"/>
+      </w:rPr>
+    </w:lvl>
+    <w:lvl w:ilvl="2" w:tentative="1">
+      <w:start w:val="1"/>
+      <w:numFmt w:val="bullet"/>
+      <w:lvlText w:val=""/>
+      <w:lvlJc w:val="left"/>
+      <w:pPr>
+        <w:tabs>
+          <w:tab w:val="num" w:pos="2160"/>
+        </w:tabs>
+        <w:ind w:left="2160" w:hanging="360"/>
+      </w:pPr>
+      <w:rPr>
+        <w:rFonts w:ascii="Symbol" w:hAnsi="Symbol" w:hint="default"/>
+        <w:sz w:val="20"/>
+      </w:rPr>
+    </w:lvl>
+    <w:lvl w:ilvl="3" w:tentative="1">
+      <w:start w:val="1"/>
+      <w:numFmt w:val="bullet"/>
+      <w:lvlText w:val=""/>
+      <w:lvlJc w:val="left"/>
+      <w:pPr>
+        <w:tabs>
+          <w:tab w:val="num" w:pos="2880"/>
+        </w:tabs>
+        <w:ind w:left="2880" w:hanging="360"/>
+      </w:pPr>
+      <w:rPr>
+        <w:rFonts w:ascii="Symbol" w:hAnsi="Symbol" w:hint="default"/>
+        <w:sz w:val="20"/>
+      </w:rPr>
+    </w:lvl>
+    <w:lvl w:ilvl="4" w:tentative="1">
+      <w:start w:val="1"/>
+      <w:numFmt w:val="bullet"/>
+      <w:lvlText w:val=""/>
+      <w:lvlJc w:val="left"/>
+      <w:pPr>
+        <w:tabs>
+          <w:tab w:val="num" w:pos="3600"/>
+        </w:tabs>
+        <w:ind w:left="3600" w:hanging="360"/>
+      </w:pPr>
+      <w:rPr>
+        <w:rFonts w:ascii="Symbol" w:hAnsi="Symbol" w:hint="default"/>
+        <w:sz w:val="20"/>
+      </w:rPr>
+    </w:lvl>
+    <w:lvl w:ilvl="5" w:tentative="1">
+      <w:start w:val="1"/>
+      <w:numFmt w:val="bullet"/>
+      <w:lvlText w:val=""/>
+      <w:lvlJc w:val="left"/>
+      <w:pPr>
+        <w:tabs>
+          <w:tab w:val="num" w:pos="4320"/>
+        </w:tabs>
+        <w:ind w:left="4320" w:hanging="360"/>
+      </w:pPr>
+      <w:rPr>
+        <w:rFonts w:ascii="Symbol" w:hAnsi="Symbol" w:hint="default"/>
+        <w:sz w:val="20"/>
+      </w:rPr>
+    </w:lvl>
+    <w:lvl w:ilvl="6" w:tentative="1">
+      <w:start w:val="1"/>
+      <w:numFmt w:val="bullet"/>
+      <w:lvlText w:val=""/>
+      <w:lvlJc w:val="left"/>
+      <w:pPr>
+        <w:tabs>
+          <w:tab w:val="num" w:pos="5040"/>
+        </w:tabs>
+        <w:ind w:left="5040" w:hanging="360"/>
+      </w:pPr>
+      <w:rPr>
+        <w:rFonts w:ascii="Symbol" w:hAnsi="Symbol" w:hint="default"/>
+        <w:sz w:val="20"/>
+      </w:rPr>
+    </w:lvl>
+    <w:lvl w:ilvl="7" w:tentative="1">
+      <w:start w:val="1"/>
+      <w:numFmt w:val="bullet"/>
+      <w:lvlText w:val=""/>
+      <w:lvlJc w:val="left"/>
+      <w:pPr>
+        <w:tabs>
+          <w:tab w:val="num" w:pos="5760"/>
+        </w:tabs>
+        <w:ind w:left="5760" w:hanging="360"/>
+      </w:pPr>
+      <w:rPr>
+        <w:rFonts w:ascii="Symbol" w:hAnsi="Symbol" w:hint="default"/>
+        <w:sz w:val="20"/>
+      </w:rPr>
+    </w:lvl>
+    <w:lvl w:ilvl="8" w:tentative="1">
+      <w:start w:val="1"/>
+      <w:numFmt w:val="bullet"/>
+      <w:lvlText w:val=""/>
+      <w:lvlJc w:val="left"/>
+      <w:pPr>
+        <w:tabs>
+          <w:tab w:val="num" w:pos="6480"/>
+        </w:tabs>
+        <w:ind w:left="6480" w:hanging="360"/>
+      </w:pPr>
+      <w:rPr>
+        <w:rFonts w:ascii="Symbol" w:hAnsi="Symbol" w:hint="default"/>
+        <w:sz w:val="20"/>
+      </w:rPr>
+    </w:lvl>
+  </w:abstractNum>
+  <w:abstractNum w:abstractNumId="9" w15:restartNumberingAfterBreak="0">
+    <w:nsid w:val="4E49141C"/>
+    <w:multiLevelType w:val="multilevel"/>
+    <w:tmpl w:val="5A9CA2AE"/>
+    <w:lvl w:ilvl="0">
+      <w:start w:val="1"/>
+      <w:numFmt w:val="bullet"/>
+      <w:lvlText w:val=""/>
+      <w:lvlJc w:val="left"/>
+      <w:pPr>
+        <w:tabs>
+          <w:tab w:val="num" w:pos="720"/>
+        </w:tabs>
+        <w:ind w:left="720" w:hanging="360"/>
+      </w:pPr>
+      <w:rPr>
+        <w:rFonts w:ascii="Symbol" w:hAnsi="Symbol" w:hint="default"/>
+        <w:sz w:val="20"/>
+      </w:rPr>
+    </w:lvl>
+    <w:lvl w:ilvl="1" w:tentative="1">
+      <w:start w:val="1"/>
+      <w:numFmt w:val="bullet"/>
+      <w:lvlText w:val=""/>
+      <w:lvlJc w:val="left"/>
+      <w:pPr>
+        <w:tabs>
+          <w:tab w:val="num" w:pos="1440"/>
+        </w:tabs>
+        <w:ind w:left="1440" w:hanging="360"/>
+      </w:pPr>
+      <w:rPr>
+        <w:rFonts w:ascii="Symbol" w:hAnsi="Symbol" w:hint="default"/>
+        <w:sz w:val="20"/>
+      </w:rPr>
+    </w:lvl>
+    <w:lvl w:ilvl="2" w:tentative="1">
+      <w:start w:val="1"/>
+      <w:numFmt w:val="bullet"/>
+      <w:lvlText w:val=""/>
+      <w:lvlJc w:val="left"/>
+      <w:pPr>
+        <w:tabs>
+          <w:tab w:val="num" w:pos="2160"/>
+        </w:tabs>
+        <w:ind w:left="2160" w:hanging="360"/>
+      </w:pPr>
+      <w:rPr>
+        <w:rFonts w:ascii="Symbol" w:hAnsi="Symbol" w:hint="default"/>
+        <w:sz w:val="20"/>
+      </w:rPr>
+    </w:lvl>
+    <w:lvl w:ilvl="3" w:tentative="1">
+      <w:start w:val="1"/>
+      <w:numFmt w:val="bullet"/>
+      <w:lvlText w:val=""/>
+      <w:lvlJc w:val="left"/>
+      <w:pPr>
+        <w:tabs>
+          <w:tab w:val="num" w:pos="2880"/>
+        </w:tabs>
+        <w:ind w:left="2880" w:hanging="360"/>
+      </w:pPr>
+      <w:rPr>
+        <w:rFonts w:ascii="Symbol" w:hAnsi="Symbol" w:hint="default"/>
+        <w:sz w:val="20"/>
+      </w:rPr>
+    </w:lvl>
+    <w:lvl w:ilvl="4" w:tentative="1">
+      <w:start w:val="1"/>
+      <w:numFmt w:val="bullet"/>
+      <w:lvlText w:val=""/>
+      <w:lvlJc w:val="left"/>
+      <w:pPr>
+        <w:tabs>
+          <w:tab w:val="num" w:pos="3600"/>
+        </w:tabs>
+        <w:ind w:left="3600" w:hanging="360"/>
+      </w:pPr>
+      <w:rPr>
+        <w:rFonts w:ascii="Symbol" w:hAnsi="Symbol" w:hint="default"/>
+        <w:sz w:val="20"/>
+      </w:rPr>
+    </w:lvl>
+    <w:lvl w:ilvl="5" w:tentative="1">
+      <w:start w:val="1"/>
+      <w:numFmt w:val="bullet"/>
+      <w:lvlText w:val=""/>
+      <w:lvlJc w:val="left"/>
+      <w:pPr>
+        <w:tabs>
+          <w:tab w:val="num" w:pos="4320"/>
+        </w:tabs>
+        <w:ind w:left="4320" w:hanging="360"/>
+      </w:pPr>
+      <w:rPr>
+        <w:rFonts w:ascii="Symbol" w:hAnsi="Symbol" w:hint="default"/>
+        <w:sz w:val="20"/>
+      </w:rPr>
+    </w:lvl>
+    <w:lvl w:ilvl="6" w:tentative="1">
+      <w:start w:val="1"/>
+      <w:numFmt w:val="bullet"/>
+      <w:lvlText w:val=""/>
+      <w:lvlJc w:val="left"/>
+      <w:pPr>
+        <w:tabs>
+          <w:tab w:val="num" w:pos="5040"/>
+        </w:tabs>
+        <w:ind w:left="5040" w:hanging="360"/>
+      </w:pPr>
+      <w:rPr>
+        <w:rFonts w:ascii="Symbol" w:hAnsi="Symbol" w:hint="default"/>
+        <w:sz w:val="20"/>
+      </w:rPr>
+    </w:lvl>
+    <w:lvl w:ilvl="7" w:tentative="1">
+      <w:start w:val="1"/>
+      <w:numFmt w:val="bullet"/>
+      <w:lvlText w:val=""/>
+      <w:lvlJc w:val="left"/>
+      <w:pPr>
+        <w:tabs>
+          <w:tab w:val="num" w:pos="5760"/>
+        </w:tabs>
+        <w:ind w:left="5760" w:hanging="360"/>
+      </w:pPr>
+      <w:rPr>
+        <w:rFonts w:ascii="Symbol" w:hAnsi="Symbol" w:hint="default"/>
+        <w:sz w:val="20"/>
+      </w:rPr>
+    </w:lvl>
+    <w:lvl w:ilvl="8" w:tentative="1">
+      <w:start w:val="1"/>
+      <w:numFmt w:val="bullet"/>
+      <w:lvlText w:val=""/>
+      <w:lvlJc w:val="left"/>
+      <w:pPr>
+        <w:tabs>
+          <w:tab w:val="num" w:pos="6480"/>
+        </w:tabs>
+        <w:ind w:left="6480" w:hanging="360"/>
+      </w:pPr>
+      <w:rPr>
+        <w:rFonts w:ascii="Symbol" w:hAnsi="Symbol" w:hint="default"/>
+        <w:sz w:val="20"/>
+      </w:rPr>
+    </w:lvl>
+  </w:abstractNum>
+  <w:abstractNum w:abstractNumId="10" w15:restartNumberingAfterBreak="0">
+    <w:nsid w:val="50B73CA5"/>
+    <w:multiLevelType w:val="multilevel"/>
+    <w:tmpl w:val="675CD15C"/>
+    <w:lvl w:ilvl="0">
+      <w:start w:val="1"/>
+      <w:numFmt w:val="bullet"/>
+      <w:lvlText w:val=""/>
+      <w:lvlJc w:val="left"/>
+      <w:pPr>
+        <w:tabs>
+          <w:tab w:val="num" w:pos="720"/>
+        </w:tabs>
+        <w:ind w:left="720" w:hanging="360"/>
+      </w:pPr>
+      <w:rPr>
+        <w:rFonts w:ascii="Symbol" w:hAnsi="Symbol" w:hint="default"/>
+        <w:sz w:val="20"/>
+      </w:rPr>
+    </w:lvl>
+    <w:lvl w:ilvl="1" w:tentative="1">
+      <w:start w:val="1"/>
+      <w:numFmt w:val="bullet"/>
+      <w:lvlText w:val=""/>
+      <w:lvlJc w:val="left"/>
+      <w:pPr>
+        <w:tabs>
+          <w:tab w:val="num" w:pos="1440"/>
+        </w:tabs>
+        <w:ind w:left="1440" w:hanging="360"/>
+      </w:pPr>
+      <w:rPr>
+        <w:rFonts w:ascii="Symbol" w:hAnsi="Symbol" w:hint="default"/>
+        <w:sz w:val="20"/>
+      </w:rPr>
+    </w:lvl>
+    <w:lvl w:ilvl="2" w:tentative="1">
+      <w:start w:val="1"/>
+      <w:numFmt w:val="bullet"/>
+      <w:lvlText w:val=""/>
+      <w:lvlJc w:val="left"/>
+      <w:pPr>
+        <w:tabs>
+          <w:tab w:val="num" w:pos="2160"/>
+        </w:tabs>
+        <w:ind w:left="2160" w:hanging="360"/>
+      </w:pPr>
+      <w:rPr>
+        <w:rFonts w:ascii="Symbol" w:hAnsi="Symbol" w:hint="default"/>
+        <w:sz w:val="20"/>
+      </w:rPr>
+    </w:lvl>
+    <w:lvl w:ilvl="3" w:tentative="1">
+      <w:start w:val="1"/>
+      <w:numFmt w:val="bullet"/>
+      <w:lvlText w:val=""/>
+      <w:lvlJc w:val="left"/>
+      <w:pPr>
+        <w:tabs>
+          <w:tab w:val="num" w:pos="2880"/>
+        </w:tabs>
+        <w:ind w:left="2880" w:hanging="360"/>
+      </w:pPr>
+      <w:rPr>
+        <w:rFonts w:ascii="Symbol" w:hAnsi="Symbol" w:hint="default"/>
+        <w:sz w:val="20"/>
+      </w:rPr>
+    </w:lvl>
+    <w:lvl w:ilvl="4" w:tentative="1">
+      <w:start w:val="1"/>
+      <w:numFmt w:val="bullet"/>
+      <w:lvlText w:val=""/>
+      <w:lvlJc w:val="left"/>
+      <w:pPr>
+        <w:tabs>
+          <w:tab w:val="num" w:pos="3600"/>
+        </w:tabs>
+        <w:ind w:left="3600" w:hanging="360"/>
+      </w:pPr>
+      <w:rPr>
+        <w:rFonts w:ascii="Symbol" w:hAnsi="Symbol" w:hint="default"/>
+        <w:sz w:val="20"/>
+      </w:rPr>
+    </w:lvl>
+    <w:lvl w:ilvl="5" w:tentative="1">
+      <w:start w:val="1"/>
+      <w:numFmt w:val="bullet"/>
+      <w:lvlText w:val=""/>
+      <w:lvlJc w:val="left"/>
+      <w:pPr>
+        <w:tabs>
+          <w:tab w:val="num" w:pos="4320"/>
+        </w:tabs>
+        <w:ind w:left="4320" w:hanging="360"/>
+      </w:pPr>
+      <w:rPr>
+        <w:rFonts w:ascii="Symbol" w:hAnsi="Symbol" w:hint="default"/>
+        <w:sz w:val="20"/>
+      </w:rPr>
+    </w:lvl>
+    <w:lvl w:ilvl="6" w:tentative="1">
+      <w:start w:val="1"/>
+      <w:numFmt w:val="bullet"/>
+      <w:lvlText w:val=""/>
+      <w:lvlJc w:val="left"/>
+      <w:pPr>
+        <w:tabs>
+          <w:tab w:val="num" w:pos="5040"/>
+        </w:tabs>
+        <w:ind w:left="5040" w:hanging="360"/>
+      </w:pPr>
+      <w:rPr>
+        <w:rFonts w:ascii="Symbol" w:hAnsi="Symbol" w:hint="default"/>
+        <w:sz w:val="20"/>
+      </w:rPr>
+    </w:lvl>
+    <w:lvl w:ilvl="7" w:tentative="1">
+      <w:start w:val="1"/>
+      <w:numFmt w:val="bullet"/>
+      <w:lvlText w:val=""/>
+      <w:lvlJc w:val="left"/>
+      <w:pPr>
+        <w:tabs>
+          <w:tab w:val="num" w:pos="5760"/>
+        </w:tabs>
+        <w:ind w:left="5760" w:hanging="360"/>
+      </w:pPr>
+      <w:rPr>
+        <w:rFonts w:ascii="Symbol" w:hAnsi="Symbol" w:hint="default"/>
+        <w:sz w:val="20"/>
+      </w:rPr>
+    </w:lvl>
+    <w:lvl w:ilvl="8" w:tentative="1">
+      <w:start w:val="1"/>
+      <w:numFmt w:val="bullet"/>
+      <w:lvlText w:val=""/>
+      <w:lvlJc w:val="left"/>
+      <w:pPr>
+        <w:tabs>
+          <w:tab w:val="num" w:pos="6480"/>
+        </w:tabs>
+        <w:ind w:left="6480" w:hanging="360"/>
+      </w:pPr>
+      <w:rPr>
+        <w:rFonts w:ascii="Symbol" w:hAnsi="Symbol" w:hint="default"/>
+        <w:sz w:val="20"/>
+      </w:rPr>
+    </w:lvl>
+  </w:abstractNum>
+  <w:abstractNum w:abstractNumId="11" w15:restartNumberingAfterBreak="0">
     <w:nsid w:val="51D222AC"/>
     <w:multiLevelType w:val="multilevel"/>
     <w:tmpl w:val="B3E25296"/>
@@ -760,7 +3678,7 @@
       </w:rPr>
     </w:lvl>
   </w:abstractNum>
-  <w:abstractNum w:abstractNumId="3" w15:restartNumberingAfterBreak="0">
+  <w:abstractNum w:abstractNumId="12" w15:restartNumberingAfterBreak="0">
     <w:nsid w:val="533A324B"/>
     <w:multiLevelType w:val="multilevel"/>
     <w:tmpl w:val="56BCC45C"/>
@@ -909,7 +3827,716 @@
       </w:rPr>
     </w:lvl>
   </w:abstractNum>
-  <w:abstractNum w:abstractNumId="4" w15:restartNumberingAfterBreak="0">
+  <w:abstractNum w:abstractNumId="13" w15:restartNumberingAfterBreak="0">
+    <w:nsid w:val="540E6F18"/>
+    <w:multiLevelType w:val="multilevel"/>
+    <w:tmpl w:val="87DCA8E0"/>
+    <w:lvl w:ilvl="0">
+      <w:start w:val="1"/>
+      <w:numFmt w:val="bullet"/>
+      <w:lvlText w:val=""/>
+      <w:lvlJc w:val="left"/>
+      <w:pPr>
+        <w:tabs>
+          <w:tab w:val="num" w:pos="720"/>
+        </w:tabs>
+        <w:ind w:left="720" w:hanging="360"/>
+      </w:pPr>
+      <w:rPr>
+        <w:rFonts w:ascii="Symbol" w:hAnsi="Symbol" w:hint="default"/>
+        <w:sz w:val="20"/>
+      </w:rPr>
+    </w:lvl>
+    <w:lvl w:ilvl="1" w:tentative="1">
+      <w:start w:val="1"/>
+      <w:numFmt w:val="bullet"/>
+      <w:lvlText w:val=""/>
+      <w:lvlJc w:val="left"/>
+      <w:pPr>
+        <w:tabs>
+          <w:tab w:val="num" w:pos="1440"/>
+        </w:tabs>
+        <w:ind w:left="1440" w:hanging="360"/>
+      </w:pPr>
+      <w:rPr>
+        <w:rFonts w:ascii="Symbol" w:hAnsi="Symbol" w:hint="default"/>
+        <w:sz w:val="20"/>
+      </w:rPr>
+    </w:lvl>
+    <w:lvl w:ilvl="2" w:tentative="1">
+      <w:start w:val="1"/>
+      <w:numFmt w:val="bullet"/>
+      <w:lvlText w:val=""/>
+      <w:lvlJc w:val="left"/>
+      <w:pPr>
+        <w:tabs>
+          <w:tab w:val="num" w:pos="2160"/>
+        </w:tabs>
+        <w:ind w:left="2160" w:hanging="360"/>
+      </w:pPr>
+      <w:rPr>
+        <w:rFonts w:ascii="Symbol" w:hAnsi="Symbol" w:hint="default"/>
+        <w:sz w:val="20"/>
+      </w:rPr>
+    </w:lvl>
+    <w:lvl w:ilvl="3" w:tentative="1">
+      <w:start w:val="1"/>
+      <w:numFmt w:val="bullet"/>
+      <w:lvlText w:val=""/>
+      <w:lvlJc w:val="left"/>
+      <w:pPr>
+        <w:tabs>
+          <w:tab w:val="num" w:pos="2880"/>
+        </w:tabs>
+        <w:ind w:left="2880" w:hanging="360"/>
+      </w:pPr>
+      <w:rPr>
+        <w:rFonts w:ascii="Symbol" w:hAnsi="Symbol" w:hint="default"/>
+        <w:sz w:val="20"/>
+      </w:rPr>
+    </w:lvl>
+    <w:lvl w:ilvl="4" w:tentative="1">
+      <w:start w:val="1"/>
+      <w:numFmt w:val="bullet"/>
+      <w:lvlText w:val=""/>
+      <w:lvlJc w:val="left"/>
+      <w:pPr>
+        <w:tabs>
+          <w:tab w:val="num" w:pos="3600"/>
+        </w:tabs>
+        <w:ind w:left="3600" w:hanging="360"/>
+      </w:pPr>
+      <w:rPr>
+        <w:rFonts w:ascii="Symbol" w:hAnsi="Symbol" w:hint="default"/>
+        <w:sz w:val="20"/>
+      </w:rPr>
+    </w:lvl>
+    <w:lvl w:ilvl="5" w:tentative="1">
+      <w:start w:val="1"/>
+      <w:numFmt w:val="bullet"/>
+      <w:lvlText w:val=""/>
+      <w:lvlJc w:val="left"/>
+      <w:pPr>
+        <w:tabs>
+          <w:tab w:val="num" w:pos="4320"/>
+        </w:tabs>
+        <w:ind w:left="4320" w:hanging="360"/>
+      </w:pPr>
+      <w:rPr>
+        <w:rFonts w:ascii="Symbol" w:hAnsi="Symbol" w:hint="default"/>
+        <w:sz w:val="20"/>
+      </w:rPr>
+    </w:lvl>
+    <w:lvl w:ilvl="6" w:tentative="1">
+      <w:start w:val="1"/>
+      <w:numFmt w:val="bullet"/>
+      <w:lvlText w:val=""/>
+      <w:lvlJc w:val="left"/>
+      <w:pPr>
+        <w:tabs>
+          <w:tab w:val="num" w:pos="5040"/>
+        </w:tabs>
+        <w:ind w:left="5040" w:hanging="360"/>
+      </w:pPr>
+      <w:rPr>
+        <w:rFonts w:ascii="Symbol" w:hAnsi="Symbol" w:hint="default"/>
+        <w:sz w:val="20"/>
+      </w:rPr>
+    </w:lvl>
+    <w:lvl w:ilvl="7" w:tentative="1">
+      <w:start w:val="1"/>
+      <w:numFmt w:val="bullet"/>
+      <w:lvlText w:val=""/>
+      <w:lvlJc w:val="left"/>
+      <w:pPr>
+        <w:tabs>
+          <w:tab w:val="num" w:pos="5760"/>
+        </w:tabs>
+        <w:ind w:left="5760" w:hanging="360"/>
+      </w:pPr>
+      <w:rPr>
+        <w:rFonts w:ascii="Symbol" w:hAnsi="Symbol" w:hint="default"/>
+        <w:sz w:val="20"/>
+      </w:rPr>
+    </w:lvl>
+    <w:lvl w:ilvl="8" w:tentative="1">
+      <w:start w:val="1"/>
+      <w:numFmt w:val="bullet"/>
+      <w:lvlText w:val=""/>
+      <w:lvlJc w:val="left"/>
+      <w:pPr>
+        <w:tabs>
+          <w:tab w:val="num" w:pos="6480"/>
+        </w:tabs>
+        <w:ind w:left="6480" w:hanging="360"/>
+      </w:pPr>
+      <w:rPr>
+        <w:rFonts w:ascii="Symbol" w:hAnsi="Symbol" w:hint="default"/>
+        <w:sz w:val="20"/>
+      </w:rPr>
+    </w:lvl>
+  </w:abstractNum>
+  <w:abstractNum w:abstractNumId="14" w15:restartNumberingAfterBreak="0">
+    <w:nsid w:val="5BB16C30"/>
+    <w:multiLevelType w:val="multilevel"/>
+    <w:tmpl w:val="6DC0F07A"/>
+    <w:lvl w:ilvl="0">
+      <w:start w:val="1"/>
+      <w:numFmt w:val="bullet"/>
+      <w:lvlText w:val=""/>
+      <w:lvlJc w:val="left"/>
+      <w:pPr>
+        <w:tabs>
+          <w:tab w:val="num" w:pos="720"/>
+        </w:tabs>
+        <w:ind w:left="720" w:hanging="360"/>
+      </w:pPr>
+      <w:rPr>
+        <w:rFonts w:ascii="Symbol" w:hAnsi="Symbol" w:hint="default"/>
+        <w:sz w:val="20"/>
+      </w:rPr>
+    </w:lvl>
+    <w:lvl w:ilvl="1" w:tentative="1">
+      <w:start w:val="1"/>
+      <w:numFmt w:val="bullet"/>
+      <w:lvlText w:val="o"/>
+      <w:lvlJc w:val="left"/>
+      <w:pPr>
+        <w:tabs>
+          <w:tab w:val="num" w:pos="1440"/>
+        </w:tabs>
+        <w:ind w:left="1440" w:hanging="360"/>
+      </w:pPr>
+      <w:rPr>
+        <w:rFonts w:ascii="Courier New" w:hAnsi="Courier New" w:hint="default"/>
+        <w:sz w:val="20"/>
+      </w:rPr>
+    </w:lvl>
+    <w:lvl w:ilvl="2" w:tentative="1">
+      <w:start w:val="1"/>
+      <w:numFmt w:val="bullet"/>
+      <w:lvlText w:val=""/>
+      <w:lvlJc w:val="left"/>
+      <w:pPr>
+        <w:tabs>
+          <w:tab w:val="num" w:pos="2160"/>
+        </w:tabs>
+        <w:ind w:left="2160" w:hanging="360"/>
+      </w:pPr>
+      <w:rPr>
+        <w:rFonts w:ascii="Wingdings" w:hAnsi="Wingdings" w:hint="default"/>
+        <w:sz w:val="20"/>
+      </w:rPr>
+    </w:lvl>
+    <w:lvl w:ilvl="3" w:tentative="1">
+      <w:start w:val="1"/>
+      <w:numFmt w:val="bullet"/>
+      <w:lvlText w:val=""/>
+      <w:lvlJc w:val="left"/>
+      <w:pPr>
+        <w:tabs>
+          <w:tab w:val="num" w:pos="2880"/>
+        </w:tabs>
+        <w:ind w:left="2880" w:hanging="360"/>
+      </w:pPr>
+      <w:rPr>
+        <w:rFonts w:ascii="Wingdings" w:hAnsi="Wingdings" w:hint="default"/>
+        <w:sz w:val="20"/>
+      </w:rPr>
+    </w:lvl>
+    <w:lvl w:ilvl="4" w:tentative="1">
+      <w:start w:val="1"/>
+      <w:numFmt w:val="bullet"/>
+      <w:lvlText w:val=""/>
+      <w:lvlJc w:val="left"/>
+      <w:pPr>
+        <w:tabs>
+          <w:tab w:val="num" w:pos="3600"/>
+        </w:tabs>
+        <w:ind w:left="3600" w:hanging="360"/>
+      </w:pPr>
+      <w:rPr>
+        <w:rFonts w:ascii="Wingdings" w:hAnsi="Wingdings" w:hint="default"/>
+        <w:sz w:val="20"/>
+      </w:rPr>
+    </w:lvl>
+    <w:lvl w:ilvl="5" w:tentative="1">
+      <w:start w:val="1"/>
+      <w:numFmt w:val="bullet"/>
+      <w:lvlText w:val=""/>
+      <w:lvlJc w:val="left"/>
+      <w:pPr>
+        <w:tabs>
+          <w:tab w:val="num" w:pos="4320"/>
+        </w:tabs>
+        <w:ind w:left="4320" w:hanging="360"/>
+      </w:pPr>
+      <w:rPr>
+        <w:rFonts w:ascii="Wingdings" w:hAnsi="Wingdings" w:hint="default"/>
+        <w:sz w:val="20"/>
+      </w:rPr>
+    </w:lvl>
+    <w:lvl w:ilvl="6" w:tentative="1">
+      <w:start w:val="1"/>
+      <w:numFmt w:val="bullet"/>
+      <w:lvlText w:val=""/>
+      <w:lvlJc w:val="left"/>
+      <w:pPr>
+        <w:tabs>
+          <w:tab w:val="num" w:pos="5040"/>
+        </w:tabs>
+        <w:ind w:left="5040" w:hanging="360"/>
+      </w:pPr>
+      <w:rPr>
+        <w:rFonts w:ascii="Wingdings" w:hAnsi="Wingdings" w:hint="default"/>
+        <w:sz w:val="20"/>
+      </w:rPr>
+    </w:lvl>
+    <w:lvl w:ilvl="7" w:tentative="1">
+      <w:start w:val="1"/>
+      <w:numFmt w:val="bullet"/>
+      <w:lvlText w:val=""/>
+      <w:lvlJc w:val="left"/>
+      <w:pPr>
+        <w:tabs>
+          <w:tab w:val="num" w:pos="5760"/>
+        </w:tabs>
+        <w:ind w:left="5760" w:hanging="360"/>
+      </w:pPr>
+      <w:rPr>
+        <w:rFonts w:ascii="Wingdings" w:hAnsi="Wingdings" w:hint="default"/>
+        <w:sz w:val="20"/>
+      </w:rPr>
+    </w:lvl>
+    <w:lvl w:ilvl="8" w:tentative="1">
+      <w:start w:val="1"/>
+      <w:numFmt w:val="bullet"/>
+      <w:lvlText w:val=""/>
+      <w:lvlJc w:val="left"/>
+      <w:pPr>
+        <w:tabs>
+          <w:tab w:val="num" w:pos="6480"/>
+        </w:tabs>
+        <w:ind w:left="6480" w:hanging="360"/>
+      </w:pPr>
+      <w:rPr>
+        <w:rFonts w:ascii="Wingdings" w:hAnsi="Wingdings" w:hint="default"/>
+        <w:sz w:val="20"/>
+      </w:rPr>
+    </w:lvl>
+  </w:abstractNum>
+  <w:abstractNum w:abstractNumId="15" w15:restartNumberingAfterBreak="0">
+    <w:nsid w:val="61110AC8"/>
+    <w:multiLevelType w:val="multilevel"/>
+    <w:tmpl w:val="92320496"/>
+    <w:lvl w:ilvl="0">
+      <w:start w:val="1"/>
+      <w:numFmt w:val="bullet"/>
+      <w:lvlText w:val=""/>
+      <w:lvlJc w:val="left"/>
+      <w:pPr>
+        <w:tabs>
+          <w:tab w:val="num" w:pos="720"/>
+        </w:tabs>
+        <w:ind w:left="720" w:hanging="360"/>
+      </w:pPr>
+      <w:rPr>
+        <w:rFonts w:ascii="Symbol" w:hAnsi="Symbol" w:hint="default"/>
+        <w:sz w:val="20"/>
+      </w:rPr>
+    </w:lvl>
+    <w:lvl w:ilvl="1" w:tentative="1">
+      <w:start w:val="1"/>
+      <w:numFmt w:val="bullet"/>
+      <w:lvlText w:val="o"/>
+      <w:lvlJc w:val="left"/>
+      <w:pPr>
+        <w:tabs>
+          <w:tab w:val="num" w:pos="1440"/>
+        </w:tabs>
+        <w:ind w:left="1440" w:hanging="360"/>
+      </w:pPr>
+      <w:rPr>
+        <w:rFonts w:ascii="Courier New" w:hAnsi="Courier New" w:hint="default"/>
+        <w:sz w:val="20"/>
+      </w:rPr>
+    </w:lvl>
+    <w:lvl w:ilvl="2" w:tentative="1">
+      <w:start w:val="1"/>
+      <w:numFmt w:val="bullet"/>
+      <w:lvlText w:val=""/>
+      <w:lvlJc w:val="left"/>
+      <w:pPr>
+        <w:tabs>
+          <w:tab w:val="num" w:pos="2160"/>
+        </w:tabs>
+        <w:ind w:left="2160" w:hanging="360"/>
+      </w:pPr>
+      <w:rPr>
+        <w:rFonts w:ascii="Wingdings" w:hAnsi="Wingdings" w:hint="default"/>
+        <w:sz w:val="20"/>
+      </w:rPr>
+    </w:lvl>
+    <w:lvl w:ilvl="3" w:tentative="1">
+      <w:start w:val="1"/>
+      <w:numFmt w:val="bullet"/>
+      <w:lvlText w:val=""/>
+      <w:lvlJc w:val="left"/>
+      <w:pPr>
+        <w:tabs>
+          <w:tab w:val="num" w:pos="2880"/>
+        </w:tabs>
+        <w:ind w:left="2880" w:hanging="360"/>
+      </w:pPr>
+      <w:rPr>
+        <w:rFonts w:ascii="Wingdings" w:hAnsi="Wingdings" w:hint="default"/>
+        <w:sz w:val="20"/>
+      </w:rPr>
+    </w:lvl>
+    <w:lvl w:ilvl="4" w:tentative="1">
+      <w:start w:val="1"/>
+      <w:numFmt w:val="bullet"/>
+      <w:lvlText w:val=""/>
+      <w:lvlJc w:val="left"/>
+      <w:pPr>
+        <w:tabs>
+          <w:tab w:val="num" w:pos="3600"/>
+        </w:tabs>
+        <w:ind w:left="3600" w:hanging="360"/>
+      </w:pPr>
+      <w:rPr>
+        <w:rFonts w:ascii="Wingdings" w:hAnsi="Wingdings" w:hint="default"/>
+        <w:sz w:val="20"/>
+      </w:rPr>
+    </w:lvl>
+    <w:lvl w:ilvl="5" w:tentative="1">
+      <w:start w:val="1"/>
+      <w:numFmt w:val="bullet"/>
+      <w:lvlText w:val=""/>
+      <w:lvlJc w:val="left"/>
+      <w:pPr>
+        <w:tabs>
+          <w:tab w:val="num" w:pos="4320"/>
+        </w:tabs>
+        <w:ind w:left="4320" w:hanging="360"/>
+      </w:pPr>
+      <w:rPr>
+        <w:rFonts w:ascii="Wingdings" w:hAnsi="Wingdings" w:hint="default"/>
+        <w:sz w:val="20"/>
+      </w:rPr>
+    </w:lvl>
+    <w:lvl w:ilvl="6" w:tentative="1">
+      <w:start w:val="1"/>
+      <w:numFmt w:val="bullet"/>
+      <w:lvlText w:val=""/>
+      <w:lvlJc w:val="left"/>
+      <w:pPr>
+        <w:tabs>
+          <w:tab w:val="num" w:pos="5040"/>
+        </w:tabs>
+        <w:ind w:left="5040" w:hanging="360"/>
+      </w:pPr>
+      <w:rPr>
+        <w:rFonts w:ascii="Wingdings" w:hAnsi="Wingdings" w:hint="default"/>
+        <w:sz w:val="20"/>
+      </w:rPr>
+    </w:lvl>
+    <w:lvl w:ilvl="7" w:tentative="1">
+      <w:start w:val="1"/>
+      <w:numFmt w:val="bullet"/>
+      <w:lvlText w:val=""/>
+      <w:lvlJc w:val="left"/>
+      <w:pPr>
+        <w:tabs>
+          <w:tab w:val="num" w:pos="5760"/>
+        </w:tabs>
+        <w:ind w:left="5760" w:hanging="360"/>
+      </w:pPr>
+      <w:rPr>
+        <w:rFonts w:ascii="Wingdings" w:hAnsi="Wingdings" w:hint="default"/>
+        <w:sz w:val="20"/>
+      </w:rPr>
+    </w:lvl>
+    <w:lvl w:ilvl="8" w:tentative="1">
+      <w:start w:val="1"/>
+      <w:numFmt w:val="bullet"/>
+      <w:lvlText w:val=""/>
+      <w:lvlJc w:val="left"/>
+      <w:pPr>
+        <w:tabs>
+          <w:tab w:val="num" w:pos="6480"/>
+        </w:tabs>
+        <w:ind w:left="6480" w:hanging="360"/>
+      </w:pPr>
+      <w:rPr>
+        <w:rFonts w:ascii="Wingdings" w:hAnsi="Wingdings" w:hint="default"/>
+        <w:sz w:val="20"/>
+      </w:rPr>
+    </w:lvl>
+  </w:abstractNum>
+  <w:abstractNum w:abstractNumId="16" w15:restartNumberingAfterBreak="0">
+    <w:nsid w:val="623D0706"/>
+    <w:multiLevelType w:val="multilevel"/>
+    <w:tmpl w:val="3116859E"/>
+    <w:lvl w:ilvl="0">
+      <w:start w:val="1"/>
+      <w:numFmt w:val="bullet"/>
+      <w:lvlText w:val=""/>
+      <w:lvlJc w:val="left"/>
+      <w:pPr>
+        <w:tabs>
+          <w:tab w:val="num" w:pos="720"/>
+        </w:tabs>
+        <w:ind w:left="720" w:hanging="360"/>
+      </w:pPr>
+      <w:rPr>
+        <w:rFonts w:ascii="Symbol" w:hAnsi="Symbol" w:hint="default"/>
+        <w:sz w:val="20"/>
+      </w:rPr>
+    </w:lvl>
+    <w:lvl w:ilvl="1" w:tentative="1">
+      <w:start w:val="1"/>
+      <w:numFmt w:val="bullet"/>
+      <w:lvlText w:val="o"/>
+      <w:lvlJc w:val="left"/>
+      <w:pPr>
+        <w:tabs>
+          <w:tab w:val="num" w:pos="1440"/>
+        </w:tabs>
+        <w:ind w:left="1440" w:hanging="360"/>
+      </w:pPr>
+      <w:rPr>
+        <w:rFonts w:ascii="Courier New" w:hAnsi="Courier New" w:hint="default"/>
+        <w:sz w:val="20"/>
+      </w:rPr>
+    </w:lvl>
+    <w:lvl w:ilvl="2" w:tentative="1">
+      <w:start w:val="1"/>
+      <w:numFmt w:val="bullet"/>
+      <w:lvlText w:val=""/>
+      <w:lvlJc w:val="left"/>
+      <w:pPr>
+        <w:tabs>
+          <w:tab w:val="num" w:pos="2160"/>
+        </w:tabs>
+        <w:ind w:left="2160" w:hanging="360"/>
+      </w:pPr>
+      <w:rPr>
+        <w:rFonts w:ascii="Wingdings" w:hAnsi="Wingdings" w:hint="default"/>
+        <w:sz w:val="20"/>
+      </w:rPr>
+    </w:lvl>
+    <w:lvl w:ilvl="3" w:tentative="1">
+      <w:start w:val="1"/>
+      <w:numFmt w:val="bullet"/>
+      <w:lvlText w:val=""/>
+      <w:lvlJc w:val="left"/>
+      <w:pPr>
+        <w:tabs>
+          <w:tab w:val="num" w:pos="2880"/>
+        </w:tabs>
+        <w:ind w:left="2880" w:hanging="360"/>
+      </w:pPr>
+      <w:rPr>
+        <w:rFonts w:ascii="Wingdings" w:hAnsi="Wingdings" w:hint="default"/>
+        <w:sz w:val="20"/>
+      </w:rPr>
+    </w:lvl>
+    <w:lvl w:ilvl="4" w:tentative="1">
+      <w:start w:val="1"/>
+      <w:numFmt w:val="bullet"/>
+      <w:lvlText w:val=""/>
+      <w:lvlJc w:val="left"/>
+      <w:pPr>
+        <w:tabs>
+          <w:tab w:val="num" w:pos="3600"/>
+        </w:tabs>
+        <w:ind w:left="3600" w:hanging="360"/>
+      </w:pPr>
+      <w:rPr>
+        <w:rFonts w:ascii="Wingdings" w:hAnsi="Wingdings" w:hint="default"/>
+        <w:sz w:val="20"/>
+      </w:rPr>
+    </w:lvl>
+    <w:lvl w:ilvl="5" w:tentative="1">
+      <w:start w:val="1"/>
+      <w:numFmt w:val="bullet"/>
+      <w:lvlText w:val=""/>
+      <w:lvlJc w:val="left"/>
+      <w:pPr>
+        <w:tabs>
+          <w:tab w:val="num" w:pos="4320"/>
+        </w:tabs>
+        <w:ind w:left="4320" w:hanging="360"/>
+      </w:pPr>
+      <w:rPr>
+        <w:rFonts w:ascii="Wingdings" w:hAnsi="Wingdings" w:hint="default"/>
+        <w:sz w:val="20"/>
+      </w:rPr>
+    </w:lvl>
+    <w:lvl w:ilvl="6" w:tentative="1">
+      <w:start w:val="1"/>
+      <w:numFmt w:val="bullet"/>
+      <w:lvlText w:val=""/>
+      <w:lvlJc w:val="left"/>
+      <w:pPr>
+        <w:tabs>
+          <w:tab w:val="num" w:pos="5040"/>
+        </w:tabs>
+        <w:ind w:left="5040" w:hanging="360"/>
+      </w:pPr>
+      <w:rPr>
+        <w:rFonts w:ascii="Wingdings" w:hAnsi="Wingdings" w:hint="default"/>
+        <w:sz w:val="20"/>
+      </w:rPr>
+    </w:lvl>
+    <w:lvl w:ilvl="7" w:tentative="1">
+      <w:start w:val="1"/>
+      <w:numFmt w:val="bullet"/>
+      <w:lvlText w:val=""/>
+      <w:lvlJc w:val="left"/>
+      <w:pPr>
+        <w:tabs>
+          <w:tab w:val="num" w:pos="5760"/>
+        </w:tabs>
+        <w:ind w:left="5760" w:hanging="360"/>
+      </w:pPr>
+      <w:rPr>
+        <w:rFonts w:ascii="Wingdings" w:hAnsi="Wingdings" w:hint="default"/>
+        <w:sz w:val="20"/>
+      </w:rPr>
+    </w:lvl>
+    <w:lvl w:ilvl="8" w:tentative="1">
+      <w:start w:val="1"/>
+      <w:numFmt w:val="bullet"/>
+      <w:lvlText w:val=""/>
+      <w:lvlJc w:val="left"/>
+      <w:pPr>
+        <w:tabs>
+          <w:tab w:val="num" w:pos="6480"/>
+        </w:tabs>
+        <w:ind w:left="6480" w:hanging="360"/>
+      </w:pPr>
+      <w:rPr>
+        <w:rFonts w:ascii="Wingdings" w:hAnsi="Wingdings" w:hint="default"/>
+        <w:sz w:val="20"/>
+      </w:rPr>
+    </w:lvl>
+  </w:abstractNum>
+  <w:abstractNum w:abstractNumId="17" w15:restartNumberingAfterBreak="0">
+    <w:nsid w:val="69E65E00"/>
+    <w:multiLevelType w:val="multilevel"/>
+    <w:tmpl w:val="04E893C4"/>
+    <w:lvl w:ilvl="0">
+      <w:start w:val="1"/>
+      <w:numFmt w:val="decimal"/>
+      <w:lvlText w:val="%1."/>
+      <w:lvlJc w:val="left"/>
+      <w:pPr>
+        <w:tabs>
+          <w:tab w:val="num" w:pos="720"/>
+        </w:tabs>
+        <w:ind w:left="720" w:hanging="360"/>
+      </w:pPr>
+    </w:lvl>
+    <w:lvl w:ilvl="1" w:tentative="1">
+      <w:start w:val="1"/>
+      <w:numFmt w:val="decimal"/>
+      <w:lvlText w:val="%2."/>
+      <w:lvlJc w:val="left"/>
+      <w:pPr>
+        <w:tabs>
+          <w:tab w:val="num" w:pos="1440"/>
+        </w:tabs>
+        <w:ind w:left="1440" w:hanging="360"/>
+      </w:pPr>
+    </w:lvl>
+    <w:lvl w:ilvl="2" w:tentative="1">
+      <w:start w:val="1"/>
+      <w:numFmt w:val="decimal"/>
+      <w:lvlText w:val="%3."/>
+      <w:lvlJc w:val="left"/>
+      <w:pPr>
+        <w:tabs>
+          <w:tab w:val="num" w:pos="2160"/>
+        </w:tabs>
+        <w:ind w:left="2160" w:hanging="360"/>
+      </w:pPr>
+    </w:lvl>
+    <w:lvl w:ilvl="3" w:tentative="1">
+      <w:start w:val="1"/>
+      <w:numFmt w:val="decimal"/>
+      <w:lvlText w:val="%4."/>
+      <w:lvlJc w:val="left"/>
+      <w:pPr>
+        <w:tabs>
+          <w:tab w:val="num" w:pos="2880"/>
+        </w:tabs>
+        <w:ind w:left="2880" w:hanging="360"/>
+      </w:pPr>
+    </w:lvl>
+    <w:lvl w:ilvl="4" w:tentative="1">
+      <w:start w:val="1"/>
+      <w:numFmt w:val="decimal"/>
+      <w:lvlText w:val="%5."/>
+      <w:lvlJc w:val="left"/>
+      <w:pPr>
+        <w:tabs>
+          <w:tab w:val="num" w:pos="3600"/>
+        </w:tabs>
+        <w:ind w:left="3600" w:hanging="360"/>
+      </w:pPr>
+    </w:lvl>
+    <w:lvl w:ilvl="5" w:tentative="1">
+      <w:start w:val="1"/>
+      <w:numFmt w:val="decimal"/>
+      <w:lvlText w:val="%6."/>
+      <w:lvlJc w:val="left"/>
+      <w:pPr>
+        <w:tabs>
+          <w:tab w:val="num" w:pos="4320"/>
+        </w:tabs>
+        <w:ind w:left="4320" w:hanging="360"/>
+      </w:pPr>
+    </w:lvl>
+    <w:lvl w:ilvl="6" w:tentative="1">
+      <w:start w:val="1"/>
+      <w:numFmt w:val="decimal"/>
+      <w:lvlText w:val="%7."/>
+      <w:lvlJc w:val="left"/>
+      <w:pPr>
+        <w:tabs>
+          <w:tab w:val="num" w:pos="5040"/>
+        </w:tabs>
+        <w:ind w:left="5040" w:hanging="360"/>
+      </w:pPr>
+    </w:lvl>
+    <w:lvl w:ilvl="7" w:tentative="1">
+      <w:start w:val="1"/>
+      <w:numFmt w:val="decimal"/>
+      <w:lvlText w:val="%8."/>
+      <w:lvlJc w:val="left"/>
+      <w:pPr>
+        <w:tabs>
+          <w:tab w:val="num" w:pos="5760"/>
+        </w:tabs>
+        <w:ind w:left="5760" w:hanging="360"/>
+      </w:pPr>
+    </w:lvl>
+    <w:lvl w:ilvl="8" w:tentative="1">
+      <w:start w:val="1"/>
+      <w:numFmt w:val="decimal"/>
+      <w:lvlText w:val="%9."/>
+      <w:lvlJc w:val="left"/>
+      <w:pPr>
+        <w:tabs>
+          <w:tab w:val="num" w:pos="6480"/>
+        </w:tabs>
+        <w:ind w:left="6480" w:hanging="360"/>
+      </w:pPr>
+    </w:lvl>
+  </w:abstractNum>
+  <w:abstractNum w:abstractNumId="18" w15:restartNumberingAfterBreak="0">
     <w:nsid w:val="6CF83EE6"/>
     <w:multiLevelType w:val="multilevel"/>
     <w:tmpl w:val="70AA93B2"/>
@@ -1058,20 +4685,330 @@
       </w:rPr>
     </w:lvl>
   </w:abstractNum>
+  <w:abstractNum w:abstractNumId="19" w15:restartNumberingAfterBreak="0">
+    <w:nsid w:val="758A781F"/>
+    <w:multiLevelType w:val="multilevel"/>
+    <w:tmpl w:val="2E141854"/>
+    <w:lvl w:ilvl="0">
+      <w:start w:val="1"/>
+      <w:numFmt w:val="bullet"/>
+      <w:lvlText w:val=""/>
+      <w:lvlJc w:val="left"/>
+      <w:pPr>
+        <w:tabs>
+          <w:tab w:val="num" w:pos="720"/>
+        </w:tabs>
+        <w:ind w:left="720" w:hanging="360"/>
+      </w:pPr>
+      <w:rPr>
+        <w:rFonts w:ascii="Symbol" w:hAnsi="Symbol" w:hint="default"/>
+        <w:sz w:val="20"/>
+      </w:rPr>
+    </w:lvl>
+    <w:lvl w:ilvl="1" w:tentative="1">
+      <w:start w:val="1"/>
+      <w:numFmt w:val="bullet"/>
+      <w:lvlText w:val=""/>
+      <w:lvlJc w:val="left"/>
+      <w:pPr>
+        <w:tabs>
+          <w:tab w:val="num" w:pos="1440"/>
+        </w:tabs>
+        <w:ind w:left="1440" w:hanging="360"/>
+      </w:pPr>
+      <w:rPr>
+        <w:rFonts w:ascii="Symbol" w:hAnsi="Symbol" w:hint="default"/>
+        <w:sz w:val="20"/>
+      </w:rPr>
+    </w:lvl>
+    <w:lvl w:ilvl="2" w:tentative="1">
+      <w:start w:val="1"/>
+      <w:numFmt w:val="bullet"/>
+      <w:lvlText w:val=""/>
+      <w:lvlJc w:val="left"/>
+      <w:pPr>
+        <w:tabs>
+          <w:tab w:val="num" w:pos="2160"/>
+        </w:tabs>
+        <w:ind w:left="2160" w:hanging="360"/>
+      </w:pPr>
+      <w:rPr>
+        <w:rFonts w:ascii="Symbol" w:hAnsi="Symbol" w:hint="default"/>
+        <w:sz w:val="20"/>
+      </w:rPr>
+    </w:lvl>
+    <w:lvl w:ilvl="3" w:tentative="1">
+      <w:start w:val="1"/>
+      <w:numFmt w:val="bullet"/>
+      <w:lvlText w:val=""/>
+      <w:lvlJc w:val="left"/>
+      <w:pPr>
+        <w:tabs>
+          <w:tab w:val="num" w:pos="2880"/>
+        </w:tabs>
+        <w:ind w:left="2880" w:hanging="360"/>
+      </w:pPr>
+      <w:rPr>
+        <w:rFonts w:ascii="Symbol" w:hAnsi="Symbol" w:hint="default"/>
+        <w:sz w:val="20"/>
+      </w:rPr>
+    </w:lvl>
+    <w:lvl w:ilvl="4" w:tentative="1">
+      <w:start w:val="1"/>
+      <w:numFmt w:val="bullet"/>
+      <w:lvlText w:val=""/>
+      <w:lvlJc w:val="left"/>
+      <w:pPr>
+        <w:tabs>
+          <w:tab w:val="num" w:pos="3600"/>
+        </w:tabs>
+        <w:ind w:left="3600" w:hanging="360"/>
+      </w:pPr>
+      <w:rPr>
+        <w:rFonts w:ascii="Symbol" w:hAnsi="Symbol" w:hint="default"/>
+        <w:sz w:val="20"/>
+      </w:rPr>
+    </w:lvl>
+    <w:lvl w:ilvl="5" w:tentative="1">
+      <w:start w:val="1"/>
+      <w:numFmt w:val="bullet"/>
+      <w:lvlText w:val=""/>
+      <w:lvlJc w:val="left"/>
+      <w:pPr>
+        <w:tabs>
+          <w:tab w:val="num" w:pos="4320"/>
+        </w:tabs>
+        <w:ind w:left="4320" w:hanging="360"/>
+      </w:pPr>
+      <w:rPr>
+        <w:rFonts w:ascii="Symbol" w:hAnsi="Symbol" w:hint="default"/>
+        <w:sz w:val="20"/>
+      </w:rPr>
+    </w:lvl>
+    <w:lvl w:ilvl="6" w:tentative="1">
+      <w:start w:val="1"/>
+      <w:numFmt w:val="bullet"/>
+      <w:lvlText w:val=""/>
+      <w:lvlJc w:val="left"/>
+      <w:pPr>
+        <w:tabs>
+          <w:tab w:val="num" w:pos="5040"/>
+        </w:tabs>
+        <w:ind w:left="5040" w:hanging="360"/>
+      </w:pPr>
+      <w:rPr>
+        <w:rFonts w:ascii="Symbol" w:hAnsi="Symbol" w:hint="default"/>
+        <w:sz w:val="20"/>
+      </w:rPr>
+    </w:lvl>
+    <w:lvl w:ilvl="7" w:tentative="1">
+      <w:start w:val="1"/>
+      <w:numFmt w:val="bullet"/>
+      <w:lvlText w:val=""/>
+      <w:lvlJc w:val="left"/>
+      <w:pPr>
+        <w:tabs>
+          <w:tab w:val="num" w:pos="5760"/>
+        </w:tabs>
+        <w:ind w:left="5760" w:hanging="360"/>
+      </w:pPr>
+      <w:rPr>
+        <w:rFonts w:ascii="Symbol" w:hAnsi="Symbol" w:hint="default"/>
+        <w:sz w:val="20"/>
+      </w:rPr>
+    </w:lvl>
+    <w:lvl w:ilvl="8" w:tentative="1">
+      <w:start w:val="1"/>
+      <w:numFmt w:val="bullet"/>
+      <w:lvlText w:val=""/>
+      <w:lvlJc w:val="left"/>
+      <w:pPr>
+        <w:tabs>
+          <w:tab w:val="num" w:pos="6480"/>
+        </w:tabs>
+        <w:ind w:left="6480" w:hanging="360"/>
+      </w:pPr>
+      <w:rPr>
+        <w:rFonts w:ascii="Symbol" w:hAnsi="Symbol" w:hint="default"/>
+        <w:sz w:val="20"/>
+      </w:rPr>
+    </w:lvl>
+  </w:abstractNum>
+  <w:abstractNum w:abstractNumId="20" w15:restartNumberingAfterBreak="0">
+    <w:nsid w:val="7FBB780C"/>
+    <w:multiLevelType w:val="multilevel"/>
+    <w:tmpl w:val="902ECCD2"/>
+    <w:lvl w:ilvl="0">
+      <w:start w:val="1"/>
+      <w:numFmt w:val="decimal"/>
+      <w:lvlText w:val="%1."/>
+      <w:lvlJc w:val="left"/>
+      <w:pPr>
+        <w:tabs>
+          <w:tab w:val="num" w:pos="720"/>
+        </w:tabs>
+        <w:ind w:left="720" w:hanging="360"/>
+      </w:pPr>
+    </w:lvl>
+    <w:lvl w:ilvl="1" w:tentative="1">
+      <w:start w:val="1"/>
+      <w:numFmt w:val="decimal"/>
+      <w:lvlText w:val="%2."/>
+      <w:lvlJc w:val="left"/>
+      <w:pPr>
+        <w:tabs>
+          <w:tab w:val="num" w:pos="1440"/>
+        </w:tabs>
+        <w:ind w:left="1440" w:hanging="360"/>
+      </w:pPr>
+    </w:lvl>
+    <w:lvl w:ilvl="2" w:tentative="1">
+      <w:start w:val="1"/>
+      <w:numFmt w:val="decimal"/>
+      <w:lvlText w:val="%3."/>
+      <w:lvlJc w:val="left"/>
+      <w:pPr>
+        <w:tabs>
+          <w:tab w:val="num" w:pos="2160"/>
+        </w:tabs>
+        <w:ind w:left="2160" w:hanging="360"/>
+      </w:pPr>
+    </w:lvl>
+    <w:lvl w:ilvl="3" w:tentative="1">
+      <w:start w:val="1"/>
+      <w:numFmt w:val="decimal"/>
+      <w:lvlText w:val="%4."/>
+      <w:lvlJc w:val="left"/>
+      <w:pPr>
+        <w:tabs>
+          <w:tab w:val="num" w:pos="2880"/>
+        </w:tabs>
+        <w:ind w:left="2880" w:hanging="360"/>
+      </w:pPr>
+    </w:lvl>
+    <w:lvl w:ilvl="4" w:tentative="1">
+      <w:start w:val="1"/>
+      <w:numFmt w:val="decimal"/>
+      <w:lvlText w:val="%5."/>
+      <w:lvlJc w:val="left"/>
+      <w:pPr>
+        <w:tabs>
+          <w:tab w:val="num" w:pos="3600"/>
+        </w:tabs>
+        <w:ind w:left="3600" w:hanging="360"/>
+      </w:pPr>
+    </w:lvl>
+    <w:lvl w:ilvl="5" w:tentative="1">
+      <w:start w:val="1"/>
+      <w:numFmt w:val="decimal"/>
+      <w:lvlText w:val="%6."/>
+      <w:lvlJc w:val="left"/>
+      <w:pPr>
+        <w:tabs>
+          <w:tab w:val="num" w:pos="4320"/>
+        </w:tabs>
+        <w:ind w:left="4320" w:hanging="360"/>
+      </w:pPr>
+    </w:lvl>
+    <w:lvl w:ilvl="6" w:tentative="1">
+      <w:start w:val="1"/>
+      <w:numFmt w:val="decimal"/>
+      <w:lvlText w:val="%7."/>
+      <w:lvlJc w:val="left"/>
+      <w:pPr>
+        <w:tabs>
+          <w:tab w:val="num" w:pos="5040"/>
+        </w:tabs>
+        <w:ind w:left="5040" w:hanging="360"/>
+      </w:pPr>
+    </w:lvl>
+    <w:lvl w:ilvl="7" w:tentative="1">
+      <w:start w:val="1"/>
+      <w:numFmt w:val="decimal"/>
+      <w:lvlText w:val="%8."/>
+      <w:lvlJc w:val="left"/>
+      <w:pPr>
+        <w:tabs>
+          <w:tab w:val="num" w:pos="5760"/>
+        </w:tabs>
+        <w:ind w:left="5760" w:hanging="360"/>
+      </w:pPr>
+    </w:lvl>
+    <w:lvl w:ilvl="8" w:tentative="1">
+      <w:start w:val="1"/>
+      <w:numFmt w:val="decimal"/>
+      <w:lvlText w:val="%9."/>
+      <w:lvlJc w:val="left"/>
+      <w:pPr>
+        <w:tabs>
+          <w:tab w:val="num" w:pos="6480"/>
+        </w:tabs>
+        <w:ind w:left="6480" w:hanging="360"/>
+      </w:pPr>
+    </w:lvl>
+  </w:abstractNum>
   <w:num w:numId="1" w16cid:durableId="1961371284">
-    <w:abstractNumId w:val="1"/>
+    <w:abstractNumId w:val="4"/>
   </w:num>
   <w:num w:numId="2" w16cid:durableId="1367027804">
-    <w:abstractNumId w:val="4"/>
+    <w:abstractNumId w:val="18"/>
   </w:num>
   <w:num w:numId="3" w16cid:durableId="1668631311">
     <w:abstractNumId w:val="0"/>
   </w:num>
   <w:num w:numId="4" w16cid:durableId="1732652887">
+    <w:abstractNumId w:val="11"/>
+  </w:num>
+  <w:num w:numId="5" w16cid:durableId="956135389">
+    <w:abstractNumId w:val="12"/>
+  </w:num>
+  <w:num w:numId="6" w16cid:durableId="1789198818">
+    <w:abstractNumId w:val="5"/>
+  </w:num>
+  <w:num w:numId="7" w16cid:durableId="269972398">
+    <w:abstractNumId w:val="14"/>
+  </w:num>
+  <w:num w:numId="8" w16cid:durableId="817572598">
+    <w:abstractNumId w:val="3"/>
+  </w:num>
+  <w:num w:numId="9" w16cid:durableId="670715461">
+    <w:abstractNumId w:val="15"/>
+  </w:num>
+  <w:num w:numId="10" w16cid:durableId="1276332657">
+    <w:abstractNumId w:val="16"/>
+  </w:num>
+  <w:num w:numId="11" w16cid:durableId="1085541468">
+    <w:abstractNumId w:val="1"/>
+  </w:num>
+  <w:num w:numId="12" w16cid:durableId="729813302">
+    <w:abstractNumId w:val="17"/>
+  </w:num>
+  <w:num w:numId="13" w16cid:durableId="219287181">
+    <w:abstractNumId w:val="20"/>
+  </w:num>
+  <w:num w:numId="14" w16cid:durableId="1478569081">
+    <w:abstractNumId w:val="19"/>
+  </w:num>
+  <w:num w:numId="15" w16cid:durableId="1784617126">
+    <w:abstractNumId w:val="8"/>
+  </w:num>
+  <w:num w:numId="16" w16cid:durableId="488444713">
+    <w:abstractNumId w:val="10"/>
+  </w:num>
+  <w:num w:numId="17" w16cid:durableId="1473865838">
+    <w:abstractNumId w:val="7"/>
+  </w:num>
+  <w:num w:numId="18" w16cid:durableId="1131827971">
     <w:abstractNumId w:val="2"/>
   </w:num>
-  <w:num w:numId="5" w16cid:durableId="956135389">
-    <w:abstractNumId w:val="3"/>
+  <w:num w:numId="19" w16cid:durableId="801387460">
+    <w:abstractNumId w:val="9"/>
+  </w:num>
+  <w:num w:numId="20" w16cid:durableId="219755788">
+    <w:abstractNumId w:val="6"/>
+  </w:num>
+  <w:num w:numId="21" w16cid:durableId="196814451">
+    <w:abstractNumId w:val="13"/>
   </w:num>
 </w:numbering>
 </file>

</xml_diff>

<commit_message>
Phase 2: Implement Room logic and real-time chat via WebSockets
</commit_message>
<xml_diff>
--- a/TaiLieuDacTa.docx
+++ b/TaiLieuDacTa.docx
@@ -1911,6 +1911,499 @@
         <w:t>Kiểm tra giao diện xem đã đúng phong cách Sakura/Kawaii chưa.</w:t>
       </w:r>
     </w:p>
+    <w:p>
+      <w:r>
+        <w:br w:type="page"/>
+      </w:r>
+    </w:p>
+    <w:p>
+      <w:pPr>
+        <w:numPr>
+          <w:ilvl w:val="0"/>
+          <w:numId w:val="22"/>
+        </w:numPr>
+        <w:rPr>
+          <w:b/>
+          <w:bCs/>
+        </w:rPr>
+      </w:pPr>
+      <w:r>
+        <w:rPr>
+          <w:b/>
+          <w:bCs/>
+        </w:rPr>
+        <w:lastRenderedPageBreak/>
+        <w:t>WaveMeet - Phase 2 Implementation Plan</w:t>
+      </w:r>
+    </w:p>
+    <w:p>
+      <w:r>
+        <w:t>Trong Phase 2 này, chúng ta sẽ xây dựng tính năng </w:t>
+      </w:r>
+      <w:r>
+        <w:rPr>
+          <w:b/>
+          <w:bCs/>
+        </w:rPr>
+        <w:t>Tạo/Tham gia phòng họp (Room)</w:t>
+      </w:r>
+      <w:r>
+        <w:t> và </w:t>
+      </w:r>
+      <w:r>
+        <w:rPr>
+          <w:b/>
+          <w:bCs/>
+        </w:rPr>
+        <w:t>Chat văn bản thời gian thực (Real-time Text Chat)</w:t>
+      </w:r>
+      <w:r>
+        <w:t> sử dụng WebSocket để kiểm tra luồng tín hiệu (Signaling base).</w:t>
+      </w:r>
+    </w:p>
+    <w:p>
+      <w:pPr>
+        <w:rPr>
+          <w:b/>
+          <w:bCs/>
+        </w:rPr>
+      </w:pPr>
+      <w:r>
+        <w:rPr>
+          <w:b/>
+          <w:bCs/>
+        </w:rPr>
+        <w:t>User Review Required</w:t>
+      </w:r>
+    </w:p>
+    <w:p>
+      <w:r>
+        <w:t>IMPORTANT</w:t>
+      </w:r>
+    </w:p>
+    <w:p>
+      <w:r>
+        <w:rPr>
+          <w:b/>
+          <w:bCs/>
+        </w:rPr>
+        <w:t>Quyền truy cập phòng:</w:t>
+      </w:r>
+      <w:r>
+        <w:t> Tôi sẽ thiết lập để:</w:t>
+      </w:r>
+    </w:p>
+    <w:p>
+      <w:pPr>
+        <w:numPr>
+          <w:ilvl w:val="0"/>
+          <w:numId w:val="22"/>
+        </w:numPr>
+      </w:pPr>
+      <w:r>
+        <w:t>Chỉ người dùng đã đăng nhập mới được tạo hoặc tham gia phòng.</w:t>
+      </w:r>
+    </w:p>
+    <w:p>
+      <w:pPr>
+        <w:numPr>
+          <w:ilvl w:val="0"/>
+          <w:numId w:val="22"/>
+        </w:numPr>
+      </w:pPr>
+      <w:r>
+        <w:t>Lịch sử tin nhắn chat sẽ </w:t>
+      </w:r>
+      <w:r>
+        <w:rPr>
+          <w:b/>
+          <w:bCs/>
+        </w:rPr>
+        <w:t>không</w:t>
+      </w:r>
+      <w:r>
+        <w:t> được lưu vào database (chỉ tồn tại tạm thời trong phiên họp theo như đặc tả của bạn). Bạn có đồng ý với thiết kế này không?</w:t>
+      </w:r>
+    </w:p>
+    <w:p>
+      <w:pPr>
+        <w:rPr>
+          <w:b/>
+          <w:bCs/>
+        </w:rPr>
+      </w:pPr>
+      <w:r>
+        <w:rPr>
+          <w:b/>
+          <w:bCs/>
+        </w:rPr>
+        <w:t>Proposed Changes</w:t>
+      </w:r>
+    </w:p>
+    <w:p>
+      <w:r>
+        <w:t>1. Room Views &amp; Routing</w:t>
+      </w:r>
+    </w:p>
+    <w:p>
+      <w:r>
+        <w:t>Tạo view để xử lý logic tạo phòng và tham gia phòng.</w:t>
+      </w:r>
+    </w:p>
+    <w:p>
+      <w:r>
+        <w:t>[MODIFY] chat/views.py</w:t>
+      </w:r>
+    </w:p>
+    <w:p>
+      <w:pPr>
+        <w:numPr>
+          <w:ilvl w:val="0"/>
+          <w:numId w:val="23"/>
+        </w:numPr>
+      </w:pPr>
+      <w:r>
+        <w:t>create_room: View tạo một Room mới và chuyển hướng người dùng vào phòng.</w:t>
+      </w:r>
+    </w:p>
+    <w:p>
+      <w:pPr>
+        <w:numPr>
+          <w:ilvl w:val="0"/>
+          <w:numId w:val="23"/>
+        </w:numPr>
+      </w:pPr>
+      <w:r>
+        <w:t>join_room: View xử lý form nhập Room ID từ trang chủ và chuyển hướng.</w:t>
+      </w:r>
+    </w:p>
+    <w:p>
+      <w:pPr>
+        <w:numPr>
+          <w:ilvl w:val="0"/>
+          <w:numId w:val="23"/>
+        </w:numPr>
+      </w:pPr>
+      <w:r>
+        <w:t>room_detail: View render giao diện của phòng họp (chứa khung chat).</w:t>
+      </w:r>
+    </w:p>
+    <w:p>
+      <w:r>
+        <w:t>[MODIFY] chat/urls.py</w:t>
+      </w:r>
+    </w:p>
+    <w:p>
+      <w:pPr>
+        <w:numPr>
+          <w:ilvl w:val="0"/>
+          <w:numId w:val="24"/>
+        </w:numPr>
+      </w:pPr>
+      <w:r>
+        <w:t>Thêm các route: /room/create/, /room/join/, /room/&lt;uuid:room_id&gt;/.</w:t>
+      </w:r>
+    </w:p>
+    <w:p>
+      <w:r>
+        <w:t>2. WebSocket Consumer</w:t>
+      </w:r>
+    </w:p>
+    <w:p>
+      <w:r>
+        <w:t>Thiết lập Django Channels Consumer để nhận và phát lại tin nhắn chat.</w:t>
+      </w:r>
+    </w:p>
+    <w:p>
+      <w:r>
+        <w:t>[NEW] chat/consumers.py</w:t>
+      </w:r>
+    </w:p>
+    <w:p>
+      <w:pPr>
+        <w:numPr>
+          <w:ilvl w:val="0"/>
+          <w:numId w:val="25"/>
+        </w:numPr>
+      </w:pPr>
+      <w:r>
+        <w:t>Tạo ChatConsumer kế thừa AsyncWebsocketConsumer.</w:t>
+      </w:r>
+    </w:p>
+    <w:p>
+      <w:pPr>
+        <w:numPr>
+          <w:ilvl w:val="0"/>
+          <w:numId w:val="25"/>
+        </w:numPr>
+      </w:pPr>
+      <w:r>
+        <w:t>Khi client kết nối (connect), join vào group chat_&lt;room_id&gt;.</w:t>
+      </w:r>
+    </w:p>
+    <w:p>
+      <w:pPr>
+        <w:numPr>
+          <w:ilvl w:val="0"/>
+          <w:numId w:val="25"/>
+        </w:numPr>
+      </w:pPr>
+      <w:r>
+        <w:t>Khi client gửi tin nhắn (receive), broadcast tin nhắn đó tới toàn bộ group kèm theo tên người gửi và thời gian.</w:t>
+      </w:r>
+    </w:p>
+    <w:p>
+      <w:r>
+        <w:t>[MODIFY] chat/routing.py</w:t>
+      </w:r>
+    </w:p>
+    <w:p>
+      <w:pPr>
+        <w:numPr>
+          <w:ilvl w:val="0"/>
+          <w:numId w:val="26"/>
+        </w:numPr>
+      </w:pPr>
+      <w:r>
+        <w:t>Đăng ký URL cho WebSocket: ws/chat/&lt;uuid:room_id&gt;/ liên kết tới ChatConsumer.</w:t>
+      </w:r>
+    </w:p>
+    <w:p>
+      <w:r>
+        <w:t>3. Giao diện (UI) Room &amp; Chat</w:t>
+      </w:r>
+    </w:p>
+    <w:p>
+      <w:r>
+        <w:lastRenderedPageBreak/>
+        <w:t>Hoàn thiện giao diện cho phòng họp.</w:t>
+      </w:r>
+    </w:p>
+    <w:p>
+      <w:r>
+        <w:t>[MODIFY] chat/templates/chat/home.html</w:t>
+      </w:r>
+    </w:p>
+    <w:p>
+      <w:pPr>
+        <w:numPr>
+          <w:ilvl w:val="0"/>
+          <w:numId w:val="27"/>
+        </w:numPr>
+      </w:pPr>
+      <w:r>
+        <w:t>Gắn link cho nút "Tạo Phòng Mới" trỏ tới create_room.</w:t>
+      </w:r>
+    </w:p>
+    <w:p>
+      <w:pPr>
+        <w:numPr>
+          <w:ilvl w:val="0"/>
+          <w:numId w:val="27"/>
+        </w:numPr>
+      </w:pPr>
+      <w:r>
+        <w:t>Thêm Form hoặc Modal nhỏ (sử dụng JS/HTML) để nhập Room ID cho nút "Tham gia Phòng".</w:t>
+      </w:r>
+    </w:p>
+    <w:p>
+      <w:r>
+        <w:t>[NEW] chat/templates/chat/room.html</w:t>
+      </w:r>
+    </w:p>
+    <w:p>
+      <w:pPr>
+        <w:numPr>
+          <w:ilvl w:val="0"/>
+          <w:numId w:val="28"/>
+        </w:numPr>
+      </w:pPr>
+      <w:r>
+        <w:t>Thiết kế giao diện phòng họp:</w:t>
+      </w:r>
+    </w:p>
+    <w:p>
+      <w:pPr>
+        <w:numPr>
+          <w:ilvl w:val="1"/>
+          <w:numId w:val="28"/>
+        </w:numPr>
+      </w:pPr>
+      <w:r>
+        <w:t>Khung chia màn hình (sau này sẽ để video).</w:t>
+      </w:r>
+    </w:p>
+    <w:p>
+      <w:pPr>
+        <w:numPr>
+          <w:ilvl w:val="1"/>
+          <w:numId w:val="28"/>
+        </w:numPr>
+      </w:pPr>
+      <w:r>
+        <w:t>Sidebar Chat bên phải.</w:t>
+      </w:r>
+    </w:p>
+    <w:p>
+      <w:pPr>
+        <w:numPr>
+          <w:ilvl w:val="0"/>
+          <w:numId w:val="28"/>
+        </w:numPr>
+      </w:pPr>
+      <w:r>
+        <w:t>Tích hợp </w:t>
+      </w:r>
+      <w:r>
+        <w:rPr>
+          <w:b/>
+          <w:bCs/>
+        </w:rPr>
+        <w:t>Vanilla JavaScript</w:t>
+      </w:r>
+      <w:r>
+        <w:t> mở kết nối WebSocket:</w:t>
+      </w:r>
+    </w:p>
+    <w:p>
+      <w:pPr>
+        <w:numPr>
+          <w:ilvl w:val="1"/>
+          <w:numId w:val="28"/>
+        </w:numPr>
+      </w:pPr>
+      <w:r>
+        <w:t>const ws = new WebSocket('ws://' + window.location.host + '/ws/chat/' + roomId + '/');</w:t>
+      </w:r>
+    </w:p>
+    <w:p>
+      <w:pPr>
+        <w:numPr>
+          <w:ilvl w:val="1"/>
+          <w:numId w:val="28"/>
+        </w:numPr>
+      </w:pPr>
+      <w:r>
+        <w:t>Nhận tin nhắn và hiển thị lên giao diện (tự động cuộn xuống dưới cùng).</w:t>
+      </w:r>
+    </w:p>
+    <w:p>
+      <w:pPr>
+        <w:numPr>
+          <w:ilvl w:val="1"/>
+          <w:numId w:val="28"/>
+        </w:numPr>
+      </w:pPr>
+      <w:r>
+        <w:t>Gửi tin nhắn khi nhấn Enter.</w:t>
+      </w:r>
+    </w:p>
+    <w:p>
+      <w:r>
+        <w:t>4. Git Versioning</w:t>
+      </w:r>
+    </w:p>
+    <w:p>
+      <w:pPr>
+        <w:numPr>
+          <w:ilvl w:val="0"/>
+          <w:numId w:val="29"/>
+        </w:numPr>
+      </w:pPr>
+      <w:r>
+        <w:t>Tự động git commit mã nguồn sau khi Phase 2 hoàn tất và hoạt động tốt.</w:t>
+      </w:r>
+    </w:p>
+    <w:p>
+      <w:pPr>
+        <w:rPr>
+          <w:b/>
+          <w:bCs/>
+        </w:rPr>
+      </w:pPr>
+      <w:r>
+        <w:rPr>
+          <w:b/>
+          <w:bCs/>
+        </w:rPr>
+        <w:t>Verification Plan</w:t>
+      </w:r>
+    </w:p>
+    <w:p>
+      <w:r>
+        <w:t>Automated/Code Verification</w:t>
+      </w:r>
+    </w:p>
+    <w:p>
+      <w:pPr>
+        <w:numPr>
+          <w:ilvl w:val="0"/>
+          <w:numId w:val="30"/>
+        </w:numPr>
+      </w:pPr>
+      <w:r>
+        <w:t>Kiểm tra lại các file tĩnh và routing của Django.</w:t>
+      </w:r>
+    </w:p>
+    <w:p>
+      <w:r>
+        <w:t>Manual Verification</w:t>
+      </w:r>
+    </w:p>
+    <w:p>
+      <w:pPr>
+        <w:numPr>
+          <w:ilvl w:val="0"/>
+          <w:numId w:val="31"/>
+        </w:numPr>
+      </w:pPr>
+      <w:r>
+        <w:t>Dùng tính năng </w:t>
+      </w:r>
+      <w:r>
+        <w:rPr>
+          <w:i/>
+          <w:iCs/>
+        </w:rPr>
+        <w:t>Mở ẩn danh</w:t>
+      </w:r>
+      <w:r>
+        <w:t> (Incognito) để đăng nhập 2 tài khoản khác nhau.</w:t>
+      </w:r>
+    </w:p>
+    <w:p>
+      <w:pPr>
+        <w:numPr>
+          <w:ilvl w:val="0"/>
+          <w:numId w:val="31"/>
+        </w:numPr>
+      </w:pPr>
+      <w:r>
+        <w:t>Tài khoản A tạo phòng và copy Link.</w:t>
+      </w:r>
+    </w:p>
+    <w:p>
+      <w:pPr>
+        <w:numPr>
+          <w:ilvl w:val="0"/>
+          <w:numId w:val="31"/>
+        </w:numPr>
+      </w:pPr>
+      <w:r>
+        <w:t>Tài khoản B tham gia phòng.</w:t>
+      </w:r>
+    </w:p>
+    <w:p>
+      <w:pPr>
+        <w:numPr>
+          <w:ilvl w:val="0"/>
+          <w:numId w:val="31"/>
+        </w:numPr>
+      </w:pPr>
+      <w:r>
+        <w:t>A và B chat với nhau để đảm bảo tin nhắn hiển thị tức thời (real-time) mà không cần tải lại trang.</w:t>
+      </w:r>
+    </w:p>
     <w:p/>
     <w:sectPr>
       <w:pgSz w:w="12240" w:h="15840"/>
@@ -2074,6 +2567,155 @@
     </w:lvl>
   </w:abstractNum>
   <w:abstractNum w:abstractNumId="1" w15:restartNumberingAfterBreak="0">
+    <w:nsid w:val="10B47CC7"/>
+    <w:multiLevelType w:val="multilevel"/>
+    <w:tmpl w:val="4B323054"/>
+    <w:lvl w:ilvl="0">
+      <w:start w:val="1"/>
+      <w:numFmt w:val="bullet"/>
+      <w:lvlText w:val=""/>
+      <w:lvlJc w:val="left"/>
+      <w:pPr>
+        <w:tabs>
+          <w:tab w:val="num" w:pos="720"/>
+        </w:tabs>
+        <w:ind w:left="720" w:hanging="360"/>
+      </w:pPr>
+      <w:rPr>
+        <w:rFonts w:ascii="Symbol" w:hAnsi="Symbol" w:hint="default"/>
+        <w:sz w:val="20"/>
+      </w:rPr>
+    </w:lvl>
+    <w:lvl w:ilvl="1" w:tentative="1">
+      <w:start w:val="1"/>
+      <w:numFmt w:val="bullet"/>
+      <w:lvlText w:val=""/>
+      <w:lvlJc w:val="left"/>
+      <w:pPr>
+        <w:tabs>
+          <w:tab w:val="num" w:pos="1440"/>
+        </w:tabs>
+        <w:ind w:left="1440" w:hanging="360"/>
+      </w:pPr>
+      <w:rPr>
+        <w:rFonts w:ascii="Symbol" w:hAnsi="Symbol" w:hint="default"/>
+        <w:sz w:val="20"/>
+      </w:rPr>
+    </w:lvl>
+    <w:lvl w:ilvl="2" w:tentative="1">
+      <w:start w:val="1"/>
+      <w:numFmt w:val="bullet"/>
+      <w:lvlText w:val=""/>
+      <w:lvlJc w:val="left"/>
+      <w:pPr>
+        <w:tabs>
+          <w:tab w:val="num" w:pos="2160"/>
+        </w:tabs>
+        <w:ind w:left="2160" w:hanging="360"/>
+      </w:pPr>
+      <w:rPr>
+        <w:rFonts w:ascii="Symbol" w:hAnsi="Symbol" w:hint="default"/>
+        <w:sz w:val="20"/>
+      </w:rPr>
+    </w:lvl>
+    <w:lvl w:ilvl="3" w:tentative="1">
+      <w:start w:val="1"/>
+      <w:numFmt w:val="bullet"/>
+      <w:lvlText w:val=""/>
+      <w:lvlJc w:val="left"/>
+      <w:pPr>
+        <w:tabs>
+          <w:tab w:val="num" w:pos="2880"/>
+        </w:tabs>
+        <w:ind w:left="2880" w:hanging="360"/>
+      </w:pPr>
+      <w:rPr>
+        <w:rFonts w:ascii="Symbol" w:hAnsi="Symbol" w:hint="default"/>
+        <w:sz w:val="20"/>
+      </w:rPr>
+    </w:lvl>
+    <w:lvl w:ilvl="4" w:tentative="1">
+      <w:start w:val="1"/>
+      <w:numFmt w:val="bullet"/>
+      <w:lvlText w:val=""/>
+      <w:lvlJc w:val="left"/>
+      <w:pPr>
+        <w:tabs>
+          <w:tab w:val="num" w:pos="3600"/>
+        </w:tabs>
+        <w:ind w:left="3600" w:hanging="360"/>
+      </w:pPr>
+      <w:rPr>
+        <w:rFonts w:ascii="Symbol" w:hAnsi="Symbol" w:hint="default"/>
+        <w:sz w:val="20"/>
+      </w:rPr>
+    </w:lvl>
+    <w:lvl w:ilvl="5" w:tentative="1">
+      <w:start w:val="1"/>
+      <w:numFmt w:val="bullet"/>
+      <w:lvlText w:val=""/>
+      <w:lvlJc w:val="left"/>
+      <w:pPr>
+        <w:tabs>
+          <w:tab w:val="num" w:pos="4320"/>
+        </w:tabs>
+        <w:ind w:left="4320" w:hanging="360"/>
+      </w:pPr>
+      <w:rPr>
+        <w:rFonts w:ascii="Symbol" w:hAnsi="Symbol" w:hint="default"/>
+        <w:sz w:val="20"/>
+      </w:rPr>
+    </w:lvl>
+    <w:lvl w:ilvl="6" w:tentative="1">
+      <w:start w:val="1"/>
+      <w:numFmt w:val="bullet"/>
+      <w:lvlText w:val=""/>
+      <w:lvlJc w:val="left"/>
+      <w:pPr>
+        <w:tabs>
+          <w:tab w:val="num" w:pos="5040"/>
+        </w:tabs>
+        <w:ind w:left="5040" w:hanging="360"/>
+      </w:pPr>
+      <w:rPr>
+        <w:rFonts w:ascii="Symbol" w:hAnsi="Symbol" w:hint="default"/>
+        <w:sz w:val="20"/>
+      </w:rPr>
+    </w:lvl>
+    <w:lvl w:ilvl="7" w:tentative="1">
+      <w:start w:val="1"/>
+      <w:numFmt w:val="bullet"/>
+      <w:lvlText w:val=""/>
+      <w:lvlJc w:val="left"/>
+      <w:pPr>
+        <w:tabs>
+          <w:tab w:val="num" w:pos="5760"/>
+        </w:tabs>
+        <w:ind w:left="5760" w:hanging="360"/>
+      </w:pPr>
+      <w:rPr>
+        <w:rFonts w:ascii="Symbol" w:hAnsi="Symbol" w:hint="default"/>
+        <w:sz w:val="20"/>
+      </w:rPr>
+    </w:lvl>
+    <w:lvl w:ilvl="8" w:tentative="1">
+      <w:start w:val="1"/>
+      <w:numFmt w:val="bullet"/>
+      <w:lvlText w:val=""/>
+      <w:lvlJc w:val="left"/>
+      <w:pPr>
+        <w:tabs>
+          <w:tab w:val="num" w:pos="6480"/>
+        </w:tabs>
+        <w:ind w:left="6480" w:hanging="360"/>
+      </w:pPr>
+      <w:rPr>
+        <w:rFonts w:ascii="Symbol" w:hAnsi="Symbol" w:hint="default"/>
+        <w:sz w:val="20"/>
+      </w:rPr>
+    </w:lvl>
+  </w:abstractNum>
+  <w:abstractNum w:abstractNumId="2" w15:restartNumberingAfterBreak="0">
     <w:nsid w:val="12700AC3"/>
     <w:multiLevelType w:val="multilevel"/>
     <w:tmpl w:val="221AA528"/>
@@ -2222,7 +2864,7 @@
       </w:rPr>
     </w:lvl>
   </w:abstractNum>
-  <w:abstractNum w:abstractNumId="2" w15:restartNumberingAfterBreak="0">
+  <w:abstractNum w:abstractNumId="3" w15:restartNumberingAfterBreak="0">
     <w:nsid w:val="15C439B5"/>
     <w:multiLevelType w:val="multilevel"/>
     <w:tmpl w:val="46826754"/>
@@ -2371,7 +3013,156 @@
       </w:rPr>
     </w:lvl>
   </w:abstractNum>
-  <w:abstractNum w:abstractNumId="3" w15:restartNumberingAfterBreak="0">
+  <w:abstractNum w:abstractNumId="4" w15:restartNumberingAfterBreak="0">
+    <w:nsid w:val="19E77330"/>
+    <w:multiLevelType w:val="multilevel"/>
+    <w:tmpl w:val="ABE2739E"/>
+    <w:lvl w:ilvl="0">
+      <w:start w:val="1"/>
+      <w:numFmt w:val="bullet"/>
+      <w:lvlText w:val=""/>
+      <w:lvlJc w:val="left"/>
+      <w:pPr>
+        <w:tabs>
+          <w:tab w:val="num" w:pos="720"/>
+        </w:tabs>
+        <w:ind w:left="720" w:hanging="360"/>
+      </w:pPr>
+      <w:rPr>
+        <w:rFonts w:ascii="Symbol" w:hAnsi="Symbol" w:hint="default"/>
+        <w:sz w:val="20"/>
+      </w:rPr>
+    </w:lvl>
+    <w:lvl w:ilvl="1" w:tentative="1">
+      <w:start w:val="1"/>
+      <w:numFmt w:val="bullet"/>
+      <w:lvlText w:val=""/>
+      <w:lvlJc w:val="left"/>
+      <w:pPr>
+        <w:tabs>
+          <w:tab w:val="num" w:pos="1440"/>
+        </w:tabs>
+        <w:ind w:left="1440" w:hanging="360"/>
+      </w:pPr>
+      <w:rPr>
+        <w:rFonts w:ascii="Symbol" w:hAnsi="Symbol" w:hint="default"/>
+        <w:sz w:val="20"/>
+      </w:rPr>
+    </w:lvl>
+    <w:lvl w:ilvl="2" w:tentative="1">
+      <w:start w:val="1"/>
+      <w:numFmt w:val="bullet"/>
+      <w:lvlText w:val=""/>
+      <w:lvlJc w:val="left"/>
+      <w:pPr>
+        <w:tabs>
+          <w:tab w:val="num" w:pos="2160"/>
+        </w:tabs>
+        <w:ind w:left="2160" w:hanging="360"/>
+      </w:pPr>
+      <w:rPr>
+        <w:rFonts w:ascii="Symbol" w:hAnsi="Symbol" w:hint="default"/>
+        <w:sz w:val="20"/>
+      </w:rPr>
+    </w:lvl>
+    <w:lvl w:ilvl="3" w:tentative="1">
+      <w:start w:val="1"/>
+      <w:numFmt w:val="bullet"/>
+      <w:lvlText w:val=""/>
+      <w:lvlJc w:val="left"/>
+      <w:pPr>
+        <w:tabs>
+          <w:tab w:val="num" w:pos="2880"/>
+        </w:tabs>
+        <w:ind w:left="2880" w:hanging="360"/>
+      </w:pPr>
+      <w:rPr>
+        <w:rFonts w:ascii="Symbol" w:hAnsi="Symbol" w:hint="default"/>
+        <w:sz w:val="20"/>
+      </w:rPr>
+    </w:lvl>
+    <w:lvl w:ilvl="4" w:tentative="1">
+      <w:start w:val="1"/>
+      <w:numFmt w:val="bullet"/>
+      <w:lvlText w:val=""/>
+      <w:lvlJc w:val="left"/>
+      <w:pPr>
+        <w:tabs>
+          <w:tab w:val="num" w:pos="3600"/>
+        </w:tabs>
+        <w:ind w:left="3600" w:hanging="360"/>
+      </w:pPr>
+      <w:rPr>
+        <w:rFonts w:ascii="Symbol" w:hAnsi="Symbol" w:hint="default"/>
+        <w:sz w:val="20"/>
+      </w:rPr>
+    </w:lvl>
+    <w:lvl w:ilvl="5" w:tentative="1">
+      <w:start w:val="1"/>
+      <w:numFmt w:val="bullet"/>
+      <w:lvlText w:val=""/>
+      <w:lvlJc w:val="left"/>
+      <w:pPr>
+        <w:tabs>
+          <w:tab w:val="num" w:pos="4320"/>
+        </w:tabs>
+        <w:ind w:left="4320" w:hanging="360"/>
+      </w:pPr>
+      <w:rPr>
+        <w:rFonts w:ascii="Symbol" w:hAnsi="Symbol" w:hint="default"/>
+        <w:sz w:val="20"/>
+      </w:rPr>
+    </w:lvl>
+    <w:lvl w:ilvl="6" w:tentative="1">
+      <w:start w:val="1"/>
+      <w:numFmt w:val="bullet"/>
+      <w:lvlText w:val=""/>
+      <w:lvlJc w:val="left"/>
+      <w:pPr>
+        <w:tabs>
+          <w:tab w:val="num" w:pos="5040"/>
+        </w:tabs>
+        <w:ind w:left="5040" w:hanging="360"/>
+      </w:pPr>
+      <w:rPr>
+        <w:rFonts w:ascii="Symbol" w:hAnsi="Symbol" w:hint="default"/>
+        <w:sz w:val="20"/>
+      </w:rPr>
+    </w:lvl>
+    <w:lvl w:ilvl="7" w:tentative="1">
+      <w:start w:val="1"/>
+      <w:numFmt w:val="bullet"/>
+      <w:lvlText w:val=""/>
+      <w:lvlJc w:val="left"/>
+      <w:pPr>
+        <w:tabs>
+          <w:tab w:val="num" w:pos="5760"/>
+        </w:tabs>
+        <w:ind w:left="5760" w:hanging="360"/>
+      </w:pPr>
+      <w:rPr>
+        <w:rFonts w:ascii="Symbol" w:hAnsi="Symbol" w:hint="default"/>
+        <w:sz w:val="20"/>
+      </w:rPr>
+    </w:lvl>
+    <w:lvl w:ilvl="8" w:tentative="1">
+      <w:start w:val="1"/>
+      <w:numFmt w:val="bullet"/>
+      <w:lvlText w:val=""/>
+      <w:lvlJc w:val="left"/>
+      <w:pPr>
+        <w:tabs>
+          <w:tab w:val="num" w:pos="6480"/>
+        </w:tabs>
+        <w:ind w:left="6480" w:hanging="360"/>
+      </w:pPr>
+      <w:rPr>
+        <w:rFonts w:ascii="Symbol" w:hAnsi="Symbol" w:hint="default"/>
+        <w:sz w:val="20"/>
+      </w:rPr>
+    </w:lvl>
+  </w:abstractNum>
+  <w:abstractNum w:abstractNumId="5" w15:restartNumberingAfterBreak="0">
     <w:nsid w:val="1C54798F"/>
     <w:multiLevelType w:val="multilevel"/>
     <w:tmpl w:val="8612E53A"/>
@@ -2520,7 +3311,7 @@
       </w:rPr>
     </w:lvl>
   </w:abstractNum>
-  <w:abstractNum w:abstractNumId="4" w15:restartNumberingAfterBreak="0">
+  <w:abstractNum w:abstractNumId="6" w15:restartNumberingAfterBreak="0">
     <w:nsid w:val="1F2637B1"/>
     <w:multiLevelType w:val="multilevel"/>
     <w:tmpl w:val="B6C2A822"/>
@@ -2635,7 +3426,7 @@
       </w:rPr>
     </w:lvl>
   </w:abstractNum>
-  <w:abstractNum w:abstractNumId="5" w15:restartNumberingAfterBreak="0">
+  <w:abstractNum w:abstractNumId="7" w15:restartNumberingAfterBreak="0">
     <w:nsid w:val="22432887"/>
     <w:multiLevelType w:val="multilevel"/>
     <w:tmpl w:val="09100B40"/>
@@ -2784,7 +3575,156 @@
       </w:rPr>
     </w:lvl>
   </w:abstractNum>
-  <w:abstractNum w:abstractNumId="6" w15:restartNumberingAfterBreak="0">
+  <w:abstractNum w:abstractNumId="8" w15:restartNumberingAfterBreak="0">
+    <w:nsid w:val="249C2B42"/>
+    <w:multiLevelType w:val="multilevel"/>
+    <w:tmpl w:val="97D8D996"/>
+    <w:lvl w:ilvl="0">
+      <w:start w:val="1"/>
+      <w:numFmt w:val="bullet"/>
+      <w:lvlText w:val=""/>
+      <w:lvlJc w:val="left"/>
+      <w:pPr>
+        <w:tabs>
+          <w:tab w:val="num" w:pos="720"/>
+        </w:tabs>
+        <w:ind w:left="720" w:hanging="360"/>
+      </w:pPr>
+      <w:rPr>
+        <w:rFonts w:ascii="Symbol" w:hAnsi="Symbol" w:hint="default"/>
+        <w:sz w:val="20"/>
+      </w:rPr>
+    </w:lvl>
+    <w:lvl w:ilvl="1" w:tentative="1">
+      <w:start w:val="1"/>
+      <w:numFmt w:val="bullet"/>
+      <w:lvlText w:val=""/>
+      <w:lvlJc w:val="left"/>
+      <w:pPr>
+        <w:tabs>
+          <w:tab w:val="num" w:pos="1440"/>
+        </w:tabs>
+        <w:ind w:left="1440" w:hanging="360"/>
+      </w:pPr>
+      <w:rPr>
+        <w:rFonts w:ascii="Symbol" w:hAnsi="Symbol" w:hint="default"/>
+        <w:sz w:val="20"/>
+      </w:rPr>
+    </w:lvl>
+    <w:lvl w:ilvl="2" w:tentative="1">
+      <w:start w:val="1"/>
+      <w:numFmt w:val="bullet"/>
+      <w:lvlText w:val=""/>
+      <w:lvlJc w:val="left"/>
+      <w:pPr>
+        <w:tabs>
+          <w:tab w:val="num" w:pos="2160"/>
+        </w:tabs>
+        <w:ind w:left="2160" w:hanging="360"/>
+      </w:pPr>
+      <w:rPr>
+        <w:rFonts w:ascii="Symbol" w:hAnsi="Symbol" w:hint="default"/>
+        <w:sz w:val="20"/>
+      </w:rPr>
+    </w:lvl>
+    <w:lvl w:ilvl="3" w:tentative="1">
+      <w:start w:val="1"/>
+      <w:numFmt w:val="bullet"/>
+      <w:lvlText w:val=""/>
+      <w:lvlJc w:val="left"/>
+      <w:pPr>
+        <w:tabs>
+          <w:tab w:val="num" w:pos="2880"/>
+        </w:tabs>
+        <w:ind w:left="2880" w:hanging="360"/>
+      </w:pPr>
+      <w:rPr>
+        <w:rFonts w:ascii="Symbol" w:hAnsi="Symbol" w:hint="default"/>
+        <w:sz w:val="20"/>
+      </w:rPr>
+    </w:lvl>
+    <w:lvl w:ilvl="4" w:tentative="1">
+      <w:start w:val="1"/>
+      <w:numFmt w:val="bullet"/>
+      <w:lvlText w:val=""/>
+      <w:lvlJc w:val="left"/>
+      <w:pPr>
+        <w:tabs>
+          <w:tab w:val="num" w:pos="3600"/>
+        </w:tabs>
+        <w:ind w:left="3600" w:hanging="360"/>
+      </w:pPr>
+      <w:rPr>
+        <w:rFonts w:ascii="Symbol" w:hAnsi="Symbol" w:hint="default"/>
+        <w:sz w:val="20"/>
+      </w:rPr>
+    </w:lvl>
+    <w:lvl w:ilvl="5" w:tentative="1">
+      <w:start w:val="1"/>
+      <w:numFmt w:val="bullet"/>
+      <w:lvlText w:val=""/>
+      <w:lvlJc w:val="left"/>
+      <w:pPr>
+        <w:tabs>
+          <w:tab w:val="num" w:pos="4320"/>
+        </w:tabs>
+        <w:ind w:left="4320" w:hanging="360"/>
+      </w:pPr>
+      <w:rPr>
+        <w:rFonts w:ascii="Symbol" w:hAnsi="Symbol" w:hint="default"/>
+        <w:sz w:val="20"/>
+      </w:rPr>
+    </w:lvl>
+    <w:lvl w:ilvl="6" w:tentative="1">
+      <w:start w:val="1"/>
+      <w:numFmt w:val="bullet"/>
+      <w:lvlText w:val=""/>
+      <w:lvlJc w:val="left"/>
+      <w:pPr>
+        <w:tabs>
+          <w:tab w:val="num" w:pos="5040"/>
+        </w:tabs>
+        <w:ind w:left="5040" w:hanging="360"/>
+      </w:pPr>
+      <w:rPr>
+        <w:rFonts w:ascii="Symbol" w:hAnsi="Symbol" w:hint="default"/>
+        <w:sz w:val="20"/>
+      </w:rPr>
+    </w:lvl>
+    <w:lvl w:ilvl="7" w:tentative="1">
+      <w:start w:val="1"/>
+      <w:numFmt w:val="bullet"/>
+      <w:lvlText w:val=""/>
+      <w:lvlJc w:val="left"/>
+      <w:pPr>
+        <w:tabs>
+          <w:tab w:val="num" w:pos="5760"/>
+        </w:tabs>
+        <w:ind w:left="5760" w:hanging="360"/>
+      </w:pPr>
+      <w:rPr>
+        <w:rFonts w:ascii="Symbol" w:hAnsi="Symbol" w:hint="default"/>
+        <w:sz w:val="20"/>
+      </w:rPr>
+    </w:lvl>
+    <w:lvl w:ilvl="8" w:tentative="1">
+      <w:start w:val="1"/>
+      <w:numFmt w:val="bullet"/>
+      <w:lvlText w:val=""/>
+      <w:lvlJc w:val="left"/>
+      <w:pPr>
+        <w:tabs>
+          <w:tab w:val="num" w:pos="6480"/>
+        </w:tabs>
+        <w:ind w:left="6480" w:hanging="360"/>
+      </w:pPr>
+      <w:rPr>
+        <w:rFonts w:ascii="Symbol" w:hAnsi="Symbol" w:hint="default"/>
+        <w:sz w:val="20"/>
+      </w:rPr>
+    </w:lvl>
+  </w:abstractNum>
+  <w:abstractNum w:abstractNumId="9" w15:restartNumberingAfterBreak="0">
     <w:nsid w:val="28E33A62"/>
     <w:multiLevelType w:val="multilevel"/>
     <w:tmpl w:val="EE446BCE"/>
@@ -2933,7 +3873,567 @@
       </w:rPr>
     </w:lvl>
   </w:abstractNum>
-  <w:abstractNum w:abstractNumId="7" w15:restartNumberingAfterBreak="0">
+  <w:abstractNum w:abstractNumId="10" w15:restartNumberingAfterBreak="0">
+    <w:nsid w:val="29E614D1"/>
+    <w:multiLevelType w:val="multilevel"/>
+    <w:tmpl w:val="8398CCF0"/>
+    <w:lvl w:ilvl="0">
+      <w:start w:val="1"/>
+      <w:numFmt w:val="bullet"/>
+      <w:lvlText w:val=""/>
+      <w:lvlJc w:val="left"/>
+      <w:pPr>
+        <w:tabs>
+          <w:tab w:val="num" w:pos="720"/>
+        </w:tabs>
+        <w:ind w:left="720" w:hanging="360"/>
+      </w:pPr>
+      <w:rPr>
+        <w:rFonts w:ascii="Symbol" w:hAnsi="Symbol" w:hint="default"/>
+        <w:sz w:val="20"/>
+      </w:rPr>
+    </w:lvl>
+    <w:lvl w:ilvl="1" w:tentative="1">
+      <w:start w:val="1"/>
+      <w:numFmt w:val="bullet"/>
+      <w:lvlText w:val=""/>
+      <w:lvlJc w:val="left"/>
+      <w:pPr>
+        <w:tabs>
+          <w:tab w:val="num" w:pos="1440"/>
+        </w:tabs>
+        <w:ind w:left="1440" w:hanging="360"/>
+      </w:pPr>
+      <w:rPr>
+        <w:rFonts w:ascii="Symbol" w:hAnsi="Symbol" w:hint="default"/>
+        <w:sz w:val="20"/>
+      </w:rPr>
+    </w:lvl>
+    <w:lvl w:ilvl="2" w:tentative="1">
+      <w:start w:val="1"/>
+      <w:numFmt w:val="bullet"/>
+      <w:lvlText w:val=""/>
+      <w:lvlJc w:val="left"/>
+      <w:pPr>
+        <w:tabs>
+          <w:tab w:val="num" w:pos="2160"/>
+        </w:tabs>
+        <w:ind w:left="2160" w:hanging="360"/>
+      </w:pPr>
+      <w:rPr>
+        <w:rFonts w:ascii="Symbol" w:hAnsi="Symbol" w:hint="default"/>
+        <w:sz w:val="20"/>
+      </w:rPr>
+    </w:lvl>
+    <w:lvl w:ilvl="3" w:tentative="1">
+      <w:start w:val="1"/>
+      <w:numFmt w:val="bullet"/>
+      <w:lvlText w:val=""/>
+      <w:lvlJc w:val="left"/>
+      <w:pPr>
+        <w:tabs>
+          <w:tab w:val="num" w:pos="2880"/>
+        </w:tabs>
+        <w:ind w:left="2880" w:hanging="360"/>
+      </w:pPr>
+      <w:rPr>
+        <w:rFonts w:ascii="Symbol" w:hAnsi="Symbol" w:hint="default"/>
+        <w:sz w:val="20"/>
+      </w:rPr>
+    </w:lvl>
+    <w:lvl w:ilvl="4" w:tentative="1">
+      <w:start w:val="1"/>
+      <w:numFmt w:val="bullet"/>
+      <w:lvlText w:val=""/>
+      <w:lvlJc w:val="left"/>
+      <w:pPr>
+        <w:tabs>
+          <w:tab w:val="num" w:pos="3600"/>
+        </w:tabs>
+        <w:ind w:left="3600" w:hanging="360"/>
+      </w:pPr>
+      <w:rPr>
+        <w:rFonts w:ascii="Symbol" w:hAnsi="Symbol" w:hint="default"/>
+        <w:sz w:val="20"/>
+      </w:rPr>
+    </w:lvl>
+    <w:lvl w:ilvl="5" w:tentative="1">
+      <w:start w:val="1"/>
+      <w:numFmt w:val="bullet"/>
+      <w:lvlText w:val=""/>
+      <w:lvlJc w:val="left"/>
+      <w:pPr>
+        <w:tabs>
+          <w:tab w:val="num" w:pos="4320"/>
+        </w:tabs>
+        <w:ind w:left="4320" w:hanging="360"/>
+      </w:pPr>
+      <w:rPr>
+        <w:rFonts w:ascii="Symbol" w:hAnsi="Symbol" w:hint="default"/>
+        <w:sz w:val="20"/>
+      </w:rPr>
+    </w:lvl>
+    <w:lvl w:ilvl="6" w:tentative="1">
+      <w:start w:val="1"/>
+      <w:numFmt w:val="bullet"/>
+      <w:lvlText w:val=""/>
+      <w:lvlJc w:val="left"/>
+      <w:pPr>
+        <w:tabs>
+          <w:tab w:val="num" w:pos="5040"/>
+        </w:tabs>
+        <w:ind w:left="5040" w:hanging="360"/>
+      </w:pPr>
+      <w:rPr>
+        <w:rFonts w:ascii="Symbol" w:hAnsi="Symbol" w:hint="default"/>
+        <w:sz w:val="20"/>
+      </w:rPr>
+    </w:lvl>
+    <w:lvl w:ilvl="7" w:tentative="1">
+      <w:start w:val="1"/>
+      <w:numFmt w:val="bullet"/>
+      <w:lvlText w:val=""/>
+      <w:lvlJc w:val="left"/>
+      <w:pPr>
+        <w:tabs>
+          <w:tab w:val="num" w:pos="5760"/>
+        </w:tabs>
+        <w:ind w:left="5760" w:hanging="360"/>
+      </w:pPr>
+      <w:rPr>
+        <w:rFonts w:ascii="Symbol" w:hAnsi="Symbol" w:hint="default"/>
+        <w:sz w:val="20"/>
+      </w:rPr>
+    </w:lvl>
+    <w:lvl w:ilvl="8" w:tentative="1">
+      <w:start w:val="1"/>
+      <w:numFmt w:val="bullet"/>
+      <w:lvlText w:val=""/>
+      <w:lvlJc w:val="left"/>
+      <w:pPr>
+        <w:tabs>
+          <w:tab w:val="num" w:pos="6480"/>
+        </w:tabs>
+        <w:ind w:left="6480" w:hanging="360"/>
+      </w:pPr>
+      <w:rPr>
+        <w:rFonts w:ascii="Symbol" w:hAnsi="Symbol" w:hint="default"/>
+        <w:sz w:val="20"/>
+      </w:rPr>
+    </w:lvl>
+  </w:abstractNum>
+  <w:abstractNum w:abstractNumId="11" w15:restartNumberingAfterBreak="0">
+    <w:nsid w:val="2A814324"/>
+    <w:multiLevelType w:val="multilevel"/>
+    <w:tmpl w:val="0262AF82"/>
+    <w:lvl w:ilvl="0">
+      <w:start w:val="1"/>
+      <w:numFmt w:val="bullet"/>
+      <w:lvlText w:val=""/>
+      <w:lvlJc w:val="left"/>
+      <w:pPr>
+        <w:tabs>
+          <w:tab w:val="num" w:pos="720"/>
+        </w:tabs>
+        <w:ind w:left="720" w:hanging="360"/>
+      </w:pPr>
+      <w:rPr>
+        <w:rFonts w:ascii="Symbol" w:hAnsi="Symbol" w:hint="default"/>
+        <w:sz w:val="20"/>
+      </w:rPr>
+    </w:lvl>
+    <w:lvl w:ilvl="1">
+      <w:start w:val="1"/>
+      <w:numFmt w:val="bullet"/>
+      <w:lvlText w:val=""/>
+      <w:lvlJc w:val="left"/>
+      <w:pPr>
+        <w:tabs>
+          <w:tab w:val="num" w:pos="1440"/>
+        </w:tabs>
+        <w:ind w:left="1440" w:hanging="360"/>
+      </w:pPr>
+      <w:rPr>
+        <w:rFonts w:ascii="Symbol" w:hAnsi="Symbol" w:hint="default"/>
+        <w:sz w:val="20"/>
+      </w:rPr>
+    </w:lvl>
+    <w:lvl w:ilvl="2" w:tentative="1">
+      <w:start w:val="1"/>
+      <w:numFmt w:val="bullet"/>
+      <w:lvlText w:val=""/>
+      <w:lvlJc w:val="left"/>
+      <w:pPr>
+        <w:tabs>
+          <w:tab w:val="num" w:pos="2160"/>
+        </w:tabs>
+        <w:ind w:left="2160" w:hanging="360"/>
+      </w:pPr>
+      <w:rPr>
+        <w:rFonts w:ascii="Symbol" w:hAnsi="Symbol" w:hint="default"/>
+        <w:sz w:val="20"/>
+      </w:rPr>
+    </w:lvl>
+    <w:lvl w:ilvl="3" w:tentative="1">
+      <w:start w:val="1"/>
+      <w:numFmt w:val="bullet"/>
+      <w:lvlText w:val=""/>
+      <w:lvlJc w:val="left"/>
+      <w:pPr>
+        <w:tabs>
+          <w:tab w:val="num" w:pos="2880"/>
+        </w:tabs>
+        <w:ind w:left="2880" w:hanging="360"/>
+      </w:pPr>
+      <w:rPr>
+        <w:rFonts w:ascii="Symbol" w:hAnsi="Symbol" w:hint="default"/>
+        <w:sz w:val="20"/>
+      </w:rPr>
+    </w:lvl>
+    <w:lvl w:ilvl="4" w:tentative="1">
+      <w:start w:val="1"/>
+      <w:numFmt w:val="bullet"/>
+      <w:lvlText w:val=""/>
+      <w:lvlJc w:val="left"/>
+      <w:pPr>
+        <w:tabs>
+          <w:tab w:val="num" w:pos="3600"/>
+        </w:tabs>
+        <w:ind w:left="3600" w:hanging="360"/>
+      </w:pPr>
+      <w:rPr>
+        <w:rFonts w:ascii="Symbol" w:hAnsi="Symbol" w:hint="default"/>
+        <w:sz w:val="20"/>
+      </w:rPr>
+    </w:lvl>
+    <w:lvl w:ilvl="5" w:tentative="1">
+      <w:start w:val="1"/>
+      <w:numFmt w:val="bullet"/>
+      <w:lvlText w:val=""/>
+      <w:lvlJc w:val="left"/>
+      <w:pPr>
+        <w:tabs>
+          <w:tab w:val="num" w:pos="4320"/>
+        </w:tabs>
+        <w:ind w:left="4320" w:hanging="360"/>
+      </w:pPr>
+      <w:rPr>
+        <w:rFonts w:ascii="Symbol" w:hAnsi="Symbol" w:hint="default"/>
+        <w:sz w:val="20"/>
+      </w:rPr>
+    </w:lvl>
+    <w:lvl w:ilvl="6" w:tentative="1">
+      <w:start w:val="1"/>
+      <w:numFmt w:val="bullet"/>
+      <w:lvlText w:val=""/>
+      <w:lvlJc w:val="left"/>
+      <w:pPr>
+        <w:tabs>
+          <w:tab w:val="num" w:pos="5040"/>
+        </w:tabs>
+        <w:ind w:left="5040" w:hanging="360"/>
+      </w:pPr>
+      <w:rPr>
+        <w:rFonts w:ascii="Symbol" w:hAnsi="Symbol" w:hint="default"/>
+        <w:sz w:val="20"/>
+      </w:rPr>
+    </w:lvl>
+    <w:lvl w:ilvl="7" w:tentative="1">
+      <w:start w:val="1"/>
+      <w:numFmt w:val="bullet"/>
+      <w:lvlText w:val=""/>
+      <w:lvlJc w:val="left"/>
+      <w:pPr>
+        <w:tabs>
+          <w:tab w:val="num" w:pos="5760"/>
+        </w:tabs>
+        <w:ind w:left="5760" w:hanging="360"/>
+      </w:pPr>
+      <w:rPr>
+        <w:rFonts w:ascii="Symbol" w:hAnsi="Symbol" w:hint="default"/>
+        <w:sz w:val="20"/>
+      </w:rPr>
+    </w:lvl>
+    <w:lvl w:ilvl="8" w:tentative="1">
+      <w:start w:val="1"/>
+      <w:numFmt w:val="bullet"/>
+      <w:lvlText w:val=""/>
+      <w:lvlJc w:val="left"/>
+      <w:pPr>
+        <w:tabs>
+          <w:tab w:val="num" w:pos="6480"/>
+        </w:tabs>
+        <w:ind w:left="6480" w:hanging="360"/>
+      </w:pPr>
+      <w:rPr>
+        <w:rFonts w:ascii="Symbol" w:hAnsi="Symbol" w:hint="default"/>
+        <w:sz w:val="20"/>
+      </w:rPr>
+    </w:lvl>
+  </w:abstractNum>
+  <w:abstractNum w:abstractNumId="12" w15:restartNumberingAfterBreak="0">
+    <w:nsid w:val="2C73674C"/>
+    <w:multiLevelType w:val="multilevel"/>
+    <w:tmpl w:val="30DE1DFE"/>
+    <w:lvl w:ilvl="0">
+      <w:start w:val="1"/>
+      <w:numFmt w:val="decimal"/>
+      <w:lvlText w:val="%1."/>
+      <w:lvlJc w:val="left"/>
+      <w:pPr>
+        <w:tabs>
+          <w:tab w:val="num" w:pos="720"/>
+        </w:tabs>
+        <w:ind w:left="720" w:hanging="360"/>
+      </w:pPr>
+    </w:lvl>
+    <w:lvl w:ilvl="1" w:tentative="1">
+      <w:start w:val="1"/>
+      <w:numFmt w:val="decimal"/>
+      <w:lvlText w:val="%2."/>
+      <w:lvlJc w:val="left"/>
+      <w:pPr>
+        <w:tabs>
+          <w:tab w:val="num" w:pos="1440"/>
+        </w:tabs>
+        <w:ind w:left="1440" w:hanging="360"/>
+      </w:pPr>
+    </w:lvl>
+    <w:lvl w:ilvl="2" w:tentative="1">
+      <w:start w:val="1"/>
+      <w:numFmt w:val="decimal"/>
+      <w:lvlText w:val="%3."/>
+      <w:lvlJc w:val="left"/>
+      <w:pPr>
+        <w:tabs>
+          <w:tab w:val="num" w:pos="2160"/>
+        </w:tabs>
+        <w:ind w:left="2160" w:hanging="360"/>
+      </w:pPr>
+    </w:lvl>
+    <w:lvl w:ilvl="3" w:tentative="1">
+      <w:start w:val="1"/>
+      <w:numFmt w:val="decimal"/>
+      <w:lvlText w:val="%4."/>
+      <w:lvlJc w:val="left"/>
+      <w:pPr>
+        <w:tabs>
+          <w:tab w:val="num" w:pos="2880"/>
+        </w:tabs>
+        <w:ind w:left="2880" w:hanging="360"/>
+      </w:pPr>
+    </w:lvl>
+    <w:lvl w:ilvl="4" w:tentative="1">
+      <w:start w:val="1"/>
+      <w:numFmt w:val="decimal"/>
+      <w:lvlText w:val="%5."/>
+      <w:lvlJc w:val="left"/>
+      <w:pPr>
+        <w:tabs>
+          <w:tab w:val="num" w:pos="3600"/>
+        </w:tabs>
+        <w:ind w:left="3600" w:hanging="360"/>
+      </w:pPr>
+    </w:lvl>
+    <w:lvl w:ilvl="5" w:tentative="1">
+      <w:start w:val="1"/>
+      <w:numFmt w:val="decimal"/>
+      <w:lvlText w:val="%6."/>
+      <w:lvlJc w:val="left"/>
+      <w:pPr>
+        <w:tabs>
+          <w:tab w:val="num" w:pos="4320"/>
+        </w:tabs>
+        <w:ind w:left="4320" w:hanging="360"/>
+      </w:pPr>
+    </w:lvl>
+    <w:lvl w:ilvl="6" w:tentative="1">
+      <w:start w:val="1"/>
+      <w:numFmt w:val="decimal"/>
+      <w:lvlText w:val="%7."/>
+      <w:lvlJc w:val="left"/>
+      <w:pPr>
+        <w:tabs>
+          <w:tab w:val="num" w:pos="5040"/>
+        </w:tabs>
+        <w:ind w:left="5040" w:hanging="360"/>
+      </w:pPr>
+    </w:lvl>
+    <w:lvl w:ilvl="7" w:tentative="1">
+      <w:start w:val="1"/>
+      <w:numFmt w:val="decimal"/>
+      <w:lvlText w:val="%8."/>
+      <w:lvlJc w:val="left"/>
+      <w:pPr>
+        <w:tabs>
+          <w:tab w:val="num" w:pos="5760"/>
+        </w:tabs>
+        <w:ind w:left="5760" w:hanging="360"/>
+      </w:pPr>
+    </w:lvl>
+    <w:lvl w:ilvl="8" w:tentative="1">
+      <w:start w:val="1"/>
+      <w:numFmt w:val="decimal"/>
+      <w:lvlText w:val="%9."/>
+      <w:lvlJc w:val="left"/>
+      <w:pPr>
+        <w:tabs>
+          <w:tab w:val="num" w:pos="6480"/>
+        </w:tabs>
+        <w:ind w:left="6480" w:hanging="360"/>
+      </w:pPr>
+    </w:lvl>
+  </w:abstractNum>
+  <w:abstractNum w:abstractNumId="13" w15:restartNumberingAfterBreak="0">
+    <w:nsid w:val="365802AE"/>
+    <w:multiLevelType w:val="multilevel"/>
+    <w:tmpl w:val="1304CDDC"/>
+    <w:lvl w:ilvl="0">
+      <w:start w:val="1"/>
+      <w:numFmt w:val="bullet"/>
+      <w:lvlText w:val=""/>
+      <w:lvlJc w:val="left"/>
+      <w:pPr>
+        <w:tabs>
+          <w:tab w:val="num" w:pos="720"/>
+        </w:tabs>
+        <w:ind w:left="720" w:hanging="360"/>
+      </w:pPr>
+      <w:rPr>
+        <w:rFonts w:ascii="Symbol" w:hAnsi="Symbol" w:hint="default"/>
+        <w:sz w:val="20"/>
+      </w:rPr>
+    </w:lvl>
+    <w:lvl w:ilvl="1" w:tentative="1">
+      <w:start w:val="1"/>
+      <w:numFmt w:val="bullet"/>
+      <w:lvlText w:val=""/>
+      <w:lvlJc w:val="left"/>
+      <w:pPr>
+        <w:tabs>
+          <w:tab w:val="num" w:pos="1440"/>
+        </w:tabs>
+        <w:ind w:left="1440" w:hanging="360"/>
+      </w:pPr>
+      <w:rPr>
+        <w:rFonts w:ascii="Symbol" w:hAnsi="Symbol" w:hint="default"/>
+        <w:sz w:val="20"/>
+      </w:rPr>
+    </w:lvl>
+    <w:lvl w:ilvl="2" w:tentative="1">
+      <w:start w:val="1"/>
+      <w:numFmt w:val="bullet"/>
+      <w:lvlText w:val=""/>
+      <w:lvlJc w:val="left"/>
+      <w:pPr>
+        <w:tabs>
+          <w:tab w:val="num" w:pos="2160"/>
+        </w:tabs>
+        <w:ind w:left="2160" w:hanging="360"/>
+      </w:pPr>
+      <w:rPr>
+        <w:rFonts w:ascii="Symbol" w:hAnsi="Symbol" w:hint="default"/>
+        <w:sz w:val="20"/>
+      </w:rPr>
+    </w:lvl>
+    <w:lvl w:ilvl="3" w:tentative="1">
+      <w:start w:val="1"/>
+      <w:numFmt w:val="bullet"/>
+      <w:lvlText w:val=""/>
+      <w:lvlJc w:val="left"/>
+      <w:pPr>
+        <w:tabs>
+          <w:tab w:val="num" w:pos="2880"/>
+        </w:tabs>
+        <w:ind w:left="2880" w:hanging="360"/>
+      </w:pPr>
+      <w:rPr>
+        <w:rFonts w:ascii="Symbol" w:hAnsi="Symbol" w:hint="default"/>
+        <w:sz w:val="20"/>
+      </w:rPr>
+    </w:lvl>
+    <w:lvl w:ilvl="4" w:tentative="1">
+      <w:start w:val="1"/>
+      <w:numFmt w:val="bullet"/>
+      <w:lvlText w:val=""/>
+      <w:lvlJc w:val="left"/>
+      <w:pPr>
+        <w:tabs>
+          <w:tab w:val="num" w:pos="3600"/>
+        </w:tabs>
+        <w:ind w:left="3600" w:hanging="360"/>
+      </w:pPr>
+      <w:rPr>
+        <w:rFonts w:ascii="Symbol" w:hAnsi="Symbol" w:hint="default"/>
+        <w:sz w:val="20"/>
+      </w:rPr>
+    </w:lvl>
+    <w:lvl w:ilvl="5" w:tentative="1">
+      <w:start w:val="1"/>
+      <w:numFmt w:val="bullet"/>
+      <w:lvlText w:val=""/>
+      <w:lvlJc w:val="left"/>
+      <w:pPr>
+        <w:tabs>
+          <w:tab w:val="num" w:pos="4320"/>
+        </w:tabs>
+        <w:ind w:left="4320" w:hanging="360"/>
+      </w:pPr>
+      <w:rPr>
+        <w:rFonts w:ascii="Symbol" w:hAnsi="Symbol" w:hint="default"/>
+        <w:sz w:val="20"/>
+      </w:rPr>
+    </w:lvl>
+    <w:lvl w:ilvl="6" w:tentative="1">
+      <w:start w:val="1"/>
+      <w:numFmt w:val="bullet"/>
+      <w:lvlText w:val=""/>
+      <w:lvlJc w:val="left"/>
+      <w:pPr>
+        <w:tabs>
+          <w:tab w:val="num" w:pos="5040"/>
+        </w:tabs>
+        <w:ind w:left="5040" w:hanging="360"/>
+      </w:pPr>
+      <w:rPr>
+        <w:rFonts w:ascii="Symbol" w:hAnsi="Symbol" w:hint="default"/>
+        <w:sz w:val="20"/>
+      </w:rPr>
+    </w:lvl>
+    <w:lvl w:ilvl="7" w:tentative="1">
+      <w:start w:val="1"/>
+      <w:numFmt w:val="bullet"/>
+      <w:lvlText w:val=""/>
+      <w:lvlJc w:val="left"/>
+      <w:pPr>
+        <w:tabs>
+          <w:tab w:val="num" w:pos="5760"/>
+        </w:tabs>
+        <w:ind w:left="5760" w:hanging="360"/>
+      </w:pPr>
+      <w:rPr>
+        <w:rFonts w:ascii="Symbol" w:hAnsi="Symbol" w:hint="default"/>
+        <w:sz w:val="20"/>
+      </w:rPr>
+    </w:lvl>
+    <w:lvl w:ilvl="8" w:tentative="1">
+      <w:start w:val="1"/>
+      <w:numFmt w:val="bullet"/>
+      <w:lvlText w:val=""/>
+      <w:lvlJc w:val="left"/>
+      <w:pPr>
+        <w:tabs>
+          <w:tab w:val="num" w:pos="6480"/>
+        </w:tabs>
+        <w:ind w:left="6480" w:hanging="360"/>
+      </w:pPr>
+      <w:rPr>
+        <w:rFonts w:ascii="Symbol" w:hAnsi="Symbol" w:hint="default"/>
+        <w:sz w:val="20"/>
+      </w:rPr>
+    </w:lvl>
+  </w:abstractNum>
+  <w:abstractNum w:abstractNumId="14" w15:restartNumberingAfterBreak="0">
     <w:nsid w:val="39147671"/>
     <w:multiLevelType w:val="multilevel"/>
     <w:tmpl w:val="28FCAB92"/>
@@ -3082,7 +4582,156 @@
       </w:rPr>
     </w:lvl>
   </w:abstractNum>
-  <w:abstractNum w:abstractNumId="8" w15:restartNumberingAfterBreak="0">
+  <w:abstractNum w:abstractNumId="15" w15:restartNumberingAfterBreak="0">
+    <w:nsid w:val="44677946"/>
+    <w:multiLevelType w:val="multilevel"/>
+    <w:tmpl w:val="7E4EEF24"/>
+    <w:lvl w:ilvl="0">
+      <w:start w:val="1"/>
+      <w:numFmt w:val="bullet"/>
+      <w:lvlText w:val=""/>
+      <w:lvlJc w:val="left"/>
+      <w:pPr>
+        <w:tabs>
+          <w:tab w:val="num" w:pos="720"/>
+        </w:tabs>
+        <w:ind w:left="720" w:hanging="360"/>
+      </w:pPr>
+      <w:rPr>
+        <w:rFonts w:ascii="Symbol" w:hAnsi="Symbol" w:hint="default"/>
+        <w:sz w:val="20"/>
+      </w:rPr>
+    </w:lvl>
+    <w:lvl w:ilvl="1" w:tentative="1">
+      <w:start w:val="1"/>
+      <w:numFmt w:val="bullet"/>
+      <w:lvlText w:val=""/>
+      <w:lvlJc w:val="left"/>
+      <w:pPr>
+        <w:tabs>
+          <w:tab w:val="num" w:pos="1440"/>
+        </w:tabs>
+        <w:ind w:left="1440" w:hanging="360"/>
+      </w:pPr>
+      <w:rPr>
+        <w:rFonts w:ascii="Symbol" w:hAnsi="Symbol" w:hint="default"/>
+        <w:sz w:val="20"/>
+      </w:rPr>
+    </w:lvl>
+    <w:lvl w:ilvl="2" w:tentative="1">
+      <w:start w:val="1"/>
+      <w:numFmt w:val="bullet"/>
+      <w:lvlText w:val=""/>
+      <w:lvlJc w:val="left"/>
+      <w:pPr>
+        <w:tabs>
+          <w:tab w:val="num" w:pos="2160"/>
+        </w:tabs>
+        <w:ind w:left="2160" w:hanging="360"/>
+      </w:pPr>
+      <w:rPr>
+        <w:rFonts w:ascii="Symbol" w:hAnsi="Symbol" w:hint="default"/>
+        <w:sz w:val="20"/>
+      </w:rPr>
+    </w:lvl>
+    <w:lvl w:ilvl="3" w:tentative="1">
+      <w:start w:val="1"/>
+      <w:numFmt w:val="bullet"/>
+      <w:lvlText w:val=""/>
+      <w:lvlJc w:val="left"/>
+      <w:pPr>
+        <w:tabs>
+          <w:tab w:val="num" w:pos="2880"/>
+        </w:tabs>
+        <w:ind w:left="2880" w:hanging="360"/>
+      </w:pPr>
+      <w:rPr>
+        <w:rFonts w:ascii="Symbol" w:hAnsi="Symbol" w:hint="default"/>
+        <w:sz w:val="20"/>
+      </w:rPr>
+    </w:lvl>
+    <w:lvl w:ilvl="4" w:tentative="1">
+      <w:start w:val="1"/>
+      <w:numFmt w:val="bullet"/>
+      <w:lvlText w:val=""/>
+      <w:lvlJc w:val="left"/>
+      <w:pPr>
+        <w:tabs>
+          <w:tab w:val="num" w:pos="3600"/>
+        </w:tabs>
+        <w:ind w:left="3600" w:hanging="360"/>
+      </w:pPr>
+      <w:rPr>
+        <w:rFonts w:ascii="Symbol" w:hAnsi="Symbol" w:hint="default"/>
+        <w:sz w:val="20"/>
+      </w:rPr>
+    </w:lvl>
+    <w:lvl w:ilvl="5" w:tentative="1">
+      <w:start w:val="1"/>
+      <w:numFmt w:val="bullet"/>
+      <w:lvlText w:val=""/>
+      <w:lvlJc w:val="left"/>
+      <w:pPr>
+        <w:tabs>
+          <w:tab w:val="num" w:pos="4320"/>
+        </w:tabs>
+        <w:ind w:left="4320" w:hanging="360"/>
+      </w:pPr>
+      <w:rPr>
+        <w:rFonts w:ascii="Symbol" w:hAnsi="Symbol" w:hint="default"/>
+        <w:sz w:val="20"/>
+      </w:rPr>
+    </w:lvl>
+    <w:lvl w:ilvl="6" w:tentative="1">
+      <w:start w:val="1"/>
+      <w:numFmt w:val="bullet"/>
+      <w:lvlText w:val=""/>
+      <w:lvlJc w:val="left"/>
+      <w:pPr>
+        <w:tabs>
+          <w:tab w:val="num" w:pos="5040"/>
+        </w:tabs>
+        <w:ind w:left="5040" w:hanging="360"/>
+      </w:pPr>
+      <w:rPr>
+        <w:rFonts w:ascii="Symbol" w:hAnsi="Symbol" w:hint="default"/>
+        <w:sz w:val="20"/>
+      </w:rPr>
+    </w:lvl>
+    <w:lvl w:ilvl="7" w:tentative="1">
+      <w:start w:val="1"/>
+      <w:numFmt w:val="bullet"/>
+      <w:lvlText w:val=""/>
+      <w:lvlJc w:val="left"/>
+      <w:pPr>
+        <w:tabs>
+          <w:tab w:val="num" w:pos="5760"/>
+        </w:tabs>
+        <w:ind w:left="5760" w:hanging="360"/>
+      </w:pPr>
+      <w:rPr>
+        <w:rFonts w:ascii="Symbol" w:hAnsi="Symbol" w:hint="default"/>
+        <w:sz w:val="20"/>
+      </w:rPr>
+    </w:lvl>
+    <w:lvl w:ilvl="8" w:tentative="1">
+      <w:start w:val="1"/>
+      <w:numFmt w:val="bullet"/>
+      <w:lvlText w:val=""/>
+      <w:lvlJc w:val="left"/>
+      <w:pPr>
+        <w:tabs>
+          <w:tab w:val="num" w:pos="6480"/>
+        </w:tabs>
+        <w:ind w:left="6480" w:hanging="360"/>
+      </w:pPr>
+      <w:rPr>
+        <w:rFonts w:ascii="Symbol" w:hAnsi="Symbol" w:hint="default"/>
+        <w:sz w:val="20"/>
+      </w:rPr>
+    </w:lvl>
+  </w:abstractNum>
+  <w:abstractNum w:abstractNumId="16" w15:restartNumberingAfterBreak="0">
     <w:nsid w:val="4E402E0F"/>
     <w:multiLevelType w:val="multilevel"/>
     <w:tmpl w:val="6068E2C8"/>
@@ -3231,7 +4880,7 @@
       </w:rPr>
     </w:lvl>
   </w:abstractNum>
-  <w:abstractNum w:abstractNumId="9" w15:restartNumberingAfterBreak="0">
+  <w:abstractNum w:abstractNumId="17" w15:restartNumberingAfterBreak="0">
     <w:nsid w:val="4E49141C"/>
     <w:multiLevelType w:val="multilevel"/>
     <w:tmpl w:val="5A9CA2AE"/>
@@ -3380,7 +5029,7 @@
       </w:rPr>
     </w:lvl>
   </w:abstractNum>
-  <w:abstractNum w:abstractNumId="10" w15:restartNumberingAfterBreak="0">
+  <w:abstractNum w:abstractNumId="18" w15:restartNumberingAfterBreak="0">
     <w:nsid w:val="50B73CA5"/>
     <w:multiLevelType w:val="multilevel"/>
     <w:tmpl w:val="675CD15C"/>
@@ -3529,7 +5178,7 @@
       </w:rPr>
     </w:lvl>
   </w:abstractNum>
-  <w:abstractNum w:abstractNumId="11" w15:restartNumberingAfterBreak="0">
+  <w:abstractNum w:abstractNumId="19" w15:restartNumberingAfterBreak="0">
     <w:nsid w:val="51D222AC"/>
     <w:multiLevelType w:val="multilevel"/>
     <w:tmpl w:val="B3E25296"/>
@@ -3678,7 +5327,7 @@
       </w:rPr>
     </w:lvl>
   </w:abstractNum>
-  <w:abstractNum w:abstractNumId="12" w15:restartNumberingAfterBreak="0">
+  <w:abstractNum w:abstractNumId="20" w15:restartNumberingAfterBreak="0">
     <w:nsid w:val="533A324B"/>
     <w:multiLevelType w:val="multilevel"/>
     <w:tmpl w:val="56BCC45C"/>
@@ -3827,7 +5476,7 @@
       </w:rPr>
     </w:lvl>
   </w:abstractNum>
-  <w:abstractNum w:abstractNumId="13" w15:restartNumberingAfterBreak="0">
+  <w:abstractNum w:abstractNumId="21" w15:restartNumberingAfterBreak="0">
     <w:nsid w:val="540E6F18"/>
     <w:multiLevelType w:val="multilevel"/>
     <w:tmpl w:val="87DCA8E0"/>
@@ -3976,7 +5625,7 @@
       </w:rPr>
     </w:lvl>
   </w:abstractNum>
-  <w:abstractNum w:abstractNumId="14" w15:restartNumberingAfterBreak="0">
+  <w:abstractNum w:abstractNumId="22" w15:restartNumberingAfterBreak="0">
     <w:nsid w:val="5BB16C30"/>
     <w:multiLevelType w:val="multilevel"/>
     <w:tmpl w:val="6DC0F07A"/>
@@ -4125,7 +5774,7 @@
       </w:rPr>
     </w:lvl>
   </w:abstractNum>
-  <w:abstractNum w:abstractNumId="15" w15:restartNumberingAfterBreak="0">
+  <w:abstractNum w:abstractNumId="23" w15:restartNumberingAfterBreak="0">
     <w:nsid w:val="61110AC8"/>
     <w:multiLevelType w:val="multilevel"/>
     <w:tmpl w:val="92320496"/>
@@ -4274,7 +5923,7 @@
       </w:rPr>
     </w:lvl>
   </w:abstractNum>
-  <w:abstractNum w:abstractNumId="16" w15:restartNumberingAfterBreak="0">
+  <w:abstractNum w:abstractNumId="24" w15:restartNumberingAfterBreak="0">
     <w:nsid w:val="623D0706"/>
     <w:multiLevelType w:val="multilevel"/>
     <w:tmpl w:val="3116859E"/>
@@ -4423,7 +6072,7 @@
       </w:rPr>
     </w:lvl>
   </w:abstractNum>
-  <w:abstractNum w:abstractNumId="17" w15:restartNumberingAfterBreak="0">
+  <w:abstractNum w:abstractNumId="25" w15:restartNumberingAfterBreak="0">
     <w:nsid w:val="69E65E00"/>
     <w:multiLevelType w:val="multilevel"/>
     <w:tmpl w:val="04E893C4"/>
@@ -4536,7 +6185,7 @@
       </w:pPr>
     </w:lvl>
   </w:abstractNum>
-  <w:abstractNum w:abstractNumId="18" w15:restartNumberingAfterBreak="0">
+  <w:abstractNum w:abstractNumId="26" w15:restartNumberingAfterBreak="0">
     <w:nsid w:val="6CF83EE6"/>
     <w:multiLevelType w:val="multilevel"/>
     <w:tmpl w:val="70AA93B2"/>
@@ -4685,7 +6334,156 @@
       </w:rPr>
     </w:lvl>
   </w:abstractNum>
-  <w:abstractNum w:abstractNumId="19" w15:restartNumberingAfterBreak="0">
+  <w:abstractNum w:abstractNumId="27" w15:restartNumberingAfterBreak="0">
+    <w:nsid w:val="743D265B"/>
+    <w:multiLevelType w:val="multilevel"/>
+    <w:tmpl w:val="3400487C"/>
+    <w:lvl w:ilvl="0">
+      <w:start w:val="1"/>
+      <w:numFmt w:val="bullet"/>
+      <w:lvlText w:val=""/>
+      <w:lvlJc w:val="left"/>
+      <w:pPr>
+        <w:tabs>
+          <w:tab w:val="num" w:pos="720"/>
+        </w:tabs>
+        <w:ind w:left="720" w:hanging="360"/>
+      </w:pPr>
+      <w:rPr>
+        <w:rFonts w:ascii="Symbol" w:hAnsi="Symbol" w:hint="default"/>
+        <w:sz w:val="20"/>
+      </w:rPr>
+    </w:lvl>
+    <w:lvl w:ilvl="1" w:tentative="1">
+      <w:start w:val="1"/>
+      <w:numFmt w:val="bullet"/>
+      <w:lvlText w:val=""/>
+      <w:lvlJc w:val="left"/>
+      <w:pPr>
+        <w:tabs>
+          <w:tab w:val="num" w:pos="1440"/>
+        </w:tabs>
+        <w:ind w:left="1440" w:hanging="360"/>
+      </w:pPr>
+      <w:rPr>
+        <w:rFonts w:ascii="Symbol" w:hAnsi="Symbol" w:hint="default"/>
+        <w:sz w:val="20"/>
+      </w:rPr>
+    </w:lvl>
+    <w:lvl w:ilvl="2" w:tentative="1">
+      <w:start w:val="1"/>
+      <w:numFmt w:val="bullet"/>
+      <w:lvlText w:val=""/>
+      <w:lvlJc w:val="left"/>
+      <w:pPr>
+        <w:tabs>
+          <w:tab w:val="num" w:pos="2160"/>
+        </w:tabs>
+        <w:ind w:left="2160" w:hanging="360"/>
+      </w:pPr>
+      <w:rPr>
+        <w:rFonts w:ascii="Symbol" w:hAnsi="Symbol" w:hint="default"/>
+        <w:sz w:val="20"/>
+      </w:rPr>
+    </w:lvl>
+    <w:lvl w:ilvl="3" w:tentative="1">
+      <w:start w:val="1"/>
+      <w:numFmt w:val="bullet"/>
+      <w:lvlText w:val=""/>
+      <w:lvlJc w:val="left"/>
+      <w:pPr>
+        <w:tabs>
+          <w:tab w:val="num" w:pos="2880"/>
+        </w:tabs>
+        <w:ind w:left="2880" w:hanging="360"/>
+      </w:pPr>
+      <w:rPr>
+        <w:rFonts w:ascii="Symbol" w:hAnsi="Symbol" w:hint="default"/>
+        <w:sz w:val="20"/>
+      </w:rPr>
+    </w:lvl>
+    <w:lvl w:ilvl="4" w:tentative="1">
+      <w:start w:val="1"/>
+      <w:numFmt w:val="bullet"/>
+      <w:lvlText w:val=""/>
+      <w:lvlJc w:val="left"/>
+      <w:pPr>
+        <w:tabs>
+          <w:tab w:val="num" w:pos="3600"/>
+        </w:tabs>
+        <w:ind w:left="3600" w:hanging="360"/>
+      </w:pPr>
+      <w:rPr>
+        <w:rFonts w:ascii="Symbol" w:hAnsi="Symbol" w:hint="default"/>
+        <w:sz w:val="20"/>
+      </w:rPr>
+    </w:lvl>
+    <w:lvl w:ilvl="5" w:tentative="1">
+      <w:start w:val="1"/>
+      <w:numFmt w:val="bullet"/>
+      <w:lvlText w:val=""/>
+      <w:lvlJc w:val="left"/>
+      <w:pPr>
+        <w:tabs>
+          <w:tab w:val="num" w:pos="4320"/>
+        </w:tabs>
+        <w:ind w:left="4320" w:hanging="360"/>
+      </w:pPr>
+      <w:rPr>
+        <w:rFonts w:ascii="Symbol" w:hAnsi="Symbol" w:hint="default"/>
+        <w:sz w:val="20"/>
+      </w:rPr>
+    </w:lvl>
+    <w:lvl w:ilvl="6" w:tentative="1">
+      <w:start w:val="1"/>
+      <w:numFmt w:val="bullet"/>
+      <w:lvlText w:val=""/>
+      <w:lvlJc w:val="left"/>
+      <w:pPr>
+        <w:tabs>
+          <w:tab w:val="num" w:pos="5040"/>
+        </w:tabs>
+        <w:ind w:left="5040" w:hanging="360"/>
+      </w:pPr>
+      <w:rPr>
+        <w:rFonts w:ascii="Symbol" w:hAnsi="Symbol" w:hint="default"/>
+        <w:sz w:val="20"/>
+      </w:rPr>
+    </w:lvl>
+    <w:lvl w:ilvl="7" w:tentative="1">
+      <w:start w:val="1"/>
+      <w:numFmt w:val="bullet"/>
+      <w:lvlText w:val=""/>
+      <w:lvlJc w:val="left"/>
+      <w:pPr>
+        <w:tabs>
+          <w:tab w:val="num" w:pos="5760"/>
+        </w:tabs>
+        <w:ind w:left="5760" w:hanging="360"/>
+      </w:pPr>
+      <w:rPr>
+        <w:rFonts w:ascii="Symbol" w:hAnsi="Symbol" w:hint="default"/>
+        <w:sz w:val="20"/>
+      </w:rPr>
+    </w:lvl>
+    <w:lvl w:ilvl="8" w:tentative="1">
+      <w:start w:val="1"/>
+      <w:numFmt w:val="bullet"/>
+      <w:lvlText w:val=""/>
+      <w:lvlJc w:val="left"/>
+      <w:pPr>
+        <w:tabs>
+          <w:tab w:val="num" w:pos="6480"/>
+        </w:tabs>
+        <w:ind w:left="6480" w:hanging="360"/>
+      </w:pPr>
+      <w:rPr>
+        <w:rFonts w:ascii="Symbol" w:hAnsi="Symbol" w:hint="default"/>
+        <w:sz w:val="20"/>
+      </w:rPr>
+    </w:lvl>
+  </w:abstractNum>
+  <w:abstractNum w:abstractNumId="28" w15:restartNumberingAfterBreak="0">
     <w:nsid w:val="758A781F"/>
     <w:multiLevelType w:val="multilevel"/>
     <w:tmpl w:val="2E141854"/>
@@ -4834,7 +6632,156 @@
       </w:rPr>
     </w:lvl>
   </w:abstractNum>
-  <w:abstractNum w:abstractNumId="20" w15:restartNumberingAfterBreak="0">
+  <w:abstractNum w:abstractNumId="29" w15:restartNumberingAfterBreak="0">
+    <w:nsid w:val="7E48662E"/>
+    <w:multiLevelType w:val="multilevel"/>
+    <w:tmpl w:val="7E2CF740"/>
+    <w:lvl w:ilvl="0">
+      <w:start w:val="1"/>
+      <w:numFmt w:val="bullet"/>
+      <w:lvlText w:val=""/>
+      <w:lvlJc w:val="left"/>
+      <w:pPr>
+        <w:tabs>
+          <w:tab w:val="num" w:pos="720"/>
+        </w:tabs>
+        <w:ind w:left="720" w:hanging="360"/>
+      </w:pPr>
+      <w:rPr>
+        <w:rFonts w:ascii="Symbol" w:hAnsi="Symbol" w:hint="default"/>
+        <w:sz w:val="20"/>
+      </w:rPr>
+    </w:lvl>
+    <w:lvl w:ilvl="1" w:tentative="1">
+      <w:start w:val="1"/>
+      <w:numFmt w:val="bullet"/>
+      <w:lvlText w:val=""/>
+      <w:lvlJc w:val="left"/>
+      <w:pPr>
+        <w:tabs>
+          <w:tab w:val="num" w:pos="1440"/>
+        </w:tabs>
+        <w:ind w:left="1440" w:hanging="360"/>
+      </w:pPr>
+      <w:rPr>
+        <w:rFonts w:ascii="Symbol" w:hAnsi="Symbol" w:hint="default"/>
+        <w:sz w:val="20"/>
+      </w:rPr>
+    </w:lvl>
+    <w:lvl w:ilvl="2" w:tentative="1">
+      <w:start w:val="1"/>
+      <w:numFmt w:val="bullet"/>
+      <w:lvlText w:val=""/>
+      <w:lvlJc w:val="left"/>
+      <w:pPr>
+        <w:tabs>
+          <w:tab w:val="num" w:pos="2160"/>
+        </w:tabs>
+        <w:ind w:left="2160" w:hanging="360"/>
+      </w:pPr>
+      <w:rPr>
+        <w:rFonts w:ascii="Symbol" w:hAnsi="Symbol" w:hint="default"/>
+        <w:sz w:val="20"/>
+      </w:rPr>
+    </w:lvl>
+    <w:lvl w:ilvl="3" w:tentative="1">
+      <w:start w:val="1"/>
+      <w:numFmt w:val="bullet"/>
+      <w:lvlText w:val=""/>
+      <w:lvlJc w:val="left"/>
+      <w:pPr>
+        <w:tabs>
+          <w:tab w:val="num" w:pos="2880"/>
+        </w:tabs>
+        <w:ind w:left="2880" w:hanging="360"/>
+      </w:pPr>
+      <w:rPr>
+        <w:rFonts w:ascii="Symbol" w:hAnsi="Symbol" w:hint="default"/>
+        <w:sz w:val="20"/>
+      </w:rPr>
+    </w:lvl>
+    <w:lvl w:ilvl="4" w:tentative="1">
+      <w:start w:val="1"/>
+      <w:numFmt w:val="bullet"/>
+      <w:lvlText w:val=""/>
+      <w:lvlJc w:val="left"/>
+      <w:pPr>
+        <w:tabs>
+          <w:tab w:val="num" w:pos="3600"/>
+        </w:tabs>
+        <w:ind w:left="3600" w:hanging="360"/>
+      </w:pPr>
+      <w:rPr>
+        <w:rFonts w:ascii="Symbol" w:hAnsi="Symbol" w:hint="default"/>
+        <w:sz w:val="20"/>
+      </w:rPr>
+    </w:lvl>
+    <w:lvl w:ilvl="5" w:tentative="1">
+      <w:start w:val="1"/>
+      <w:numFmt w:val="bullet"/>
+      <w:lvlText w:val=""/>
+      <w:lvlJc w:val="left"/>
+      <w:pPr>
+        <w:tabs>
+          <w:tab w:val="num" w:pos="4320"/>
+        </w:tabs>
+        <w:ind w:left="4320" w:hanging="360"/>
+      </w:pPr>
+      <w:rPr>
+        <w:rFonts w:ascii="Symbol" w:hAnsi="Symbol" w:hint="default"/>
+        <w:sz w:val="20"/>
+      </w:rPr>
+    </w:lvl>
+    <w:lvl w:ilvl="6" w:tentative="1">
+      <w:start w:val="1"/>
+      <w:numFmt w:val="bullet"/>
+      <w:lvlText w:val=""/>
+      <w:lvlJc w:val="left"/>
+      <w:pPr>
+        <w:tabs>
+          <w:tab w:val="num" w:pos="5040"/>
+        </w:tabs>
+        <w:ind w:left="5040" w:hanging="360"/>
+      </w:pPr>
+      <w:rPr>
+        <w:rFonts w:ascii="Symbol" w:hAnsi="Symbol" w:hint="default"/>
+        <w:sz w:val="20"/>
+      </w:rPr>
+    </w:lvl>
+    <w:lvl w:ilvl="7" w:tentative="1">
+      <w:start w:val="1"/>
+      <w:numFmt w:val="bullet"/>
+      <w:lvlText w:val=""/>
+      <w:lvlJc w:val="left"/>
+      <w:pPr>
+        <w:tabs>
+          <w:tab w:val="num" w:pos="5760"/>
+        </w:tabs>
+        <w:ind w:left="5760" w:hanging="360"/>
+      </w:pPr>
+      <w:rPr>
+        <w:rFonts w:ascii="Symbol" w:hAnsi="Symbol" w:hint="default"/>
+        <w:sz w:val="20"/>
+      </w:rPr>
+    </w:lvl>
+    <w:lvl w:ilvl="8" w:tentative="1">
+      <w:start w:val="1"/>
+      <w:numFmt w:val="bullet"/>
+      <w:lvlText w:val=""/>
+      <w:lvlJc w:val="left"/>
+      <w:pPr>
+        <w:tabs>
+          <w:tab w:val="num" w:pos="6480"/>
+        </w:tabs>
+        <w:ind w:left="6480" w:hanging="360"/>
+      </w:pPr>
+      <w:rPr>
+        <w:rFonts w:ascii="Symbol" w:hAnsi="Symbol" w:hint="default"/>
+        <w:sz w:val="20"/>
+      </w:rPr>
+    </w:lvl>
+  </w:abstractNum>
+  <w:abstractNum w:abstractNumId="30" w15:restartNumberingAfterBreak="0">
     <w:nsid w:val="7FBB780C"/>
     <w:multiLevelType w:val="multilevel"/>
     <w:tmpl w:val="902ECCD2"/>
@@ -4948,67 +6895,97 @@
     </w:lvl>
   </w:abstractNum>
   <w:num w:numId="1" w16cid:durableId="1961371284">
-    <w:abstractNumId w:val="4"/>
+    <w:abstractNumId w:val="6"/>
   </w:num>
   <w:num w:numId="2" w16cid:durableId="1367027804">
-    <w:abstractNumId w:val="18"/>
+    <w:abstractNumId w:val="26"/>
   </w:num>
   <w:num w:numId="3" w16cid:durableId="1668631311">
     <w:abstractNumId w:val="0"/>
   </w:num>
   <w:num w:numId="4" w16cid:durableId="1732652887">
+    <w:abstractNumId w:val="19"/>
+  </w:num>
+  <w:num w:numId="5" w16cid:durableId="956135389">
+    <w:abstractNumId w:val="20"/>
+  </w:num>
+  <w:num w:numId="6" w16cid:durableId="1789198818">
+    <w:abstractNumId w:val="7"/>
+  </w:num>
+  <w:num w:numId="7" w16cid:durableId="269972398">
+    <w:abstractNumId w:val="22"/>
+  </w:num>
+  <w:num w:numId="8" w16cid:durableId="817572598">
+    <w:abstractNumId w:val="5"/>
+  </w:num>
+  <w:num w:numId="9" w16cid:durableId="670715461">
+    <w:abstractNumId w:val="23"/>
+  </w:num>
+  <w:num w:numId="10" w16cid:durableId="1276332657">
+    <w:abstractNumId w:val="24"/>
+  </w:num>
+  <w:num w:numId="11" w16cid:durableId="1085541468">
+    <w:abstractNumId w:val="2"/>
+  </w:num>
+  <w:num w:numId="12" w16cid:durableId="729813302">
+    <w:abstractNumId w:val="25"/>
+  </w:num>
+  <w:num w:numId="13" w16cid:durableId="219287181">
+    <w:abstractNumId w:val="30"/>
+  </w:num>
+  <w:num w:numId="14" w16cid:durableId="1478569081">
+    <w:abstractNumId w:val="28"/>
+  </w:num>
+  <w:num w:numId="15" w16cid:durableId="1784617126">
+    <w:abstractNumId w:val="16"/>
+  </w:num>
+  <w:num w:numId="16" w16cid:durableId="488444713">
+    <w:abstractNumId w:val="18"/>
+  </w:num>
+  <w:num w:numId="17" w16cid:durableId="1473865838">
+    <w:abstractNumId w:val="14"/>
+  </w:num>
+  <w:num w:numId="18" w16cid:durableId="1131827971">
+    <w:abstractNumId w:val="3"/>
+  </w:num>
+  <w:num w:numId="19" w16cid:durableId="801387460">
+    <w:abstractNumId w:val="17"/>
+  </w:num>
+  <w:num w:numId="20" w16cid:durableId="219755788">
+    <w:abstractNumId w:val="9"/>
+  </w:num>
+  <w:num w:numId="21" w16cid:durableId="196814451">
+    <w:abstractNumId w:val="21"/>
+  </w:num>
+  <w:num w:numId="22" w16cid:durableId="166287831">
+    <w:abstractNumId w:val="12"/>
+  </w:num>
+  <w:num w:numId="23" w16cid:durableId="1636062703">
+    <w:abstractNumId w:val="15"/>
+  </w:num>
+  <w:num w:numId="24" w16cid:durableId="651569532">
+    <w:abstractNumId w:val="27"/>
+  </w:num>
+  <w:num w:numId="25" w16cid:durableId="1769961410">
+    <w:abstractNumId w:val="8"/>
+  </w:num>
+  <w:num w:numId="26" w16cid:durableId="1853033479">
+    <w:abstractNumId w:val="4"/>
+  </w:num>
+  <w:num w:numId="27" w16cid:durableId="1389182724">
+    <w:abstractNumId w:val="10"/>
+  </w:num>
+  <w:num w:numId="28" w16cid:durableId="1210071178">
     <w:abstractNumId w:val="11"/>
   </w:num>
-  <w:num w:numId="5" w16cid:durableId="956135389">
-    <w:abstractNumId w:val="12"/>
+  <w:num w:numId="29" w16cid:durableId="2055808716">
+    <w:abstractNumId w:val="13"/>
   </w:num>
-  <w:num w:numId="6" w16cid:durableId="1789198818">
-    <w:abstractNumId w:val="5"/>
-  </w:num>
-  <w:num w:numId="7" w16cid:durableId="269972398">
-    <w:abstractNumId w:val="14"/>
-  </w:num>
-  <w:num w:numId="8" w16cid:durableId="817572598">
-    <w:abstractNumId w:val="3"/>
-  </w:num>
-  <w:num w:numId="9" w16cid:durableId="670715461">
-    <w:abstractNumId w:val="15"/>
-  </w:num>
-  <w:num w:numId="10" w16cid:durableId="1276332657">
-    <w:abstractNumId w:val="16"/>
-  </w:num>
-  <w:num w:numId="11" w16cid:durableId="1085541468">
+  <w:num w:numId="30" w16cid:durableId="951592037">
     <w:abstractNumId w:val="1"/>
   </w:num>
-  <w:num w:numId="12" w16cid:durableId="729813302">
-    <w:abstractNumId w:val="17"/>
-  </w:num>
-  <w:num w:numId="13" w16cid:durableId="219287181">
-    <w:abstractNumId w:val="20"/>
-  </w:num>
-  <w:num w:numId="14" w16cid:durableId="1478569081">
-    <w:abstractNumId w:val="19"/>
-  </w:num>
-  <w:num w:numId="15" w16cid:durableId="1784617126">
-    <w:abstractNumId w:val="8"/>
-  </w:num>
-  <w:num w:numId="16" w16cid:durableId="488444713">
-    <w:abstractNumId w:val="10"/>
-  </w:num>
-  <w:num w:numId="17" w16cid:durableId="1473865838">
-    <w:abstractNumId w:val="7"/>
-  </w:num>
-  <w:num w:numId="18" w16cid:durableId="1131827971">
-    <w:abstractNumId w:val="2"/>
-  </w:num>
-  <w:num w:numId="19" w16cid:durableId="801387460">
-    <w:abstractNumId w:val="9"/>
-  </w:num>
-  <w:num w:numId="20" w16cid:durableId="219755788">
-    <w:abstractNumId w:val="6"/>
-  </w:num>
-  <w:num w:numId="21" w16cid:durableId="196814451">
-    <w:abstractNumId w:val="13"/>
+  <w:num w:numId="31" w16cid:durableId="1780370132">
+    <w:abstractNumId w:val="29"/>
   </w:num>
 </w:numbering>
 </file>

</xml_diff>

<commit_message>
Phase 3: Integrate WebRTC for P2P video and audio streaming
</commit_message>
<xml_diff>
--- a/TaiLieuDacTa.docx
+++ b/TaiLieuDacTa.docx
@@ -2404,6 +2404,419 @@
         <w:t>A và B chat với nhau để đảm bảo tin nhắn hiển thị tức thời (real-time) mà không cần tải lại trang.</w:t>
       </w:r>
     </w:p>
+    <w:p>
+      <w:r>
+        <w:br w:type="page"/>
+      </w:r>
+    </w:p>
+    <w:p>
+      <w:pPr>
+        <w:numPr>
+          <w:ilvl w:val="0"/>
+          <w:numId w:val="32"/>
+        </w:numPr>
+        <w:rPr>
+          <w:b/>
+          <w:bCs/>
+        </w:rPr>
+      </w:pPr>
+      <w:r>
+        <w:rPr>
+          <w:b/>
+          <w:bCs/>
+        </w:rPr>
+        <w:lastRenderedPageBreak/>
+        <w:t>WaveMeet - Phase 3 Implementation Plan</w:t>
+      </w:r>
+    </w:p>
+    <w:p>
+      <w:r>
+        <w:t>Trong Phase 3 này, chúng ta sẽ bước vào phần kỹ thuật quan trọng nhất của hệ thống: </w:t>
+      </w:r>
+      <w:r>
+        <w:rPr>
+          <w:b/>
+          <w:bCs/>
+        </w:rPr>
+        <w:t>Truyền phát Video &amp; Audio P2P qua WebRTC</w:t>
+      </w:r>
+      <w:r>
+        <w:t>. Các client sẽ giao tiếp (Signaling) với nhau để trao đổi cấu hình (SDP) và địa chỉ kết nối (ICE) thông qua chính luồng WebSockets (Django Channels) mà chúng ta đã xây dựng.</w:t>
+      </w:r>
+    </w:p>
+    <w:p>
+      <w:pPr>
+        <w:rPr>
+          <w:b/>
+          <w:bCs/>
+        </w:rPr>
+      </w:pPr>
+      <w:r>
+        <w:rPr>
+          <w:b/>
+          <w:bCs/>
+        </w:rPr>
+        <w:t>User Review Required</w:t>
+      </w:r>
+    </w:p>
+    <w:p>
+      <w:r>
+        <w:t>IMPORTANT</w:t>
+      </w:r>
+    </w:p>
+    <w:p>
+      <w:r>
+        <w:rPr>
+          <w:b/>
+          <w:bCs/>
+        </w:rPr>
+        <w:t>Kiến trúc Mesh P2P &amp; Signaling Protocol:</w:t>
+      </w:r>
+      <w:r>
+        <w:t> Để hỗ trợ Grid View cho nhiều người (1x1, 2x2, 3x3), tôi sẽ thiết lập kiến trúc </w:t>
+      </w:r>
+      <w:r>
+        <w:rPr>
+          <w:b/>
+          <w:bCs/>
+        </w:rPr>
+        <w:t>Mesh P2P</w:t>
+      </w:r>
+      <w:r>
+        <w:t> (Mọi người kết nối trực tiếp với tất cả những người còn lại). Máy chủ Signaling (Django Channels) sẽ làm nhiệm vụ broadcast các gói tin có nhãn (offer, answer, ice_candidate) kèm theo target_user. Các trình duyệt sẽ tự phân loại gói tin thuộc về mình để thiết lập kết nối RTCPeerConnection. Bạn có đồng ý với thiết kế Signaling này không?</w:t>
+      </w:r>
+    </w:p>
+    <w:p>
+      <w:r>
+        <w:t>TIP</w:t>
+      </w:r>
+    </w:p>
+    <w:p>
+      <w:r>
+        <w:rPr>
+          <w:b/>
+          <w:bCs/>
+        </w:rPr>
+        <w:t>STUN/TURN Server:</w:t>
+      </w:r>
+      <w:r>
+        <w:t> Ở môi trường local hiện tại, WebRTC có thể hoạt động mà không cần TURN server. Tuy nhiên, tôi sẽ code sẵn việc khai báo public STUN server của Google (ví dụ: stun:stun.l.google.com:19302) trong hàm khởi tạo RTCPeerConnection để sát với thực tế. Khi deploy Phase 4, chúng ta có thể thêm TURN server nếu cần.</w:t>
+      </w:r>
+    </w:p>
+    <w:p>
+      <w:pPr>
+        <w:rPr>
+          <w:b/>
+          <w:bCs/>
+        </w:rPr>
+      </w:pPr>
+      <w:r>
+        <w:rPr>
+          <w:b/>
+          <w:bCs/>
+        </w:rPr>
+        <w:t>Proposed Changes</w:t>
+      </w:r>
+    </w:p>
+    <w:p>
+      <w:r>
+        <w:t>1. Nâng cấp Signaling Server</w:t>
+      </w:r>
+    </w:p>
+    <w:p>
+      <w:r>
+        <w:t>Chúng ta cần làm cho ChatConsumer xử lý được nhiều loại gói tin (actions) thay vì chỉ tin nhắn chat văn bản.</w:t>
+      </w:r>
+    </w:p>
+    <w:p>
+      <w:r>
+        <w:t>[MODIFY] chat/consumers.py</w:t>
+      </w:r>
+    </w:p>
+    <w:p>
+      <w:pPr>
+        <w:numPr>
+          <w:ilvl w:val="0"/>
+          <w:numId w:val="32"/>
+        </w:numPr>
+      </w:pPr>
+      <w:r>
+        <w:t>Thay đổi hàm receive để đọc biến action từ JSON (ví dụ: action: 'chat_message', action: 'offer', action: 'answer', action: 'ice_candidate', action: 'peer_joined').</w:t>
+      </w:r>
+    </w:p>
+    <w:p>
+      <w:pPr>
+        <w:numPr>
+          <w:ilvl w:val="0"/>
+          <w:numId w:val="32"/>
+        </w:numPr>
+      </w:pPr>
+      <w:r>
+        <w:t>Mọi gói tin sẽ được broadcast qua room_group và kèm theo tên của người gửi (sender).</w:t>
+      </w:r>
+    </w:p>
+    <w:p>
+      <w:r>
+        <w:t>2. Giao diện Room &amp; Grid View</w:t>
+      </w:r>
+    </w:p>
+    <w:p>
+      <w:r>
+        <w:lastRenderedPageBreak/>
+        <w:t>Bổ sung các thành phần giao diện cho Video và điều khiển thiết bị.</w:t>
+      </w:r>
+    </w:p>
+    <w:p>
+      <w:r>
+        <w:t>[MODIFY] chat/templates/chat/room.html</w:t>
+      </w:r>
+    </w:p>
+    <w:p>
+      <w:pPr>
+        <w:numPr>
+          <w:ilvl w:val="0"/>
+          <w:numId w:val="33"/>
+        </w:numPr>
+      </w:pPr>
+      <w:r>
+        <w:t>Thay thế thẻ &lt;div class="bg-gray-900..."&gt; hiện tại bằng một Grid Container có khả năng auto-scale (Grid View).</w:t>
+      </w:r>
+    </w:p>
+    <w:p>
+      <w:pPr>
+        <w:numPr>
+          <w:ilvl w:val="0"/>
+          <w:numId w:val="33"/>
+        </w:numPr>
+      </w:pPr>
+      <w:r>
+        <w:t>Tạo &lt;video id="local-video" autoplay muted&gt; dành cho người dùng hiện tại.</w:t>
+      </w:r>
+    </w:p>
+    <w:p>
+      <w:pPr>
+        <w:numPr>
+          <w:ilvl w:val="0"/>
+          <w:numId w:val="33"/>
+        </w:numPr>
+      </w:pPr>
+      <w:r>
+        <w:t>Thêm thanh điều khiển (Toolbar) với 2 nút: </w:t>
+      </w:r>
+      <w:r>
+        <w:rPr>
+          <w:b/>
+          <w:bCs/>
+        </w:rPr>
+        <w:t>Bật/Tắt Mic</w:t>
+      </w:r>
+      <w:r>
+        <w:t> và </w:t>
+      </w:r>
+      <w:r>
+        <w:rPr>
+          <w:b/>
+          <w:bCs/>
+        </w:rPr>
+        <w:t>Bật/Tắt Camera</w:t>
+      </w:r>
+      <w:r>
+        <w:t>.</w:t>
+      </w:r>
+    </w:p>
+    <w:p>
+      <w:pPr>
+        <w:numPr>
+          <w:ilvl w:val="0"/>
+          <w:numId w:val="33"/>
+        </w:numPr>
+      </w:pPr>
+      <w:r>
+        <w:t>Css Tailwind sẽ đảm bảo việc chia lưới 1x1, 2x2, 3x3 đẹp mắt khi có người mới.</w:t>
+      </w:r>
+    </w:p>
+    <w:p>
+      <w:r>
+        <w:t>3. Tích hợp JavaScript WebRTC</w:t>
+      </w:r>
+    </w:p>
+    <w:p>
+      <w:r>
+        <w:t>Viết script xử lý logic của WebRTC.</w:t>
+      </w:r>
+    </w:p>
+    <w:p>
+      <w:r>
+        <w:t>[MODIFY] chat/templates/chat/room.html (Phần &lt;script&gt;)</w:t>
+      </w:r>
+    </w:p>
+    <w:p>
+      <w:pPr>
+        <w:numPr>
+          <w:ilvl w:val="0"/>
+          <w:numId w:val="34"/>
+        </w:numPr>
+      </w:pPr>
+      <w:r>
+        <w:t>Dùng navigator.mediaDevices.getUserMedia để xin quyền Camera/Mic.</w:t>
+      </w:r>
+    </w:p>
+    <w:p>
+      <w:pPr>
+        <w:numPr>
+          <w:ilvl w:val="0"/>
+          <w:numId w:val="34"/>
+        </w:numPr>
+      </w:pPr>
+      <w:r>
+        <w:t>Khi WebSocket kết nối thành công, gửi gói tin action: 'peer_joined' để báo cho những người trong phòng.</w:t>
+      </w:r>
+    </w:p>
+    <w:p>
+      <w:pPr>
+        <w:numPr>
+          <w:ilvl w:val="0"/>
+          <w:numId w:val="34"/>
+        </w:numPr>
+      </w:pPr>
+      <w:r>
+        <w:t>Khởi tạo tập hợp peers = {} lưu trữ các đối tượng RTCPeerConnection ứng với từng người tham gia.</w:t>
+      </w:r>
+    </w:p>
+    <w:p>
+      <w:pPr>
+        <w:numPr>
+          <w:ilvl w:val="0"/>
+          <w:numId w:val="34"/>
+        </w:numPr>
+      </w:pPr>
+      <w:r>
+        <w:rPr>
+          <w:b/>
+          <w:bCs/>
+        </w:rPr>
+        <w:t>Quy trình kết nối</w:t>
+      </w:r>
+      <w:r>
+        <w:t>:</w:t>
+      </w:r>
+    </w:p>
+    <w:p>
+      <w:pPr>
+        <w:numPr>
+          <w:ilvl w:val="1"/>
+          <w:numId w:val="34"/>
+        </w:numPr>
+      </w:pPr>
+      <w:r>
+        <w:t>Người cũ trong phòng nhận được peer_joined, sẽ khởi tạo RTCPeerConnection, add track video của mình, tạo Offer và gửi ngược lại cho người mới.</w:t>
+      </w:r>
+    </w:p>
+    <w:p>
+      <w:pPr>
+        <w:numPr>
+          <w:ilvl w:val="1"/>
+          <w:numId w:val="34"/>
+        </w:numPr>
+      </w:pPr>
+      <w:r>
+        <w:t>Người mới nhận Offer, gọi setRemoteDescription, tạo Answer và gửi lại.</w:t>
+      </w:r>
+    </w:p>
+    <w:p>
+      <w:pPr>
+        <w:numPr>
+          <w:ilvl w:val="1"/>
+          <w:numId w:val="34"/>
+        </w:numPr>
+      </w:pPr>
+      <w:r>
+        <w:t>Quá trình trao đổi các ICE Candidate diễn ra song song để thiết lập luồng Media.</w:t>
+      </w:r>
+    </w:p>
+    <w:p>
+      <w:pPr>
+        <w:numPr>
+          <w:ilvl w:val="0"/>
+          <w:numId w:val="34"/>
+        </w:numPr>
+      </w:pPr>
+      <w:r>
+        <w:rPr>
+          <w:b/>
+          <w:bCs/>
+        </w:rPr>
+        <w:t>Xử lý sự kiện</w:t>
+      </w:r>
+      <w:r>
+        <w:t>: Khi nhận được track mới (ontrack), sẽ tự động tạo một thẻ &lt;video&gt; mới và gắn vào Grid Container.</w:t>
+      </w:r>
+    </w:p>
+    <w:p>
+      <w:pPr>
+        <w:rPr>
+          <w:b/>
+          <w:bCs/>
+        </w:rPr>
+      </w:pPr>
+      <w:r>
+        <w:rPr>
+          <w:b/>
+          <w:bCs/>
+        </w:rPr>
+        <w:t>Verification Plan</w:t>
+      </w:r>
+    </w:p>
+    <w:p>
+      <w:r>
+        <w:t>Manual Verification</w:t>
+      </w:r>
+    </w:p>
+    <w:p>
+      <w:pPr>
+        <w:numPr>
+          <w:ilvl w:val="0"/>
+          <w:numId w:val="35"/>
+        </w:numPr>
+      </w:pPr>
+      <w:r>
+        <w:t>Mở 2 tab ẩn danh, tham gia cùng một Room ID.</w:t>
+      </w:r>
+    </w:p>
+    <w:p>
+      <w:pPr>
+        <w:numPr>
+          <w:ilvl w:val="0"/>
+          <w:numId w:val="35"/>
+        </w:numPr>
+      </w:pPr>
+      <w:r>
+        <w:t>Trình duyệt sẽ hỏi quyền truy cập Camera/Mic. Cấp quyền cho cả 2 tab.</w:t>
+      </w:r>
+    </w:p>
+    <w:p>
+      <w:pPr>
+        <w:numPr>
+          <w:ilvl w:val="0"/>
+          <w:numId w:val="35"/>
+        </w:numPr>
+      </w:pPr>
+      <w:r>
+        <w:t>Ngay sau đó, cả 2 tab sẽ tự động hiển thị video của nhau theo bố cục Grid.</w:t>
+      </w:r>
+    </w:p>
+    <w:p>
+      <w:pPr>
+        <w:numPr>
+          <w:ilvl w:val="0"/>
+          <w:numId w:val="35"/>
+        </w:numPr>
+      </w:pPr>
+      <w:r>
+        <w:lastRenderedPageBreak/>
+        <w:t>Ấn thử nút Bật/Tắt Mic và Camera, biểu tượng sẽ thay đổi và luồng dữ liệu (video track) sẽ bị vô hiệu hóa/kích hoạt theo.</w:t>
+      </w:r>
+    </w:p>
     <w:p/>
     <w:sectPr>
       <w:pgSz w:w="12240" w:h="15840"/>
@@ -4583,6 +4996,155 @@
     </w:lvl>
   </w:abstractNum>
   <w:abstractNum w:abstractNumId="15" w15:restartNumberingAfterBreak="0">
+    <w:nsid w:val="41CF68D1"/>
+    <w:multiLevelType w:val="multilevel"/>
+    <w:tmpl w:val="AD28734C"/>
+    <w:lvl w:ilvl="0">
+      <w:start w:val="1"/>
+      <w:numFmt w:val="bullet"/>
+      <w:lvlText w:val=""/>
+      <w:lvlJc w:val="left"/>
+      <w:pPr>
+        <w:tabs>
+          <w:tab w:val="num" w:pos="720"/>
+        </w:tabs>
+        <w:ind w:left="720" w:hanging="360"/>
+      </w:pPr>
+      <w:rPr>
+        <w:rFonts w:ascii="Symbol" w:hAnsi="Symbol" w:hint="default"/>
+        <w:sz w:val="20"/>
+      </w:rPr>
+    </w:lvl>
+    <w:lvl w:ilvl="1" w:tentative="1">
+      <w:start w:val="1"/>
+      <w:numFmt w:val="bullet"/>
+      <w:lvlText w:val=""/>
+      <w:lvlJc w:val="left"/>
+      <w:pPr>
+        <w:tabs>
+          <w:tab w:val="num" w:pos="1440"/>
+        </w:tabs>
+        <w:ind w:left="1440" w:hanging="360"/>
+      </w:pPr>
+      <w:rPr>
+        <w:rFonts w:ascii="Symbol" w:hAnsi="Symbol" w:hint="default"/>
+        <w:sz w:val="20"/>
+      </w:rPr>
+    </w:lvl>
+    <w:lvl w:ilvl="2" w:tentative="1">
+      <w:start w:val="1"/>
+      <w:numFmt w:val="bullet"/>
+      <w:lvlText w:val=""/>
+      <w:lvlJc w:val="left"/>
+      <w:pPr>
+        <w:tabs>
+          <w:tab w:val="num" w:pos="2160"/>
+        </w:tabs>
+        <w:ind w:left="2160" w:hanging="360"/>
+      </w:pPr>
+      <w:rPr>
+        <w:rFonts w:ascii="Symbol" w:hAnsi="Symbol" w:hint="default"/>
+        <w:sz w:val="20"/>
+      </w:rPr>
+    </w:lvl>
+    <w:lvl w:ilvl="3" w:tentative="1">
+      <w:start w:val="1"/>
+      <w:numFmt w:val="bullet"/>
+      <w:lvlText w:val=""/>
+      <w:lvlJc w:val="left"/>
+      <w:pPr>
+        <w:tabs>
+          <w:tab w:val="num" w:pos="2880"/>
+        </w:tabs>
+        <w:ind w:left="2880" w:hanging="360"/>
+      </w:pPr>
+      <w:rPr>
+        <w:rFonts w:ascii="Symbol" w:hAnsi="Symbol" w:hint="default"/>
+        <w:sz w:val="20"/>
+      </w:rPr>
+    </w:lvl>
+    <w:lvl w:ilvl="4" w:tentative="1">
+      <w:start w:val="1"/>
+      <w:numFmt w:val="bullet"/>
+      <w:lvlText w:val=""/>
+      <w:lvlJc w:val="left"/>
+      <w:pPr>
+        <w:tabs>
+          <w:tab w:val="num" w:pos="3600"/>
+        </w:tabs>
+        <w:ind w:left="3600" w:hanging="360"/>
+      </w:pPr>
+      <w:rPr>
+        <w:rFonts w:ascii="Symbol" w:hAnsi="Symbol" w:hint="default"/>
+        <w:sz w:val="20"/>
+      </w:rPr>
+    </w:lvl>
+    <w:lvl w:ilvl="5" w:tentative="1">
+      <w:start w:val="1"/>
+      <w:numFmt w:val="bullet"/>
+      <w:lvlText w:val=""/>
+      <w:lvlJc w:val="left"/>
+      <w:pPr>
+        <w:tabs>
+          <w:tab w:val="num" w:pos="4320"/>
+        </w:tabs>
+        <w:ind w:left="4320" w:hanging="360"/>
+      </w:pPr>
+      <w:rPr>
+        <w:rFonts w:ascii="Symbol" w:hAnsi="Symbol" w:hint="default"/>
+        <w:sz w:val="20"/>
+      </w:rPr>
+    </w:lvl>
+    <w:lvl w:ilvl="6" w:tentative="1">
+      <w:start w:val="1"/>
+      <w:numFmt w:val="bullet"/>
+      <w:lvlText w:val=""/>
+      <w:lvlJc w:val="left"/>
+      <w:pPr>
+        <w:tabs>
+          <w:tab w:val="num" w:pos="5040"/>
+        </w:tabs>
+        <w:ind w:left="5040" w:hanging="360"/>
+      </w:pPr>
+      <w:rPr>
+        <w:rFonts w:ascii="Symbol" w:hAnsi="Symbol" w:hint="default"/>
+        <w:sz w:val="20"/>
+      </w:rPr>
+    </w:lvl>
+    <w:lvl w:ilvl="7" w:tentative="1">
+      <w:start w:val="1"/>
+      <w:numFmt w:val="bullet"/>
+      <w:lvlText w:val=""/>
+      <w:lvlJc w:val="left"/>
+      <w:pPr>
+        <w:tabs>
+          <w:tab w:val="num" w:pos="5760"/>
+        </w:tabs>
+        <w:ind w:left="5760" w:hanging="360"/>
+      </w:pPr>
+      <w:rPr>
+        <w:rFonts w:ascii="Symbol" w:hAnsi="Symbol" w:hint="default"/>
+        <w:sz w:val="20"/>
+      </w:rPr>
+    </w:lvl>
+    <w:lvl w:ilvl="8" w:tentative="1">
+      <w:start w:val="1"/>
+      <w:numFmt w:val="bullet"/>
+      <w:lvlText w:val=""/>
+      <w:lvlJc w:val="left"/>
+      <w:pPr>
+        <w:tabs>
+          <w:tab w:val="num" w:pos="6480"/>
+        </w:tabs>
+        <w:ind w:left="6480" w:hanging="360"/>
+      </w:pPr>
+      <w:rPr>
+        <w:rFonts w:ascii="Symbol" w:hAnsi="Symbol" w:hint="default"/>
+        <w:sz w:val="20"/>
+      </w:rPr>
+    </w:lvl>
+  </w:abstractNum>
+  <w:abstractNum w:abstractNumId="16" w15:restartNumberingAfterBreak="0">
     <w:nsid w:val="44677946"/>
     <w:multiLevelType w:val="multilevel"/>
     <w:tmpl w:val="7E4EEF24"/>
@@ -4731,7 +5293,7 @@
       </w:rPr>
     </w:lvl>
   </w:abstractNum>
-  <w:abstractNum w:abstractNumId="16" w15:restartNumberingAfterBreak="0">
+  <w:abstractNum w:abstractNumId="17" w15:restartNumberingAfterBreak="0">
     <w:nsid w:val="4E402E0F"/>
     <w:multiLevelType w:val="multilevel"/>
     <w:tmpl w:val="6068E2C8"/>
@@ -4880,7 +5442,7 @@
       </w:rPr>
     </w:lvl>
   </w:abstractNum>
-  <w:abstractNum w:abstractNumId="17" w15:restartNumberingAfterBreak="0">
+  <w:abstractNum w:abstractNumId="18" w15:restartNumberingAfterBreak="0">
     <w:nsid w:val="4E49141C"/>
     <w:multiLevelType w:val="multilevel"/>
     <w:tmpl w:val="5A9CA2AE"/>
@@ -5029,7 +5591,7 @@
       </w:rPr>
     </w:lvl>
   </w:abstractNum>
-  <w:abstractNum w:abstractNumId="18" w15:restartNumberingAfterBreak="0">
+  <w:abstractNum w:abstractNumId="19" w15:restartNumberingAfterBreak="0">
     <w:nsid w:val="50B73CA5"/>
     <w:multiLevelType w:val="multilevel"/>
     <w:tmpl w:val="675CD15C"/>
@@ -5178,7 +5740,7 @@
       </w:rPr>
     </w:lvl>
   </w:abstractNum>
-  <w:abstractNum w:abstractNumId="19" w15:restartNumberingAfterBreak="0">
+  <w:abstractNum w:abstractNumId="20" w15:restartNumberingAfterBreak="0">
     <w:nsid w:val="51D222AC"/>
     <w:multiLevelType w:val="multilevel"/>
     <w:tmpl w:val="B3E25296"/>
@@ -5327,7 +5889,7 @@
       </w:rPr>
     </w:lvl>
   </w:abstractNum>
-  <w:abstractNum w:abstractNumId="20" w15:restartNumberingAfterBreak="0">
+  <w:abstractNum w:abstractNumId="21" w15:restartNumberingAfterBreak="0">
     <w:nsid w:val="533A324B"/>
     <w:multiLevelType w:val="multilevel"/>
     <w:tmpl w:val="56BCC45C"/>
@@ -5476,7 +6038,7 @@
       </w:rPr>
     </w:lvl>
   </w:abstractNum>
-  <w:abstractNum w:abstractNumId="21" w15:restartNumberingAfterBreak="0">
+  <w:abstractNum w:abstractNumId="22" w15:restartNumberingAfterBreak="0">
     <w:nsid w:val="540E6F18"/>
     <w:multiLevelType w:val="multilevel"/>
     <w:tmpl w:val="87DCA8E0"/>
@@ -5625,7 +6187,301 @@
       </w:rPr>
     </w:lvl>
   </w:abstractNum>
-  <w:abstractNum w:abstractNumId="22" w15:restartNumberingAfterBreak="0">
+  <w:abstractNum w:abstractNumId="23" w15:restartNumberingAfterBreak="0">
+    <w:nsid w:val="59EA2C4A"/>
+    <w:multiLevelType w:val="multilevel"/>
+    <w:tmpl w:val="8BD26C36"/>
+    <w:lvl w:ilvl="0">
+      <w:start w:val="1"/>
+      <w:numFmt w:val="bullet"/>
+      <w:lvlText w:val=""/>
+      <w:lvlJc w:val="left"/>
+      <w:pPr>
+        <w:tabs>
+          <w:tab w:val="num" w:pos="720"/>
+        </w:tabs>
+        <w:ind w:left="720" w:hanging="360"/>
+      </w:pPr>
+      <w:rPr>
+        <w:rFonts w:ascii="Symbol" w:hAnsi="Symbol" w:hint="default"/>
+        <w:sz w:val="20"/>
+      </w:rPr>
+    </w:lvl>
+    <w:lvl w:ilvl="1" w:tentative="1">
+      <w:start w:val="1"/>
+      <w:numFmt w:val="bullet"/>
+      <w:lvlText w:val=""/>
+      <w:lvlJc w:val="left"/>
+      <w:pPr>
+        <w:tabs>
+          <w:tab w:val="num" w:pos="1440"/>
+        </w:tabs>
+        <w:ind w:left="1440" w:hanging="360"/>
+      </w:pPr>
+      <w:rPr>
+        <w:rFonts w:ascii="Symbol" w:hAnsi="Symbol" w:hint="default"/>
+        <w:sz w:val="20"/>
+      </w:rPr>
+    </w:lvl>
+    <w:lvl w:ilvl="2" w:tentative="1">
+      <w:start w:val="1"/>
+      <w:numFmt w:val="bullet"/>
+      <w:lvlText w:val=""/>
+      <w:lvlJc w:val="left"/>
+      <w:pPr>
+        <w:tabs>
+          <w:tab w:val="num" w:pos="2160"/>
+        </w:tabs>
+        <w:ind w:left="2160" w:hanging="360"/>
+      </w:pPr>
+      <w:rPr>
+        <w:rFonts w:ascii="Symbol" w:hAnsi="Symbol" w:hint="default"/>
+        <w:sz w:val="20"/>
+      </w:rPr>
+    </w:lvl>
+    <w:lvl w:ilvl="3" w:tentative="1">
+      <w:start w:val="1"/>
+      <w:numFmt w:val="bullet"/>
+      <w:lvlText w:val=""/>
+      <w:lvlJc w:val="left"/>
+      <w:pPr>
+        <w:tabs>
+          <w:tab w:val="num" w:pos="2880"/>
+        </w:tabs>
+        <w:ind w:left="2880" w:hanging="360"/>
+      </w:pPr>
+      <w:rPr>
+        <w:rFonts w:ascii="Symbol" w:hAnsi="Symbol" w:hint="default"/>
+        <w:sz w:val="20"/>
+      </w:rPr>
+    </w:lvl>
+    <w:lvl w:ilvl="4" w:tentative="1">
+      <w:start w:val="1"/>
+      <w:numFmt w:val="bullet"/>
+      <w:lvlText w:val=""/>
+      <w:lvlJc w:val="left"/>
+      <w:pPr>
+        <w:tabs>
+          <w:tab w:val="num" w:pos="3600"/>
+        </w:tabs>
+        <w:ind w:left="3600" w:hanging="360"/>
+      </w:pPr>
+      <w:rPr>
+        <w:rFonts w:ascii="Symbol" w:hAnsi="Symbol" w:hint="default"/>
+        <w:sz w:val="20"/>
+      </w:rPr>
+    </w:lvl>
+    <w:lvl w:ilvl="5" w:tentative="1">
+      <w:start w:val="1"/>
+      <w:numFmt w:val="bullet"/>
+      <w:lvlText w:val=""/>
+      <w:lvlJc w:val="left"/>
+      <w:pPr>
+        <w:tabs>
+          <w:tab w:val="num" w:pos="4320"/>
+        </w:tabs>
+        <w:ind w:left="4320" w:hanging="360"/>
+      </w:pPr>
+      <w:rPr>
+        <w:rFonts w:ascii="Symbol" w:hAnsi="Symbol" w:hint="default"/>
+        <w:sz w:val="20"/>
+      </w:rPr>
+    </w:lvl>
+    <w:lvl w:ilvl="6" w:tentative="1">
+      <w:start w:val="1"/>
+      <w:numFmt w:val="bullet"/>
+      <w:lvlText w:val=""/>
+      <w:lvlJc w:val="left"/>
+      <w:pPr>
+        <w:tabs>
+          <w:tab w:val="num" w:pos="5040"/>
+        </w:tabs>
+        <w:ind w:left="5040" w:hanging="360"/>
+      </w:pPr>
+      <w:rPr>
+        <w:rFonts w:ascii="Symbol" w:hAnsi="Symbol" w:hint="default"/>
+        <w:sz w:val="20"/>
+      </w:rPr>
+    </w:lvl>
+    <w:lvl w:ilvl="7" w:tentative="1">
+      <w:start w:val="1"/>
+      <w:numFmt w:val="bullet"/>
+      <w:lvlText w:val=""/>
+      <w:lvlJc w:val="left"/>
+      <w:pPr>
+        <w:tabs>
+          <w:tab w:val="num" w:pos="5760"/>
+        </w:tabs>
+        <w:ind w:left="5760" w:hanging="360"/>
+      </w:pPr>
+      <w:rPr>
+        <w:rFonts w:ascii="Symbol" w:hAnsi="Symbol" w:hint="default"/>
+        <w:sz w:val="20"/>
+      </w:rPr>
+    </w:lvl>
+    <w:lvl w:ilvl="8" w:tentative="1">
+      <w:start w:val="1"/>
+      <w:numFmt w:val="bullet"/>
+      <w:lvlText w:val=""/>
+      <w:lvlJc w:val="left"/>
+      <w:pPr>
+        <w:tabs>
+          <w:tab w:val="num" w:pos="6480"/>
+        </w:tabs>
+        <w:ind w:left="6480" w:hanging="360"/>
+      </w:pPr>
+      <w:rPr>
+        <w:rFonts w:ascii="Symbol" w:hAnsi="Symbol" w:hint="default"/>
+        <w:sz w:val="20"/>
+      </w:rPr>
+    </w:lvl>
+  </w:abstractNum>
+  <w:abstractNum w:abstractNumId="24" w15:restartNumberingAfterBreak="0">
+    <w:nsid w:val="5A0E2298"/>
+    <w:multiLevelType w:val="multilevel"/>
+    <w:tmpl w:val="BB9612AC"/>
+    <w:lvl w:ilvl="0">
+      <w:start w:val="1"/>
+      <w:numFmt w:val="bullet"/>
+      <w:lvlText w:val=""/>
+      <w:lvlJc w:val="left"/>
+      <w:pPr>
+        <w:tabs>
+          <w:tab w:val="num" w:pos="720"/>
+        </w:tabs>
+        <w:ind w:left="720" w:hanging="360"/>
+      </w:pPr>
+      <w:rPr>
+        <w:rFonts w:ascii="Symbol" w:hAnsi="Symbol" w:hint="default"/>
+        <w:sz w:val="20"/>
+      </w:rPr>
+    </w:lvl>
+    <w:lvl w:ilvl="1">
+      <w:start w:val="1"/>
+      <w:numFmt w:val="decimal"/>
+      <w:lvlText w:val="%2."/>
+      <w:lvlJc w:val="left"/>
+      <w:pPr>
+        <w:tabs>
+          <w:tab w:val="num" w:pos="1440"/>
+        </w:tabs>
+        <w:ind w:left="1440" w:hanging="360"/>
+      </w:pPr>
+    </w:lvl>
+    <w:lvl w:ilvl="2" w:tentative="1">
+      <w:start w:val="1"/>
+      <w:numFmt w:val="bullet"/>
+      <w:lvlText w:val=""/>
+      <w:lvlJc w:val="left"/>
+      <w:pPr>
+        <w:tabs>
+          <w:tab w:val="num" w:pos="2160"/>
+        </w:tabs>
+        <w:ind w:left="2160" w:hanging="360"/>
+      </w:pPr>
+      <w:rPr>
+        <w:rFonts w:ascii="Symbol" w:hAnsi="Symbol" w:hint="default"/>
+        <w:sz w:val="20"/>
+      </w:rPr>
+    </w:lvl>
+    <w:lvl w:ilvl="3" w:tentative="1">
+      <w:start w:val="1"/>
+      <w:numFmt w:val="bullet"/>
+      <w:lvlText w:val=""/>
+      <w:lvlJc w:val="left"/>
+      <w:pPr>
+        <w:tabs>
+          <w:tab w:val="num" w:pos="2880"/>
+        </w:tabs>
+        <w:ind w:left="2880" w:hanging="360"/>
+      </w:pPr>
+      <w:rPr>
+        <w:rFonts w:ascii="Symbol" w:hAnsi="Symbol" w:hint="default"/>
+        <w:sz w:val="20"/>
+      </w:rPr>
+    </w:lvl>
+    <w:lvl w:ilvl="4" w:tentative="1">
+      <w:start w:val="1"/>
+      <w:numFmt w:val="bullet"/>
+      <w:lvlText w:val=""/>
+      <w:lvlJc w:val="left"/>
+      <w:pPr>
+        <w:tabs>
+          <w:tab w:val="num" w:pos="3600"/>
+        </w:tabs>
+        <w:ind w:left="3600" w:hanging="360"/>
+      </w:pPr>
+      <w:rPr>
+        <w:rFonts w:ascii="Symbol" w:hAnsi="Symbol" w:hint="default"/>
+        <w:sz w:val="20"/>
+      </w:rPr>
+    </w:lvl>
+    <w:lvl w:ilvl="5" w:tentative="1">
+      <w:start w:val="1"/>
+      <w:numFmt w:val="bullet"/>
+      <w:lvlText w:val=""/>
+      <w:lvlJc w:val="left"/>
+      <w:pPr>
+        <w:tabs>
+          <w:tab w:val="num" w:pos="4320"/>
+        </w:tabs>
+        <w:ind w:left="4320" w:hanging="360"/>
+      </w:pPr>
+      <w:rPr>
+        <w:rFonts w:ascii="Symbol" w:hAnsi="Symbol" w:hint="default"/>
+        <w:sz w:val="20"/>
+      </w:rPr>
+    </w:lvl>
+    <w:lvl w:ilvl="6" w:tentative="1">
+      <w:start w:val="1"/>
+      <w:numFmt w:val="bullet"/>
+      <w:lvlText w:val=""/>
+      <w:lvlJc w:val="left"/>
+      <w:pPr>
+        <w:tabs>
+          <w:tab w:val="num" w:pos="5040"/>
+        </w:tabs>
+        <w:ind w:left="5040" w:hanging="360"/>
+      </w:pPr>
+      <w:rPr>
+        <w:rFonts w:ascii="Symbol" w:hAnsi="Symbol" w:hint="default"/>
+        <w:sz w:val="20"/>
+      </w:rPr>
+    </w:lvl>
+    <w:lvl w:ilvl="7" w:tentative="1">
+      <w:start w:val="1"/>
+      <w:numFmt w:val="bullet"/>
+      <w:lvlText w:val=""/>
+      <w:lvlJc w:val="left"/>
+      <w:pPr>
+        <w:tabs>
+          <w:tab w:val="num" w:pos="5760"/>
+        </w:tabs>
+        <w:ind w:left="5760" w:hanging="360"/>
+      </w:pPr>
+      <w:rPr>
+        <w:rFonts w:ascii="Symbol" w:hAnsi="Symbol" w:hint="default"/>
+        <w:sz w:val="20"/>
+      </w:rPr>
+    </w:lvl>
+    <w:lvl w:ilvl="8" w:tentative="1">
+      <w:start w:val="1"/>
+      <w:numFmt w:val="bullet"/>
+      <w:lvlText w:val=""/>
+      <w:lvlJc w:val="left"/>
+      <w:pPr>
+        <w:tabs>
+          <w:tab w:val="num" w:pos="6480"/>
+        </w:tabs>
+        <w:ind w:left="6480" w:hanging="360"/>
+      </w:pPr>
+      <w:rPr>
+        <w:rFonts w:ascii="Symbol" w:hAnsi="Symbol" w:hint="default"/>
+        <w:sz w:val="20"/>
+      </w:rPr>
+    </w:lvl>
+  </w:abstractNum>
+  <w:abstractNum w:abstractNumId="25" w15:restartNumberingAfterBreak="0">
     <w:nsid w:val="5BB16C30"/>
     <w:multiLevelType w:val="multilevel"/>
     <w:tmpl w:val="6DC0F07A"/>
@@ -5774,7 +6630,7 @@
       </w:rPr>
     </w:lvl>
   </w:abstractNum>
-  <w:abstractNum w:abstractNumId="23" w15:restartNumberingAfterBreak="0">
+  <w:abstractNum w:abstractNumId="26" w15:restartNumberingAfterBreak="0">
     <w:nsid w:val="61110AC8"/>
     <w:multiLevelType w:val="multilevel"/>
     <w:tmpl w:val="92320496"/>
@@ -5923,7 +6779,7 @@
       </w:rPr>
     </w:lvl>
   </w:abstractNum>
-  <w:abstractNum w:abstractNumId="24" w15:restartNumberingAfterBreak="0">
+  <w:abstractNum w:abstractNumId="27" w15:restartNumberingAfterBreak="0">
     <w:nsid w:val="623D0706"/>
     <w:multiLevelType w:val="multilevel"/>
     <w:tmpl w:val="3116859E"/>
@@ -6072,7 +6928,7 @@
       </w:rPr>
     </w:lvl>
   </w:abstractNum>
-  <w:abstractNum w:abstractNumId="25" w15:restartNumberingAfterBreak="0">
+  <w:abstractNum w:abstractNumId="28" w15:restartNumberingAfterBreak="0">
     <w:nsid w:val="69E65E00"/>
     <w:multiLevelType w:val="multilevel"/>
     <w:tmpl w:val="04E893C4"/>
@@ -6185,7 +7041,7 @@
       </w:pPr>
     </w:lvl>
   </w:abstractNum>
-  <w:abstractNum w:abstractNumId="26" w15:restartNumberingAfterBreak="0">
+  <w:abstractNum w:abstractNumId="29" w15:restartNumberingAfterBreak="0">
     <w:nsid w:val="6CF83EE6"/>
     <w:multiLevelType w:val="multilevel"/>
     <w:tmpl w:val="70AA93B2"/>
@@ -6334,7 +7190,7 @@
       </w:rPr>
     </w:lvl>
   </w:abstractNum>
-  <w:abstractNum w:abstractNumId="27" w15:restartNumberingAfterBreak="0">
+  <w:abstractNum w:abstractNumId="30" w15:restartNumberingAfterBreak="0">
     <w:nsid w:val="743D265B"/>
     <w:multiLevelType w:val="multilevel"/>
     <w:tmpl w:val="3400487C"/>
@@ -6483,7 +7339,7 @@
       </w:rPr>
     </w:lvl>
   </w:abstractNum>
-  <w:abstractNum w:abstractNumId="28" w15:restartNumberingAfterBreak="0">
+  <w:abstractNum w:abstractNumId="31" w15:restartNumberingAfterBreak="0">
     <w:nsid w:val="758A781F"/>
     <w:multiLevelType w:val="multilevel"/>
     <w:tmpl w:val="2E141854"/>
@@ -6632,7 +7488,7 @@
       </w:rPr>
     </w:lvl>
   </w:abstractNum>
-  <w:abstractNum w:abstractNumId="29" w15:restartNumberingAfterBreak="0">
+  <w:abstractNum w:abstractNumId="32" w15:restartNumberingAfterBreak="0">
     <w:nsid w:val="7E48662E"/>
     <w:multiLevelType w:val="multilevel"/>
     <w:tmpl w:val="7E2CF740"/>
@@ -6781,7 +7637,156 @@
       </w:rPr>
     </w:lvl>
   </w:abstractNum>
-  <w:abstractNum w:abstractNumId="30" w15:restartNumberingAfterBreak="0">
+  <w:abstractNum w:abstractNumId="33" w15:restartNumberingAfterBreak="0">
+    <w:nsid w:val="7FA7012C"/>
+    <w:multiLevelType w:val="multilevel"/>
+    <w:tmpl w:val="3DF8D112"/>
+    <w:lvl w:ilvl="0">
+      <w:start w:val="1"/>
+      <w:numFmt w:val="bullet"/>
+      <w:lvlText w:val=""/>
+      <w:lvlJc w:val="left"/>
+      <w:pPr>
+        <w:tabs>
+          <w:tab w:val="num" w:pos="720"/>
+        </w:tabs>
+        <w:ind w:left="720" w:hanging="360"/>
+      </w:pPr>
+      <w:rPr>
+        <w:rFonts w:ascii="Symbol" w:hAnsi="Symbol" w:hint="default"/>
+        <w:sz w:val="20"/>
+      </w:rPr>
+    </w:lvl>
+    <w:lvl w:ilvl="1" w:tentative="1">
+      <w:start w:val="1"/>
+      <w:numFmt w:val="bullet"/>
+      <w:lvlText w:val=""/>
+      <w:lvlJc w:val="left"/>
+      <w:pPr>
+        <w:tabs>
+          <w:tab w:val="num" w:pos="1440"/>
+        </w:tabs>
+        <w:ind w:left="1440" w:hanging="360"/>
+      </w:pPr>
+      <w:rPr>
+        <w:rFonts w:ascii="Symbol" w:hAnsi="Symbol" w:hint="default"/>
+        <w:sz w:val="20"/>
+      </w:rPr>
+    </w:lvl>
+    <w:lvl w:ilvl="2" w:tentative="1">
+      <w:start w:val="1"/>
+      <w:numFmt w:val="bullet"/>
+      <w:lvlText w:val=""/>
+      <w:lvlJc w:val="left"/>
+      <w:pPr>
+        <w:tabs>
+          <w:tab w:val="num" w:pos="2160"/>
+        </w:tabs>
+        <w:ind w:left="2160" w:hanging="360"/>
+      </w:pPr>
+      <w:rPr>
+        <w:rFonts w:ascii="Symbol" w:hAnsi="Symbol" w:hint="default"/>
+        <w:sz w:val="20"/>
+      </w:rPr>
+    </w:lvl>
+    <w:lvl w:ilvl="3" w:tentative="1">
+      <w:start w:val="1"/>
+      <w:numFmt w:val="bullet"/>
+      <w:lvlText w:val=""/>
+      <w:lvlJc w:val="left"/>
+      <w:pPr>
+        <w:tabs>
+          <w:tab w:val="num" w:pos="2880"/>
+        </w:tabs>
+        <w:ind w:left="2880" w:hanging="360"/>
+      </w:pPr>
+      <w:rPr>
+        <w:rFonts w:ascii="Symbol" w:hAnsi="Symbol" w:hint="default"/>
+        <w:sz w:val="20"/>
+      </w:rPr>
+    </w:lvl>
+    <w:lvl w:ilvl="4" w:tentative="1">
+      <w:start w:val="1"/>
+      <w:numFmt w:val="bullet"/>
+      <w:lvlText w:val=""/>
+      <w:lvlJc w:val="left"/>
+      <w:pPr>
+        <w:tabs>
+          <w:tab w:val="num" w:pos="3600"/>
+        </w:tabs>
+        <w:ind w:left="3600" w:hanging="360"/>
+      </w:pPr>
+      <w:rPr>
+        <w:rFonts w:ascii="Symbol" w:hAnsi="Symbol" w:hint="default"/>
+        <w:sz w:val="20"/>
+      </w:rPr>
+    </w:lvl>
+    <w:lvl w:ilvl="5" w:tentative="1">
+      <w:start w:val="1"/>
+      <w:numFmt w:val="bullet"/>
+      <w:lvlText w:val=""/>
+      <w:lvlJc w:val="left"/>
+      <w:pPr>
+        <w:tabs>
+          <w:tab w:val="num" w:pos="4320"/>
+        </w:tabs>
+        <w:ind w:left="4320" w:hanging="360"/>
+      </w:pPr>
+      <w:rPr>
+        <w:rFonts w:ascii="Symbol" w:hAnsi="Symbol" w:hint="default"/>
+        <w:sz w:val="20"/>
+      </w:rPr>
+    </w:lvl>
+    <w:lvl w:ilvl="6" w:tentative="1">
+      <w:start w:val="1"/>
+      <w:numFmt w:val="bullet"/>
+      <w:lvlText w:val=""/>
+      <w:lvlJc w:val="left"/>
+      <w:pPr>
+        <w:tabs>
+          <w:tab w:val="num" w:pos="5040"/>
+        </w:tabs>
+        <w:ind w:left="5040" w:hanging="360"/>
+      </w:pPr>
+      <w:rPr>
+        <w:rFonts w:ascii="Symbol" w:hAnsi="Symbol" w:hint="default"/>
+        <w:sz w:val="20"/>
+      </w:rPr>
+    </w:lvl>
+    <w:lvl w:ilvl="7" w:tentative="1">
+      <w:start w:val="1"/>
+      <w:numFmt w:val="bullet"/>
+      <w:lvlText w:val=""/>
+      <w:lvlJc w:val="left"/>
+      <w:pPr>
+        <w:tabs>
+          <w:tab w:val="num" w:pos="5760"/>
+        </w:tabs>
+        <w:ind w:left="5760" w:hanging="360"/>
+      </w:pPr>
+      <w:rPr>
+        <w:rFonts w:ascii="Symbol" w:hAnsi="Symbol" w:hint="default"/>
+        <w:sz w:val="20"/>
+      </w:rPr>
+    </w:lvl>
+    <w:lvl w:ilvl="8" w:tentative="1">
+      <w:start w:val="1"/>
+      <w:numFmt w:val="bullet"/>
+      <w:lvlText w:val=""/>
+      <w:lvlJc w:val="left"/>
+      <w:pPr>
+        <w:tabs>
+          <w:tab w:val="num" w:pos="6480"/>
+        </w:tabs>
+        <w:ind w:left="6480" w:hanging="360"/>
+      </w:pPr>
+      <w:rPr>
+        <w:rFonts w:ascii="Symbol" w:hAnsi="Symbol" w:hint="default"/>
+        <w:sz w:val="20"/>
+      </w:rPr>
+    </w:lvl>
+  </w:abstractNum>
+  <w:abstractNum w:abstractNumId="34" w15:restartNumberingAfterBreak="0">
     <w:nsid w:val="7FBB780C"/>
     <w:multiLevelType w:val="multilevel"/>
     <w:tmpl w:val="902ECCD2"/>
@@ -6898,49 +7903,49 @@
     <w:abstractNumId w:val="6"/>
   </w:num>
   <w:num w:numId="2" w16cid:durableId="1367027804">
-    <w:abstractNumId w:val="26"/>
+    <w:abstractNumId w:val="29"/>
   </w:num>
   <w:num w:numId="3" w16cid:durableId="1668631311">
     <w:abstractNumId w:val="0"/>
   </w:num>
   <w:num w:numId="4" w16cid:durableId="1732652887">
-    <w:abstractNumId w:val="19"/>
+    <w:abstractNumId w:val="20"/>
   </w:num>
   <w:num w:numId="5" w16cid:durableId="956135389">
-    <w:abstractNumId w:val="20"/>
+    <w:abstractNumId w:val="21"/>
   </w:num>
   <w:num w:numId="6" w16cid:durableId="1789198818">
     <w:abstractNumId w:val="7"/>
   </w:num>
   <w:num w:numId="7" w16cid:durableId="269972398">
-    <w:abstractNumId w:val="22"/>
+    <w:abstractNumId w:val="25"/>
   </w:num>
   <w:num w:numId="8" w16cid:durableId="817572598">
     <w:abstractNumId w:val="5"/>
   </w:num>
   <w:num w:numId="9" w16cid:durableId="670715461">
-    <w:abstractNumId w:val="23"/>
+    <w:abstractNumId w:val="26"/>
   </w:num>
   <w:num w:numId="10" w16cid:durableId="1276332657">
-    <w:abstractNumId w:val="24"/>
+    <w:abstractNumId w:val="27"/>
   </w:num>
   <w:num w:numId="11" w16cid:durableId="1085541468">
     <w:abstractNumId w:val="2"/>
   </w:num>
   <w:num w:numId="12" w16cid:durableId="729813302">
-    <w:abstractNumId w:val="25"/>
+    <w:abstractNumId w:val="28"/>
   </w:num>
   <w:num w:numId="13" w16cid:durableId="219287181">
-    <w:abstractNumId w:val="30"/>
+    <w:abstractNumId w:val="34"/>
   </w:num>
   <w:num w:numId="14" w16cid:durableId="1478569081">
-    <w:abstractNumId w:val="28"/>
+    <w:abstractNumId w:val="31"/>
   </w:num>
   <w:num w:numId="15" w16cid:durableId="1784617126">
-    <w:abstractNumId w:val="16"/>
+    <w:abstractNumId w:val="17"/>
   </w:num>
   <w:num w:numId="16" w16cid:durableId="488444713">
-    <w:abstractNumId w:val="18"/>
+    <w:abstractNumId w:val="19"/>
   </w:num>
   <w:num w:numId="17" w16cid:durableId="1473865838">
     <w:abstractNumId w:val="14"/>
@@ -6949,22 +7954,22 @@
     <w:abstractNumId w:val="3"/>
   </w:num>
   <w:num w:numId="19" w16cid:durableId="801387460">
-    <w:abstractNumId w:val="17"/>
+    <w:abstractNumId w:val="18"/>
   </w:num>
   <w:num w:numId="20" w16cid:durableId="219755788">
     <w:abstractNumId w:val="9"/>
   </w:num>
   <w:num w:numId="21" w16cid:durableId="196814451">
-    <w:abstractNumId w:val="21"/>
+    <w:abstractNumId w:val="22"/>
   </w:num>
   <w:num w:numId="22" w16cid:durableId="166287831">
     <w:abstractNumId w:val="12"/>
   </w:num>
   <w:num w:numId="23" w16cid:durableId="1636062703">
-    <w:abstractNumId w:val="15"/>
+    <w:abstractNumId w:val="16"/>
   </w:num>
   <w:num w:numId="24" w16cid:durableId="651569532">
-    <w:abstractNumId w:val="27"/>
+    <w:abstractNumId w:val="30"/>
   </w:num>
   <w:num w:numId="25" w16cid:durableId="1769961410">
     <w:abstractNumId w:val="8"/>
@@ -6985,7 +7990,19 @@
     <w:abstractNumId w:val="1"/>
   </w:num>
   <w:num w:numId="31" w16cid:durableId="1780370132">
-    <w:abstractNumId w:val="29"/>
+    <w:abstractNumId w:val="32"/>
+  </w:num>
+  <w:num w:numId="32" w16cid:durableId="1576473904">
+    <w:abstractNumId w:val="15"/>
+  </w:num>
+  <w:num w:numId="33" w16cid:durableId="681971854">
+    <w:abstractNumId w:val="33"/>
+  </w:num>
+  <w:num w:numId="34" w16cid:durableId="1310600430">
+    <w:abstractNumId w:val="24"/>
+  </w:num>
+  <w:num w:numId="35" w16cid:durableId="1824739748">
+    <w:abstractNumId w:val="23"/>
   </w:num>
 </w:numbering>
 </file>

</xml_diff>

<commit_message>
Phase 4: Add Screen Sharing and Docker deployment prep
</commit_message>
<xml_diff>
--- a/TaiLieuDacTa.docx
+++ b/TaiLieuDacTa.docx
@@ -2817,6 +2817,382 @@
         <w:t>Ấn thử nút Bật/Tắt Mic và Camera, biểu tượng sẽ thay đổi và luồng dữ liệu (video track) sẽ bị vô hiệu hóa/kích hoạt theo.</w:t>
       </w:r>
     </w:p>
+    <w:p>
+      <w:r>
+        <w:br w:type="page"/>
+      </w:r>
+    </w:p>
+    <w:p>
+      <w:pPr>
+        <w:numPr>
+          <w:ilvl w:val="0"/>
+          <w:numId w:val="36"/>
+        </w:numPr>
+        <w:rPr>
+          <w:b/>
+          <w:bCs/>
+        </w:rPr>
+      </w:pPr>
+      <w:r>
+        <w:rPr>
+          <w:b/>
+          <w:bCs/>
+        </w:rPr>
+        <w:lastRenderedPageBreak/>
+        <w:t>WaveMeet - Phase 4 Implementation Plan</w:t>
+      </w:r>
+    </w:p>
+    <w:p>
+      <w:r>
+        <w:t>Chúng ta đã đến </w:t>
+      </w:r>
+      <w:r>
+        <w:rPr>
+          <w:b/>
+          <w:bCs/>
+        </w:rPr>
+        <w:t>Phase 4 (Giai đoạn Cuối)</w:t>
+      </w:r>
+      <w:r>
+        <w:t>. Trong Phase này, chúng ta sẽ hoàn thiện tính năng </w:t>
+      </w:r>
+      <w:r>
+        <w:rPr>
+          <w:b/>
+          <w:bCs/>
+        </w:rPr>
+        <w:t>Chia sẻ màn hình (Screen Sharing)</w:t>
+      </w:r>
+      <w:r>
+        <w:t> và chuẩn bị cấu hình để sẵn sàng triển khai (Deploy) dự án lên Cloud.</w:t>
+      </w:r>
+    </w:p>
+    <w:p>
+      <w:pPr>
+        <w:rPr>
+          <w:b/>
+          <w:bCs/>
+        </w:rPr>
+      </w:pPr>
+      <w:r>
+        <w:rPr>
+          <w:b/>
+          <w:bCs/>
+        </w:rPr>
+        <w:t>User Review Required</w:t>
+      </w:r>
+    </w:p>
+    <w:p>
+      <w:r>
+        <w:t>IMPORTANT</w:t>
+      </w:r>
+    </w:p>
+    <w:p>
+      <w:r>
+        <w:rPr>
+          <w:b/>
+          <w:bCs/>
+        </w:rPr>
+        <w:t>Cơ chế Share Screen:</w:t>
+      </w:r>
+      <w:r>
+        <w:t> Khi bật Share Screen, luồng Camera hiện tại của người dùng sẽ bị </w:t>
+      </w:r>
+      <w:r>
+        <w:rPr>
+          <w:b/>
+          <w:bCs/>
+        </w:rPr>
+        <w:t>thay thế</w:t>
+      </w:r>
+      <w:r>
+        <w:t> bằng luồng Màn hình (để tối ưu hóa băng thông thay vì gửi cả 2 luồng cùng lúc). Người dùng có thể quay lại Camera bằng cách tắt Share Screen. Bạn có đồng ý với thiết kế này không?</w:t>
+      </w:r>
+    </w:p>
+    <w:p>
+      <w:r>
+        <w:t>TIP</w:t>
+      </w:r>
+    </w:p>
+    <w:p>
+      <w:r>
+        <w:rPr>
+          <w:b/>
+          <w:bCs/>
+        </w:rPr>
+        <w:t>Deployment Prep:</w:t>
+      </w:r>
+      <w:r>
+        <w:t> Vì tôi không có quyền truy cập trực tiếp vào thẻ tín dụng / tài khoản Cloud (GCP/Render) của bạn, tôi sẽ tạo sẵn các file cấu hình như </w:t>
+      </w:r>
+      <w:r>
+        <w:rPr>
+          <w:b/>
+          <w:bCs/>
+        </w:rPr>
+        <w:t>Dockerfile</w:t>
+      </w:r>
+      <w:r>
+        <w:t>, </w:t>
+      </w:r>
+      <w:r>
+        <w:rPr>
+          <w:b/>
+          <w:bCs/>
+        </w:rPr>
+        <w:t>requirements.txt</w:t>
+      </w:r>
+      <w:r>
+        <w:t>, và viết hướng dẫn chi tiết trong file README để bạn có thể tự Deploy dễ dàng bằng 1 click lên Render/Railway. Bạn thấy thế nào?</w:t>
+      </w:r>
+    </w:p>
+    <w:p>
+      <w:pPr>
+        <w:rPr>
+          <w:b/>
+          <w:bCs/>
+        </w:rPr>
+      </w:pPr>
+      <w:r>
+        <w:rPr>
+          <w:b/>
+          <w:bCs/>
+        </w:rPr>
+        <w:t>Proposed Changes</w:t>
+      </w:r>
+    </w:p>
+    <w:p>
+      <w:r>
+        <w:t>1. Tính năng Chia sẻ màn hình (Screen Share)</w:t>
+      </w:r>
+    </w:p>
+    <w:p>
+      <w:r>
+        <w:t>Thêm luồng getDisplayMedia vào file JavaScript WebRTC.</w:t>
+      </w:r>
+    </w:p>
+    <w:p>
+      <w:r>
+        <w:t>[MODIFY] chat/templates/chat/room.html</w:t>
+      </w:r>
+    </w:p>
+    <w:p>
+      <w:pPr>
+        <w:numPr>
+          <w:ilvl w:val="0"/>
+          <w:numId w:val="36"/>
+        </w:numPr>
+      </w:pPr>
+      <w:r>
+        <w:rPr>
+          <w:b/>
+          <w:bCs/>
+        </w:rPr>
+        <w:t>UI</w:t>
+      </w:r>
+      <w:r>
+        <w:t>: Thêm nút </w:t>
+      </w:r>
+      <w:r>
+        <w:rPr>
+          <w:b/>
+          <w:bCs/>
+        </w:rPr>
+        <w:t>Share Screen</w:t>
+      </w:r>
+      <w:r>
+        <w:t> (</w:t>
+      </w:r>
+      <w:r>
+        <w:rPr>
+          <w:rFonts w:ascii="Segoe UI Emoji" w:hAnsi="Segoe UI Emoji" w:cs="Segoe UI Emoji"/>
+        </w:rPr>
+        <w:t>💻</w:t>
+      </w:r>
+      <w:r>
+        <w:t>) vào thanh Controls Bar ở cuối màn hình.</w:t>
+      </w:r>
+    </w:p>
+    <w:p>
+      <w:pPr>
+        <w:numPr>
+          <w:ilvl w:val="0"/>
+          <w:numId w:val="36"/>
+        </w:numPr>
+      </w:pPr>
+      <w:r>
+        <w:rPr>
+          <w:b/>
+          <w:bCs/>
+        </w:rPr>
+        <w:t>JS Logic</w:t>
+      </w:r>
+      <w:r>
+        <w:t>:</w:t>
+      </w:r>
+    </w:p>
+    <w:p>
+      <w:pPr>
+        <w:numPr>
+          <w:ilvl w:val="1"/>
+          <w:numId w:val="36"/>
+        </w:numPr>
+      </w:pPr>
+      <w:r>
+        <w:t>Viết hàm toggleScreenShare().</w:t>
+      </w:r>
+    </w:p>
+    <w:p>
+      <w:pPr>
+        <w:numPr>
+          <w:ilvl w:val="1"/>
+          <w:numId w:val="36"/>
+        </w:numPr>
+      </w:pPr>
+      <w:r>
+        <w:t>Gọi API navigator.mediaDevices.getDisplayMedia({ video: true }) để trình duyệt bật hộp thoại chọn màn hình.</w:t>
+      </w:r>
+    </w:p>
+    <w:p>
+      <w:pPr>
+        <w:numPr>
+          <w:ilvl w:val="1"/>
+          <w:numId w:val="36"/>
+        </w:numPr>
+      </w:pPr>
+      <w:r>
+        <w:t>Sau khi lấy được screenStream, tìm tất cả các RTCPeerConnection hiện tại và dùng sender.replaceTrack() để thay thế track Camera bằng track Màn hình và truyền đi (không cần phải đàm phán lại SDP từ đầu).</w:t>
+      </w:r>
+    </w:p>
+    <w:p>
+      <w:pPr>
+        <w:numPr>
+          <w:ilvl w:val="1"/>
+          <w:numId w:val="36"/>
+        </w:numPr>
+      </w:pPr>
+      <w:r>
+        <w:t>Gắn screenStream vào thẻ &lt;video&gt; local để mình cũng nhìn thấy.</w:t>
+      </w:r>
+    </w:p>
+    <w:p>
+      <w:pPr>
+        <w:numPr>
+          <w:ilvl w:val="1"/>
+          <w:numId w:val="36"/>
+        </w:numPr>
+      </w:pPr>
+      <w:r>
+        <w:lastRenderedPageBreak/>
+        <w:t>Lắng nghe sự kiện onended của track Màn hình (khi người dùng bấm "Dừng chia sẻ" trên popup mặc định của Chrome) để tự động switch luồng về lại Camera.</w:t>
+      </w:r>
+    </w:p>
+    <w:p>
+      <w:r>
+        <w:t>2. Chuẩn bị Môi trường Deploy</w:t>
+      </w:r>
+    </w:p>
+    <w:p>
+      <w:r>
+        <w:t>Tạo các cấu hình môi trường để đóng gói dự án, giúp dễ dàng deploy.</w:t>
+      </w:r>
+    </w:p>
+    <w:p>
+      <w:r>
+        <w:t>[NEW] requirements.txt</w:t>
+      </w:r>
+    </w:p>
+    <w:p>
+      <w:pPr>
+        <w:numPr>
+          <w:ilvl w:val="0"/>
+          <w:numId w:val="37"/>
+        </w:numPr>
+      </w:pPr>
+      <w:r>
+        <w:t>Xuất danh sách các thư viện Python (Django, Channels, Daphne, Redis...) để setup môi trường production.</w:t>
+      </w:r>
+    </w:p>
+    <w:p>
+      <w:r>
+        <w:t>[NEW] Dockerfile</w:t>
+      </w:r>
+    </w:p>
+    <w:p>
+      <w:pPr>
+        <w:numPr>
+          <w:ilvl w:val="0"/>
+          <w:numId w:val="38"/>
+        </w:numPr>
+      </w:pPr>
+      <w:r>
+        <w:t>Đóng gói toàn bộ ứng dụng Django và Daphne thành một Docker Image chuẩn, sẵn sàng chạy trên Cloud Run, Render hoặc Railway.</w:t>
+      </w:r>
+    </w:p>
+    <w:p>
+      <w:pPr>
+        <w:rPr>
+          <w:b/>
+          <w:bCs/>
+        </w:rPr>
+      </w:pPr>
+      <w:r>
+        <w:rPr>
+          <w:b/>
+          <w:bCs/>
+        </w:rPr>
+        <w:t>Verification Plan</w:t>
+      </w:r>
+    </w:p>
+    <w:p>
+      <w:r>
+        <w:t>Manual Verification</w:t>
+      </w:r>
+    </w:p>
+    <w:p>
+      <w:pPr>
+        <w:numPr>
+          <w:ilvl w:val="0"/>
+          <w:numId w:val="39"/>
+        </w:numPr>
+      </w:pPr>
+      <w:r>
+        <w:t>Mở lại 2 trình duyệt ẩn danh vào chung phòng.</w:t>
+      </w:r>
+    </w:p>
+    <w:p>
+      <w:pPr>
+        <w:numPr>
+          <w:ilvl w:val="0"/>
+          <w:numId w:val="39"/>
+        </w:numPr>
+      </w:pPr>
+      <w:r>
+        <w:t>Ấn nút Share Screen, chọn 1 tab hoặc toàn màn hình.</w:t>
+      </w:r>
+    </w:p>
+    <w:p>
+      <w:pPr>
+        <w:numPr>
+          <w:ilvl w:val="0"/>
+          <w:numId w:val="39"/>
+        </w:numPr>
+      </w:pPr>
+      <w:r>
+        <w:t>Xác nhận màn hình được truyền sang trình duyệt bên kia mượt mà.</w:t>
+      </w:r>
+    </w:p>
+    <w:p>
+      <w:pPr>
+        <w:numPr>
+          <w:ilvl w:val="0"/>
+          <w:numId w:val="39"/>
+        </w:numPr>
+      </w:pPr>
+      <w:r>
+        <w:t>Bấm "Dừng chia sẻ", luồng sẽ tự động quay trở về Camera.</w:t>
+      </w:r>
+    </w:p>
     <w:p/>
     <w:sectPr>
       <w:pgSz w:w="12240" w:h="15840"/>
@@ -2980,6 +3356,155 @@
     </w:lvl>
   </w:abstractNum>
   <w:abstractNum w:abstractNumId="1" w15:restartNumberingAfterBreak="0">
+    <w:nsid w:val="0E306DA7"/>
+    <w:multiLevelType w:val="multilevel"/>
+    <w:tmpl w:val="01B2748C"/>
+    <w:lvl w:ilvl="0">
+      <w:start w:val="1"/>
+      <w:numFmt w:val="bullet"/>
+      <w:lvlText w:val=""/>
+      <w:lvlJc w:val="left"/>
+      <w:pPr>
+        <w:tabs>
+          <w:tab w:val="num" w:pos="720"/>
+        </w:tabs>
+        <w:ind w:left="720" w:hanging="360"/>
+      </w:pPr>
+      <w:rPr>
+        <w:rFonts w:ascii="Symbol" w:hAnsi="Symbol" w:hint="default"/>
+        <w:sz w:val="20"/>
+      </w:rPr>
+    </w:lvl>
+    <w:lvl w:ilvl="1" w:tentative="1">
+      <w:start w:val="1"/>
+      <w:numFmt w:val="bullet"/>
+      <w:lvlText w:val=""/>
+      <w:lvlJc w:val="left"/>
+      <w:pPr>
+        <w:tabs>
+          <w:tab w:val="num" w:pos="1440"/>
+        </w:tabs>
+        <w:ind w:left="1440" w:hanging="360"/>
+      </w:pPr>
+      <w:rPr>
+        <w:rFonts w:ascii="Symbol" w:hAnsi="Symbol" w:hint="default"/>
+        <w:sz w:val="20"/>
+      </w:rPr>
+    </w:lvl>
+    <w:lvl w:ilvl="2" w:tentative="1">
+      <w:start w:val="1"/>
+      <w:numFmt w:val="bullet"/>
+      <w:lvlText w:val=""/>
+      <w:lvlJc w:val="left"/>
+      <w:pPr>
+        <w:tabs>
+          <w:tab w:val="num" w:pos="2160"/>
+        </w:tabs>
+        <w:ind w:left="2160" w:hanging="360"/>
+      </w:pPr>
+      <w:rPr>
+        <w:rFonts w:ascii="Symbol" w:hAnsi="Symbol" w:hint="default"/>
+        <w:sz w:val="20"/>
+      </w:rPr>
+    </w:lvl>
+    <w:lvl w:ilvl="3" w:tentative="1">
+      <w:start w:val="1"/>
+      <w:numFmt w:val="bullet"/>
+      <w:lvlText w:val=""/>
+      <w:lvlJc w:val="left"/>
+      <w:pPr>
+        <w:tabs>
+          <w:tab w:val="num" w:pos="2880"/>
+        </w:tabs>
+        <w:ind w:left="2880" w:hanging="360"/>
+      </w:pPr>
+      <w:rPr>
+        <w:rFonts w:ascii="Symbol" w:hAnsi="Symbol" w:hint="default"/>
+        <w:sz w:val="20"/>
+      </w:rPr>
+    </w:lvl>
+    <w:lvl w:ilvl="4" w:tentative="1">
+      <w:start w:val="1"/>
+      <w:numFmt w:val="bullet"/>
+      <w:lvlText w:val=""/>
+      <w:lvlJc w:val="left"/>
+      <w:pPr>
+        <w:tabs>
+          <w:tab w:val="num" w:pos="3600"/>
+        </w:tabs>
+        <w:ind w:left="3600" w:hanging="360"/>
+      </w:pPr>
+      <w:rPr>
+        <w:rFonts w:ascii="Symbol" w:hAnsi="Symbol" w:hint="default"/>
+        <w:sz w:val="20"/>
+      </w:rPr>
+    </w:lvl>
+    <w:lvl w:ilvl="5" w:tentative="1">
+      <w:start w:val="1"/>
+      <w:numFmt w:val="bullet"/>
+      <w:lvlText w:val=""/>
+      <w:lvlJc w:val="left"/>
+      <w:pPr>
+        <w:tabs>
+          <w:tab w:val="num" w:pos="4320"/>
+        </w:tabs>
+        <w:ind w:left="4320" w:hanging="360"/>
+      </w:pPr>
+      <w:rPr>
+        <w:rFonts w:ascii="Symbol" w:hAnsi="Symbol" w:hint="default"/>
+        <w:sz w:val="20"/>
+      </w:rPr>
+    </w:lvl>
+    <w:lvl w:ilvl="6" w:tentative="1">
+      <w:start w:val="1"/>
+      <w:numFmt w:val="bullet"/>
+      <w:lvlText w:val=""/>
+      <w:lvlJc w:val="left"/>
+      <w:pPr>
+        <w:tabs>
+          <w:tab w:val="num" w:pos="5040"/>
+        </w:tabs>
+        <w:ind w:left="5040" w:hanging="360"/>
+      </w:pPr>
+      <w:rPr>
+        <w:rFonts w:ascii="Symbol" w:hAnsi="Symbol" w:hint="default"/>
+        <w:sz w:val="20"/>
+      </w:rPr>
+    </w:lvl>
+    <w:lvl w:ilvl="7" w:tentative="1">
+      <w:start w:val="1"/>
+      <w:numFmt w:val="bullet"/>
+      <w:lvlText w:val=""/>
+      <w:lvlJc w:val="left"/>
+      <w:pPr>
+        <w:tabs>
+          <w:tab w:val="num" w:pos="5760"/>
+        </w:tabs>
+        <w:ind w:left="5760" w:hanging="360"/>
+      </w:pPr>
+      <w:rPr>
+        <w:rFonts w:ascii="Symbol" w:hAnsi="Symbol" w:hint="default"/>
+        <w:sz w:val="20"/>
+      </w:rPr>
+    </w:lvl>
+    <w:lvl w:ilvl="8" w:tentative="1">
+      <w:start w:val="1"/>
+      <w:numFmt w:val="bullet"/>
+      <w:lvlText w:val=""/>
+      <w:lvlJc w:val="left"/>
+      <w:pPr>
+        <w:tabs>
+          <w:tab w:val="num" w:pos="6480"/>
+        </w:tabs>
+        <w:ind w:left="6480" w:hanging="360"/>
+      </w:pPr>
+      <w:rPr>
+        <w:rFonts w:ascii="Symbol" w:hAnsi="Symbol" w:hint="default"/>
+        <w:sz w:val="20"/>
+      </w:rPr>
+    </w:lvl>
+  </w:abstractNum>
+  <w:abstractNum w:abstractNumId="2" w15:restartNumberingAfterBreak="0">
     <w:nsid w:val="10B47CC7"/>
     <w:multiLevelType w:val="multilevel"/>
     <w:tmpl w:val="4B323054"/>
@@ -3128,7 +3653,7 @@
       </w:rPr>
     </w:lvl>
   </w:abstractNum>
-  <w:abstractNum w:abstractNumId="2" w15:restartNumberingAfterBreak="0">
+  <w:abstractNum w:abstractNumId="3" w15:restartNumberingAfterBreak="0">
     <w:nsid w:val="12700AC3"/>
     <w:multiLevelType w:val="multilevel"/>
     <w:tmpl w:val="221AA528"/>
@@ -3277,7 +3802,7 @@
       </w:rPr>
     </w:lvl>
   </w:abstractNum>
-  <w:abstractNum w:abstractNumId="3" w15:restartNumberingAfterBreak="0">
+  <w:abstractNum w:abstractNumId="4" w15:restartNumberingAfterBreak="0">
     <w:nsid w:val="15C439B5"/>
     <w:multiLevelType w:val="multilevel"/>
     <w:tmpl w:val="46826754"/>
@@ -3426,7 +3951,7 @@
       </w:rPr>
     </w:lvl>
   </w:abstractNum>
-  <w:abstractNum w:abstractNumId="4" w15:restartNumberingAfterBreak="0">
+  <w:abstractNum w:abstractNumId="5" w15:restartNumberingAfterBreak="0">
     <w:nsid w:val="19E77330"/>
     <w:multiLevelType w:val="multilevel"/>
     <w:tmpl w:val="ABE2739E"/>
@@ -3575,7 +4100,156 @@
       </w:rPr>
     </w:lvl>
   </w:abstractNum>
-  <w:abstractNum w:abstractNumId="5" w15:restartNumberingAfterBreak="0">
+  <w:abstractNum w:abstractNumId="6" w15:restartNumberingAfterBreak="0">
+    <w:nsid w:val="1AEB50FE"/>
+    <w:multiLevelType w:val="multilevel"/>
+    <w:tmpl w:val="D89C8DD4"/>
+    <w:lvl w:ilvl="0">
+      <w:start w:val="1"/>
+      <w:numFmt w:val="bullet"/>
+      <w:lvlText w:val=""/>
+      <w:lvlJc w:val="left"/>
+      <w:pPr>
+        <w:tabs>
+          <w:tab w:val="num" w:pos="720"/>
+        </w:tabs>
+        <w:ind w:left="720" w:hanging="360"/>
+      </w:pPr>
+      <w:rPr>
+        <w:rFonts w:ascii="Symbol" w:hAnsi="Symbol" w:hint="default"/>
+        <w:sz w:val="20"/>
+      </w:rPr>
+    </w:lvl>
+    <w:lvl w:ilvl="1" w:tentative="1">
+      <w:start w:val="1"/>
+      <w:numFmt w:val="bullet"/>
+      <w:lvlText w:val=""/>
+      <w:lvlJc w:val="left"/>
+      <w:pPr>
+        <w:tabs>
+          <w:tab w:val="num" w:pos="1440"/>
+        </w:tabs>
+        <w:ind w:left="1440" w:hanging="360"/>
+      </w:pPr>
+      <w:rPr>
+        <w:rFonts w:ascii="Symbol" w:hAnsi="Symbol" w:hint="default"/>
+        <w:sz w:val="20"/>
+      </w:rPr>
+    </w:lvl>
+    <w:lvl w:ilvl="2" w:tentative="1">
+      <w:start w:val="1"/>
+      <w:numFmt w:val="bullet"/>
+      <w:lvlText w:val=""/>
+      <w:lvlJc w:val="left"/>
+      <w:pPr>
+        <w:tabs>
+          <w:tab w:val="num" w:pos="2160"/>
+        </w:tabs>
+        <w:ind w:left="2160" w:hanging="360"/>
+      </w:pPr>
+      <w:rPr>
+        <w:rFonts w:ascii="Symbol" w:hAnsi="Symbol" w:hint="default"/>
+        <w:sz w:val="20"/>
+      </w:rPr>
+    </w:lvl>
+    <w:lvl w:ilvl="3" w:tentative="1">
+      <w:start w:val="1"/>
+      <w:numFmt w:val="bullet"/>
+      <w:lvlText w:val=""/>
+      <w:lvlJc w:val="left"/>
+      <w:pPr>
+        <w:tabs>
+          <w:tab w:val="num" w:pos="2880"/>
+        </w:tabs>
+        <w:ind w:left="2880" w:hanging="360"/>
+      </w:pPr>
+      <w:rPr>
+        <w:rFonts w:ascii="Symbol" w:hAnsi="Symbol" w:hint="default"/>
+        <w:sz w:val="20"/>
+      </w:rPr>
+    </w:lvl>
+    <w:lvl w:ilvl="4" w:tentative="1">
+      <w:start w:val="1"/>
+      <w:numFmt w:val="bullet"/>
+      <w:lvlText w:val=""/>
+      <w:lvlJc w:val="left"/>
+      <w:pPr>
+        <w:tabs>
+          <w:tab w:val="num" w:pos="3600"/>
+        </w:tabs>
+        <w:ind w:left="3600" w:hanging="360"/>
+      </w:pPr>
+      <w:rPr>
+        <w:rFonts w:ascii="Symbol" w:hAnsi="Symbol" w:hint="default"/>
+        <w:sz w:val="20"/>
+      </w:rPr>
+    </w:lvl>
+    <w:lvl w:ilvl="5" w:tentative="1">
+      <w:start w:val="1"/>
+      <w:numFmt w:val="bullet"/>
+      <w:lvlText w:val=""/>
+      <w:lvlJc w:val="left"/>
+      <w:pPr>
+        <w:tabs>
+          <w:tab w:val="num" w:pos="4320"/>
+        </w:tabs>
+        <w:ind w:left="4320" w:hanging="360"/>
+      </w:pPr>
+      <w:rPr>
+        <w:rFonts w:ascii="Symbol" w:hAnsi="Symbol" w:hint="default"/>
+        <w:sz w:val="20"/>
+      </w:rPr>
+    </w:lvl>
+    <w:lvl w:ilvl="6" w:tentative="1">
+      <w:start w:val="1"/>
+      <w:numFmt w:val="bullet"/>
+      <w:lvlText w:val=""/>
+      <w:lvlJc w:val="left"/>
+      <w:pPr>
+        <w:tabs>
+          <w:tab w:val="num" w:pos="5040"/>
+        </w:tabs>
+        <w:ind w:left="5040" w:hanging="360"/>
+      </w:pPr>
+      <w:rPr>
+        <w:rFonts w:ascii="Symbol" w:hAnsi="Symbol" w:hint="default"/>
+        <w:sz w:val="20"/>
+      </w:rPr>
+    </w:lvl>
+    <w:lvl w:ilvl="7" w:tentative="1">
+      <w:start w:val="1"/>
+      <w:numFmt w:val="bullet"/>
+      <w:lvlText w:val=""/>
+      <w:lvlJc w:val="left"/>
+      <w:pPr>
+        <w:tabs>
+          <w:tab w:val="num" w:pos="5760"/>
+        </w:tabs>
+        <w:ind w:left="5760" w:hanging="360"/>
+      </w:pPr>
+      <w:rPr>
+        <w:rFonts w:ascii="Symbol" w:hAnsi="Symbol" w:hint="default"/>
+        <w:sz w:val="20"/>
+      </w:rPr>
+    </w:lvl>
+    <w:lvl w:ilvl="8" w:tentative="1">
+      <w:start w:val="1"/>
+      <w:numFmt w:val="bullet"/>
+      <w:lvlText w:val=""/>
+      <w:lvlJc w:val="left"/>
+      <w:pPr>
+        <w:tabs>
+          <w:tab w:val="num" w:pos="6480"/>
+        </w:tabs>
+        <w:ind w:left="6480" w:hanging="360"/>
+      </w:pPr>
+      <w:rPr>
+        <w:rFonts w:ascii="Symbol" w:hAnsi="Symbol" w:hint="default"/>
+        <w:sz w:val="20"/>
+      </w:rPr>
+    </w:lvl>
+  </w:abstractNum>
+  <w:abstractNum w:abstractNumId="7" w15:restartNumberingAfterBreak="0">
     <w:nsid w:val="1C54798F"/>
     <w:multiLevelType w:val="multilevel"/>
     <w:tmpl w:val="8612E53A"/>
@@ -3724,7 +4398,7 @@
       </w:rPr>
     </w:lvl>
   </w:abstractNum>
-  <w:abstractNum w:abstractNumId="6" w15:restartNumberingAfterBreak="0">
+  <w:abstractNum w:abstractNumId="8" w15:restartNumberingAfterBreak="0">
     <w:nsid w:val="1F2637B1"/>
     <w:multiLevelType w:val="multilevel"/>
     <w:tmpl w:val="B6C2A822"/>
@@ -3839,7 +4513,7 @@
       </w:rPr>
     </w:lvl>
   </w:abstractNum>
-  <w:abstractNum w:abstractNumId="7" w15:restartNumberingAfterBreak="0">
+  <w:abstractNum w:abstractNumId="9" w15:restartNumberingAfterBreak="0">
     <w:nsid w:val="22432887"/>
     <w:multiLevelType w:val="multilevel"/>
     <w:tmpl w:val="09100B40"/>
@@ -3988,7 +4662,7 @@
       </w:rPr>
     </w:lvl>
   </w:abstractNum>
-  <w:abstractNum w:abstractNumId="8" w15:restartNumberingAfterBreak="0">
+  <w:abstractNum w:abstractNumId="10" w15:restartNumberingAfterBreak="0">
     <w:nsid w:val="249C2B42"/>
     <w:multiLevelType w:val="multilevel"/>
     <w:tmpl w:val="97D8D996"/>
@@ -4137,7 +4811,7 @@
       </w:rPr>
     </w:lvl>
   </w:abstractNum>
-  <w:abstractNum w:abstractNumId="9" w15:restartNumberingAfterBreak="0">
+  <w:abstractNum w:abstractNumId="11" w15:restartNumberingAfterBreak="0">
     <w:nsid w:val="28E33A62"/>
     <w:multiLevelType w:val="multilevel"/>
     <w:tmpl w:val="EE446BCE"/>
@@ -4286,7 +4960,7 @@
       </w:rPr>
     </w:lvl>
   </w:abstractNum>
-  <w:abstractNum w:abstractNumId="10" w15:restartNumberingAfterBreak="0">
+  <w:abstractNum w:abstractNumId="12" w15:restartNumberingAfterBreak="0">
     <w:nsid w:val="29E614D1"/>
     <w:multiLevelType w:val="multilevel"/>
     <w:tmpl w:val="8398CCF0"/>
@@ -4435,7 +5109,7 @@
       </w:rPr>
     </w:lvl>
   </w:abstractNum>
-  <w:abstractNum w:abstractNumId="11" w15:restartNumberingAfterBreak="0">
+  <w:abstractNum w:abstractNumId="13" w15:restartNumberingAfterBreak="0">
     <w:nsid w:val="2A814324"/>
     <w:multiLevelType w:val="multilevel"/>
     <w:tmpl w:val="0262AF82"/>
@@ -4584,7 +5258,7 @@
       </w:rPr>
     </w:lvl>
   </w:abstractNum>
-  <w:abstractNum w:abstractNumId="12" w15:restartNumberingAfterBreak="0">
+  <w:abstractNum w:abstractNumId="14" w15:restartNumberingAfterBreak="0">
     <w:nsid w:val="2C73674C"/>
     <w:multiLevelType w:val="multilevel"/>
     <w:tmpl w:val="30DE1DFE"/>
@@ -4697,7 +5371,7 @@
       </w:pPr>
     </w:lvl>
   </w:abstractNum>
-  <w:abstractNum w:abstractNumId="13" w15:restartNumberingAfterBreak="0">
+  <w:abstractNum w:abstractNumId="15" w15:restartNumberingAfterBreak="0">
     <w:nsid w:val="365802AE"/>
     <w:multiLevelType w:val="multilevel"/>
     <w:tmpl w:val="1304CDDC"/>
@@ -4846,7 +5520,7 @@
       </w:rPr>
     </w:lvl>
   </w:abstractNum>
-  <w:abstractNum w:abstractNumId="14" w15:restartNumberingAfterBreak="0">
+  <w:abstractNum w:abstractNumId="16" w15:restartNumberingAfterBreak="0">
     <w:nsid w:val="39147671"/>
     <w:multiLevelType w:val="multilevel"/>
     <w:tmpl w:val="28FCAB92"/>
@@ -4995,7 +5669,7 @@
       </w:rPr>
     </w:lvl>
   </w:abstractNum>
-  <w:abstractNum w:abstractNumId="15" w15:restartNumberingAfterBreak="0">
+  <w:abstractNum w:abstractNumId="17" w15:restartNumberingAfterBreak="0">
     <w:nsid w:val="41CF68D1"/>
     <w:multiLevelType w:val="multilevel"/>
     <w:tmpl w:val="AD28734C"/>
@@ -5144,7 +5818,7 @@
       </w:rPr>
     </w:lvl>
   </w:abstractNum>
-  <w:abstractNum w:abstractNumId="16" w15:restartNumberingAfterBreak="0">
+  <w:abstractNum w:abstractNumId="18" w15:restartNumberingAfterBreak="0">
     <w:nsid w:val="44677946"/>
     <w:multiLevelType w:val="multilevel"/>
     <w:tmpl w:val="7E4EEF24"/>
@@ -5293,7 +5967,7 @@
       </w:rPr>
     </w:lvl>
   </w:abstractNum>
-  <w:abstractNum w:abstractNumId="17" w15:restartNumberingAfterBreak="0">
+  <w:abstractNum w:abstractNumId="19" w15:restartNumberingAfterBreak="0">
     <w:nsid w:val="4E402E0F"/>
     <w:multiLevelType w:val="multilevel"/>
     <w:tmpl w:val="6068E2C8"/>
@@ -5442,7 +6116,7 @@
       </w:rPr>
     </w:lvl>
   </w:abstractNum>
-  <w:abstractNum w:abstractNumId="18" w15:restartNumberingAfterBreak="0">
+  <w:abstractNum w:abstractNumId="20" w15:restartNumberingAfterBreak="0">
     <w:nsid w:val="4E49141C"/>
     <w:multiLevelType w:val="multilevel"/>
     <w:tmpl w:val="5A9CA2AE"/>
@@ -5591,7 +6265,7 @@
       </w:rPr>
     </w:lvl>
   </w:abstractNum>
-  <w:abstractNum w:abstractNumId="19" w15:restartNumberingAfterBreak="0">
+  <w:abstractNum w:abstractNumId="21" w15:restartNumberingAfterBreak="0">
     <w:nsid w:val="50B73CA5"/>
     <w:multiLevelType w:val="multilevel"/>
     <w:tmpl w:val="675CD15C"/>
@@ -5740,7 +6414,7 @@
       </w:rPr>
     </w:lvl>
   </w:abstractNum>
-  <w:abstractNum w:abstractNumId="20" w15:restartNumberingAfterBreak="0">
+  <w:abstractNum w:abstractNumId="22" w15:restartNumberingAfterBreak="0">
     <w:nsid w:val="51D222AC"/>
     <w:multiLevelType w:val="multilevel"/>
     <w:tmpl w:val="B3E25296"/>
@@ -5889,7 +6563,156 @@
       </w:rPr>
     </w:lvl>
   </w:abstractNum>
-  <w:abstractNum w:abstractNumId="21" w15:restartNumberingAfterBreak="0">
+  <w:abstractNum w:abstractNumId="23" w15:restartNumberingAfterBreak="0">
+    <w:nsid w:val="531E76E5"/>
+    <w:multiLevelType w:val="multilevel"/>
+    <w:tmpl w:val="EDE02BC8"/>
+    <w:lvl w:ilvl="0">
+      <w:start w:val="1"/>
+      <w:numFmt w:val="bullet"/>
+      <w:lvlText w:val=""/>
+      <w:lvlJc w:val="left"/>
+      <w:pPr>
+        <w:tabs>
+          <w:tab w:val="num" w:pos="720"/>
+        </w:tabs>
+        <w:ind w:left="720" w:hanging="360"/>
+      </w:pPr>
+      <w:rPr>
+        <w:rFonts w:ascii="Symbol" w:hAnsi="Symbol" w:hint="default"/>
+        <w:sz w:val="20"/>
+      </w:rPr>
+    </w:lvl>
+    <w:lvl w:ilvl="1" w:tentative="1">
+      <w:start w:val="1"/>
+      <w:numFmt w:val="bullet"/>
+      <w:lvlText w:val=""/>
+      <w:lvlJc w:val="left"/>
+      <w:pPr>
+        <w:tabs>
+          <w:tab w:val="num" w:pos="1440"/>
+        </w:tabs>
+        <w:ind w:left="1440" w:hanging="360"/>
+      </w:pPr>
+      <w:rPr>
+        <w:rFonts w:ascii="Symbol" w:hAnsi="Symbol" w:hint="default"/>
+        <w:sz w:val="20"/>
+      </w:rPr>
+    </w:lvl>
+    <w:lvl w:ilvl="2" w:tentative="1">
+      <w:start w:val="1"/>
+      <w:numFmt w:val="bullet"/>
+      <w:lvlText w:val=""/>
+      <w:lvlJc w:val="left"/>
+      <w:pPr>
+        <w:tabs>
+          <w:tab w:val="num" w:pos="2160"/>
+        </w:tabs>
+        <w:ind w:left="2160" w:hanging="360"/>
+      </w:pPr>
+      <w:rPr>
+        <w:rFonts w:ascii="Symbol" w:hAnsi="Symbol" w:hint="default"/>
+        <w:sz w:val="20"/>
+      </w:rPr>
+    </w:lvl>
+    <w:lvl w:ilvl="3" w:tentative="1">
+      <w:start w:val="1"/>
+      <w:numFmt w:val="bullet"/>
+      <w:lvlText w:val=""/>
+      <w:lvlJc w:val="left"/>
+      <w:pPr>
+        <w:tabs>
+          <w:tab w:val="num" w:pos="2880"/>
+        </w:tabs>
+        <w:ind w:left="2880" w:hanging="360"/>
+      </w:pPr>
+      <w:rPr>
+        <w:rFonts w:ascii="Symbol" w:hAnsi="Symbol" w:hint="default"/>
+        <w:sz w:val="20"/>
+      </w:rPr>
+    </w:lvl>
+    <w:lvl w:ilvl="4" w:tentative="1">
+      <w:start w:val="1"/>
+      <w:numFmt w:val="bullet"/>
+      <w:lvlText w:val=""/>
+      <w:lvlJc w:val="left"/>
+      <w:pPr>
+        <w:tabs>
+          <w:tab w:val="num" w:pos="3600"/>
+        </w:tabs>
+        <w:ind w:left="3600" w:hanging="360"/>
+      </w:pPr>
+      <w:rPr>
+        <w:rFonts w:ascii="Symbol" w:hAnsi="Symbol" w:hint="default"/>
+        <w:sz w:val="20"/>
+      </w:rPr>
+    </w:lvl>
+    <w:lvl w:ilvl="5" w:tentative="1">
+      <w:start w:val="1"/>
+      <w:numFmt w:val="bullet"/>
+      <w:lvlText w:val=""/>
+      <w:lvlJc w:val="left"/>
+      <w:pPr>
+        <w:tabs>
+          <w:tab w:val="num" w:pos="4320"/>
+        </w:tabs>
+        <w:ind w:left="4320" w:hanging="360"/>
+      </w:pPr>
+      <w:rPr>
+        <w:rFonts w:ascii="Symbol" w:hAnsi="Symbol" w:hint="default"/>
+        <w:sz w:val="20"/>
+      </w:rPr>
+    </w:lvl>
+    <w:lvl w:ilvl="6" w:tentative="1">
+      <w:start w:val="1"/>
+      <w:numFmt w:val="bullet"/>
+      <w:lvlText w:val=""/>
+      <w:lvlJc w:val="left"/>
+      <w:pPr>
+        <w:tabs>
+          <w:tab w:val="num" w:pos="5040"/>
+        </w:tabs>
+        <w:ind w:left="5040" w:hanging="360"/>
+      </w:pPr>
+      <w:rPr>
+        <w:rFonts w:ascii="Symbol" w:hAnsi="Symbol" w:hint="default"/>
+        <w:sz w:val="20"/>
+      </w:rPr>
+    </w:lvl>
+    <w:lvl w:ilvl="7" w:tentative="1">
+      <w:start w:val="1"/>
+      <w:numFmt w:val="bullet"/>
+      <w:lvlText w:val=""/>
+      <w:lvlJc w:val="left"/>
+      <w:pPr>
+        <w:tabs>
+          <w:tab w:val="num" w:pos="5760"/>
+        </w:tabs>
+        <w:ind w:left="5760" w:hanging="360"/>
+      </w:pPr>
+      <w:rPr>
+        <w:rFonts w:ascii="Symbol" w:hAnsi="Symbol" w:hint="default"/>
+        <w:sz w:val="20"/>
+      </w:rPr>
+    </w:lvl>
+    <w:lvl w:ilvl="8" w:tentative="1">
+      <w:start w:val="1"/>
+      <w:numFmt w:val="bullet"/>
+      <w:lvlText w:val=""/>
+      <w:lvlJc w:val="left"/>
+      <w:pPr>
+        <w:tabs>
+          <w:tab w:val="num" w:pos="6480"/>
+        </w:tabs>
+        <w:ind w:left="6480" w:hanging="360"/>
+      </w:pPr>
+      <w:rPr>
+        <w:rFonts w:ascii="Symbol" w:hAnsi="Symbol" w:hint="default"/>
+        <w:sz w:val="20"/>
+      </w:rPr>
+    </w:lvl>
+  </w:abstractNum>
+  <w:abstractNum w:abstractNumId="24" w15:restartNumberingAfterBreak="0">
     <w:nsid w:val="533A324B"/>
     <w:multiLevelType w:val="multilevel"/>
     <w:tmpl w:val="56BCC45C"/>
@@ -6038,7 +6861,7 @@
       </w:rPr>
     </w:lvl>
   </w:abstractNum>
-  <w:abstractNum w:abstractNumId="22" w15:restartNumberingAfterBreak="0">
+  <w:abstractNum w:abstractNumId="25" w15:restartNumberingAfterBreak="0">
     <w:nsid w:val="540E6F18"/>
     <w:multiLevelType w:val="multilevel"/>
     <w:tmpl w:val="87DCA8E0"/>
@@ -6187,7 +7010,7 @@
       </w:rPr>
     </w:lvl>
   </w:abstractNum>
-  <w:abstractNum w:abstractNumId="23" w15:restartNumberingAfterBreak="0">
+  <w:abstractNum w:abstractNumId="26" w15:restartNumberingAfterBreak="0">
     <w:nsid w:val="59EA2C4A"/>
     <w:multiLevelType w:val="multilevel"/>
     <w:tmpl w:val="8BD26C36"/>
@@ -6336,7 +7159,7 @@
       </w:rPr>
     </w:lvl>
   </w:abstractNum>
-  <w:abstractNum w:abstractNumId="24" w15:restartNumberingAfterBreak="0">
+  <w:abstractNum w:abstractNumId="27" w15:restartNumberingAfterBreak="0">
     <w:nsid w:val="5A0E2298"/>
     <w:multiLevelType w:val="multilevel"/>
     <w:tmpl w:val="BB9612AC"/>
@@ -6481,7 +7304,7 @@
       </w:rPr>
     </w:lvl>
   </w:abstractNum>
-  <w:abstractNum w:abstractNumId="25" w15:restartNumberingAfterBreak="0">
+  <w:abstractNum w:abstractNumId="28" w15:restartNumberingAfterBreak="0">
     <w:nsid w:val="5BB16C30"/>
     <w:multiLevelType w:val="multilevel"/>
     <w:tmpl w:val="6DC0F07A"/>
@@ -6630,7 +7453,7 @@
       </w:rPr>
     </w:lvl>
   </w:abstractNum>
-  <w:abstractNum w:abstractNumId="26" w15:restartNumberingAfterBreak="0">
+  <w:abstractNum w:abstractNumId="29" w15:restartNumberingAfterBreak="0">
     <w:nsid w:val="61110AC8"/>
     <w:multiLevelType w:val="multilevel"/>
     <w:tmpl w:val="92320496"/>
@@ -6779,7 +7602,7 @@
       </w:rPr>
     </w:lvl>
   </w:abstractNum>
-  <w:abstractNum w:abstractNumId="27" w15:restartNumberingAfterBreak="0">
+  <w:abstractNum w:abstractNumId="30" w15:restartNumberingAfterBreak="0">
     <w:nsid w:val="623D0706"/>
     <w:multiLevelType w:val="multilevel"/>
     <w:tmpl w:val="3116859E"/>
@@ -6928,7 +7751,7 @@
       </w:rPr>
     </w:lvl>
   </w:abstractNum>
-  <w:abstractNum w:abstractNumId="28" w15:restartNumberingAfterBreak="0">
+  <w:abstractNum w:abstractNumId="31" w15:restartNumberingAfterBreak="0">
     <w:nsid w:val="69E65E00"/>
     <w:multiLevelType w:val="multilevel"/>
     <w:tmpl w:val="04E893C4"/>
@@ -7041,7 +7864,7 @@
       </w:pPr>
     </w:lvl>
   </w:abstractNum>
-  <w:abstractNum w:abstractNumId="29" w15:restartNumberingAfterBreak="0">
+  <w:abstractNum w:abstractNumId="32" w15:restartNumberingAfterBreak="0">
     <w:nsid w:val="6CF83EE6"/>
     <w:multiLevelType w:val="multilevel"/>
     <w:tmpl w:val="70AA93B2"/>
@@ -7190,7 +8013,7 @@
       </w:rPr>
     </w:lvl>
   </w:abstractNum>
-  <w:abstractNum w:abstractNumId="30" w15:restartNumberingAfterBreak="0">
+  <w:abstractNum w:abstractNumId="33" w15:restartNumberingAfterBreak="0">
     <w:nsid w:val="743D265B"/>
     <w:multiLevelType w:val="multilevel"/>
     <w:tmpl w:val="3400487C"/>
@@ -7339,7 +8162,156 @@
       </w:rPr>
     </w:lvl>
   </w:abstractNum>
-  <w:abstractNum w:abstractNumId="31" w15:restartNumberingAfterBreak="0">
+  <w:abstractNum w:abstractNumId="34" w15:restartNumberingAfterBreak="0">
+    <w:nsid w:val="748F6EEA"/>
+    <w:multiLevelType w:val="multilevel"/>
+    <w:tmpl w:val="9BA21E5C"/>
+    <w:lvl w:ilvl="0">
+      <w:start w:val="1"/>
+      <w:numFmt w:val="bullet"/>
+      <w:lvlText w:val=""/>
+      <w:lvlJc w:val="left"/>
+      <w:pPr>
+        <w:tabs>
+          <w:tab w:val="num" w:pos="720"/>
+        </w:tabs>
+        <w:ind w:left="720" w:hanging="360"/>
+      </w:pPr>
+      <w:rPr>
+        <w:rFonts w:ascii="Symbol" w:hAnsi="Symbol" w:hint="default"/>
+        <w:sz w:val="20"/>
+      </w:rPr>
+    </w:lvl>
+    <w:lvl w:ilvl="1">
+      <w:start w:val="1"/>
+      <w:numFmt w:val="bullet"/>
+      <w:lvlText w:val=""/>
+      <w:lvlJc w:val="left"/>
+      <w:pPr>
+        <w:tabs>
+          <w:tab w:val="num" w:pos="1440"/>
+        </w:tabs>
+        <w:ind w:left="1440" w:hanging="360"/>
+      </w:pPr>
+      <w:rPr>
+        <w:rFonts w:ascii="Symbol" w:hAnsi="Symbol" w:hint="default"/>
+        <w:sz w:val="20"/>
+      </w:rPr>
+    </w:lvl>
+    <w:lvl w:ilvl="2" w:tentative="1">
+      <w:start w:val="1"/>
+      <w:numFmt w:val="bullet"/>
+      <w:lvlText w:val=""/>
+      <w:lvlJc w:val="left"/>
+      <w:pPr>
+        <w:tabs>
+          <w:tab w:val="num" w:pos="2160"/>
+        </w:tabs>
+        <w:ind w:left="2160" w:hanging="360"/>
+      </w:pPr>
+      <w:rPr>
+        <w:rFonts w:ascii="Symbol" w:hAnsi="Symbol" w:hint="default"/>
+        <w:sz w:val="20"/>
+      </w:rPr>
+    </w:lvl>
+    <w:lvl w:ilvl="3" w:tentative="1">
+      <w:start w:val="1"/>
+      <w:numFmt w:val="bullet"/>
+      <w:lvlText w:val=""/>
+      <w:lvlJc w:val="left"/>
+      <w:pPr>
+        <w:tabs>
+          <w:tab w:val="num" w:pos="2880"/>
+        </w:tabs>
+        <w:ind w:left="2880" w:hanging="360"/>
+      </w:pPr>
+      <w:rPr>
+        <w:rFonts w:ascii="Symbol" w:hAnsi="Symbol" w:hint="default"/>
+        <w:sz w:val="20"/>
+      </w:rPr>
+    </w:lvl>
+    <w:lvl w:ilvl="4" w:tentative="1">
+      <w:start w:val="1"/>
+      <w:numFmt w:val="bullet"/>
+      <w:lvlText w:val=""/>
+      <w:lvlJc w:val="left"/>
+      <w:pPr>
+        <w:tabs>
+          <w:tab w:val="num" w:pos="3600"/>
+        </w:tabs>
+        <w:ind w:left="3600" w:hanging="360"/>
+      </w:pPr>
+      <w:rPr>
+        <w:rFonts w:ascii="Symbol" w:hAnsi="Symbol" w:hint="default"/>
+        <w:sz w:val="20"/>
+      </w:rPr>
+    </w:lvl>
+    <w:lvl w:ilvl="5" w:tentative="1">
+      <w:start w:val="1"/>
+      <w:numFmt w:val="bullet"/>
+      <w:lvlText w:val=""/>
+      <w:lvlJc w:val="left"/>
+      <w:pPr>
+        <w:tabs>
+          <w:tab w:val="num" w:pos="4320"/>
+        </w:tabs>
+        <w:ind w:left="4320" w:hanging="360"/>
+      </w:pPr>
+      <w:rPr>
+        <w:rFonts w:ascii="Symbol" w:hAnsi="Symbol" w:hint="default"/>
+        <w:sz w:val="20"/>
+      </w:rPr>
+    </w:lvl>
+    <w:lvl w:ilvl="6" w:tentative="1">
+      <w:start w:val="1"/>
+      <w:numFmt w:val="bullet"/>
+      <w:lvlText w:val=""/>
+      <w:lvlJc w:val="left"/>
+      <w:pPr>
+        <w:tabs>
+          <w:tab w:val="num" w:pos="5040"/>
+        </w:tabs>
+        <w:ind w:left="5040" w:hanging="360"/>
+      </w:pPr>
+      <w:rPr>
+        <w:rFonts w:ascii="Symbol" w:hAnsi="Symbol" w:hint="default"/>
+        <w:sz w:val="20"/>
+      </w:rPr>
+    </w:lvl>
+    <w:lvl w:ilvl="7" w:tentative="1">
+      <w:start w:val="1"/>
+      <w:numFmt w:val="bullet"/>
+      <w:lvlText w:val=""/>
+      <w:lvlJc w:val="left"/>
+      <w:pPr>
+        <w:tabs>
+          <w:tab w:val="num" w:pos="5760"/>
+        </w:tabs>
+        <w:ind w:left="5760" w:hanging="360"/>
+      </w:pPr>
+      <w:rPr>
+        <w:rFonts w:ascii="Symbol" w:hAnsi="Symbol" w:hint="default"/>
+        <w:sz w:val="20"/>
+      </w:rPr>
+    </w:lvl>
+    <w:lvl w:ilvl="8" w:tentative="1">
+      <w:start w:val="1"/>
+      <w:numFmt w:val="bullet"/>
+      <w:lvlText w:val=""/>
+      <w:lvlJc w:val="left"/>
+      <w:pPr>
+        <w:tabs>
+          <w:tab w:val="num" w:pos="6480"/>
+        </w:tabs>
+        <w:ind w:left="6480" w:hanging="360"/>
+      </w:pPr>
+      <w:rPr>
+        <w:rFonts w:ascii="Symbol" w:hAnsi="Symbol" w:hint="default"/>
+        <w:sz w:val="20"/>
+      </w:rPr>
+    </w:lvl>
+  </w:abstractNum>
+  <w:abstractNum w:abstractNumId="35" w15:restartNumberingAfterBreak="0">
     <w:nsid w:val="758A781F"/>
     <w:multiLevelType w:val="multilevel"/>
     <w:tmpl w:val="2E141854"/>
@@ -7488,7 +8460,7 @@
       </w:rPr>
     </w:lvl>
   </w:abstractNum>
-  <w:abstractNum w:abstractNumId="32" w15:restartNumberingAfterBreak="0">
+  <w:abstractNum w:abstractNumId="36" w15:restartNumberingAfterBreak="0">
     <w:nsid w:val="7E48662E"/>
     <w:multiLevelType w:val="multilevel"/>
     <w:tmpl w:val="7E2CF740"/>
@@ -7637,7 +8609,7 @@
       </w:rPr>
     </w:lvl>
   </w:abstractNum>
-  <w:abstractNum w:abstractNumId="33" w15:restartNumberingAfterBreak="0">
+  <w:abstractNum w:abstractNumId="37" w15:restartNumberingAfterBreak="0">
     <w:nsid w:val="7FA7012C"/>
     <w:multiLevelType w:val="multilevel"/>
     <w:tmpl w:val="3DF8D112"/>
@@ -7786,7 +8758,7 @@
       </w:rPr>
     </w:lvl>
   </w:abstractNum>
-  <w:abstractNum w:abstractNumId="34" w15:restartNumberingAfterBreak="0">
+  <w:abstractNum w:abstractNumId="38" w15:restartNumberingAfterBreak="0">
     <w:nsid w:val="7FBB780C"/>
     <w:multiLevelType w:val="multilevel"/>
     <w:tmpl w:val="902ECCD2"/>
@@ -7900,109 +8872,121 @@
     </w:lvl>
   </w:abstractNum>
   <w:num w:numId="1" w16cid:durableId="1961371284">
-    <w:abstractNumId w:val="6"/>
+    <w:abstractNumId w:val="8"/>
   </w:num>
   <w:num w:numId="2" w16cid:durableId="1367027804">
-    <w:abstractNumId w:val="29"/>
+    <w:abstractNumId w:val="32"/>
   </w:num>
   <w:num w:numId="3" w16cid:durableId="1668631311">
     <w:abstractNumId w:val="0"/>
   </w:num>
   <w:num w:numId="4" w16cid:durableId="1732652887">
+    <w:abstractNumId w:val="22"/>
+  </w:num>
+  <w:num w:numId="5" w16cid:durableId="956135389">
+    <w:abstractNumId w:val="24"/>
+  </w:num>
+  <w:num w:numId="6" w16cid:durableId="1789198818">
+    <w:abstractNumId w:val="9"/>
+  </w:num>
+  <w:num w:numId="7" w16cid:durableId="269972398">
+    <w:abstractNumId w:val="28"/>
+  </w:num>
+  <w:num w:numId="8" w16cid:durableId="817572598">
+    <w:abstractNumId w:val="7"/>
+  </w:num>
+  <w:num w:numId="9" w16cid:durableId="670715461">
+    <w:abstractNumId w:val="29"/>
+  </w:num>
+  <w:num w:numId="10" w16cid:durableId="1276332657">
+    <w:abstractNumId w:val="30"/>
+  </w:num>
+  <w:num w:numId="11" w16cid:durableId="1085541468">
+    <w:abstractNumId w:val="3"/>
+  </w:num>
+  <w:num w:numId="12" w16cid:durableId="729813302">
+    <w:abstractNumId w:val="31"/>
+  </w:num>
+  <w:num w:numId="13" w16cid:durableId="219287181">
+    <w:abstractNumId w:val="38"/>
+  </w:num>
+  <w:num w:numId="14" w16cid:durableId="1478569081">
+    <w:abstractNumId w:val="35"/>
+  </w:num>
+  <w:num w:numId="15" w16cid:durableId="1784617126">
+    <w:abstractNumId w:val="19"/>
+  </w:num>
+  <w:num w:numId="16" w16cid:durableId="488444713">
+    <w:abstractNumId w:val="21"/>
+  </w:num>
+  <w:num w:numId="17" w16cid:durableId="1473865838">
+    <w:abstractNumId w:val="16"/>
+  </w:num>
+  <w:num w:numId="18" w16cid:durableId="1131827971">
+    <w:abstractNumId w:val="4"/>
+  </w:num>
+  <w:num w:numId="19" w16cid:durableId="801387460">
     <w:abstractNumId w:val="20"/>
   </w:num>
-  <w:num w:numId="5" w16cid:durableId="956135389">
-    <w:abstractNumId w:val="21"/>
+  <w:num w:numId="20" w16cid:durableId="219755788">
+    <w:abstractNumId w:val="11"/>
   </w:num>
-  <w:num w:numId="6" w16cid:durableId="1789198818">
-    <w:abstractNumId w:val="7"/>
-  </w:num>
-  <w:num w:numId="7" w16cid:durableId="269972398">
+  <w:num w:numId="21" w16cid:durableId="196814451">
     <w:abstractNumId w:val="25"/>
   </w:num>
-  <w:num w:numId="8" w16cid:durableId="817572598">
+  <w:num w:numId="22" w16cid:durableId="166287831">
+    <w:abstractNumId w:val="14"/>
+  </w:num>
+  <w:num w:numId="23" w16cid:durableId="1636062703">
+    <w:abstractNumId w:val="18"/>
+  </w:num>
+  <w:num w:numId="24" w16cid:durableId="651569532">
+    <w:abstractNumId w:val="33"/>
+  </w:num>
+  <w:num w:numId="25" w16cid:durableId="1769961410">
+    <w:abstractNumId w:val="10"/>
+  </w:num>
+  <w:num w:numId="26" w16cid:durableId="1853033479">
     <w:abstractNumId w:val="5"/>
   </w:num>
-  <w:num w:numId="9" w16cid:durableId="670715461">
+  <w:num w:numId="27" w16cid:durableId="1389182724">
+    <w:abstractNumId w:val="12"/>
+  </w:num>
+  <w:num w:numId="28" w16cid:durableId="1210071178">
+    <w:abstractNumId w:val="13"/>
+  </w:num>
+  <w:num w:numId="29" w16cid:durableId="2055808716">
+    <w:abstractNumId w:val="15"/>
+  </w:num>
+  <w:num w:numId="30" w16cid:durableId="951592037">
+    <w:abstractNumId w:val="2"/>
+  </w:num>
+  <w:num w:numId="31" w16cid:durableId="1780370132">
+    <w:abstractNumId w:val="36"/>
+  </w:num>
+  <w:num w:numId="32" w16cid:durableId="1576473904">
+    <w:abstractNumId w:val="17"/>
+  </w:num>
+  <w:num w:numId="33" w16cid:durableId="681971854">
+    <w:abstractNumId w:val="37"/>
+  </w:num>
+  <w:num w:numId="34" w16cid:durableId="1310600430">
+    <w:abstractNumId w:val="27"/>
+  </w:num>
+  <w:num w:numId="35" w16cid:durableId="1824739748">
     <w:abstractNumId w:val="26"/>
   </w:num>
-  <w:num w:numId="10" w16cid:durableId="1276332657">
-    <w:abstractNumId w:val="27"/>
-  </w:num>
-  <w:num w:numId="11" w16cid:durableId="1085541468">
-    <w:abstractNumId w:val="2"/>
-  </w:num>
-  <w:num w:numId="12" w16cid:durableId="729813302">
-    <w:abstractNumId w:val="28"/>
-  </w:num>
-  <w:num w:numId="13" w16cid:durableId="219287181">
+  <w:num w:numId="36" w16cid:durableId="2028209590">
     <w:abstractNumId w:val="34"/>
   </w:num>
-  <w:num w:numId="14" w16cid:durableId="1478569081">
-    <w:abstractNumId w:val="31"/>
+  <w:num w:numId="37" w16cid:durableId="2099673263">
+    <w:abstractNumId w:val="23"/>
   </w:num>
-  <w:num w:numId="15" w16cid:durableId="1784617126">
-    <w:abstractNumId w:val="17"/>
+  <w:num w:numId="38" w16cid:durableId="839005494">
+    <w:abstractNumId w:val="6"/>
   </w:num>
-  <w:num w:numId="16" w16cid:durableId="488444713">
-    <w:abstractNumId w:val="19"/>
-  </w:num>
-  <w:num w:numId="17" w16cid:durableId="1473865838">
-    <w:abstractNumId w:val="14"/>
-  </w:num>
-  <w:num w:numId="18" w16cid:durableId="1131827971">
-    <w:abstractNumId w:val="3"/>
-  </w:num>
-  <w:num w:numId="19" w16cid:durableId="801387460">
-    <w:abstractNumId w:val="18"/>
-  </w:num>
-  <w:num w:numId="20" w16cid:durableId="219755788">
-    <w:abstractNumId w:val="9"/>
-  </w:num>
-  <w:num w:numId="21" w16cid:durableId="196814451">
-    <w:abstractNumId w:val="22"/>
-  </w:num>
-  <w:num w:numId="22" w16cid:durableId="166287831">
-    <w:abstractNumId w:val="12"/>
-  </w:num>
-  <w:num w:numId="23" w16cid:durableId="1636062703">
-    <w:abstractNumId w:val="16"/>
-  </w:num>
-  <w:num w:numId="24" w16cid:durableId="651569532">
-    <w:abstractNumId w:val="30"/>
-  </w:num>
-  <w:num w:numId="25" w16cid:durableId="1769961410">
-    <w:abstractNumId w:val="8"/>
-  </w:num>
-  <w:num w:numId="26" w16cid:durableId="1853033479">
-    <w:abstractNumId w:val="4"/>
-  </w:num>
-  <w:num w:numId="27" w16cid:durableId="1389182724">
-    <w:abstractNumId w:val="10"/>
-  </w:num>
-  <w:num w:numId="28" w16cid:durableId="1210071178">
-    <w:abstractNumId w:val="11"/>
-  </w:num>
-  <w:num w:numId="29" w16cid:durableId="2055808716">
-    <w:abstractNumId w:val="13"/>
-  </w:num>
-  <w:num w:numId="30" w16cid:durableId="951592037">
+  <w:num w:numId="39" w16cid:durableId="1280183906">
     <w:abstractNumId w:val="1"/>
-  </w:num>
-  <w:num w:numId="31" w16cid:durableId="1780370132">
-    <w:abstractNumId w:val="32"/>
-  </w:num>
-  <w:num w:numId="32" w16cid:durableId="1576473904">
-    <w:abstractNumId w:val="15"/>
-  </w:num>
-  <w:num w:numId="33" w16cid:durableId="681971854">
-    <w:abstractNumId w:val="33"/>
-  </w:num>
-  <w:num w:numId="34" w16cid:durableId="1310600430">
-    <w:abstractNumId w:val="24"/>
-  </w:num>
-  <w:num w:numId="35" w16cid:durableId="1824739748">
-    <w:abstractNumId w:val="23"/>
   </w:num>
 </w:numbering>
 </file>

</xml_diff>

<commit_message>
Phase 5: Upgrade to LiveKit SFU
</commit_message>
<xml_diff>
--- a/TaiLieuDacTa.docx
+++ b/TaiLieuDacTa.docx
@@ -3193,6 +3193,798 @@
         <w:t>Bấm "Dừng chia sẻ", luồng sẽ tự động quay trở về Camera.</w:t>
       </w:r>
     </w:p>
+    <w:p>
+      <w:r>
+        <w:br w:type="page"/>
+      </w:r>
+    </w:p>
+    <w:p>
+      <w:r>
+        <w:lastRenderedPageBreak/>
+        <w:t>1. Nâng cấp Kiến trúc mạng (Core &amp; Infrastructure)</w:t>
+      </w:r>
+    </w:p>
+    <w:p>
+      <w:pPr>
+        <w:numPr>
+          <w:ilvl w:val="0"/>
+          <w:numId w:val="40"/>
+        </w:numPr>
+      </w:pPr>
+      <w:r>
+        <w:rPr>
+          <w:b/>
+          <w:bCs/>
+        </w:rPr>
+        <w:t>Từ Mesh Network sang SFU (Selective Forwarding Unit):</w:t>
+      </w:r>
+      <w:r>
+        <w:t> Hiện tại, với mô hình P2P Mesh, nếu phòng có 10 người, mỗi thiết bị phải mở 9 kết nối và gửi/nhận 9 luồng video, gây quá tải CPU và băng thông. Thay vì dùng Mesh, ta có thể xây dựng hoặc tích hợp một Media Server (như </w:t>
+      </w:r>
+      <w:r>
+        <w:rPr>
+          <w:i/>
+          <w:iCs/>
+        </w:rPr>
+        <w:t>mediasoup</w:t>
+      </w:r>
+      <w:r>
+        <w:t> hoặc </w:t>
+      </w:r>
+      <w:r>
+        <w:rPr>
+          <w:i/>
+          <w:iCs/>
+        </w:rPr>
+        <w:t>Janus</w:t>
+      </w:r>
+      <w:r>
+        <w:t>) đóng vai trò SFU. Mọi người chỉ cần gửi 1 luồng video lên server, server sẽ phân phối đến những người còn lại. Lúc này sức chứa của phòng họp có thể lên tới 50-100 người.</w:t>
+      </w:r>
+    </w:p>
+    <w:p>
+      <w:pPr>
+        <w:numPr>
+          <w:ilvl w:val="0"/>
+          <w:numId w:val="40"/>
+        </w:numPr>
+      </w:pPr>
+      <w:r>
+        <w:rPr>
+          <w:b/>
+          <w:bCs/>
+        </w:rPr>
+        <w:t>Tự build STUN/TURN Server:</w:t>
+      </w:r>
+      <w:r>
+        <w:t> Hiện tại dùng STUN của Google chỉ giải quyết được các mạng thông thường. Đối với mạng doanh nghiệp có tường lửa mạnh (Symmetric NAT), P2P sẽ thất bại. Bạn có thể thuê một VPS Linux nhỏ và cài đặt </w:t>
+      </w:r>
+      <w:r>
+        <w:rPr>
+          <w:b/>
+          <w:bCs/>
+        </w:rPr>
+        <w:t>Coturn</w:t>
+      </w:r>
+      <w:r>
+        <w:t> làm TURN server của riêng mình để trung chuyển dữ liệu khi kết nối P2P bị chặn.</w:t>
+      </w:r>
+    </w:p>
+    <w:p>
+      <w:r>
+        <w:t>2. Các tính năng Nâng cao trong Phòng họp (In-Room Features)</w:t>
+      </w:r>
+    </w:p>
+    <w:p>
+      <w:pPr>
+        <w:numPr>
+          <w:ilvl w:val="0"/>
+          <w:numId w:val="41"/>
+        </w:numPr>
+      </w:pPr>
+      <w:r>
+        <w:rPr>
+          <w:b/>
+          <w:bCs/>
+        </w:rPr>
+        <w:t>Host Controls (Quyền Quản trị viên):</w:t>
+      </w:r>
+    </w:p>
+    <w:p>
+      <w:pPr>
+        <w:numPr>
+          <w:ilvl w:val="1"/>
+          <w:numId w:val="41"/>
+        </w:numPr>
+      </w:pPr>
+      <w:r>
+        <w:t>Chỉ định ai là Host (người tạo phòng). Host có quyền </w:t>
+      </w:r>
+      <w:r>
+        <w:rPr>
+          <w:b/>
+          <w:bCs/>
+        </w:rPr>
+        <w:t>Mute All</w:t>
+      </w:r>
+      <w:r>
+        <w:t> (Tắt mic mọi người), </w:t>
+      </w:r>
+      <w:r>
+        <w:rPr>
+          <w:b/>
+          <w:bCs/>
+        </w:rPr>
+        <w:t>Kick</w:t>
+      </w:r>
+      <w:r>
+        <w:t> (Đuổi ai đó ra khỏi phòng), và </w:t>
+      </w:r>
+      <w:r>
+        <w:rPr>
+          <w:b/>
+          <w:bCs/>
+        </w:rPr>
+        <w:t>Lock Room</w:t>
+      </w:r>
+      <w:r>
+        <w:t> (Khóa phòng không cho ai tham gia nữa dù có link).</w:t>
+      </w:r>
+    </w:p>
+    <w:p>
+      <w:pPr>
+        <w:numPr>
+          <w:ilvl w:val="0"/>
+          <w:numId w:val="41"/>
+        </w:numPr>
+      </w:pPr>
+      <w:r>
+        <w:rPr>
+          <w:b/>
+          <w:bCs/>
+        </w:rPr>
+        <w:t>Background Blur &amp; Virtual Background (Thay đổi phông nền):</w:t>
+      </w:r>
+    </w:p>
+    <w:p>
+      <w:pPr>
+        <w:numPr>
+          <w:ilvl w:val="1"/>
+          <w:numId w:val="41"/>
+        </w:numPr>
+      </w:pPr>
+      <w:r>
+        <w:t>Tích hợp thư viện AI xử lý hình ảnh phía client như </w:t>
+      </w:r>
+      <w:r>
+        <w:rPr>
+          <w:i/>
+          <w:iCs/>
+        </w:rPr>
+        <w:t>MediaPipe</w:t>
+      </w:r>
+      <w:r>
+        <w:t> hoặc </w:t>
+      </w:r>
+      <w:r>
+        <w:rPr>
+          <w:i/>
+          <w:iCs/>
+        </w:rPr>
+        <w:t>TensorFlow.js</w:t>
+      </w:r>
+      <w:r>
+        <w:t> (thông qua Canvas API) để tách nền, làm mờ nền hoặc thay bằng hình ảnh anime (phù hợp với concept Sakura).</w:t>
+      </w:r>
+    </w:p>
+    <w:p>
+      <w:pPr>
+        <w:numPr>
+          <w:ilvl w:val="0"/>
+          <w:numId w:val="41"/>
+        </w:numPr>
+      </w:pPr>
+      <w:r>
+        <w:rPr>
+          <w:b/>
+          <w:bCs/>
+        </w:rPr>
+        <w:t>Tính năng Giơ tay (Raise Hand):</w:t>
+      </w:r>
+    </w:p>
+    <w:p>
+      <w:pPr>
+        <w:numPr>
+          <w:ilvl w:val="1"/>
+          <w:numId w:val="41"/>
+        </w:numPr>
+      </w:pPr>
+      <w:r>
+        <w:t xml:space="preserve">Khi một người muốn phát biểu, họ bấm nút "Giơ tay". Hệ thống sẽ dùng WebSockets bắn tín hiệu để hiển thị icon </w:t>
+      </w:r>
+      <w:r>
+        <w:rPr>
+          <w:rFonts w:ascii="Segoe UI Emoji" w:hAnsi="Segoe UI Emoji" w:cs="Segoe UI Emoji"/>
+        </w:rPr>
+        <w:t>✋</w:t>
+      </w:r>
+      <w:r>
+        <w:t xml:space="preserve"> cạnh video của người đó kèm âm thanh "ting" nhỏ.</w:t>
+      </w:r>
+    </w:p>
+    <w:p>
+      <w:pPr>
+        <w:numPr>
+          <w:ilvl w:val="0"/>
+          <w:numId w:val="41"/>
+        </w:numPr>
+      </w:pPr>
+      <w:r>
+        <w:rPr>
+          <w:b/>
+          <w:bCs/>
+        </w:rPr>
+        <w:t>Picture-in-Picture (PiP) và Pin Video:</w:t>
+      </w:r>
+    </w:p>
+    <w:p>
+      <w:pPr>
+        <w:numPr>
+          <w:ilvl w:val="1"/>
+          <w:numId w:val="41"/>
+        </w:numPr>
+      </w:pPr>
+      <w:r>
+        <w:t>Double-click vào video của ai đó để "Ghim" (phóng to) người đó lên giữa màn hình, các video khác sẽ thu nhỏ lại phía dưới.</w:t>
+      </w:r>
+    </w:p>
+    <w:p>
+      <w:pPr>
+        <w:numPr>
+          <w:ilvl w:val="1"/>
+          <w:numId w:val="41"/>
+        </w:numPr>
+      </w:pPr>
+      <w:r>
+        <w:lastRenderedPageBreak/>
+        <w:t>Khi người dùng chuyển sang tab khác, có thể tự động bật chế độ cửa sổ thu nhỏ (Picture-in-Picture API) để họ vừa lướt web vừa họp.</w:t>
+      </w:r>
+    </w:p>
+    <w:p>
+      <w:pPr>
+        <w:numPr>
+          <w:ilvl w:val="0"/>
+          <w:numId w:val="41"/>
+        </w:numPr>
+      </w:pPr>
+      <w:r>
+        <w:rPr>
+          <w:b/>
+          <w:bCs/>
+        </w:rPr>
+        <w:t>Ghi hình phiên họp (Record Session):</w:t>
+      </w:r>
+    </w:p>
+    <w:p>
+      <w:pPr>
+        <w:numPr>
+          <w:ilvl w:val="1"/>
+          <w:numId w:val="41"/>
+        </w:numPr>
+      </w:pPr>
+      <w:r>
+        <w:t>Sử dụng MediaRecorder API ở phía client để lưu luồng Video/Audio và tải xuống máy tính dưới dạng file .webm hoặc .mp4 khi kết thúc.</w:t>
+      </w:r>
+    </w:p>
+    <w:p>
+      <w:r>
+        <w:t>3. Tương tác và Tiện ích (Social &amp; Utilities)</w:t>
+      </w:r>
+    </w:p>
+    <w:p>
+      <w:pPr>
+        <w:numPr>
+          <w:ilvl w:val="0"/>
+          <w:numId w:val="42"/>
+        </w:numPr>
+      </w:pPr>
+      <w:r>
+        <w:rPr>
+          <w:b/>
+          <w:bCs/>
+        </w:rPr>
+        <w:t>Bắn Emojis Real-time (Reactions):</w:t>
+      </w:r>
+    </w:p>
+    <w:p>
+      <w:pPr>
+        <w:numPr>
+          <w:ilvl w:val="1"/>
+          <w:numId w:val="42"/>
+        </w:numPr>
+      </w:pPr>
+      <w:r>
+        <w:t>Thêm một thanh Emoji (Tym, Cười, Vỗ tay). Khi bấm, một loạt các Emoji sẽ bay lơ lửng trên màn hình Video của người dùng đó (sử dụng CSS Animation và WebSockets).</w:t>
+      </w:r>
+    </w:p>
+    <w:p>
+      <w:pPr>
+        <w:numPr>
+          <w:ilvl w:val="0"/>
+          <w:numId w:val="42"/>
+        </w:numPr>
+      </w:pPr>
+      <w:r>
+        <w:rPr>
+          <w:b/>
+          <w:bCs/>
+        </w:rPr>
+        <w:t>Chia sẻ File / Hình ảnh trực tiếp trong Chat:</w:t>
+      </w:r>
+    </w:p>
+    <w:p>
+      <w:pPr>
+        <w:numPr>
+          <w:ilvl w:val="1"/>
+          <w:numId w:val="42"/>
+        </w:numPr>
+      </w:pPr>
+      <w:r>
+        <w:t>Cho phép kéo-thả hình ảnh hoặc file vào khung chat. Tối ưu nhất là truyền file theo dạng P2P qua </w:t>
+      </w:r>
+      <w:r>
+        <w:rPr>
+          <w:b/>
+          <w:bCs/>
+        </w:rPr>
+        <w:t>RTCDataChannel</w:t>
+      </w:r>
+      <w:r>
+        <w:t> thay vì phải lưu lên server để tiết kiệm chi phí lưu trữ.</w:t>
+      </w:r>
+    </w:p>
+    <w:p>
+      <w:pPr>
+        <w:numPr>
+          <w:ilvl w:val="0"/>
+          <w:numId w:val="42"/>
+        </w:numPr>
+      </w:pPr>
+      <w:r>
+        <w:rPr>
+          <w:b/>
+          <w:bCs/>
+        </w:rPr>
+        <w:t>Tính năng Bạn bè (Friends) &amp; Trạng thái hoạt động (Presence):</w:t>
+      </w:r>
+    </w:p>
+    <w:p>
+      <w:pPr>
+        <w:numPr>
+          <w:ilvl w:val="1"/>
+          <w:numId w:val="42"/>
+        </w:numPr>
+      </w:pPr>
+      <w:r>
+        <w:t>Mặc dù Database của chúng ta đã có bảng Friendship, nhưng hiện tại UI chưa áp dụng. Ta có thể làm trang "Danh bạ", hiển thị ai đang Online (chấm xanh). Thêm nút "Mời vào phòng" để hệ thống tự động bắn Notification hoặc popup rủ bạn bè vào phòng họp.</w:t>
+      </w:r>
+    </w:p>
+    <w:p>
+      <w:pPr>
+        <w:numPr>
+          <w:ilvl w:val="0"/>
+          <w:numId w:val="42"/>
+        </w:numPr>
+      </w:pPr>
+      <w:r>
+        <w:rPr>
+          <w:b/>
+          <w:bCs/>
+        </w:rPr>
+        <w:t>Live Captions (Phụ đề trực tiếp):</w:t>
+      </w:r>
+    </w:p>
+    <w:p>
+      <w:pPr>
+        <w:numPr>
+          <w:ilvl w:val="1"/>
+          <w:numId w:val="42"/>
+        </w:numPr>
+      </w:pPr>
+      <w:r>
+        <w:t>Tích hợp thư viện Speech Recognition API (được hỗ trợ sẵn trên Chrome) để nhận diện giọng nói và hiển thị phụ đề thời gian thực ngay dưới video cho người bị lãng tai hoặc môi trường ồn ào.</w:t>
+      </w:r>
+    </w:p>
+    <w:p>
+      <w:r>
+        <w:br/>
+      </w:r>
+    </w:p>
+    <w:p>
+      <w:r>
+        <w:br w:type="page"/>
+      </w:r>
+    </w:p>
+    <w:p>
+      <w:pPr>
+        <w:numPr>
+          <w:ilvl w:val="0"/>
+          <w:numId w:val="43"/>
+        </w:numPr>
+        <w:rPr>
+          <w:b/>
+          <w:bCs/>
+        </w:rPr>
+      </w:pPr>
+      <w:r>
+        <w:rPr>
+          <w:b/>
+          <w:bCs/>
+        </w:rPr>
+        <w:lastRenderedPageBreak/>
+        <w:t>WaveMeet - Phase 5 Implementation Plan</w:t>
+      </w:r>
+    </w:p>
+    <w:p>
+      <w:r>
+        <w:t>Trong </w:t>
+      </w:r>
+      <w:r>
+        <w:rPr>
+          <w:b/>
+          <w:bCs/>
+        </w:rPr>
+        <w:t>Phase 5</w:t>
+      </w:r>
+      <w:r>
+        <w:t> này, chúng ta sẽ tập trung giải quyết bài toán cốt lõi về </w:t>
+      </w:r>
+      <w:r>
+        <w:rPr>
+          <w:b/>
+          <w:bCs/>
+        </w:rPr>
+        <w:t>Hạ tầng Mạng (Network Infrastructure)</w:t>
+      </w:r>
+      <w:r>
+        <w:t> để WaveMeet có thể chạy mượt mà ở môi trường thực tế chứ không chỉ ở localhost.</w:t>
+      </w:r>
+    </w:p>
+    <w:p>
+      <w:pPr>
+        <w:rPr>
+          <w:b/>
+          <w:bCs/>
+        </w:rPr>
+      </w:pPr>
+      <w:r>
+        <w:rPr>
+          <w:b/>
+          <w:bCs/>
+        </w:rPr>
+        <w:t>User Review Required</w:t>
+      </w:r>
+    </w:p>
+    <w:p>
+      <w:r>
+        <w:t>IMPORTANT</w:t>
+      </w:r>
+    </w:p>
+    <w:p>
+      <w:r>
+        <w:t>Việc nâng cấp mạng bao gồm 2 phần chính: </w:t>
+      </w:r>
+      <w:r>
+        <w:rPr>
+          <w:b/>
+          <w:bCs/>
+        </w:rPr>
+        <w:t>Vượt tường lửa (TURN)</w:t>
+      </w:r>
+      <w:r>
+        <w:t> và </w:t>
+      </w:r>
+      <w:r>
+        <w:rPr>
+          <w:b/>
+          <w:bCs/>
+        </w:rPr>
+        <w:t>Xử lý đa luồng (SFU)</w:t>
+      </w:r>
+      <w:r>
+        <w:t>. Bạn vui lòng đọc kỹ và đưa ra lựa chọn nhé:</w:t>
+      </w:r>
+    </w:p>
+    <w:p>
+      <w:r>
+        <w:t>Vấn đề 1: Tích hợp STUN / TURN Server (Vượt tường lửa)</w:t>
+      </w:r>
+    </w:p>
+    <w:p>
+      <w:r>
+        <w:t>Khi triển khai thực tế, khoảng 30% người dùng (đặc biệt mạng công ty, trường học) bị chặn bởi Symmetric NAT, khiến WebRTC P2P thất bại.</w:t>
+      </w:r>
+    </w:p>
+    <w:p>
+      <w:pPr>
+        <w:numPr>
+          <w:ilvl w:val="0"/>
+          <w:numId w:val="43"/>
+        </w:numPr>
+      </w:pPr>
+      <w:r>
+        <w:rPr>
+          <w:b/>
+          <w:bCs/>
+        </w:rPr>
+        <w:t>Giải pháp:</w:t>
+      </w:r>
+      <w:r>
+        <w:t> Tôi sẽ nâng cấp hệ thống để tự động cấp phát tài khoản TURN Server tạm thời (sử dụng cơ chế TURN REST API với HMAC Auth). Khi user vào phòng, Django sẽ tự động sinh username/password có hạn sử dụng 5 phút để trình duyệt dùng làm relay.</w:t>
+      </w:r>
+    </w:p>
+    <w:p>
+      <w:pPr>
+        <w:numPr>
+          <w:ilvl w:val="0"/>
+          <w:numId w:val="43"/>
+        </w:numPr>
+      </w:pPr>
+      <w:r>
+        <w:rPr>
+          <w:b/>
+          <w:bCs/>
+        </w:rPr>
+        <w:t>Tùy chọn cho bạn:</w:t>
+      </w:r>
+      <w:r>
+        <w:t> Bạn có muốn tôi tích hợp API của một dịch vụ cung cấp TURN miễn phí (như Metered TURN) để test ngay bây giờ không?</w:t>
+      </w:r>
+    </w:p>
+    <w:p>
+      <w:r>
+        <w:t>Vấn đề 2: Nâng cấp từ Mesh sang SFU (Tùy chọn Nâng cao)</w:t>
+      </w:r>
+    </w:p>
+    <w:p>
+      <w:r>
+        <w:t>Ở Phase 3, chúng ta đang dùng mô hình </w:t>
+      </w:r>
+      <w:r>
+        <w:rPr>
+          <w:b/>
+          <w:bCs/>
+        </w:rPr>
+        <w:t>Mesh</w:t>
+      </w:r>
+      <w:r>
+        <w:t> (mọi người kết nối trực tiếp với nhau). Để chuyển sang mô hình </w:t>
+      </w:r>
+      <w:r>
+        <w:rPr>
+          <w:b/>
+          <w:bCs/>
+        </w:rPr>
+        <w:t>SFU</w:t>
+      </w:r>
+      <w:r>
+        <w:t> (1 người gửi lên Server, Server phân phối đi):</w:t>
+      </w:r>
+    </w:p>
+    <w:p>
+      <w:pPr>
+        <w:numPr>
+          <w:ilvl w:val="0"/>
+          <w:numId w:val="44"/>
+        </w:numPr>
+      </w:pPr>
+      <w:r>
+        <w:t>Việc viết SFU bằng Python (Django) có hiệu năng rất kém vì Python không giỏi xử lý Media trực tiếp.</w:t>
+      </w:r>
+    </w:p>
+    <w:p>
+      <w:pPr>
+        <w:numPr>
+          <w:ilvl w:val="0"/>
+          <w:numId w:val="44"/>
+        </w:numPr>
+      </w:pPr>
+      <w:r>
+        <w:rPr>
+          <w:b/>
+          <w:bCs/>
+        </w:rPr>
+        <w:t>Giải pháp chuẩn công nghiệp:</w:t>
+      </w:r>
+      <w:r>
+        <w:t> Ta cần chạy một SFU Server độc lập (ví dụ: </w:t>
+      </w:r>
+      <w:r>
+        <w:rPr>
+          <w:b/>
+          <w:bCs/>
+        </w:rPr>
+        <w:t>LiveKit</w:t>
+      </w:r>
+      <w:r>
+        <w:t>, </w:t>
+      </w:r>
+      <w:r>
+        <w:rPr>
+          <w:b/>
+          <w:bCs/>
+        </w:rPr>
+        <w:t>Janus</w:t>
+      </w:r>
+      <w:r>
+        <w:t>, hoặc </w:t>
+      </w:r>
+      <w:r>
+        <w:rPr>
+          <w:b/>
+          <w:bCs/>
+        </w:rPr>
+        <w:t>mediasoup</w:t>
+      </w:r>
+      <w:r>
+        <w:t>) song song với Django.</w:t>
+      </w:r>
+    </w:p>
+    <w:p>
+      <w:pPr>
+        <w:numPr>
+          <w:ilvl w:val="0"/>
+          <w:numId w:val="44"/>
+        </w:numPr>
+      </w:pPr>
+      <w:r>
+        <w:rPr>
+          <w:b/>
+          <w:bCs/>
+        </w:rPr>
+        <w:t>Lựa chọn của bạn:</w:t>
+      </w:r>
+    </w:p>
+    <w:p>
+      <w:pPr>
+        <w:numPr>
+          <w:ilvl w:val="1"/>
+          <w:numId w:val="44"/>
+        </w:numPr>
+      </w:pPr>
+      <w:r>
+        <w:rPr>
+          <w:b/>
+          <w:bCs/>
+        </w:rPr>
+        <w:t>Lựa chọn A (Khuyên dùng):</w:t>
+      </w:r>
+      <w:r>
+        <w:t> Tạm thời giữ mô hình Mesh, tập trung hoàn thiện tính năng TURN Server và quản lý băng thông (Bandwidth Management) để tối ưu Mesh.</w:t>
+      </w:r>
+    </w:p>
+    <w:p>
+      <w:pPr>
+        <w:numPr>
+          <w:ilvl w:val="1"/>
+          <w:numId w:val="44"/>
+        </w:numPr>
+      </w:pPr>
+      <w:r>
+        <w:rPr>
+          <w:b/>
+          <w:bCs/>
+        </w:rPr>
+        <w:lastRenderedPageBreak/>
+        <w:t>Lựa chọn B (Thay đổi lớn):</w:t>
+      </w:r>
+      <w:r>
+        <w:t> Tích hợp </w:t>
+      </w:r>
+      <w:r>
+        <w:rPr>
+          <w:b/>
+          <w:bCs/>
+        </w:rPr>
+        <w:t>LiveKit SFU</w:t>
+      </w:r>
+      <w:r>
+        <w:t>. Lựa chọn này sẽ phải đập bỏ phần lớn logic WebRTC thủ công ở Phase 3 để thay bằng LiveKit SDK.</w:t>
+      </w:r>
+    </w:p>
+    <w:p>
+      <w:r>
+        <w:rPr>
+          <w:i/>
+          <w:iCs/>
+        </w:rPr>
+        <w:t>(Vui lòng phản hồi lại lựa chọn của bạn cho Vấn đề 1 và 2 trước khi tôi bắt đầu code).</w:t>
+      </w:r>
+    </w:p>
+    <w:p>
+      <w:pPr>
+        <w:rPr>
+          <w:b/>
+          <w:bCs/>
+        </w:rPr>
+      </w:pPr>
+      <w:r>
+        <w:rPr>
+          <w:b/>
+          <w:bCs/>
+        </w:rPr>
+        <w:t>Proposed Changes (Dự kiến cho phần TURN &amp; Tối ưu Mesh)</w:t>
+      </w:r>
+    </w:p>
+    <w:p>
+      <w:r>
+        <w:t>1. Cấp phát TURN Credentials (Backend)</w:t>
+      </w:r>
+    </w:p>
+    <w:p>
+      <w:r>
+        <w:t>[NEW] chat/utils.py</w:t>
+      </w:r>
+    </w:p>
+    <w:p>
+      <w:pPr>
+        <w:numPr>
+          <w:ilvl w:val="0"/>
+          <w:numId w:val="45"/>
+        </w:numPr>
+      </w:pPr>
+      <w:r>
+        <w:t>Viết hàm tạo TURN Credentials bảo mật bằng HMAC SHA1.</w:t>
+      </w:r>
+    </w:p>
+    <w:p>
+      <w:r>
+        <w:t>[MODIFY] chat/consumers.py hoặc chat/views.py</w:t>
+      </w:r>
+    </w:p>
+    <w:p>
+      <w:pPr>
+        <w:numPr>
+          <w:ilvl w:val="0"/>
+          <w:numId w:val="46"/>
+        </w:numPr>
+      </w:pPr>
+      <w:r>
+        <w:t>Khi người dùng vào phòng, cấp phát bộ iceServers (STUN + TURN) có đính kèm username và credential.</w:t>
+      </w:r>
+    </w:p>
+    <w:p>
+      <w:r>
+        <w:t>2. Tối ưu Băng thông WebRTC (Frontend)</w:t>
+      </w:r>
+    </w:p>
+    <w:p>
+      <w:r>
+        <w:t>[MODIFY] chat/templates/chat/room.html</w:t>
+      </w:r>
+    </w:p>
+    <w:p>
+      <w:pPr>
+        <w:numPr>
+          <w:ilvl w:val="0"/>
+          <w:numId w:val="47"/>
+        </w:numPr>
+      </w:pPr>
+      <w:r>
+        <w:t>Cập nhật lại biến configuration để nhận danh sách TURN server từ Backend.</w:t>
+      </w:r>
+    </w:p>
+    <w:p>
+      <w:pPr>
+        <w:numPr>
+          <w:ilvl w:val="0"/>
+          <w:numId w:val="47"/>
+        </w:numPr>
+      </w:pPr>
+      <w:r>
+        <w:t>Can thiệp vào SDP (Session Description Protocol) trước khi gửi đi để giới hạn bitrate của Video (ví dụ: tối đa 500kbps cho mỗi luồng) nhằm tránh sập mạng khi phòng có 4-5 người theo mô hình Mesh.</w:t>
+      </w:r>
+    </w:p>
     <w:p/>
     <w:sectPr>
       <w:pgSz w:w="12240" w:h="15840"/>
@@ -3654,6 +4446,155 @@
     </w:lvl>
   </w:abstractNum>
   <w:abstractNum w:abstractNumId="3" w15:restartNumberingAfterBreak="0">
+    <w:nsid w:val="10F656CF"/>
+    <w:multiLevelType w:val="multilevel"/>
+    <w:tmpl w:val="36DC22F8"/>
+    <w:lvl w:ilvl="0">
+      <w:start w:val="1"/>
+      <w:numFmt w:val="bullet"/>
+      <w:lvlText w:val=""/>
+      <w:lvlJc w:val="left"/>
+      <w:pPr>
+        <w:tabs>
+          <w:tab w:val="num" w:pos="720"/>
+        </w:tabs>
+        <w:ind w:left="720" w:hanging="360"/>
+      </w:pPr>
+      <w:rPr>
+        <w:rFonts w:ascii="Symbol" w:hAnsi="Symbol" w:hint="default"/>
+        <w:sz w:val="20"/>
+      </w:rPr>
+    </w:lvl>
+    <w:lvl w:ilvl="1" w:tentative="1">
+      <w:start w:val="1"/>
+      <w:numFmt w:val="bullet"/>
+      <w:lvlText w:val=""/>
+      <w:lvlJc w:val="left"/>
+      <w:pPr>
+        <w:tabs>
+          <w:tab w:val="num" w:pos="1440"/>
+        </w:tabs>
+        <w:ind w:left="1440" w:hanging="360"/>
+      </w:pPr>
+      <w:rPr>
+        <w:rFonts w:ascii="Symbol" w:hAnsi="Symbol" w:hint="default"/>
+        <w:sz w:val="20"/>
+      </w:rPr>
+    </w:lvl>
+    <w:lvl w:ilvl="2" w:tentative="1">
+      <w:start w:val="1"/>
+      <w:numFmt w:val="bullet"/>
+      <w:lvlText w:val=""/>
+      <w:lvlJc w:val="left"/>
+      <w:pPr>
+        <w:tabs>
+          <w:tab w:val="num" w:pos="2160"/>
+        </w:tabs>
+        <w:ind w:left="2160" w:hanging="360"/>
+      </w:pPr>
+      <w:rPr>
+        <w:rFonts w:ascii="Symbol" w:hAnsi="Symbol" w:hint="default"/>
+        <w:sz w:val="20"/>
+      </w:rPr>
+    </w:lvl>
+    <w:lvl w:ilvl="3" w:tentative="1">
+      <w:start w:val="1"/>
+      <w:numFmt w:val="bullet"/>
+      <w:lvlText w:val=""/>
+      <w:lvlJc w:val="left"/>
+      <w:pPr>
+        <w:tabs>
+          <w:tab w:val="num" w:pos="2880"/>
+        </w:tabs>
+        <w:ind w:left="2880" w:hanging="360"/>
+      </w:pPr>
+      <w:rPr>
+        <w:rFonts w:ascii="Symbol" w:hAnsi="Symbol" w:hint="default"/>
+        <w:sz w:val="20"/>
+      </w:rPr>
+    </w:lvl>
+    <w:lvl w:ilvl="4" w:tentative="1">
+      <w:start w:val="1"/>
+      <w:numFmt w:val="bullet"/>
+      <w:lvlText w:val=""/>
+      <w:lvlJc w:val="left"/>
+      <w:pPr>
+        <w:tabs>
+          <w:tab w:val="num" w:pos="3600"/>
+        </w:tabs>
+        <w:ind w:left="3600" w:hanging="360"/>
+      </w:pPr>
+      <w:rPr>
+        <w:rFonts w:ascii="Symbol" w:hAnsi="Symbol" w:hint="default"/>
+        <w:sz w:val="20"/>
+      </w:rPr>
+    </w:lvl>
+    <w:lvl w:ilvl="5" w:tentative="1">
+      <w:start w:val="1"/>
+      <w:numFmt w:val="bullet"/>
+      <w:lvlText w:val=""/>
+      <w:lvlJc w:val="left"/>
+      <w:pPr>
+        <w:tabs>
+          <w:tab w:val="num" w:pos="4320"/>
+        </w:tabs>
+        <w:ind w:left="4320" w:hanging="360"/>
+      </w:pPr>
+      <w:rPr>
+        <w:rFonts w:ascii="Symbol" w:hAnsi="Symbol" w:hint="default"/>
+        <w:sz w:val="20"/>
+      </w:rPr>
+    </w:lvl>
+    <w:lvl w:ilvl="6" w:tentative="1">
+      <w:start w:val="1"/>
+      <w:numFmt w:val="bullet"/>
+      <w:lvlText w:val=""/>
+      <w:lvlJc w:val="left"/>
+      <w:pPr>
+        <w:tabs>
+          <w:tab w:val="num" w:pos="5040"/>
+        </w:tabs>
+        <w:ind w:left="5040" w:hanging="360"/>
+      </w:pPr>
+      <w:rPr>
+        <w:rFonts w:ascii="Symbol" w:hAnsi="Symbol" w:hint="default"/>
+        <w:sz w:val="20"/>
+      </w:rPr>
+    </w:lvl>
+    <w:lvl w:ilvl="7" w:tentative="1">
+      <w:start w:val="1"/>
+      <w:numFmt w:val="bullet"/>
+      <w:lvlText w:val=""/>
+      <w:lvlJc w:val="left"/>
+      <w:pPr>
+        <w:tabs>
+          <w:tab w:val="num" w:pos="5760"/>
+        </w:tabs>
+        <w:ind w:left="5760" w:hanging="360"/>
+      </w:pPr>
+      <w:rPr>
+        <w:rFonts w:ascii="Symbol" w:hAnsi="Symbol" w:hint="default"/>
+        <w:sz w:val="20"/>
+      </w:rPr>
+    </w:lvl>
+    <w:lvl w:ilvl="8" w:tentative="1">
+      <w:start w:val="1"/>
+      <w:numFmt w:val="bullet"/>
+      <w:lvlText w:val=""/>
+      <w:lvlJc w:val="left"/>
+      <w:pPr>
+        <w:tabs>
+          <w:tab w:val="num" w:pos="6480"/>
+        </w:tabs>
+        <w:ind w:left="6480" w:hanging="360"/>
+      </w:pPr>
+      <w:rPr>
+        <w:rFonts w:ascii="Symbol" w:hAnsi="Symbol" w:hint="default"/>
+        <w:sz w:val="20"/>
+      </w:rPr>
+    </w:lvl>
+  </w:abstractNum>
+  <w:abstractNum w:abstractNumId="4" w15:restartNumberingAfterBreak="0">
     <w:nsid w:val="12700AC3"/>
     <w:multiLevelType w:val="multilevel"/>
     <w:tmpl w:val="221AA528"/>
@@ -3802,7 +4743,156 @@
       </w:rPr>
     </w:lvl>
   </w:abstractNum>
-  <w:abstractNum w:abstractNumId="4" w15:restartNumberingAfterBreak="0">
+  <w:abstractNum w:abstractNumId="5" w15:restartNumberingAfterBreak="0">
+    <w:nsid w:val="14135E7D"/>
+    <w:multiLevelType w:val="multilevel"/>
+    <w:tmpl w:val="4000983E"/>
+    <w:lvl w:ilvl="0">
+      <w:start w:val="1"/>
+      <w:numFmt w:val="bullet"/>
+      <w:lvlText w:val=""/>
+      <w:lvlJc w:val="left"/>
+      <w:pPr>
+        <w:tabs>
+          <w:tab w:val="num" w:pos="720"/>
+        </w:tabs>
+        <w:ind w:left="720" w:hanging="360"/>
+      </w:pPr>
+      <w:rPr>
+        <w:rFonts w:ascii="Symbol" w:hAnsi="Symbol" w:hint="default"/>
+        <w:sz w:val="20"/>
+      </w:rPr>
+    </w:lvl>
+    <w:lvl w:ilvl="1" w:tentative="1">
+      <w:start w:val="1"/>
+      <w:numFmt w:val="bullet"/>
+      <w:lvlText w:val=""/>
+      <w:lvlJc w:val="left"/>
+      <w:pPr>
+        <w:tabs>
+          <w:tab w:val="num" w:pos="1440"/>
+        </w:tabs>
+        <w:ind w:left="1440" w:hanging="360"/>
+      </w:pPr>
+      <w:rPr>
+        <w:rFonts w:ascii="Symbol" w:hAnsi="Symbol" w:hint="default"/>
+        <w:sz w:val="20"/>
+      </w:rPr>
+    </w:lvl>
+    <w:lvl w:ilvl="2" w:tentative="1">
+      <w:start w:val="1"/>
+      <w:numFmt w:val="bullet"/>
+      <w:lvlText w:val=""/>
+      <w:lvlJc w:val="left"/>
+      <w:pPr>
+        <w:tabs>
+          <w:tab w:val="num" w:pos="2160"/>
+        </w:tabs>
+        <w:ind w:left="2160" w:hanging="360"/>
+      </w:pPr>
+      <w:rPr>
+        <w:rFonts w:ascii="Symbol" w:hAnsi="Symbol" w:hint="default"/>
+        <w:sz w:val="20"/>
+      </w:rPr>
+    </w:lvl>
+    <w:lvl w:ilvl="3" w:tentative="1">
+      <w:start w:val="1"/>
+      <w:numFmt w:val="bullet"/>
+      <w:lvlText w:val=""/>
+      <w:lvlJc w:val="left"/>
+      <w:pPr>
+        <w:tabs>
+          <w:tab w:val="num" w:pos="2880"/>
+        </w:tabs>
+        <w:ind w:left="2880" w:hanging="360"/>
+      </w:pPr>
+      <w:rPr>
+        <w:rFonts w:ascii="Symbol" w:hAnsi="Symbol" w:hint="default"/>
+        <w:sz w:val="20"/>
+      </w:rPr>
+    </w:lvl>
+    <w:lvl w:ilvl="4" w:tentative="1">
+      <w:start w:val="1"/>
+      <w:numFmt w:val="bullet"/>
+      <w:lvlText w:val=""/>
+      <w:lvlJc w:val="left"/>
+      <w:pPr>
+        <w:tabs>
+          <w:tab w:val="num" w:pos="3600"/>
+        </w:tabs>
+        <w:ind w:left="3600" w:hanging="360"/>
+      </w:pPr>
+      <w:rPr>
+        <w:rFonts w:ascii="Symbol" w:hAnsi="Symbol" w:hint="default"/>
+        <w:sz w:val="20"/>
+      </w:rPr>
+    </w:lvl>
+    <w:lvl w:ilvl="5" w:tentative="1">
+      <w:start w:val="1"/>
+      <w:numFmt w:val="bullet"/>
+      <w:lvlText w:val=""/>
+      <w:lvlJc w:val="left"/>
+      <w:pPr>
+        <w:tabs>
+          <w:tab w:val="num" w:pos="4320"/>
+        </w:tabs>
+        <w:ind w:left="4320" w:hanging="360"/>
+      </w:pPr>
+      <w:rPr>
+        <w:rFonts w:ascii="Symbol" w:hAnsi="Symbol" w:hint="default"/>
+        <w:sz w:val="20"/>
+      </w:rPr>
+    </w:lvl>
+    <w:lvl w:ilvl="6" w:tentative="1">
+      <w:start w:val="1"/>
+      <w:numFmt w:val="bullet"/>
+      <w:lvlText w:val=""/>
+      <w:lvlJc w:val="left"/>
+      <w:pPr>
+        <w:tabs>
+          <w:tab w:val="num" w:pos="5040"/>
+        </w:tabs>
+        <w:ind w:left="5040" w:hanging="360"/>
+      </w:pPr>
+      <w:rPr>
+        <w:rFonts w:ascii="Symbol" w:hAnsi="Symbol" w:hint="default"/>
+        <w:sz w:val="20"/>
+      </w:rPr>
+    </w:lvl>
+    <w:lvl w:ilvl="7" w:tentative="1">
+      <w:start w:val="1"/>
+      <w:numFmt w:val="bullet"/>
+      <w:lvlText w:val=""/>
+      <w:lvlJc w:val="left"/>
+      <w:pPr>
+        <w:tabs>
+          <w:tab w:val="num" w:pos="5760"/>
+        </w:tabs>
+        <w:ind w:left="5760" w:hanging="360"/>
+      </w:pPr>
+      <w:rPr>
+        <w:rFonts w:ascii="Symbol" w:hAnsi="Symbol" w:hint="default"/>
+        <w:sz w:val="20"/>
+      </w:rPr>
+    </w:lvl>
+    <w:lvl w:ilvl="8" w:tentative="1">
+      <w:start w:val="1"/>
+      <w:numFmt w:val="bullet"/>
+      <w:lvlText w:val=""/>
+      <w:lvlJc w:val="left"/>
+      <w:pPr>
+        <w:tabs>
+          <w:tab w:val="num" w:pos="6480"/>
+        </w:tabs>
+        <w:ind w:left="6480" w:hanging="360"/>
+      </w:pPr>
+      <w:rPr>
+        <w:rFonts w:ascii="Symbol" w:hAnsi="Symbol" w:hint="default"/>
+        <w:sz w:val="20"/>
+      </w:rPr>
+    </w:lvl>
+  </w:abstractNum>
+  <w:abstractNum w:abstractNumId="6" w15:restartNumberingAfterBreak="0">
     <w:nsid w:val="15C439B5"/>
     <w:multiLevelType w:val="multilevel"/>
     <w:tmpl w:val="46826754"/>
@@ -3951,7 +5041,7 @@
       </w:rPr>
     </w:lvl>
   </w:abstractNum>
-  <w:abstractNum w:abstractNumId="5" w15:restartNumberingAfterBreak="0">
+  <w:abstractNum w:abstractNumId="7" w15:restartNumberingAfterBreak="0">
     <w:nsid w:val="19E77330"/>
     <w:multiLevelType w:val="multilevel"/>
     <w:tmpl w:val="ABE2739E"/>
@@ -4100,7 +5190,7 @@
       </w:rPr>
     </w:lvl>
   </w:abstractNum>
-  <w:abstractNum w:abstractNumId="6" w15:restartNumberingAfterBreak="0">
+  <w:abstractNum w:abstractNumId="8" w15:restartNumberingAfterBreak="0">
     <w:nsid w:val="1AEB50FE"/>
     <w:multiLevelType w:val="multilevel"/>
     <w:tmpl w:val="D89C8DD4"/>
@@ -4249,7 +5339,7 @@
       </w:rPr>
     </w:lvl>
   </w:abstractNum>
-  <w:abstractNum w:abstractNumId="7" w15:restartNumberingAfterBreak="0">
+  <w:abstractNum w:abstractNumId="9" w15:restartNumberingAfterBreak="0">
     <w:nsid w:val="1C54798F"/>
     <w:multiLevelType w:val="multilevel"/>
     <w:tmpl w:val="8612E53A"/>
@@ -4398,7 +5488,156 @@
       </w:rPr>
     </w:lvl>
   </w:abstractNum>
-  <w:abstractNum w:abstractNumId="8" w15:restartNumberingAfterBreak="0">
+  <w:abstractNum w:abstractNumId="10" w15:restartNumberingAfterBreak="0">
+    <w:nsid w:val="1E58543F"/>
+    <w:multiLevelType w:val="multilevel"/>
+    <w:tmpl w:val="83EEC14E"/>
+    <w:lvl w:ilvl="0">
+      <w:start w:val="1"/>
+      <w:numFmt w:val="bullet"/>
+      <w:lvlText w:val=""/>
+      <w:lvlJc w:val="left"/>
+      <w:pPr>
+        <w:tabs>
+          <w:tab w:val="num" w:pos="720"/>
+        </w:tabs>
+        <w:ind w:left="720" w:hanging="360"/>
+      </w:pPr>
+      <w:rPr>
+        <w:rFonts w:ascii="Symbol" w:hAnsi="Symbol" w:hint="default"/>
+        <w:sz w:val="20"/>
+      </w:rPr>
+    </w:lvl>
+    <w:lvl w:ilvl="1">
+      <w:start w:val="1"/>
+      <w:numFmt w:val="bullet"/>
+      <w:lvlText w:val=""/>
+      <w:lvlJc w:val="left"/>
+      <w:pPr>
+        <w:tabs>
+          <w:tab w:val="num" w:pos="1440"/>
+        </w:tabs>
+        <w:ind w:left="1440" w:hanging="360"/>
+      </w:pPr>
+      <w:rPr>
+        <w:rFonts w:ascii="Symbol" w:hAnsi="Symbol" w:hint="default"/>
+        <w:sz w:val="20"/>
+      </w:rPr>
+    </w:lvl>
+    <w:lvl w:ilvl="2" w:tentative="1">
+      <w:start w:val="1"/>
+      <w:numFmt w:val="bullet"/>
+      <w:lvlText w:val=""/>
+      <w:lvlJc w:val="left"/>
+      <w:pPr>
+        <w:tabs>
+          <w:tab w:val="num" w:pos="2160"/>
+        </w:tabs>
+        <w:ind w:left="2160" w:hanging="360"/>
+      </w:pPr>
+      <w:rPr>
+        <w:rFonts w:ascii="Symbol" w:hAnsi="Symbol" w:hint="default"/>
+        <w:sz w:val="20"/>
+      </w:rPr>
+    </w:lvl>
+    <w:lvl w:ilvl="3" w:tentative="1">
+      <w:start w:val="1"/>
+      <w:numFmt w:val="bullet"/>
+      <w:lvlText w:val=""/>
+      <w:lvlJc w:val="left"/>
+      <w:pPr>
+        <w:tabs>
+          <w:tab w:val="num" w:pos="2880"/>
+        </w:tabs>
+        <w:ind w:left="2880" w:hanging="360"/>
+      </w:pPr>
+      <w:rPr>
+        <w:rFonts w:ascii="Symbol" w:hAnsi="Symbol" w:hint="default"/>
+        <w:sz w:val="20"/>
+      </w:rPr>
+    </w:lvl>
+    <w:lvl w:ilvl="4" w:tentative="1">
+      <w:start w:val="1"/>
+      <w:numFmt w:val="bullet"/>
+      <w:lvlText w:val=""/>
+      <w:lvlJc w:val="left"/>
+      <w:pPr>
+        <w:tabs>
+          <w:tab w:val="num" w:pos="3600"/>
+        </w:tabs>
+        <w:ind w:left="3600" w:hanging="360"/>
+      </w:pPr>
+      <w:rPr>
+        <w:rFonts w:ascii="Symbol" w:hAnsi="Symbol" w:hint="default"/>
+        <w:sz w:val="20"/>
+      </w:rPr>
+    </w:lvl>
+    <w:lvl w:ilvl="5" w:tentative="1">
+      <w:start w:val="1"/>
+      <w:numFmt w:val="bullet"/>
+      <w:lvlText w:val=""/>
+      <w:lvlJc w:val="left"/>
+      <w:pPr>
+        <w:tabs>
+          <w:tab w:val="num" w:pos="4320"/>
+        </w:tabs>
+        <w:ind w:left="4320" w:hanging="360"/>
+      </w:pPr>
+      <w:rPr>
+        <w:rFonts w:ascii="Symbol" w:hAnsi="Symbol" w:hint="default"/>
+        <w:sz w:val="20"/>
+      </w:rPr>
+    </w:lvl>
+    <w:lvl w:ilvl="6" w:tentative="1">
+      <w:start w:val="1"/>
+      <w:numFmt w:val="bullet"/>
+      <w:lvlText w:val=""/>
+      <w:lvlJc w:val="left"/>
+      <w:pPr>
+        <w:tabs>
+          <w:tab w:val="num" w:pos="5040"/>
+        </w:tabs>
+        <w:ind w:left="5040" w:hanging="360"/>
+      </w:pPr>
+      <w:rPr>
+        <w:rFonts w:ascii="Symbol" w:hAnsi="Symbol" w:hint="default"/>
+        <w:sz w:val="20"/>
+      </w:rPr>
+    </w:lvl>
+    <w:lvl w:ilvl="7" w:tentative="1">
+      <w:start w:val="1"/>
+      <w:numFmt w:val="bullet"/>
+      <w:lvlText w:val=""/>
+      <w:lvlJc w:val="left"/>
+      <w:pPr>
+        <w:tabs>
+          <w:tab w:val="num" w:pos="5760"/>
+        </w:tabs>
+        <w:ind w:left="5760" w:hanging="360"/>
+      </w:pPr>
+      <w:rPr>
+        <w:rFonts w:ascii="Symbol" w:hAnsi="Symbol" w:hint="default"/>
+        <w:sz w:val="20"/>
+      </w:rPr>
+    </w:lvl>
+    <w:lvl w:ilvl="8" w:tentative="1">
+      <w:start w:val="1"/>
+      <w:numFmt w:val="bullet"/>
+      <w:lvlText w:val=""/>
+      <w:lvlJc w:val="left"/>
+      <w:pPr>
+        <w:tabs>
+          <w:tab w:val="num" w:pos="6480"/>
+        </w:tabs>
+        <w:ind w:left="6480" w:hanging="360"/>
+      </w:pPr>
+      <w:rPr>
+        <w:rFonts w:ascii="Symbol" w:hAnsi="Symbol" w:hint="default"/>
+        <w:sz w:val="20"/>
+      </w:rPr>
+    </w:lvl>
+  </w:abstractNum>
+  <w:abstractNum w:abstractNumId="11" w15:restartNumberingAfterBreak="0">
     <w:nsid w:val="1F2637B1"/>
     <w:multiLevelType w:val="multilevel"/>
     <w:tmpl w:val="B6C2A822"/>
@@ -4513,7 +5752,7 @@
       </w:rPr>
     </w:lvl>
   </w:abstractNum>
-  <w:abstractNum w:abstractNumId="9" w15:restartNumberingAfterBreak="0">
+  <w:abstractNum w:abstractNumId="12" w15:restartNumberingAfterBreak="0">
     <w:nsid w:val="22432887"/>
     <w:multiLevelType w:val="multilevel"/>
     <w:tmpl w:val="09100B40"/>
@@ -4662,7 +5901,7 @@
       </w:rPr>
     </w:lvl>
   </w:abstractNum>
-  <w:abstractNum w:abstractNumId="10" w15:restartNumberingAfterBreak="0">
+  <w:abstractNum w:abstractNumId="13" w15:restartNumberingAfterBreak="0">
     <w:nsid w:val="249C2B42"/>
     <w:multiLevelType w:val="multilevel"/>
     <w:tmpl w:val="97D8D996"/>
@@ -4811,7 +6050,156 @@
       </w:rPr>
     </w:lvl>
   </w:abstractNum>
-  <w:abstractNum w:abstractNumId="11" w15:restartNumberingAfterBreak="0">
+  <w:abstractNum w:abstractNumId="14" w15:restartNumberingAfterBreak="0">
+    <w:nsid w:val="273B3316"/>
+    <w:multiLevelType w:val="multilevel"/>
+    <w:tmpl w:val="23DE7E00"/>
+    <w:lvl w:ilvl="0">
+      <w:start w:val="1"/>
+      <w:numFmt w:val="bullet"/>
+      <w:lvlText w:val=""/>
+      <w:lvlJc w:val="left"/>
+      <w:pPr>
+        <w:tabs>
+          <w:tab w:val="num" w:pos="720"/>
+        </w:tabs>
+        <w:ind w:left="720" w:hanging="360"/>
+      </w:pPr>
+      <w:rPr>
+        <w:rFonts w:ascii="Symbol" w:hAnsi="Symbol" w:hint="default"/>
+        <w:sz w:val="20"/>
+      </w:rPr>
+    </w:lvl>
+    <w:lvl w:ilvl="1">
+      <w:start w:val="1"/>
+      <w:numFmt w:val="bullet"/>
+      <w:lvlText w:val=""/>
+      <w:lvlJc w:val="left"/>
+      <w:pPr>
+        <w:tabs>
+          <w:tab w:val="num" w:pos="1440"/>
+        </w:tabs>
+        <w:ind w:left="1440" w:hanging="360"/>
+      </w:pPr>
+      <w:rPr>
+        <w:rFonts w:ascii="Symbol" w:hAnsi="Symbol" w:hint="default"/>
+        <w:sz w:val="20"/>
+      </w:rPr>
+    </w:lvl>
+    <w:lvl w:ilvl="2" w:tentative="1">
+      <w:start w:val="1"/>
+      <w:numFmt w:val="bullet"/>
+      <w:lvlText w:val=""/>
+      <w:lvlJc w:val="left"/>
+      <w:pPr>
+        <w:tabs>
+          <w:tab w:val="num" w:pos="2160"/>
+        </w:tabs>
+        <w:ind w:left="2160" w:hanging="360"/>
+      </w:pPr>
+      <w:rPr>
+        <w:rFonts w:ascii="Symbol" w:hAnsi="Symbol" w:hint="default"/>
+        <w:sz w:val="20"/>
+      </w:rPr>
+    </w:lvl>
+    <w:lvl w:ilvl="3" w:tentative="1">
+      <w:start w:val="1"/>
+      <w:numFmt w:val="bullet"/>
+      <w:lvlText w:val=""/>
+      <w:lvlJc w:val="left"/>
+      <w:pPr>
+        <w:tabs>
+          <w:tab w:val="num" w:pos="2880"/>
+        </w:tabs>
+        <w:ind w:left="2880" w:hanging="360"/>
+      </w:pPr>
+      <w:rPr>
+        <w:rFonts w:ascii="Symbol" w:hAnsi="Symbol" w:hint="default"/>
+        <w:sz w:val="20"/>
+      </w:rPr>
+    </w:lvl>
+    <w:lvl w:ilvl="4" w:tentative="1">
+      <w:start w:val="1"/>
+      <w:numFmt w:val="bullet"/>
+      <w:lvlText w:val=""/>
+      <w:lvlJc w:val="left"/>
+      <w:pPr>
+        <w:tabs>
+          <w:tab w:val="num" w:pos="3600"/>
+        </w:tabs>
+        <w:ind w:left="3600" w:hanging="360"/>
+      </w:pPr>
+      <w:rPr>
+        <w:rFonts w:ascii="Symbol" w:hAnsi="Symbol" w:hint="default"/>
+        <w:sz w:val="20"/>
+      </w:rPr>
+    </w:lvl>
+    <w:lvl w:ilvl="5" w:tentative="1">
+      <w:start w:val="1"/>
+      <w:numFmt w:val="bullet"/>
+      <w:lvlText w:val=""/>
+      <w:lvlJc w:val="left"/>
+      <w:pPr>
+        <w:tabs>
+          <w:tab w:val="num" w:pos="4320"/>
+        </w:tabs>
+        <w:ind w:left="4320" w:hanging="360"/>
+      </w:pPr>
+      <w:rPr>
+        <w:rFonts w:ascii="Symbol" w:hAnsi="Symbol" w:hint="default"/>
+        <w:sz w:val="20"/>
+      </w:rPr>
+    </w:lvl>
+    <w:lvl w:ilvl="6" w:tentative="1">
+      <w:start w:val="1"/>
+      <w:numFmt w:val="bullet"/>
+      <w:lvlText w:val=""/>
+      <w:lvlJc w:val="left"/>
+      <w:pPr>
+        <w:tabs>
+          <w:tab w:val="num" w:pos="5040"/>
+        </w:tabs>
+        <w:ind w:left="5040" w:hanging="360"/>
+      </w:pPr>
+      <w:rPr>
+        <w:rFonts w:ascii="Symbol" w:hAnsi="Symbol" w:hint="default"/>
+        <w:sz w:val="20"/>
+      </w:rPr>
+    </w:lvl>
+    <w:lvl w:ilvl="7" w:tentative="1">
+      <w:start w:val="1"/>
+      <w:numFmt w:val="bullet"/>
+      <w:lvlText w:val=""/>
+      <w:lvlJc w:val="left"/>
+      <w:pPr>
+        <w:tabs>
+          <w:tab w:val="num" w:pos="5760"/>
+        </w:tabs>
+        <w:ind w:left="5760" w:hanging="360"/>
+      </w:pPr>
+      <w:rPr>
+        <w:rFonts w:ascii="Symbol" w:hAnsi="Symbol" w:hint="default"/>
+        <w:sz w:val="20"/>
+      </w:rPr>
+    </w:lvl>
+    <w:lvl w:ilvl="8" w:tentative="1">
+      <w:start w:val="1"/>
+      <w:numFmt w:val="bullet"/>
+      <w:lvlText w:val=""/>
+      <w:lvlJc w:val="left"/>
+      <w:pPr>
+        <w:tabs>
+          <w:tab w:val="num" w:pos="6480"/>
+        </w:tabs>
+        <w:ind w:left="6480" w:hanging="360"/>
+      </w:pPr>
+      <w:rPr>
+        <w:rFonts w:ascii="Symbol" w:hAnsi="Symbol" w:hint="default"/>
+        <w:sz w:val="20"/>
+      </w:rPr>
+    </w:lvl>
+  </w:abstractNum>
+  <w:abstractNum w:abstractNumId="15" w15:restartNumberingAfterBreak="0">
     <w:nsid w:val="28E33A62"/>
     <w:multiLevelType w:val="multilevel"/>
     <w:tmpl w:val="EE446BCE"/>
@@ -4960,7 +6348,7 @@
       </w:rPr>
     </w:lvl>
   </w:abstractNum>
-  <w:abstractNum w:abstractNumId="12" w15:restartNumberingAfterBreak="0">
+  <w:abstractNum w:abstractNumId="16" w15:restartNumberingAfterBreak="0">
     <w:nsid w:val="29E614D1"/>
     <w:multiLevelType w:val="multilevel"/>
     <w:tmpl w:val="8398CCF0"/>
@@ -5109,7 +6497,7 @@
       </w:rPr>
     </w:lvl>
   </w:abstractNum>
-  <w:abstractNum w:abstractNumId="13" w15:restartNumberingAfterBreak="0">
+  <w:abstractNum w:abstractNumId="17" w15:restartNumberingAfterBreak="0">
     <w:nsid w:val="2A814324"/>
     <w:multiLevelType w:val="multilevel"/>
     <w:tmpl w:val="0262AF82"/>
@@ -5258,7 +6646,7 @@
       </w:rPr>
     </w:lvl>
   </w:abstractNum>
-  <w:abstractNum w:abstractNumId="14" w15:restartNumberingAfterBreak="0">
+  <w:abstractNum w:abstractNumId="18" w15:restartNumberingAfterBreak="0">
     <w:nsid w:val="2C73674C"/>
     <w:multiLevelType w:val="multilevel"/>
     <w:tmpl w:val="30DE1DFE"/>
@@ -5371,7 +6759,7 @@
       </w:pPr>
     </w:lvl>
   </w:abstractNum>
-  <w:abstractNum w:abstractNumId="15" w15:restartNumberingAfterBreak="0">
+  <w:abstractNum w:abstractNumId="19" w15:restartNumberingAfterBreak="0">
     <w:nsid w:val="365802AE"/>
     <w:multiLevelType w:val="multilevel"/>
     <w:tmpl w:val="1304CDDC"/>
@@ -5520,7 +6908,7 @@
       </w:rPr>
     </w:lvl>
   </w:abstractNum>
-  <w:abstractNum w:abstractNumId="16" w15:restartNumberingAfterBreak="0">
+  <w:abstractNum w:abstractNumId="20" w15:restartNumberingAfterBreak="0">
     <w:nsid w:val="39147671"/>
     <w:multiLevelType w:val="multilevel"/>
     <w:tmpl w:val="28FCAB92"/>
@@ -5669,7 +7057,156 @@
       </w:rPr>
     </w:lvl>
   </w:abstractNum>
-  <w:abstractNum w:abstractNumId="17" w15:restartNumberingAfterBreak="0">
+  <w:abstractNum w:abstractNumId="21" w15:restartNumberingAfterBreak="0">
+    <w:nsid w:val="3EAB7134"/>
+    <w:multiLevelType w:val="multilevel"/>
+    <w:tmpl w:val="5F7A3DF4"/>
+    <w:lvl w:ilvl="0">
+      <w:start w:val="1"/>
+      <w:numFmt w:val="bullet"/>
+      <w:lvlText w:val=""/>
+      <w:lvlJc w:val="left"/>
+      <w:pPr>
+        <w:tabs>
+          <w:tab w:val="num" w:pos="720"/>
+        </w:tabs>
+        <w:ind w:left="720" w:hanging="360"/>
+      </w:pPr>
+      <w:rPr>
+        <w:rFonts w:ascii="Symbol" w:hAnsi="Symbol" w:hint="default"/>
+        <w:sz w:val="20"/>
+      </w:rPr>
+    </w:lvl>
+    <w:lvl w:ilvl="1" w:tentative="1">
+      <w:start w:val="1"/>
+      <w:numFmt w:val="bullet"/>
+      <w:lvlText w:val=""/>
+      <w:lvlJc w:val="left"/>
+      <w:pPr>
+        <w:tabs>
+          <w:tab w:val="num" w:pos="1440"/>
+        </w:tabs>
+        <w:ind w:left="1440" w:hanging="360"/>
+      </w:pPr>
+      <w:rPr>
+        <w:rFonts w:ascii="Symbol" w:hAnsi="Symbol" w:hint="default"/>
+        <w:sz w:val="20"/>
+      </w:rPr>
+    </w:lvl>
+    <w:lvl w:ilvl="2" w:tentative="1">
+      <w:start w:val="1"/>
+      <w:numFmt w:val="bullet"/>
+      <w:lvlText w:val=""/>
+      <w:lvlJc w:val="left"/>
+      <w:pPr>
+        <w:tabs>
+          <w:tab w:val="num" w:pos="2160"/>
+        </w:tabs>
+        <w:ind w:left="2160" w:hanging="360"/>
+      </w:pPr>
+      <w:rPr>
+        <w:rFonts w:ascii="Symbol" w:hAnsi="Symbol" w:hint="default"/>
+        <w:sz w:val="20"/>
+      </w:rPr>
+    </w:lvl>
+    <w:lvl w:ilvl="3" w:tentative="1">
+      <w:start w:val="1"/>
+      <w:numFmt w:val="bullet"/>
+      <w:lvlText w:val=""/>
+      <w:lvlJc w:val="left"/>
+      <w:pPr>
+        <w:tabs>
+          <w:tab w:val="num" w:pos="2880"/>
+        </w:tabs>
+        <w:ind w:left="2880" w:hanging="360"/>
+      </w:pPr>
+      <w:rPr>
+        <w:rFonts w:ascii="Symbol" w:hAnsi="Symbol" w:hint="default"/>
+        <w:sz w:val="20"/>
+      </w:rPr>
+    </w:lvl>
+    <w:lvl w:ilvl="4" w:tentative="1">
+      <w:start w:val="1"/>
+      <w:numFmt w:val="bullet"/>
+      <w:lvlText w:val=""/>
+      <w:lvlJc w:val="left"/>
+      <w:pPr>
+        <w:tabs>
+          <w:tab w:val="num" w:pos="3600"/>
+        </w:tabs>
+        <w:ind w:left="3600" w:hanging="360"/>
+      </w:pPr>
+      <w:rPr>
+        <w:rFonts w:ascii="Symbol" w:hAnsi="Symbol" w:hint="default"/>
+        <w:sz w:val="20"/>
+      </w:rPr>
+    </w:lvl>
+    <w:lvl w:ilvl="5" w:tentative="1">
+      <w:start w:val="1"/>
+      <w:numFmt w:val="bullet"/>
+      <w:lvlText w:val=""/>
+      <w:lvlJc w:val="left"/>
+      <w:pPr>
+        <w:tabs>
+          <w:tab w:val="num" w:pos="4320"/>
+        </w:tabs>
+        <w:ind w:left="4320" w:hanging="360"/>
+      </w:pPr>
+      <w:rPr>
+        <w:rFonts w:ascii="Symbol" w:hAnsi="Symbol" w:hint="default"/>
+        <w:sz w:val="20"/>
+      </w:rPr>
+    </w:lvl>
+    <w:lvl w:ilvl="6" w:tentative="1">
+      <w:start w:val="1"/>
+      <w:numFmt w:val="bullet"/>
+      <w:lvlText w:val=""/>
+      <w:lvlJc w:val="left"/>
+      <w:pPr>
+        <w:tabs>
+          <w:tab w:val="num" w:pos="5040"/>
+        </w:tabs>
+        <w:ind w:left="5040" w:hanging="360"/>
+      </w:pPr>
+      <w:rPr>
+        <w:rFonts w:ascii="Symbol" w:hAnsi="Symbol" w:hint="default"/>
+        <w:sz w:val="20"/>
+      </w:rPr>
+    </w:lvl>
+    <w:lvl w:ilvl="7" w:tentative="1">
+      <w:start w:val="1"/>
+      <w:numFmt w:val="bullet"/>
+      <w:lvlText w:val=""/>
+      <w:lvlJc w:val="left"/>
+      <w:pPr>
+        <w:tabs>
+          <w:tab w:val="num" w:pos="5760"/>
+        </w:tabs>
+        <w:ind w:left="5760" w:hanging="360"/>
+      </w:pPr>
+      <w:rPr>
+        <w:rFonts w:ascii="Symbol" w:hAnsi="Symbol" w:hint="default"/>
+        <w:sz w:val="20"/>
+      </w:rPr>
+    </w:lvl>
+    <w:lvl w:ilvl="8" w:tentative="1">
+      <w:start w:val="1"/>
+      <w:numFmt w:val="bullet"/>
+      <w:lvlText w:val=""/>
+      <w:lvlJc w:val="left"/>
+      <w:pPr>
+        <w:tabs>
+          <w:tab w:val="num" w:pos="6480"/>
+        </w:tabs>
+        <w:ind w:left="6480" w:hanging="360"/>
+      </w:pPr>
+      <w:rPr>
+        <w:rFonts w:ascii="Symbol" w:hAnsi="Symbol" w:hint="default"/>
+        <w:sz w:val="20"/>
+      </w:rPr>
+    </w:lvl>
+  </w:abstractNum>
+  <w:abstractNum w:abstractNumId="22" w15:restartNumberingAfterBreak="0">
     <w:nsid w:val="41CF68D1"/>
     <w:multiLevelType w:val="multilevel"/>
     <w:tmpl w:val="AD28734C"/>
@@ -5818,7 +7355,156 @@
       </w:rPr>
     </w:lvl>
   </w:abstractNum>
-  <w:abstractNum w:abstractNumId="18" w15:restartNumberingAfterBreak="0">
+  <w:abstractNum w:abstractNumId="23" w15:restartNumberingAfterBreak="0">
+    <w:nsid w:val="43CC28C3"/>
+    <w:multiLevelType w:val="multilevel"/>
+    <w:tmpl w:val="DF7C2F76"/>
+    <w:lvl w:ilvl="0">
+      <w:start w:val="1"/>
+      <w:numFmt w:val="bullet"/>
+      <w:lvlText w:val=""/>
+      <w:lvlJc w:val="left"/>
+      <w:pPr>
+        <w:tabs>
+          <w:tab w:val="num" w:pos="720"/>
+        </w:tabs>
+        <w:ind w:left="720" w:hanging="360"/>
+      </w:pPr>
+      <w:rPr>
+        <w:rFonts w:ascii="Symbol" w:hAnsi="Symbol" w:hint="default"/>
+        <w:sz w:val="20"/>
+      </w:rPr>
+    </w:lvl>
+    <w:lvl w:ilvl="1">
+      <w:start w:val="1"/>
+      <w:numFmt w:val="bullet"/>
+      <w:lvlText w:val=""/>
+      <w:lvlJc w:val="left"/>
+      <w:pPr>
+        <w:tabs>
+          <w:tab w:val="num" w:pos="1440"/>
+        </w:tabs>
+        <w:ind w:left="1440" w:hanging="360"/>
+      </w:pPr>
+      <w:rPr>
+        <w:rFonts w:ascii="Symbol" w:hAnsi="Symbol" w:hint="default"/>
+        <w:sz w:val="20"/>
+      </w:rPr>
+    </w:lvl>
+    <w:lvl w:ilvl="2" w:tentative="1">
+      <w:start w:val="1"/>
+      <w:numFmt w:val="bullet"/>
+      <w:lvlText w:val=""/>
+      <w:lvlJc w:val="left"/>
+      <w:pPr>
+        <w:tabs>
+          <w:tab w:val="num" w:pos="2160"/>
+        </w:tabs>
+        <w:ind w:left="2160" w:hanging="360"/>
+      </w:pPr>
+      <w:rPr>
+        <w:rFonts w:ascii="Symbol" w:hAnsi="Symbol" w:hint="default"/>
+        <w:sz w:val="20"/>
+      </w:rPr>
+    </w:lvl>
+    <w:lvl w:ilvl="3" w:tentative="1">
+      <w:start w:val="1"/>
+      <w:numFmt w:val="bullet"/>
+      <w:lvlText w:val=""/>
+      <w:lvlJc w:val="left"/>
+      <w:pPr>
+        <w:tabs>
+          <w:tab w:val="num" w:pos="2880"/>
+        </w:tabs>
+        <w:ind w:left="2880" w:hanging="360"/>
+      </w:pPr>
+      <w:rPr>
+        <w:rFonts w:ascii="Symbol" w:hAnsi="Symbol" w:hint="default"/>
+        <w:sz w:val="20"/>
+      </w:rPr>
+    </w:lvl>
+    <w:lvl w:ilvl="4" w:tentative="1">
+      <w:start w:val="1"/>
+      <w:numFmt w:val="bullet"/>
+      <w:lvlText w:val=""/>
+      <w:lvlJc w:val="left"/>
+      <w:pPr>
+        <w:tabs>
+          <w:tab w:val="num" w:pos="3600"/>
+        </w:tabs>
+        <w:ind w:left="3600" w:hanging="360"/>
+      </w:pPr>
+      <w:rPr>
+        <w:rFonts w:ascii="Symbol" w:hAnsi="Symbol" w:hint="default"/>
+        <w:sz w:val="20"/>
+      </w:rPr>
+    </w:lvl>
+    <w:lvl w:ilvl="5" w:tentative="1">
+      <w:start w:val="1"/>
+      <w:numFmt w:val="bullet"/>
+      <w:lvlText w:val=""/>
+      <w:lvlJc w:val="left"/>
+      <w:pPr>
+        <w:tabs>
+          <w:tab w:val="num" w:pos="4320"/>
+        </w:tabs>
+        <w:ind w:left="4320" w:hanging="360"/>
+      </w:pPr>
+      <w:rPr>
+        <w:rFonts w:ascii="Symbol" w:hAnsi="Symbol" w:hint="default"/>
+        <w:sz w:val="20"/>
+      </w:rPr>
+    </w:lvl>
+    <w:lvl w:ilvl="6" w:tentative="1">
+      <w:start w:val="1"/>
+      <w:numFmt w:val="bullet"/>
+      <w:lvlText w:val=""/>
+      <w:lvlJc w:val="left"/>
+      <w:pPr>
+        <w:tabs>
+          <w:tab w:val="num" w:pos="5040"/>
+        </w:tabs>
+        <w:ind w:left="5040" w:hanging="360"/>
+      </w:pPr>
+      <w:rPr>
+        <w:rFonts w:ascii="Symbol" w:hAnsi="Symbol" w:hint="default"/>
+        <w:sz w:val="20"/>
+      </w:rPr>
+    </w:lvl>
+    <w:lvl w:ilvl="7" w:tentative="1">
+      <w:start w:val="1"/>
+      <w:numFmt w:val="bullet"/>
+      <w:lvlText w:val=""/>
+      <w:lvlJc w:val="left"/>
+      <w:pPr>
+        <w:tabs>
+          <w:tab w:val="num" w:pos="5760"/>
+        </w:tabs>
+        <w:ind w:left="5760" w:hanging="360"/>
+      </w:pPr>
+      <w:rPr>
+        <w:rFonts w:ascii="Symbol" w:hAnsi="Symbol" w:hint="default"/>
+        <w:sz w:val="20"/>
+      </w:rPr>
+    </w:lvl>
+    <w:lvl w:ilvl="8" w:tentative="1">
+      <w:start w:val="1"/>
+      <w:numFmt w:val="bullet"/>
+      <w:lvlText w:val=""/>
+      <w:lvlJc w:val="left"/>
+      <w:pPr>
+        <w:tabs>
+          <w:tab w:val="num" w:pos="6480"/>
+        </w:tabs>
+        <w:ind w:left="6480" w:hanging="360"/>
+      </w:pPr>
+      <w:rPr>
+        <w:rFonts w:ascii="Symbol" w:hAnsi="Symbol" w:hint="default"/>
+        <w:sz w:val="20"/>
+      </w:rPr>
+    </w:lvl>
+  </w:abstractNum>
+  <w:abstractNum w:abstractNumId="24" w15:restartNumberingAfterBreak="0">
     <w:nsid w:val="44677946"/>
     <w:multiLevelType w:val="multilevel"/>
     <w:tmpl w:val="7E4EEF24"/>
@@ -5967,7 +7653,7 @@
       </w:rPr>
     </w:lvl>
   </w:abstractNum>
-  <w:abstractNum w:abstractNumId="19" w15:restartNumberingAfterBreak="0">
+  <w:abstractNum w:abstractNumId="25" w15:restartNumberingAfterBreak="0">
     <w:nsid w:val="4E402E0F"/>
     <w:multiLevelType w:val="multilevel"/>
     <w:tmpl w:val="6068E2C8"/>
@@ -6116,7 +7802,7 @@
       </w:rPr>
     </w:lvl>
   </w:abstractNum>
-  <w:abstractNum w:abstractNumId="20" w15:restartNumberingAfterBreak="0">
+  <w:abstractNum w:abstractNumId="26" w15:restartNumberingAfterBreak="0">
     <w:nsid w:val="4E49141C"/>
     <w:multiLevelType w:val="multilevel"/>
     <w:tmpl w:val="5A9CA2AE"/>
@@ -6265,7 +7951,7 @@
       </w:rPr>
     </w:lvl>
   </w:abstractNum>
-  <w:abstractNum w:abstractNumId="21" w15:restartNumberingAfterBreak="0">
+  <w:abstractNum w:abstractNumId="27" w15:restartNumberingAfterBreak="0">
     <w:nsid w:val="50B73CA5"/>
     <w:multiLevelType w:val="multilevel"/>
     <w:tmpl w:val="675CD15C"/>
@@ -6414,7 +8100,7 @@
       </w:rPr>
     </w:lvl>
   </w:abstractNum>
-  <w:abstractNum w:abstractNumId="22" w15:restartNumberingAfterBreak="0">
+  <w:abstractNum w:abstractNumId="28" w15:restartNumberingAfterBreak="0">
     <w:nsid w:val="51D222AC"/>
     <w:multiLevelType w:val="multilevel"/>
     <w:tmpl w:val="B3E25296"/>
@@ -6563,7 +8249,7 @@
       </w:rPr>
     </w:lvl>
   </w:abstractNum>
-  <w:abstractNum w:abstractNumId="23" w15:restartNumberingAfterBreak="0">
+  <w:abstractNum w:abstractNumId="29" w15:restartNumberingAfterBreak="0">
     <w:nsid w:val="531E76E5"/>
     <w:multiLevelType w:val="multilevel"/>
     <w:tmpl w:val="EDE02BC8"/>
@@ -6712,7 +8398,7 @@
       </w:rPr>
     </w:lvl>
   </w:abstractNum>
-  <w:abstractNum w:abstractNumId="24" w15:restartNumberingAfterBreak="0">
+  <w:abstractNum w:abstractNumId="30" w15:restartNumberingAfterBreak="0">
     <w:nsid w:val="533A324B"/>
     <w:multiLevelType w:val="multilevel"/>
     <w:tmpl w:val="56BCC45C"/>
@@ -6861,7 +8547,7 @@
       </w:rPr>
     </w:lvl>
   </w:abstractNum>
-  <w:abstractNum w:abstractNumId="25" w15:restartNumberingAfterBreak="0">
+  <w:abstractNum w:abstractNumId="31" w15:restartNumberingAfterBreak="0">
     <w:nsid w:val="540E6F18"/>
     <w:multiLevelType w:val="multilevel"/>
     <w:tmpl w:val="87DCA8E0"/>
@@ -7010,7 +8696,7 @@
       </w:rPr>
     </w:lvl>
   </w:abstractNum>
-  <w:abstractNum w:abstractNumId="26" w15:restartNumberingAfterBreak="0">
+  <w:abstractNum w:abstractNumId="32" w15:restartNumberingAfterBreak="0">
     <w:nsid w:val="59EA2C4A"/>
     <w:multiLevelType w:val="multilevel"/>
     <w:tmpl w:val="8BD26C36"/>
@@ -7159,7 +8845,7 @@
       </w:rPr>
     </w:lvl>
   </w:abstractNum>
-  <w:abstractNum w:abstractNumId="27" w15:restartNumberingAfterBreak="0">
+  <w:abstractNum w:abstractNumId="33" w15:restartNumberingAfterBreak="0">
     <w:nsid w:val="5A0E2298"/>
     <w:multiLevelType w:val="multilevel"/>
     <w:tmpl w:val="BB9612AC"/>
@@ -7304,7 +8990,7 @@
       </w:rPr>
     </w:lvl>
   </w:abstractNum>
-  <w:abstractNum w:abstractNumId="28" w15:restartNumberingAfterBreak="0">
+  <w:abstractNum w:abstractNumId="34" w15:restartNumberingAfterBreak="0">
     <w:nsid w:val="5BB16C30"/>
     <w:multiLevelType w:val="multilevel"/>
     <w:tmpl w:val="6DC0F07A"/>
@@ -7453,7 +9139,7 @@
       </w:rPr>
     </w:lvl>
   </w:abstractNum>
-  <w:abstractNum w:abstractNumId="29" w15:restartNumberingAfterBreak="0">
+  <w:abstractNum w:abstractNumId="35" w15:restartNumberingAfterBreak="0">
     <w:nsid w:val="61110AC8"/>
     <w:multiLevelType w:val="multilevel"/>
     <w:tmpl w:val="92320496"/>
@@ -7602,7 +9288,7 @@
       </w:rPr>
     </w:lvl>
   </w:abstractNum>
-  <w:abstractNum w:abstractNumId="30" w15:restartNumberingAfterBreak="0">
+  <w:abstractNum w:abstractNumId="36" w15:restartNumberingAfterBreak="0">
     <w:nsid w:val="623D0706"/>
     <w:multiLevelType w:val="multilevel"/>
     <w:tmpl w:val="3116859E"/>
@@ -7751,7 +9437,156 @@
       </w:rPr>
     </w:lvl>
   </w:abstractNum>
-  <w:abstractNum w:abstractNumId="31" w15:restartNumberingAfterBreak="0">
+  <w:abstractNum w:abstractNumId="37" w15:restartNumberingAfterBreak="0">
+    <w:nsid w:val="69152890"/>
+    <w:multiLevelType w:val="multilevel"/>
+    <w:tmpl w:val="B8644AC8"/>
+    <w:lvl w:ilvl="0">
+      <w:start w:val="1"/>
+      <w:numFmt w:val="bullet"/>
+      <w:lvlText w:val=""/>
+      <w:lvlJc w:val="left"/>
+      <w:pPr>
+        <w:tabs>
+          <w:tab w:val="num" w:pos="720"/>
+        </w:tabs>
+        <w:ind w:left="720" w:hanging="360"/>
+      </w:pPr>
+      <w:rPr>
+        <w:rFonts w:ascii="Symbol" w:hAnsi="Symbol" w:hint="default"/>
+        <w:sz w:val="20"/>
+      </w:rPr>
+    </w:lvl>
+    <w:lvl w:ilvl="1" w:tentative="1">
+      <w:start w:val="1"/>
+      <w:numFmt w:val="bullet"/>
+      <w:lvlText w:val=""/>
+      <w:lvlJc w:val="left"/>
+      <w:pPr>
+        <w:tabs>
+          <w:tab w:val="num" w:pos="1440"/>
+        </w:tabs>
+        <w:ind w:left="1440" w:hanging="360"/>
+      </w:pPr>
+      <w:rPr>
+        <w:rFonts w:ascii="Symbol" w:hAnsi="Symbol" w:hint="default"/>
+        <w:sz w:val="20"/>
+      </w:rPr>
+    </w:lvl>
+    <w:lvl w:ilvl="2" w:tentative="1">
+      <w:start w:val="1"/>
+      <w:numFmt w:val="bullet"/>
+      <w:lvlText w:val=""/>
+      <w:lvlJc w:val="left"/>
+      <w:pPr>
+        <w:tabs>
+          <w:tab w:val="num" w:pos="2160"/>
+        </w:tabs>
+        <w:ind w:left="2160" w:hanging="360"/>
+      </w:pPr>
+      <w:rPr>
+        <w:rFonts w:ascii="Symbol" w:hAnsi="Symbol" w:hint="default"/>
+        <w:sz w:val="20"/>
+      </w:rPr>
+    </w:lvl>
+    <w:lvl w:ilvl="3" w:tentative="1">
+      <w:start w:val="1"/>
+      <w:numFmt w:val="bullet"/>
+      <w:lvlText w:val=""/>
+      <w:lvlJc w:val="left"/>
+      <w:pPr>
+        <w:tabs>
+          <w:tab w:val="num" w:pos="2880"/>
+        </w:tabs>
+        <w:ind w:left="2880" w:hanging="360"/>
+      </w:pPr>
+      <w:rPr>
+        <w:rFonts w:ascii="Symbol" w:hAnsi="Symbol" w:hint="default"/>
+        <w:sz w:val="20"/>
+      </w:rPr>
+    </w:lvl>
+    <w:lvl w:ilvl="4" w:tentative="1">
+      <w:start w:val="1"/>
+      <w:numFmt w:val="bullet"/>
+      <w:lvlText w:val=""/>
+      <w:lvlJc w:val="left"/>
+      <w:pPr>
+        <w:tabs>
+          <w:tab w:val="num" w:pos="3600"/>
+        </w:tabs>
+        <w:ind w:left="3600" w:hanging="360"/>
+      </w:pPr>
+      <w:rPr>
+        <w:rFonts w:ascii="Symbol" w:hAnsi="Symbol" w:hint="default"/>
+        <w:sz w:val="20"/>
+      </w:rPr>
+    </w:lvl>
+    <w:lvl w:ilvl="5" w:tentative="1">
+      <w:start w:val="1"/>
+      <w:numFmt w:val="bullet"/>
+      <w:lvlText w:val=""/>
+      <w:lvlJc w:val="left"/>
+      <w:pPr>
+        <w:tabs>
+          <w:tab w:val="num" w:pos="4320"/>
+        </w:tabs>
+        <w:ind w:left="4320" w:hanging="360"/>
+      </w:pPr>
+      <w:rPr>
+        <w:rFonts w:ascii="Symbol" w:hAnsi="Symbol" w:hint="default"/>
+        <w:sz w:val="20"/>
+      </w:rPr>
+    </w:lvl>
+    <w:lvl w:ilvl="6" w:tentative="1">
+      <w:start w:val="1"/>
+      <w:numFmt w:val="bullet"/>
+      <w:lvlText w:val=""/>
+      <w:lvlJc w:val="left"/>
+      <w:pPr>
+        <w:tabs>
+          <w:tab w:val="num" w:pos="5040"/>
+        </w:tabs>
+        <w:ind w:left="5040" w:hanging="360"/>
+      </w:pPr>
+      <w:rPr>
+        <w:rFonts w:ascii="Symbol" w:hAnsi="Symbol" w:hint="default"/>
+        <w:sz w:val="20"/>
+      </w:rPr>
+    </w:lvl>
+    <w:lvl w:ilvl="7" w:tentative="1">
+      <w:start w:val="1"/>
+      <w:numFmt w:val="bullet"/>
+      <w:lvlText w:val=""/>
+      <w:lvlJc w:val="left"/>
+      <w:pPr>
+        <w:tabs>
+          <w:tab w:val="num" w:pos="5760"/>
+        </w:tabs>
+        <w:ind w:left="5760" w:hanging="360"/>
+      </w:pPr>
+      <w:rPr>
+        <w:rFonts w:ascii="Symbol" w:hAnsi="Symbol" w:hint="default"/>
+        <w:sz w:val="20"/>
+      </w:rPr>
+    </w:lvl>
+    <w:lvl w:ilvl="8" w:tentative="1">
+      <w:start w:val="1"/>
+      <w:numFmt w:val="bullet"/>
+      <w:lvlText w:val=""/>
+      <w:lvlJc w:val="left"/>
+      <w:pPr>
+        <w:tabs>
+          <w:tab w:val="num" w:pos="6480"/>
+        </w:tabs>
+        <w:ind w:left="6480" w:hanging="360"/>
+      </w:pPr>
+      <w:rPr>
+        <w:rFonts w:ascii="Symbol" w:hAnsi="Symbol" w:hint="default"/>
+        <w:sz w:val="20"/>
+      </w:rPr>
+    </w:lvl>
+  </w:abstractNum>
+  <w:abstractNum w:abstractNumId="38" w15:restartNumberingAfterBreak="0">
     <w:nsid w:val="69E65E00"/>
     <w:multiLevelType w:val="multilevel"/>
     <w:tmpl w:val="04E893C4"/>
@@ -7864,7 +9699,156 @@
       </w:pPr>
     </w:lvl>
   </w:abstractNum>
-  <w:abstractNum w:abstractNumId="32" w15:restartNumberingAfterBreak="0">
+  <w:abstractNum w:abstractNumId="39" w15:restartNumberingAfterBreak="0">
+    <w:nsid w:val="6BE86D99"/>
+    <w:multiLevelType w:val="multilevel"/>
+    <w:tmpl w:val="C2C6DE8C"/>
+    <w:lvl w:ilvl="0">
+      <w:start w:val="1"/>
+      <w:numFmt w:val="bullet"/>
+      <w:lvlText w:val=""/>
+      <w:lvlJc w:val="left"/>
+      <w:pPr>
+        <w:tabs>
+          <w:tab w:val="num" w:pos="720"/>
+        </w:tabs>
+        <w:ind w:left="720" w:hanging="360"/>
+      </w:pPr>
+      <w:rPr>
+        <w:rFonts w:ascii="Symbol" w:hAnsi="Symbol" w:hint="default"/>
+        <w:sz w:val="20"/>
+      </w:rPr>
+    </w:lvl>
+    <w:lvl w:ilvl="1" w:tentative="1">
+      <w:start w:val="1"/>
+      <w:numFmt w:val="bullet"/>
+      <w:lvlText w:val=""/>
+      <w:lvlJc w:val="left"/>
+      <w:pPr>
+        <w:tabs>
+          <w:tab w:val="num" w:pos="1440"/>
+        </w:tabs>
+        <w:ind w:left="1440" w:hanging="360"/>
+      </w:pPr>
+      <w:rPr>
+        <w:rFonts w:ascii="Symbol" w:hAnsi="Symbol" w:hint="default"/>
+        <w:sz w:val="20"/>
+      </w:rPr>
+    </w:lvl>
+    <w:lvl w:ilvl="2" w:tentative="1">
+      <w:start w:val="1"/>
+      <w:numFmt w:val="bullet"/>
+      <w:lvlText w:val=""/>
+      <w:lvlJc w:val="left"/>
+      <w:pPr>
+        <w:tabs>
+          <w:tab w:val="num" w:pos="2160"/>
+        </w:tabs>
+        <w:ind w:left="2160" w:hanging="360"/>
+      </w:pPr>
+      <w:rPr>
+        <w:rFonts w:ascii="Symbol" w:hAnsi="Symbol" w:hint="default"/>
+        <w:sz w:val="20"/>
+      </w:rPr>
+    </w:lvl>
+    <w:lvl w:ilvl="3" w:tentative="1">
+      <w:start w:val="1"/>
+      <w:numFmt w:val="bullet"/>
+      <w:lvlText w:val=""/>
+      <w:lvlJc w:val="left"/>
+      <w:pPr>
+        <w:tabs>
+          <w:tab w:val="num" w:pos="2880"/>
+        </w:tabs>
+        <w:ind w:left="2880" w:hanging="360"/>
+      </w:pPr>
+      <w:rPr>
+        <w:rFonts w:ascii="Symbol" w:hAnsi="Symbol" w:hint="default"/>
+        <w:sz w:val="20"/>
+      </w:rPr>
+    </w:lvl>
+    <w:lvl w:ilvl="4" w:tentative="1">
+      <w:start w:val="1"/>
+      <w:numFmt w:val="bullet"/>
+      <w:lvlText w:val=""/>
+      <w:lvlJc w:val="left"/>
+      <w:pPr>
+        <w:tabs>
+          <w:tab w:val="num" w:pos="3600"/>
+        </w:tabs>
+        <w:ind w:left="3600" w:hanging="360"/>
+      </w:pPr>
+      <w:rPr>
+        <w:rFonts w:ascii="Symbol" w:hAnsi="Symbol" w:hint="default"/>
+        <w:sz w:val="20"/>
+      </w:rPr>
+    </w:lvl>
+    <w:lvl w:ilvl="5" w:tentative="1">
+      <w:start w:val="1"/>
+      <w:numFmt w:val="bullet"/>
+      <w:lvlText w:val=""/>
+      <w:lvlJc w:val="left"/>
+      <w:pPr>
+        <w:tabs>
+          <w:tab w:val="num" w:pos="4320"/>
+        </w:tabs>
+        <w:ind w:left="4320" w:hanging="360"/>
+      </w:pPr>
+      <w:rPr>
+        <w:rFonts w:ascii="Symbol" w:hAnsi="Symbol" w:hint="default"/>
+        <w:sz w:val="20"/>
+      </w:rPr>
+    </w:lvl>
+    <w:lvl w:ilvl="6" w:tentative="1">
+      <w:start w:val="1"/>
+      <w:numFmt w:val="bullet"/>
+      <w:lvlText w:val=""/>
+      <w:lvlJc w:val="left"/>
+      <w:pPr>
+        <w:tabs>
+          <w:tab w:val="num" w:pos="5040"/>
+        </w:tabs>
+        <w:ind w:left="5040" w:hanging="360"/>
+      </w:pPr>
+      <w:rPr>
+        <w:rFonts w:ascii="Symbol" w:hAnsi="Symbol" w:hint="default"/>
+        <w:sz w:val="20"/>
+      </w:rPr>
+    </w:lvl>
+    <w:lvl w:ilvl="7" w:tentative="1">
+      <w:start w:val="1"/>
+      <w:numFmt w:val="bullet"/>
+      <w:lvlText w:val=""/>
+      <w:lvlJc w:val="left"/>
+      <w:pPr>
+        <w:tabs>
+          <w:tab w:val="num" w:pos="5760"/>
+        </w:tabs>
+        <w:ind w:left="5760" w:hanging="360"/>
+      </w:pPr>
+      <w:rPr>
+        <w:rFonts w:ascii="Symbol" w:hAnsi="Symbol" w:hint="default"/>
+        <w:sz w:val="20"/>
+      </w:rPr>
+    </w:lvl>
+    <w:lvl w:ilvl="8" w:tentative="1">
+      <w:start w:val="1"/>
+      <w:numFmt w:val="bullet"/>
+      <w:lvlText w:val=""/>
+      <w:lvlJc w:val="left"/>
+      <w:pPr>
+        <w:tabs>
+          <w:tab w:val="num" w:pos="6480"/>
+        </w:tabs>
+        <w:ind w:left="6480" w:hanging="360"/>
+      </w:pPr>
+      <w:rPr>
+        <w:rFonts w:ascii="Symbol" w:hAnsi="Symbol" w:hint="default"/>
+        <w:sz w:val="20"/>
+      </w:rPr>
+    </w:lvl>
+  </w:abstractNum>
+  <w:abstractNum w:abstractNumId="40" w15:restartNumberingAfterBreak="0">
     <w:nsid w:val="6CF83EE6"/>
     <w:multiLevelType w:val="multilevel"/>
     <w:tmpl w:val="70AA93B2"/>
@@ -8013,7 +9997,7 @@
       </w:rPr>
     </w:lvl>
   </w:abstractNum>
-  <w:abstractNum w:abstractNumId="33" w15:restartNumberingAfterBreak="0">
+  <w:abstractNum w:abstractNumId="41" w15:restartNumberingAfterBreak="0">
     <w:nsid w:val="743D265B"/>
     <w:multiLevelType w:val="multilevel"/>
     <w:tmpl w:val="3400487C"/>
@@ -8162,7 +10146,7 @@
       </w:rPr>
     </w:lvl>
   </w:abstractNum>
-  <w:abstractNum w:abstractNumId="34" w15:restartNumberingAfterBreak="0">
+  <w:abstractNum w:abstractNumId="42" w15:restartNumberingAfterBreak="0">
     <w:nsid w:val="748F6EEA"/>
     <w:multiLevelType w:val="multilevel"/>
     <w:tmpl w:val="9BA21E5C"/>
@@ -8311,7 +10295,7 @@
       </w:rPr>
     </w:lvl>
   </w:abstractNum>
-  <w:abstractNum w:abstractNumId="35" w15:restartNumberingAfterBreak="0">
+  <w:abstractNum w:abstractNumId="43" w15:restartNumberingAfterBreak="0">
     <w:nsid w:val="758A781F"/>
     <w:multiLevelType w:val="multilevel"/>
     <w:tmpl w:val="2E141854"/>
@@ -8460,7 +10444,7 @@
       </w:rPr>
     </w:lvl>
   </w:abstractNum>
-  <w:abstractNum w:abstractNumId="36" w15:restartNumberingAfterBreak="0">
+  <w:abstractNum w:abstractNumId="44" w15:restartNumberingAfterBreak="0">
     <w:nsid w:val="7E48662E"/>
     <w:multiLevelType w:val="multilevel"/>
     <w:tmpl w:val="7E2CF740"/>
@@ -8609,7 +10593,7 @@
       </w:rPr>
     </w:lvl>
   </w:abstractNum>
-  <w:abstractNum w:abstractNumId="37" w15:restartNumberingAfterBreak="0">
+  <w:abstractNum w:abstractNumId="45" w15:restartNumberingAfterBreak="0">
     <w:nsid w:val="7FA7012C"/>
     <w:multiLevelType w:val="multilevel"/>
     <w:tmpl w:val="3DF8D112"/>
@@ -8758,7 +10742,7 @@
       </w:rPr>
     </w:lvl>
   </w:abstractNum>
-  <w:abstractNum w:abstractNumId="38" w15:restartNumberingAfterBreak="0">
+  <w:abstractNum w:abstractNumId="46" w15:restartNumberingAfterBreak="0">
     <w:nsid w:val="7FBB780C"/>
     <w:multiLevelType w:val="multilevel"/>
     <w:tmpl w:val="902ECCD2"/>
@@ -8872,121 +10856,145 @@
     </w:lvl>
   </w:abstractNum>
   <w:num w:numId="1" w16cid:durableId="1961371284">
-    <w:abstractNumId w:val="8"/>
+    <w:abstractNumId w:val="11"/>
   </w:num>
   <w:num w:numId="2" w16cid:durableId="1367027804">
-    <w:abstractNumId w:val="32"/>
+    <w:abstractNumId w:val="40"/>
   </w:num>
   <w:num w:numId="3" w16cid:durableId="1668631311">
     <w:abstractNumId w:val="0"/>
   </w:num>
   <w:num w:numId="4" w16cid:durableId="1732652887">
-    <w:abstractNumId w:val="22"/>
+    <w:abstractNumId w:val="28"/>
   </w:num>
   <w:num w:numId="5" w16cid:durableId="956135389">
+    <w:abstractNumId w:val="30"/>
+  </w:num>
+  <w:num w:numId="6" w16cid:durableId="1789198818">
+    <w:abstractNumId w:val="12"/>
+  </w:num>
+  <w:num w:numId="7" w16cid:durableId="269972398">
+    <w:abstractNumId w:val="34"/>
+  </w:num>
+  <w:num w:numId="8" w16cid:durableId="817572598">
+    <w:abstractNumId w:val="9"/>
+  </w:num>
+  <w:num w:numId="9" w16cid:durableId="670715461">
+    <w:abstractNumId w:val="35"/>
+  </w:num>
+  <w:num w:numId="10" w16cid:durableId="1276332657">
+    <w:abstractNumId w:val="36"/>
+  </w:num>
+  <w:num w:numId="11" w16cid:durableId="1085541468">
+    <w:abstractNumId w:val="4"/>
+  </w:num>
+  <w:num w:numId="12" w16cid:durableId="729813302">
+    <w:abstractNumId w:val="38"/>
+  </w:num>
+  <w:num w:numId="13" w16cid:durableId="219287181">
+    <w:abstractNumId w:val="46"/>
+  </w:num>
+  <w:num w:numId="14" w16cid:durableId="1478569081">
+    <w:abstractNumId w:val="43"/>
+  </w:num>
+  <w:num w:numId="15" w16cid:durableId="1784617126">
+    <w:abstractNumId w:val="25"/>
+  </w:num>
+  <w:num w:numId="16" w16cid:durableId="488444713">
+    <w:abstractNumId w:val="27"/>
+  </w:num>
+  <w:num w:numId="17" w16cid:durableId="1473865838">
+    <w:abstractNumId w:val="20"/>
+  </w:num>
+  <w:num w:numId="18" w16cid:durableId="1131827971">
+    <w:abstractNumId w:val="6"/>
+  </w:num>
+  <w:num w:numId="19" w16cid:durableId="801387460">
+    <w:abstractNumId w:val="26"/>
+  </w:num>
+  <w:num w:numId="20" w16cid:durableId="219755788">
+    <w:abstractNumId w:val="15"/>
+  </w:num>
+  <w:num w:numId="21" w16cid:durableId="196814451">
+    <w:abstractNumId w:val="31"/>
+  </w:num>
+  <w:num w:numId="22" w16cid:durableId="166287831">
+    <w:abstractNumId w:val="18"/>
+  </w:num>
+  <w:num w:numId="23" w16cid:durableId="1636062703">
     <w:abstractNumId w:val="24"/>
   </w:num>
-  <w:num w:numId="6" w16cid:durableId="1789198818">
-    <w:abstractNumId w:val="9"/>
+  <w:num w:numId="24" w16cid:durableId="651569532">
+    <w:abstractNumId w:val="41"/>
   </w:num>
-  <w:num w:numId="7" w16cid:durableId="269972398">
-    <w:abstractNumId w:val="28"/>
+  <w:num w:numId="25" w16cid:durableId="1769961410">
+    <w:abstractNumId w:val="13"/>
   </w:num>
-  <w:num w:numId="8" w16cid:durableId="817572598">
+  <w:num w:numId="26" w16cid:durableId="1853033479">
     <w:abstractNumId w:val="7"/>
   </w:num>
-  <w:num w:numId="9" w16cid:durableId="670715461">
-    <w:abstractNumId w:val="29"/>
-  </w:num>
-  <w:num w:numId="10" w16cid:durableId="1276332657">
-    <w:abstractNumId w:val="30"/>
-  </w:num>
-  <w:num w:numId="11" w16cid:durableId="1085541468">
-    <w:abstractNumId w:val="3"/>
-  </w:num>
-  <w:num w:numId="12" w16cid:durableId="729813302">
-    <w:abstractNumId w:val="31"/>
-  </w:num>
-  <w:num w:numId="13" w16cid:durableId="219287181">
-    <w:abstractNumId w:val="38"/>
-  </w:num>
-  <w:num w:numId="14" w16cid:durableId="1478569081">
-    <w:abstractNumId w:val="35"/>
-  </w:num>
-  <w:num w:numId="15" w16cid:durableId="1784617126">
-    <w:abstractNumId w:val="19"/>
-  </w:num>
-  <w:num w:numId="16" w16cid:durableId="488444713">
-    <w:abstractNumId w:val="21"/>
-  </w:num>
-  <w:num w:numId="17" w16cid:durableId="1473865838">
+  <w:num w:numId="27" w16cid:durableId="1389182724">
     <w:abstractNumId w:val="16"/>
   </w:num>
-  <w:num w:numId="18" w16cid:durableId="1131827971">
-    <w:abstractNumId w:val="4"/>
-  </w:num>
-  <w:num w:numId="19" w16cid:durableId="801387460">
-    <w:abstractNumId w:val="20"/>
-  </w:num>
-  <w:num w:numId="20" w16cid:durableId="219755788">
-    <w:abstractNumId w:val="11"/>
-  </w:num>
-  <w:num w:numId="21" w16cid:durableId="196814451">
-    <w:abstractNumId w:val="25"/>
-  </w:num>
-  <w:num w:numId="22" w16cid:durableId="166287831">
-    <w:abstractNumId w:val="14"/>
-  </w:num>
-  <w:num w:numId="23" w16cid:durableId="1636062703">
-    <w:abstractNumId w:val="18"/>
-  </w:num>
-  <w:num w:numId="24" w16cid:durableId="651569532">
-    <w:abstractNumId w:val="33"/>
-  </w:num>
-  <w:num w:numId="25" w16cid:durableId="1769961410">
-    <w:abstractNumId w:val="10"/>
-  </w:num>
-  <w:num w:numId="26" w16cid:durableId="1853033479">
-    <w:abstractNumId w:val="5"/>
-  </w:num>
-  <w:num w:numId="27" w16cid:durableId="1389182724">
-    <w:abstractNumId w:val="12"/>
-  </w:num>
   <w:num w:numId="28" w16cid:durableId="1210071178">
-    <w:abstractNumId w:val="13"/>
+    <w:abstractNumId w:val="17"/>
   </w:num>
   <w:num w:numId="29" w16cid:durableId="2055808716">
-    <w:abstractNumId w:val="15"/>
+    <w:abstractNumId w:val="19"/>
   </w:num>
   <w:num w:numId="30" w16cid:durableId="951592037">
     <w:abstractNumId w:val="2"/>
   </w:num>
   <w:num w:numId="31" w16cid:durableId="1780370132">
-    <w:abstractNumId w:val="36"/>
+    <w:abstractNumId w:val="44"/>
   </w:num>
   <w:num w:numId="32" w16cid:durableId="1576473904">
-    <w:abstractNumId w:val="17"/>
+    <w:abstractNumId w:val="22"/>
   </w:num>
   <w:num w:numId="33" w16cid:durableId="681971854">
-    <w:abstractNumId w:val="37"/>
+    <w:abstractNumId w:val="45"/>
   </w:num>
   <w:num w:numId="34" w16cid:durableId="1310600430">
-    <w:abstractNumId w:val="27"/>
+    <w:abstractNumId w:val="33"/>
   </w:num>
   <w:num w:numId="35" w16cid:durableId="1824739748">
-    <w:abstractNumId w:val="26"/>
+    <w:abstractNumId w:val="32"/>
   </w:num>
   <w:num w:numId="36" w16cid:durableId="2028209590">
-    <w:abstractNumId w:val="34"/>
+    <w:abstractNumId w:val="42"/>
   </w:num>
   <w:num w:numId="37" w16cid:durableId="2099673263">
-    <w:abstractNumId w:val="23"/>
+    <w:abstractNumId w:val="29"/>
   </w:num>
   <w:num w:numId="38" w16cid:durableId="839005494">
-    <w:abstractNumId w:val="6"/>
+    <w:abstractNumId w:val="8"/>
   </w:num>
   <w:num w:numId="39" w16cid:durableId="1280183906">
     <w:abstractNumId w:val="1"/>
+  </w:num>
+  <w:num w:numId="40" w16cid:durableId="948463993">
+    <w:abstractNumId w:val="37"/>
+  </w:num>
+  <w:num w:numId="41" w16cid:durableId="596405105">
+    <w:abstractNumId w:val="10"/>
+  </w:num>
+  <w:num w:numId="42" w16cid:durableId="499856645">
+    <w:abstractNumId w:val="14"/>
+  </w:num>
+  <w:num w:numId="43" w16cid:durableId="134107496">
+    <w:abstractNumId w:val="3"/>
+  </w:num>
+  <w:num w:numId="44" w16cid:durableId="682703799">
+    <w:abstractNumId w:val="23"/>
+  </w:num>
+  <w:num w:numId="45" w16cid:durableId="198863764">
+    <w:abstractNumId w:val="5"/>
+  </w:num>
+  <w:num w:numId="46" w16cid:durableId="754591814">
+    <w:abstractNumId w:val="39"/>
+  </w:num>
+  <w:num w:numId="47" w16cid:durableId="658388422">
+    <w:abstractNumId w:val="21"/>
   </w:num>
 </w:numbering>
 </file>

</xml_diff>

<commit_message>
Phase 6: In-Room Features (Host Controls, Background Blur, Raise Hand, PiP, Record)
</commit_message>
<xml_diff>
--- a/TaiLieuDacTa.docx
+++ b/TaiLieuDacTa.docx
@@ -3985,6 +3985,486 @@
         <w:t>Can thiệp vào SDP (Session Description Protocol) trước khi gửi đi để giới hạn bitrate của Video (ví dụ: tối đa 500kbps cho mỗi luồng) nhằm tránh sập mạng khi phòng có 4-5 người theo mô hình Mesh.</w:t>
       </w:r>
     </w:p>
+    <w:p>
+      <w:r>
+        <w:br w:type="page"/>
+      </w:r>
+    </w:p>
+    <w:p>
+      <w:pPr>
+        <w:numPr>
+          <w:ilvl w:val="0"/>
+          <w:numId w:val="48"/>
+        </w:numPr>
+        <w:rPr>
+          <w:b/>
+          <w:bCs/>
+        </w:rPr>
+      </w:pPr>
+      <w:r>
+        <w:rPr>
+          <w:b/>
+          <w:bCs/>
+        </w:rPr>
+        <w:lastRenderedPageBreak/>
+        <w:t>WaveMeet - Phase 6 Implementation Plan</w:t>
+      </w:r>
+    </w:p>
+    <w:p>
+      <w:r>
+        <w:t>Phần 1 (Nâng cấp mạng P2P Mesh + TURN) đã được chúng ta hoàn thành xuất sắc! Bây giờ, chúng ta sẽ bắt tay vào </w:t>
+      </w:r>
+      <w:r>
+        <w:rPr>
+          <w:b/>
+          <w:bCs/>
+        </w:rPr>
+        <w:t>Phần 2: Nâng cao Trải nghiệm Phòng họp (In-Room Features)</w:t>
+      </w:r>
+      <w:r>
+        <w:t>.</w:t>
+      </w:r>
+    </w:p>
+    <w:p>
+      <w:r>
+        <w:t>Đây là một đợt nâng cấp khổng lồ về mặt Giao diện (Frontend) và Tương tác (Signaling).</w:t>
+      </w:r>
+    </w:p>
+    <w:p>
+      <w:pPr>
+        <w:rPr>
+          <w:b/>
+          <w:bCs/>
+        </w:rPr>
+      </w:pPr>
+      <w:r>
+        <w:rPr>
+          <w:b/>
+          <w:bCs/>
+        </w:rPr>
+        <w:t>User Review Required</w:t>
+      </w:r>
+    </w:p>
+    <w:p>
+      <w:r>
+        <w:t>IMPORTANT</w:t>
+      </w:r>
+    </w:p>
+    <w:p>
+      <w:r>
+        <w:rPr>
+          <w:b/>
+          <w:bCs/>
+        </w:rPr>
+        <w:t>Về tính năng Thay đổi phông nền (Virtual Background):</w:t>
+      </w:r>
+      <w:r>
+        <w:t> Tính năng này yêu cầu xử lý hình ảnh từng khung hình (Frame-by-frame) bằng AI. Tôi sẽ sử dụng thư viện </w:t>
+      </w:r>
+      <w:r>
+        <w:rPr>
+          <w:b/>
+          <w:bCs/>
+        </w:rPr>
+        <w:t>MediaPipe Selfie Segmentation</w:t>
+      </w:r>
+      <w:r>
+        <w:t> của Google vì nó rất nhẹ và chạy trực tiếp trên trình duyệt bằng WebGL. Quá trình xử lý sẽ chạy qua một thẻ &lt;canvas&gt;, sau đó luồng stream từ canvas này mới được gửi đi cho người khác. Bạn có đồng ý sử dụng thư viện này không?</w:t>
+      </w:r>
+    </w:p>
+    <w:p>
+      <w:r>
+        <w:t>TIP</w:t>
+      </w:r>
+    </w:p>
+    <w:p>
+      <w:r>
+        <w:rPr>
+          <w:b/>
+          <w:bCs/>
+        </w:rPr>
+        <w:t>Về tính năng Ghi hình (Record Session):</w:t>
+      </w:r>
+      <w:r>
+        <w:t> Ghi hình nhiều luồng P2P độc lập trên trình duyệt là rất khó. Cách tối ưu và thực tế nhất (giống hệt Google Meet) là yêu cầu quyền Share Screen chính cái tab đang họp (Tab Capture), sau đó dùng MediaRecorder ghi lại toàn bộ Tab đó kèm âm thanh và tải xuống dưới dạng .webm.</w:t>
+      </w:r>
+    </w:p>
+    <w:p>
+      <w:pPr>
+        <w:rPr>
+          <w:b/>
+          <w:bCs/>
+        </w:rPr>
+      </w:pPr>
+      <w:r>
+        <w:rPr>
+          <w:b/>
+          <w:bCs/>
+        </w:rPr>
+        <w:t>Proposed Changes</w:t>
+      </w:r>
+    </w:p>
+    <w:p>
+      <w:r>
+        <w:t>1. Database &amp; Backend: Khóa phòng (Lock Room)</w:t>
+      </w:r>
+    </w:p>
+    <w:p>
+      <w:r>
+        <w:t>[MODIFY] chat/models.py</w:t>
+      </w:r>
+    </w:p>
+    <w:p>
+      <w:pPr>
+        <w:numPr>
+          <w:ilvl w:val="0"/>
+          <w:numId w:val="48"/>
+        </w:numPr>
+      </w:pPr>
+      <w:r>
+        <w:t>Bổ sung trường is_locked = models.BooleanField(default=False) vào model Room.</w:t>
+      </w:r>
+    </w:p>
+    <w:p>
+      <w:r>
+        <w:t>[MODIFY] chat/views.py</w:t>
+      </w:r>
+    </w:p>
+    <w:p>
+      <w:pPr>
+        <w:numPr>
+          <w:ilvl w:val="0"/>
+          <w:numId w:val="49"/>
+        </w:numPr>
+      </w:pPr>
+      <w:r>
+        <w:t>Ở hàm join_room, kiểm tra nếu room.is_locked == True thì chặn user không cho vào.</w:t>
+      </w:r>
+    </w:p>
+    <w:p>
+      <w:pPr>
+        <w:numPr>
+          <w:ilvl w:val="0"/>
+          <w:numId w:val="49"/>
+        </w:numPr>
+      </w:pPr>
+      <w:r>
+        <w:t>Truyền biến is_host (boolean) vào room.html để UI biết ai là chủ phòng.</w:t>
+      </w:r>
+    </w:p>
+    <w:p>
+      <w:pPr>
+        <w:numPr>
+          <w:ilvl w:val="0"/>
+          <w:numId w:val="49"/>
+        </w:numPr>
+      </w:pPr>
+      <w:r>
+        <w:t>Thêm một API/View nhỏ hoặc xử lý qua WebSockets để Host bật/tắt is_locked. (Tôi sẽ xử lý qua API Fetch cho an toàn).</w:t>
+      </w:r>
+    </w:p>
+    <w:p>
+      <w:r>
+        <w:t>2. Host Controls (Quyền Quản trị)</w:t>
+      </w:r>
+    </w:p>
+    <w:p>
+      <w:r>
+        <w:lastRenderedPageBreak/>
+        <w:t>[MODIFY] chat/templates/chat/room.html</w:t>
+      </w:r>
+    </w:p>
+    <w:p>
+      <w:pPr>
+        <w:numPr>
+          <w:ilvl w:val="0"/>
+          <w:numId w:val="50"/>
+        </w:numPr>
+      </w:pPr>
+      <w:r>
+        <w:t>Thêm </w:t>
+      </w:r>
+      <w:r>
+        <w:rPr>
+          <w:b/>
+          <w:bCs/>
+        </w:rPr>
+        <w:t>Host Panel</w:t>
+      </w:r>
+      <w:r>
+        <w:t> (chỉ hiện nếu is_host == True).</w:t>
+      </w:r>
+    </w:p>
+    <w:p>
+      <w:pPr>
+        <w:numPr>
+          <w:ilvl w:val="0"/>
+          <w:numId w:val="50"/>
+        </w:numPr>
+      </w:pPr>
+      <w:r>
+        <w:rPr>
+          <w:b/>
+          <w:bCs/>
+        </w:rPr>
+        <w:t>Mute All</w:t>
+      </w:r>
+      <w:r>
+        <w:t>: Bắn gói tin WS action: 'mute_all'. Các client khác nhận được sẽ tự động ép tắt Microphone của họ.</w:t>
+      </w:r>
+    </w:p>
+    <w:p>
+      <w:pPr>
+        <w:numPr>
+          <w:ilvl w:val="0"/>
+          <w:numId w:val="50"/>
+        </w:numPr>
+      </w:pPr>
+      <w:r>
+        <w:rPr>
+          <w:b/>
+          <w:bCs/>
+        </w:rPr>
+        <w:t>Kick</w:t>
+      </w:r>
+      <w:r>
+        <w:t>: Thêm nút Kick (Dấu X đỏ) góc mỗi khung video của người khác (chỉ Host thấy). Khi bấm, bắn tin nhắn WS action: 'kick', target: 'username'. Người bị Kick sẽ bị văng ra trang chủ.</w:t>
+      </w:r>
+    </w:p>
+    <w:p>
+      <w:r>
+        <w:t>3. Raise Hand (Giơ tay)</w:t>
+      </w:r>
+    </w:p>
+    <w:p>
+      <w:r>
+        <w:t>[MODIFY] chat/templates/chat/room.html</w:t>
+      </w:r>
+    </w:p>
+    <w:p>
+      <w:pPr>
+        <w:numPr>
+          <w:ilvl w:val="0"/>
+          <w:numId w:val="51"/>
+        </w:numPr>
+      </w:pPr>
+      <w:r>
+        <w:t xml:space="preserve">Bổ sung nút "Giơ tay </w:t>
+      </w:r>
+      <w:r>
+        <w:rPr>
+          <w:rFonts w:ascii="Segoe UI Emoji" w:hAnsi="Segoe UI Emoji" w:cs="Segoe UI Emoji"/>
+        </w:rPr>
+        <w:t>✋</w:t>
+      </w:r>
+      <w:r>
+        <w:t>" vào Controls Bar.</w:t>
+      </w:r>
+    </w:p>
+    <w:p>
+      <w:pPr>
+        <w:numPr>
+          <w:ilvl w:val="0"/>
+          <w:numId w:val="51"/>
+        </w:numPr>
+      </w:pPr>
+      <w:r>
+        <w:t>Bắn gói tin WS action: 'raise_hand'.</w:t>
+      </w:r>
+    </w:p>
+    <w:p>
+      <w:pPr>
+        <w:numPr>
+          <w:ilvl w:val="0"/>
+          <w:numId w:val="51"/>
+        </w:numPr>
+      </w:pPr>
+      <w:r>
+        <w:t xml:space="preserve">Khi nhận tín hiệu, hiển thị icon </w:t>
+      </w:r>
+      <w:r>
+        <w:rPr>
+          <w:rFonts w:ascii="Segoe UI Emoji" w:hAnsi="Segoe UI Emoji" w:cs="Segoe UI Emoji"/>
+        </w:rPr>
+        <w:t>✋</w:t>
+      </w:r>
+      <w:r>
+        <w:t xml:space="preserve"> chớp tắt ở góc video người đó và phát âm thanh "Ting" (sử dụng âm thanh mã hóa base64 để không cần file tĩnh).</w:t>
+      </w:r>
+    </w:p>
+    <w:p>
+      <w:r>
+        <w:t>4. Background Blur &amp; Virtual Background</w:t>
+      </w:r>
+    </w:p>
+    <w:p>
+      <w:r>
+        <w:t>[MODIFY] chat/templates/chat/room.html</w:t>
+      </w:r>
+    </w:p>
+    <w:p>
+      <w:pPr>
+        <w:numPr>
+          <w:ilvl w:val="0"/>
+          <w:numId w:val="52"/>
+        </w:numPr>
+      </w:pPr>
+      <w:r>
+        <w:t>Nhúng CDN của @mediapipe/selfie_segmentation.</w:t>
+      </w:r>
+    </w:p>
+    <w:p>
+      <w:pPr>
+        <w:numPr>
+          <w:ilvl w:val="0"/>
+          <w:numId w:val="52"/>
+        </w:numPr>
+      </w:pPr>
+      <w:r>
+        <w:t>Thêm một &lt;canvas&gt; ẩn. Thay vì truyền thẳng getUserMedia vào WebRTC, ta vẽ Frame từ Camera lên Canvas, tách nền (Làm mờ bằng Filter Blur, hoặc chèn ảnh tĩnh phong cảnh Sakura). Sau đó dùng canvas.captureStream() để truyền cho WebRTC.</w:t>
+      </w:r>
+    </w:p>
+    <w:p>
+      <w:r>
+        <w:t>5. Pin Video &amp; Picture-in-Picture</w:t>
+      </w:r>
+    </w:p>
+    <w:p>
+      <w:r>
+        <w:t>[MODIFY] chat/templates/chat/room.html</w:t>
+      </w:r>
+    </w:p>
+    <w:p>
+      <w:pPr>
+        <w:numPr>
+          <w:ilvl w:val="0"/>
+          <w:numId w:val="53"/>
+        </w:numPr>
+      </w:pPr>
+      <w:r>
+        <w:rPr>
+          <w:b/>
+          <w:bCs/>
+        </w:rPr>
+        <w:t>Pin Video</w:t>
+      </w:r>
+      <w:r>
+        <w:t>: Bắt sự kiện ondblclick vào video. Thay đổi CSS để video đó có thuộc tính position: absolute, phóng to chiếm toàn màn hình, các video khác co lại thành hàng ngang phía dưới (như Google Meet).</w:t>
+      </w:r>
+    </w:p>
+    <w:p>
+      <w:pPr>
+        <w:numPr>
+          <w:ilvl w:val="0"/>
+          <w:numId w:val="53"/>
+        </w:numPr>
+      </w:pPr>
+      <w:r>
+        <w:rPr>
+          <w:b/>
+          <w:bCs/>
+        </w:rPr>
+        <w:t>PiP</w:t>
+      </w:r>
+      <w:r>
+        <w:t>: Thêm nút PiP trên mỗi video để gọi API video.requestPictureInPicture(), cho phép video trôi nổi khi bạn đổi Tab.</w:t>
+      </w:r>
+    </w:p>
+    <w:p>
+      <w:r>
+        <w:t>6. Record Session (Ghi hình)</w:t>
+      </w:r>
+    </w:p>
+    <w:p>
+      <w:r>
+        <w:lastRenderedPageBreak/>
+        <w:t>[MODIFY] chat/templates/chat/room.html</w:t>
+      </w:r>
+    </w:p>
+    <w:p>
+      <w:pPr>
+        <w:numPr>
+          <w:ilvl w:val="0"/>
+          <w:numId w:val="54"/>
+        </w:numPr>
+      </w:pPr>
+      <w:r>
+        <w:t xml:space="preserve">Nút "Ghi hình </w:t>
+      </w:r>
+      <w:r>
+        <w:rPr>
+          <w:rFonts w:ascii="Segoe UI Emoji" w:hAnsi="Segoe UI Emoji" w:cs="Segoe UI Emoji"/>
+        </w:rPr>
+        <w:t>🔴</w:t>
+      </w:r>
+      <w:r>
+        <w:t>".</w:t>
+      </w:r>
+    </w:p>
+    <w:p>
+      <w:pPr>
+        <w:numPr>
+          <w:ilvl w:val="0"/>
+          <w:numId w:val="54"/>
+        </w:numPr>
+      </w:pPr>
+      <w:r>
+        <w:t>Dùng getDisplayMedia yêu cầu quyền quay màn hình, bọc trong MediaRecorder, lưu các đoạn chunk dữ liệu vào mảng, và khi dừng lại sẽ tạo thẻ &lt;a&gt; để tự động download file.</w:t>
+      </w:r>
+    </w:p>
+    <w:p>
+      <w:pPr>
+        <w:rPr>
+          <w:b/>
+          <w:bCs/>
+        </w:rPr>
+      </w:pPr>
+      <w:r>
+        <w:rPr>
+          <w:b/>
+          <w:bCs/>
+        </w:rPr>
+        <w:t>Verification Plan</w:t>
+      </w:r>
+    </w:p>
+    <w:p>
+      <w:r>
+        <w:t>Đây là bản cập nhật lớn nên chúng ta sẽ làm cẩn thận và sau đó test bằng cách mở nhiều trình duyệt:</w:t>
+      </w:r>
+    </w:p>
+    <w:p>
+      <w:pPr>
+        <w:numPr>
+          <w:ilvl w:val="0"/>
+          <w:numId w:val="55"/>
+        </w:numPr>
+      </w:pPr>
+      <w:r>
+        <w:t>Thử chức năng Mute All và Kick.</w:t>
+      </w:r>
+    </w:p>
+    <w:p>
+      <w:pPr>
+        <w:numPr>
+          <w:ilvl w:val="0"/>
+          <w:numId w:val="55"/>
+        </w:numPr>
+      </w:pPr>
+      <w:r>
+        <w:t>Thử bật tính năng Background Blur xem AI có tách nền đúng không.</w:t>
+      </w:r>
+    </w:p>
+    <w:p>
+      <w:pPr>
+        <w:numPr>
+          <w:ilvl w:val="0"/>
+          <w:numId w:val="55"/>
+        </w:numPr>
+      </w:pPr>
+      <w:r>
+        <w:t>Test thử chức năng Record xem có xuất ra được file .webm không.</w:t>
+      </w:r>
+    </w:p>
     <w:p/>
     <w:sectPr>
       <w:pgSz w:w="12240" w:h="15840"/>
@@ -4297,6 +4777,155 @@
     </w:lvl>
   </w:abstractNum>
   <w:abstractNum w:abstractNumId="2" w15:restartNumberingAfterBreak="0">
+    <w:nsid w:val="10362A2F"/>
+    <w:multiLevelType w:val="multilevel"/>
+    <w:tmpl w:val="2CF63492"/>
+    <w:lvl w:ilvl="0">
+      <w:start w:val="1"/>
+      <w:numFmt w:val="bullet"/>
+      <w:lvlText w:val=""/>
+      <w:lvlJc w:val="left"/>
+      <w:pPr>
+        <w:tabs>
+          <w:tab w:val="num" w:pos="720"/>
+        </w:tabs>
+        <w:ind w:left="720" w:hanging="360"/>
+      </w:pPr>
+      <w:rPr>
+        <w:rFonts w:ascii="Symbol" w:hAnsi="Symbol" w:hint="default"/>
+        <w:sz w:val="20"/>
+      </w:rPr>
+    </w:lvl>
+    <w:lvl w:ilvl="1" w:tentative="1">
+      <w:start w:val="1"/>
+      <w:numFmt w:val="bullet"/>
+      <w:lvlText w:val=""/>
+      <w:lvlJc w:val="left"/>
+      <w:pPr>
+        <w:tabs>
+          <w:tab w:val="num" w:pos="1440"/>
+        </w:tabs>
+        <w:ind w:left="1440" w:hanging="360"/>
+      </w:pPr>
+      <w:rPr>
+        <w:rFonts w:ascii="Symbol" w:hAnsi="Symbol" w:hint="default"/>
+        <w:sz w:val="20"/>
+      </w:rPr>
+    </w:lvl>
+    <w:lvl w:ilvl="2" w:tentative="1">
+      <w:start w:val="1"/>
+      <w:numFmt w:val="bullet"/>
+      <w:lvlText w:val=""/>
+      <w:lvlJc w:val="left"/>
+      <w:pPr>
+        <w:tabs>
+          <w:tab w:val="num" w:pos="2160"/>
+        </w:tabs>
+        <w:ind w:left="2160" w:hanging="360"/>
+      </w:pPr>
+      <w:rPr>
+        <w:rFonts w:ascii="Symbol" w:hAnsi="Symbol" w:hint="default"/>
+        <w:sz w:val="20"/>
+      </w:rPr>
+    </w:lvl>
+    <w:lvl w:ilvl="3" w:tentative="1">
+      <w:start w:val="1"/>
+      <w:numFmt w:val="bullet"/>
+      <w:lvlText w:val=""/>
+      <w:lvlJc w:val="left"/>
+      <w:pPr>
+        <w:tabs>
+          <w:tab w:val="num" w:pos="2880"/>
+        </w:tabs>
+        <w:ind w:left="2880" w:hanging="360"/>
+      </w:pPr>
+      <w:rPr>
+        <w:rFonts w:ascii="Symbol" w:hAnsi="Symbol" w:hint="default"/>
+        <w:sz w:val="20"/>
+      </w:rPr>
+    </w:lvl>
+    <w:lvl w:ilvl="4" w:tentative="1">
+      <w:start w:val="1"/>
+      <w:numFmt w:val="bullet"/>
+      <w:lvlText w:val=""/>
+      <w:lvlJc w:val="left"/>
+      <w:pPr>
+        <w:tabs>
+          <w:tab w:val="num" w:pos="3600"/>
+        </w:tabs>
+        <w:ind w:left="3600" w:hanging="360"/>
+      </w:pPr>
+      <w:rPr>
+        <w:rFonts w:ascii="Symbol" w:hAnsi="Symbol" w:hint="default"/>
+        <w:sz w:val="20"/>
+      </w:rPr>
+    </w:lvl>
+    <w:lvl w:ilvl="5" w:tentative="1">
+      <w:start w:val="1"/>
+      <w:numFmt w:val="bullet"/>
+      <w:lvlText w:val=""/>
+      <w:lvlJc w:val="left"/>
+      <w:pPr>
+        <w:tabs>
+          <w:tab w:val="num" w:pos="4320"/>
+        </w:tabs>
+        <w:ind w:left="4320" w:hanging="360"/>
+      </w:pPr>
+      <w:rPr>
+        <w:rFonts w:ascii="Symbol" w:hAnsi="Symbol" w:hint="default"/>
+        <w:sz w:val="20"/>
+      </w:rPr>
+    </w:lvl>
+    <w:lvl w:ilvl="6" w:tentative="1">
+      <w:start w:val="1"/>
+      <w:numFmt w:val="bullet"/>
+      <w:lvlText w:val=""/>
+      <w:lvlJc w:val="left"/>
+      <w:pPr>
+        <w:tabs>
+          <w:tab w:val="num" w:pos="5040"/>
+        </w:tabs>
+        <w:ind w:left="5040" w:hanging="360"/>
+      </w:pPr>
+      <w:rPr>
+        <w:rFonts w:ascii="Symbol" w:hAnsi="Symbol" w:hint="default"/>
+        <w:sz w:val="20"/>
+      </w:rPr>
+    </w:lvl>
+    <w:lvl w:ilvl="7" w:tentative="1">
+      <w:start w:val="1"/>
+      <w:numFmt w:val="bullet"/>
+      <w:lvlText w:val=""/>
+      <w:lvlJc w:val="left"/>
+      <w:pPr>
+        <w:tabs>
+          <w:tab w:val="num" w:pos="5760"/>
+        </w:tabs>
+        <w:ind w:left="5760" w:hanging="360"/>
+      </w:pPr>
+      <w:rPr>
+        <w:rFonts w:ascii="Symbol" w:hAnsi="Symbol" w:hint="default"/>
+        <w:sz w:val="20"/>
+      </w:rPr>
+    </w:lvl>
+    <w:lvl w:ilvl="8" w:tentative="1">
+      <w:start w:val="1"/>
+      <w:numFmt w:val="bullet"/>
+      <w:lvlText w:val=""/>
+      <w:lvlJc w:val="left"/>
+      <w:pPr>
+        <w:tabs>
+          <w:tab w:val="num" w:pos="6480"/>
+        </w:tabs>
+        <w:ind w:left="6480" w:hanging="360"/>
+      </w:pPr>
+      <w:rPr>
+        <w:rFonts w:ascii="Symbol" w:hAnsi="Symbol" w:hint="default"/>
+        <w:sz w:val="20"/>
+      </w:rPr>
+    </w:lvl>
+  </w:abstractNum>
+  <w:abstractNum w:abstractNumId="3" w15:restartNumberingAfterBreak="0">
     <w:nsid w:val="10B47CC7"/>
     <w:multiLevelType w:val="multilevel"/>
     <w:tmpl w:val="4B323054"/>
@@ -4445,7 +5074,7 @@
       </w:rPr>
     </w:lvl>
   </w:abstractNum>
-  <w:abstractNum w:abstractNumId="3" w15:restartNumberingAfterBreak="0">
+  <w:abstractNum w:abstractNumId="4" w15:restartNumberingAfterBreak="0">
     <w:nsid w:val="10F656CF"/>
     <w:multiLevelType w:val="multilevel"/>
     <w:tmpl w:val="36DC22F8"/>
@@ -4594,7 +5223,7 @@
       </w:rPr>
     </w:lvl>
   </w:abstractNum>
-  <w:abstractNum w:abstractNumId="4" w15:restartNumberingAfterBreak="0">
+  <w:abstractNum w:abstractNumId="5" w15:restartNumberingAfterBreak="0">
     <w:nsid w:val="12700AC3"/>
     <w:multiLevelType w:val="multilevel"/>
     <w:tmpl w:val="221AA528"/>
@@ -4743,7 +5372,7 @@
       </w:rPr>
     </w:lvl>
   </w:abstractNum>
-  <w:abstractNum w:abstractNumId="5" w15:restartNumberingAfterBreak="0">
+  <w:abstractNum w:abstractNumId="6" w15:restartNumberingAfterBreak="0">
     <w:nsid w:val="14135E7D"/>
     <w:multiLevelType w:val="multilevel"/>
     <w:tmpl w:val="4000983E"/>
@@ -4892,7 +5521,7 @@
       </w:rPr>
     </w:lvl>
   </w:abstractNum>
-  <w:abstractNum w:abstractNumId="6" w15:restartNumberingAfterBreak="0">
+  <w:abstractNum w:abstractNumId="7" w15:restartNumberingAfterBreak="0">
     <w:nsid w:val="15C439B5"/>
     <w:multiLevelType w:val="multilevel"/>
     <w:tmpl w:val="46826754"/>
@@ -5041,7 +5670,156 @@
       </w:rPr>
     </w:lvl>
   </w:abstractNum>
-  <w:abstractNum w:abstractNumId="7" w15:restartNumberingAfterBreak="0">
+  <w:abstractNum w:abstractNumId="8" w15:restartNumberingAfterBreak="0">
+    <w:nsid w:val="190E622D"/>
+    <w:multiLevelType w:val="multilevel"/>
+    <w:tmpl w:val="21FAD250"/>
+    <w:lvl w:ilvl="0">
+      <w:start w:val="1"/>
+      <w:numFmt w:val="bullet"/>
+      <w:lvlText w:val=""/>
+      <w:lvlJc w:val="left"/>
+      <w:pPr>
+        <w:tabs>
+          <w:tab w:val="num" w:pos="720"/>
+        </w:tabs>
+        <w:ind w:left="720" w:hanging="360"/>
+      </w:pPr>
+      <w:rPr>
+        <w:rFonts w:ascii="Symbol" w:hAnsi="Symbol" w:hint="default"/>
+        <w:sz w:val="20"/>
+      </w:rPr>
+    </w:lvl>
+    <w:lvl w:ilvl="1" w:tentative="1">
+      <w:start w:val="1"/>
+      <w:numFmt w:val="bullet"/>
+      <w:lvlText w:val=""/>
+      <w:lvlJc w:val="left"/>
+      <w:pPr>
+        <w:tabs>
+          <w:tab w:val="num" w:pos="1440"/>
+        </w:tabs>
+        <w:ind w:left="1440" w:hanging="360"/>
+      </w:pPr>
+      <w:rPr>
+        <w:rFonts w:ascii="Symbol" w:hAnsi="Symbol" w:hint="default"/>
+        <w:sz w:val="20"/>
+      </w:rPr>
+    </w:lvl>
+    <w:lvl w:ilvl="2" w:tentative="1">
+      <w:start w:val="1"/>
+      <w:numFmt w:val="bullet"/>
+      <w:lvlText w:val=""/>
+      <w:lvlJc w:val="left"/>
+      <w:pPr>
+        <w:tabs>
+          <w:tab w:val="num" w:pos="2160"/>
+        </w:tabs>
+        <w:ind w:left="2160" w:hanging="360"/>
+      </w:pPr>
+      <w:rPr>
+        <w:rFonts w:ascii="Symbol" w:hAnsi="Symbol" w:hint="default"/>
+        <w:sz w:val="20"/>
+      </w:rPr>
+    </w:lvl>
+    <w:lvl w:ilvl="3" w:tentative="1">
+      <w:start w:val="1"/>
+      <w:numFmt w:val="bullet"/>
+      <w:lvlText w:val=""/>
+      <w:lvlJc w:val="left"/>
+      <w:pPr>
+        <w:tabs>
+          <w:tab w:val="num" w:pos="2880"/>
+        </w:tabs>
+        <w:ind w:left="2880" w:hanging="360"/>
+      </w:pPr>
+      <w:rPr>
+        <w:rFonts w:ascii="Symbol" w:hAnsi="Symbol" w:hint="default"/>
+        <w:sz w:val="20"/>
+      </w:rPr>
+    </w:lvl>
+    <w:lvl w:ilvl="4" w:tentative="1">
+      <w:start w:val="1"/>
+      <w:numFmt w:val="bullet"/>
+      <w:lvlText w:val=""/>
+      <w:lvlJc w:val="left"/>
+      <w:pPr>
+        <w:tabs>
+          <w:tab w:val="num" w:pos="3600"/>
+        </w:tabs>
+        <w:ind w:left="3600" w:hanging="360"/>
+      </w:pPr>
+      <w:rPr>
+        <w:rFonts w:ascii="Symbol" w:hAnsi="Symbol" w:hint="default"/>
+        <w:sz w:val="20"/>
+      </w:rPr>
+    </w:lvl>
+    <w:lvl w:ilvl="5" w:tentative="1">
+      <w:start w:val="1"/>
+      <w:numFmt w:val="bullet"/>
+      <w:lvlText w:val=""/>
+      <w:lvlJc w:val="left"/>
+      <w:pPr>
+        <w:tabs>
+          <w:tab w:val="num" w:pos="4320"/>
+        </w:tabs>
+        <w:ind w:left="4320" w:hanging="360"/>
+      </w:pPr>
+      <w:rPr>
+        <w:rFonts w:ascii="Symbol" w:hAnsi="Symbol" w:hint="default"/>
+        <w:sz w:val="20"/>
+      </w:rPr>
+    </w:lvl>
+    <w:lvl w:ilvl="6" w:tentative="1">
+      <w:start w:val="1"/>
+      <w:numFmt w:val="bullet"/>
+      <w:lvlText w:val=""/>
+      <w:lvlJc w:val="left"/>
+      <w:pPr>
+        <w:tabs>
+          <w:tab w:val="num" w:pos="5040"/>
+        </w:tabs>
+        <w:ind w:left="5040" w:hanging="360"/>
+      </w:pPr>
+      <w:rPr>
+        <w:rFonts w:ascii="Symbol" w:hAnsi="Symbol" w:hint="default"/>
+        <w:sz w:val="20"/>
+      </w:rPr>
+    </w:lvl>
+    <w:lvl w:ilvl="7" w:tentative="1">
+      <w:start w:val="1"/>
+      <w:numFmt w:val="bullet"/>
+      <w:lvlText w:val=""/>
+      <w:lvlJc w:val="left"/>
+      <w:pPr>
+        <w:tabs>
+          <w:tab w:val="num" w:pos="5760"/>
+        </w:tabs>
+        <w:ind w:left="5760" w:hanging="360"/>
+      </w:pPr>
+      <w:rPr>
+        <w:rFonts w:ascii="Symbol" w:hAnsi="Symbol" w:hint="default"/>
+        <w:sz w:val="20"/>
+      </w:rPr>
+    </w:lvl>
+    <w:lvl w:ilvl="8" w:tentative="1">
+      <w:start w:val="1"/>
+      <w:numFmt w:val="bullet"/>
+      <w:lvlText w:val=""/>
+      <w:lvlJc w:val="left"/>
+      <w:pPr>
+        <w:tabs>
+          <w:tab w:val="num" w:pos="6480"/>
+        </w:tabs>
+        <w:ind w:left="6480" w:hanging="360"/>
+      </w:pPr>
+      <w:rPr>
+        <w:rFonts w:ascii="Symbol" w:hAnsi="Symbol" w:hint="default"/>
+        <w:sz w:val="20"/>
+      </w:rPr>
+    </w:lvl>
+  </w:abstractNum>
+  <w:abstractNum w:abstractNumId="9" w15:restartNumberingAfterBreak="0">
     <w:nsid w:val="19E77330"/>
     <w:multiLevelType w:val="multilevel"/>
     <w:tmpl w:val="ABE2739E"/>
@@ -5190,7 +5968,7 @@
       </w:rPr>
     </w:lvl>
   </w:abstractNum>
-  <w:abstractNum w:abstractNumId="8" w15:restartNumberingAfterBreak="0">
+  <w:abstractNum w:abstractNumId="10" w15:restartNumberingAfterBreak="0">
     <w:nsid w:val="1AEB50FE"/>
     <w:multiLevelType w:val="multilevel"/>
     <w:tmpl w:val="D89C8DD4"/>
@@ -5339,7 +6117,7 @@
       </w:rPr>
     </w:lvl>
   </w:abstractNum>
-  <w:abstractNum w:abstractNumId="9" w15:restartNumberingAfterBreak="0">
+  <w:abstractNum w:abstractNumId="11" w15:restartNumberingAfterBreak="0">
     <w:nsid w:val="1C54798F"/>
     <w:multiLevelType w:val="multilevel"/>
     <w:tmpl w:val="8612E53A"/>
@@ -5488,7 +6266,7 @@
       </w:rPr>
     </w:lvl>
   </w:abstractNum>
-  <w:abstractNum w:abstractNumId="10" w15:restartNumberingAfterBreak="0">
+  <w:abstractNum w:abstractNumId="12" w15:restartNumberingAfterBreak="0">
     <w:nsid w:val="1E58543F"/>
     <w:multiLevelType w:val="multilevel"/>
     <w:tmpl w:val="83EEC14E"/>
@@ -5637,7 +6415,7 @@
       </w:rPr>
     </w:lvl>
   </w:abstractNum>
-  <w:abstractNum w:abstractNumId="11" w15:restartNumberingAfterBreak="0">
+  <w:abstractNum w:abstractNumId="13" w15:restartNumberingAfterBreak="0">
     <w:nsid w:val="1F2637B1"/>
     <w:multiLevelType w:val="multilevel"/>
     <w:tmpl w:val="B6C2A822"/>
@@ -5752,7 +6530,7 @@
       </w:rPr>
     </w:lvl>
   </w:abstractNum>
-  <w:abstractNum w:abstractNumId="12" w15:restartNumberingAfterBreak="0">
+  <w:abstractNum w:abstractNumId="14" w15:restartNumberingAfterBreak="0">
     <w:nsid w:val="22432887"/>
     <w:multiLevelType w:val="multilevel"/>
     <w:tmpl w:val="09100B40"/>
@@ -5901,7 +6679,7 @@
       </w:rPr>
     </w:lvl>
   </w:abstractNum>
-  <w:abstractNum w:abstractNumId="13" w15:restartNumberingAfterBreak="0">
+  <w:abstractNum w:abstractNumId="15" w15:restartNumberingAfterBreak="0">
     <w:nsid w:val="249C2B42"/>
     <w:multiLevelType w:val="multilevel"/>
     <w:tmpl w:val="97D8D996"/>
@@ -6050,7 +6828,156 @@
       </w:rPr>
     </w:lvl>
   </w:abstractNum>
-  <w:abstractNum w:abstractNumId="14" w15:restartNumberingAfterBreak="0">
+  <w:abstractNum w:abstractNumId="16" w15:restartNumberingAfterBreak="0">
+    <w:nsid w:val="264C6D23"/>
+    <w:multiLevelType w:val="multilevel"/>
+    <w:tmpl w:val="498E5436"/>
+    <w:lvl w:ilvl="0">
+      <w:start w:val="1"/>
+      <w:numFmt w:val="bullet"/>
+      <w:lvlText w:val=""/>
+      <w:lvlJc w:val="left"/>
+      <w:pPr>
+        <w:tabs>
+          <w:tab w:val="num" w:pos="720"/>
+        </w:tabs>
+        <w:ind w:left="720" w:hanging="360"/>
+      </w:pPr>
+      <w:rPr>
+        <w:rFonts w:ascii="Symbol" w:hAnsi="Symbol" w:hint="default"/>
+        <w:sz w:val="20"/>
+      </w:rPr>
+    </w:lvl>
+    <w:lvl w:ilvl="1" w:tentative="1">
+      <w:start w:val="1"/>
+      <w:numFmt w:val="bullet"/>
+      <w:lvlText w:val=""/>
+      <w:lvlJc w:val="left"/>
+      <w:pPr>
+        <w:tabs>
+          <w:tab w:val="num" w:pos="1440"/>
+        </w:tabs>
+        <w:ind w:left="1440" w:hanging="360"/>
+      </w:pPr>
+      <w:rPr>
+        <w:rFonts w:ascii="Symbol" w:hAnsi="Symbol" w:hint="default"/>
+        <w:sz w:val="20"/>
+      </w:rPr>
+    </w:lvl>
+    <w:lvl w:ilvl="2" w:tentative="1">
+      <w:start w:val="1"/>
+      <w:numFmt w:val="bullet"/>
+      <w:lvlText w:val=""/>
+      <w:lvlJc w:val="left"/>
+      <w:pPr>
+        <w:tabs>
+          <w:tab w:val="num" w:pos="2160"/>
+        </w:tabs>
+        <w:ind w:left="2160" w:hanging="360"/>
+      </w:pPr>
+      <w:rPr>
+        <w:rFonts w:ascii="Symbol" w:hAnsi="Symbol" w:hint="default"/>
+        <w:sz w:val="20"/>
+      </w:rPr>
+    </w:lvl>
+    <w:lvl w:ilvl="3" w:tentative="1">
+      <w:start w:val="1"/>
+      <w:numFmt w:val="bullet"/>
+      <w:lvlText w:val=""/>
+      <w:lvlJc w:val="left"/>
+      <w:pPr>
+        <w:tabs>
+          <w:tab w:val="num" w:pos="2880"/>
+        </w:tabs>
+        <w:ind w:left="2880" w:hanging="360"/>
+      </w:pPr>
+      <w:rPr>
+        <w:rFonts w:ascii="Symbol" w:hAnsi="Symbol" w:hint="default"/>
+        <w:sz w:val="20"/>
+      </w:rPr>
+    </w:lvl>
+    <w:lvl w:ilvl="4" w:tentative="1">
+      <w:start w:val="1"/>
+      <w:numFmt w:val="bullet"/>
+      <w:lvlText w:val=""/>
+      <w:lvlJc w:val="left"/>
+      <w:pPr>
+        <w:tabs>
+          <w:tab w:val="num" w:pos="3600"/>
+        </w:tabs>
+        <w:ind w:left="3600" w:hanging="360"/>
+      </w:pPr>
+      <w:rPr>
+        <w:rFonts w:ascii="Symbol" w:hAnsi="Symbol" w:hint="default"/>
+        <w:sz w:val="20"/>
+      </w:rPr>
+    </w:lvl>
+    <w:lvl w:ilvl="5" w:tentative="1">
+      <w:start w:val="1"/>
+      <w:numFmt w:val="bullet"/>
+      <w:lvlText w:val=""/>
+      <w:lvlJc w:val="left"/>
+      <w:pPr>
+        <w:tabs>
+          <w:tab w:val="num" w:pos="4320"/>
+        </w:tabs>
+        <w:ind w:left="4320" w:hanging="360"/>
+      </w:pPr>
+      <w:rPr>
+        <w:rFonts w:ascii="Symbol" w:hAnsi="Symbol" w:hint="default"/>
+        <w:sz w:val="20"/>
+      </w:rPr>
+    </w:lvl>
+    <w:lvl w:ilvl="6" w:tentative="1">
+      <w:start w:val="1"/>
+      <w:numFmt w:val="bullet"/>
+      <w:lvlText w:val=""/>
+      <w:lvlJc w:val="left"/>
+      <w:pPr>
+        <w:tabs>
+          <w:tab w:val="num" w:pos="5040"/>
+        </w:tabs>
+        <w:ind w:left="5040" w:hanging="360"/>
+      </w:pPr>
+      <w:rPr>
+        <w:rFonts w:ascii="Symbol" w:hAnsi="Symbol" w:hint="default"/>
+        <w:sz w:val="20"/>
+      </w:rPr>
+    </w:lvl>
+    <w:lvl w:ilvl="7" w:tentative="1">
+      <w:start w:val="1"/>
+      <w:numFmt w:val="bullet"/>
+      <w:lvlText w:val=""/>
+      <w:lvlJc w:val="left"/>
+      <w:pPr>
+        <w:tabs>
+          <w:tab w:val="num" w:pos="5760"/>
+        </w:tabs>
+        <w:ind w:left="5760" w:hanging="360"/>
+      </w:pPr>
+      <w:rPr>
+        <w:rFonts w:ascii="Symbol" w:hAnsi="Symbol" w:hint="default"/>
+        <w:sz w:val="20"/>
+      </w:rPr>
+    </w:lvl>
+    <w:lvl w:ilvl="8" w:tentative="1">
+      <w:start w:val="1"/>
+      <w:numFmt w:val="bullet"/>
+      <w:lvlText w:val=""/>
+      <w:lvlJc w:val="left"/>
+      <w:pPr>
+        <w:tabs>
+          <w:tab w:val="num" w:pos="6480"/>
+        </w:tabs>
+        <w:ind w:left="6480" w:hanging="360"/>
+      </w:pPr>
+      <w:rPr>
+        <w:rFonts w:ascii="Symbol" w:hAnsi="Symbol" w:hint="default"/>
+        <w:sz w:val="20"/>
+      </w:rPr>
+    </w:lvl>
+  </w:abstractNum>
+  <w:abstractNum w:abstractNumId="17" w15:restartNumberingAfterBreak="0">
     <w:nsid w:val="273B3316"/>
     <w:multiLevelType w:val="multilevel"/>
     <w:tmpl w:val="23DE7E00"/>
@@ -6199,7 +7126,7 @@
       </w:rPr>
     </w:lvl>
   </w:abstractNum>
-  <w:abstractNum w:abstractNumId="15" w15:restartNumberingAfterBreak="0">
+  <w:abstractNum w:abstractNumId="18" w15:restartNumberingAfterBreak="0">
     <w:nsid w:val="28E33A62"/>
     <w:multiLevelType w:val="multilevel"/>
     <w:tmpl w:val="EE446BCE"/>
@@ -6348,7 +7275,7 @@
       </w:rPr>
     </w:lvl>
   </w:abstractNum>
-  <w:abstractNum w:abstractNumId="16" w15:restartNumberingAfterBreak="0">
+  <w:abstractNum w:abstractNumId="19" w15:restartNumberingAfterBreak="0">
     <w:nsid w:val="29E614D1"/>
     <w:multiLevelType w:val="multilevel"/>
     <w:tmpl w:val="8398CCF0"/>
@@ -6497,7 +7424,156 @@
       </w:rPr>
     </w:lvl>
   </w:abstractNum>
-  <w:abstractNum w:abstractNumId="17" w15:restartNumberingAfterBreak="0">
+  <w:abstractNum w:abstractNumId="20" w15:restartNumberingAfterBreak="0">
+    <w:nsid w:val="29F0233E"/>
+    <w:multiLevelType w:val="multilevel"/>
+    <w:tmpl w:val="733C2876"/>
+    <w:lvl w:ilvl="0">
+      <w:start w:val="1"/>
+      <w:numFmt w:val="bullet"/>
+      <w:lvlText w:val=""/>
+      <w:lvlJc w:val="left"/>
+      <w:pPr>
+        <w:tabs>
+          <w:tab w:val="num" w:pos="720"/>
+        </w:tabs>
+        <w:ind w:left="720" w:hanging="360"/>
+      </w:pPr>
+      <w:rPr>
+        <w:rFonts w:ascii="Symbol" w:hAnsi="Symbol" w:hint="default"/>
+        <w:sz w:val="20"/>
+      </w:rPr>
+    </w:lvl>
+    <w:lvl w:ilvl="1" w:tentative="1">
+      <w:start w:val="1"/>
+      <w:numFmt w:val="bullet"/>
+      <w:lvlText w:val=""/>
+      <w:lvlJc w:val="left"/>
+      <w:pPr>
+        <w:tabs>
+          <w:tab w:val="num" w:pos="1440"/>
+        </w:tabs>
+        <w:ind w:left="1440" w:hanging="360"/>
+      </w:pPr>
+      <w:rPr>
+        <w:rFonts w:ascii="Symbol" w:hAnsi="Symbol" w:hint="default"/>
+        <w:sz w:val="20"/>
+      </w:rPr>
+    </w:lvl>
+    <w:lvl w:ilvl="2" w:tentative="1">
+      <w:start w:val="1"/>
+      <w:numFmt w:val="bullet"/>
+      <w:lvlText w:val=""/>
+      <w:lvlJc w:val="left"/>
+      <w:pPr>
+        <w:tabs>
+          <w:tab w:val="num" w:pos="2160"/>
+        </w:tabs>
+        <w:ind w:left="2160" w:hanging="360"/>
+      </w:pPr>
+      <w:rPr>
+        <w:rFonts w:ascii="Symbol" w:hAnsi="Symbol" w:hint="default"/>
+        <w:sz w:val="20"/>
+      </w:rPr>
+    </w:lvl>
+    <w:lvl w:ilvl="3" w:tentative="1">
+      <w:start w:val="1"/>
+      <w:numFmt w:val="bullet"/>
+      <w:lvlText w:val=""/>
+      <w:lvlJc w:val="left"/>
+      <w:pPr>
+        <w:tabs>
+          <w:tab w:val="num" w:pos="2880"/>
+        </w:tabs>
+        <w:ind w:left="2880" w:hanging="360"/>
+      </w:pPr>
+      <w:rPr>
+        <w:rFonts w:ascii="Symbol" w:hAnsi="Symbol" w:hint="default"/>
+        <w:sz w:val="20"/>
+      </w:rPr>
+    </w:lvl>
+    <w:lvl w:ilvl="4" w:tentative="1">
+      <w:start w:val="1"/>
+      <w:numFmt w:val="bullet"/>
+      <w:lvlText w:val=""/>
+      <w:lvlJc w:val="left"/>
+      <w:pPr>
+        <w:tabs>
+          <w:tab w:val="num" w:pos="3600"/>
+        </w:tabs>
+        <w:ind w:left="3600" w:hanging="360"/>
+      </w:pPr>
+      <w:rPr>
+        <w:rFonts w:ascii="Symbol" w:hAnsi="Symbol" w:hint="default"/>
+        <w:sz w:val="20"/>
+      </w:rPr>
+    </w:lvl>
+    <w:lvl w:ilvl="5" w:tentative="1">
+      <w:start w:val="1"/>
+      <w:numFmt w:val="bullet"/>
+      <w:lvlText w:val=""/>
+      <w:lvlJc w:val="left"/>
+      <w:pPr>
+        <w:tabs>
+          <w:tab w:val="num" w:pos="4320"/>
+        </w:tabs>
+        <w:ind w:left="4320" w:hanging="360"/>
+      </w:pPr>
+      <w:rPr>
+        <w:rFonts w:ascii="Symbol" w:hAnsi="Symbol" w:hint="default"/>
+        <w:sz w:val="20"/>
+      </w:rPr>
+    </w:lvl>
+    <w:lvl w:ilvl="6" w:tentative="1">
+      <w:start w:val="1"/>
+      <w:numFmt w:val="bullet"/>
+      <w:lvlText w:val=""/>
+      <w:lvlJc w:val="left"/>
+      <w:pPr>
+        <w:tabs>
+          <w:tab w:val="num" w:pos="5040"/>
+        </w:tabs>
+        <w:ind w:left="5040" w:hanging="360"/>
+      </w:pPr>
+      <w:rPr>
+        <w:rFonts w:ascii="Symbol" w:hAnsi="Symbol" w:hint="default"/>
+        <w:sz w:val="20"/>
+      </w:rPr>
+    </w:lvl>
+    <w:lvl w:ilvl="7" w:tentative="1">
+      <w:start w:val="1"/>
+      <w:numFmt w:val="bullet"/>
+      <w:lvlText w:val=""/>
+      <w:lvlJc w:val="left"/>
+      <w:pPr>
+        <w:tabs>
+          <w:tab w:val="num" w:pos="5760"/>
+        </w:tabs>
+        <w:ind w:left="5760" w:hanging="360"/>
+      </w:pPr>
+      <w:rPr>
+        <w:rFonts w:ascii="Symbol" w:hAnsi="Symbol" w:hint="default"/>
+        <w:sz w:val="20"/>
+      </w:rPr>
+    </w:lvl>
+    <w:lvl w:ilvl="8" w:tentative="1">
+      <w:start w:val="1"/>
+      <w:numFmt w:val="bullet"/>
+      <w:lvlText w:val=""/>
+      <w:lvlJc w:val="left"/>
+      <w:pPr>
+        <w:tabs>
+          <w:tab w:val="num" w:pos="6480"/>
+        </w:tabs>
+        <w:ind w:left="6480" w:hanging="360"/>
+      </w:pPr>
+      <w:rPr>
+        <w:rFonts w:ascii="Symbol" w:hAnsi="Symbol" w:hint="default"/>
+        <w:sz w:val="20"/>
+      </w:rPr>
+    </w:lvl>
+  </w:abstractNum>
+  <w:abstractNum w:abstractNumId="21" w15:restartNumberingAfterBreak="0">
     <w:nsid w:val="2A814324"/>
     <w:multiLevelType w:val="multilevel"/>
     <w:tmpl w:val="0262AF82"/>
@@ -6646,7 +7722,7 @@
       </w:rPr>
     </w:lvl>
   </w:abstractNum>
-  <w:abstractNum w:abstractNumId="18" w15:restartNumberingAfterBreak="0">
+  <w:abstractNum w:abstractNumId="22" w15:restartNumberingAfterBreak="0">
     <w:nsid w:val="2C73674C"/>
     <w:multiLevelType w:val="multilevel"/>
     <w:tmpl w:val="30DE1DFE"/>
@@ -6759,7 +7835,156 @@
       </w:pPr>
     </w:lvl>
   </w:abstractNum>
-  <w:abstractNum w:abstractNumId="19" w15:restartNumberingAfterBreak="0">
+  <w:abstractNum w:abstractNumId="23" w15:restartNumberingAfterBreak="0">
+    <w:nsid w:val="2E5B1560"/>
+    <w:multiLevelType w:val="multilevel"/>
+    <w:tmpl w:val="96641D5C"/>
+    <w:lvl w:ilvl="0">
+      <w:start w:val="1"/>
+      <w:numFmt w:val="bullet"/>
+      <w:lvlText w:val=""/>
+      <w:lvlJc w:val="left"/>
+      <w:pPr>
+        <w:tabs>
+          <w:tab w:val="num" w:pos="720"/>
+        </w:tabs>
+        <w:ind w:left="720" w:hanging="360"/>
+      </w:pPr>
+      <w:rPr>
+        <w:rFonts w:ascii="Symbol" w:hAnsi="Symbol" w:hint="default"/>
+        <w:sz w:val="20"/>
+      </w:rPr>
+    </w:lvl>
+    <w:lvl w:ilvl="1" w:tentative="1">
+      <w:start w:val="1"/>
+      <w:numFmt w:val="bullet"/>
+      <w:lvlText w:val=""/>
+      <w:lvlJc w:val="left"/>
+      <w:pPr>
+        <w:tabs>
+          <w:tab w:val="num" w:pos="1440"/>
+        </w:tabs>
+        <w:ind w:left="1440" w:hanging="360"/>
+      </w:pPr>
+      <w:rPr>
+        <w:rFonts w:ascii="Symbol" w:hAnsi="Symbol" w:hint="default"/>
+        <w:sz w:val="20"/>
+      </w:rPr>
+    </w:lvl>
+    <w:lvl w:ilvl="2" w:tentative="1">
+      <w:start w:val="1"/>
+      <w:numFmt w:val="bullet"/>
+      <w:lvlText w:val=""/>
+      <w:lvlJc w:val="left"/>
+      <w:pPr>
+        <w:tabs>
+          <w:tab w:val="num" w:pos="2160"/>
+        </w:tabs>
+        <w:ind w:left="2160" w:hanging="360"/>
+      </w:pPr>
+      <w:rPr>
+        <w:rFonts w:ascii="Symbol" w:hAnsi="Symbol" w:hint="default"/>
+        <w:sz w:val="20"/>
+      </w:rPr>
+    </w:lvl>
+    <w:lvl w:ilvl="3" w:tentative="1">
+      <w:start w:val="1"/>
+      <w:numFmt w:val="bullet"/>
+      <w:lvlText w:val=""/>
+      <w:lvlJc w:val="left"/>
+      <w:pPr>
+        <w:tabs>
+          <w:tab w:val="num" w:pos="2880"/>
+        </w:tabs>
+        <w:ind w:left="2880" w:hanging="360"/>
+      </w:pPr>
+      <w:rPr>
+        <w:rFonts w:ascii="Symbol" w:hAnsi="Symbol" w:hint="default"/>
+        <w:sz w:val="20"/>
+      </w:rPr>
+    </w:lvl>
+    <w:lvl w:ilvl="4" w:tentative="1">
+      <w:start w:val="1"/>
+      <w:numFmt w:val="bullet"/>
+      <w:lvlText w:val=""/>
+      <w:lvlJc w:val="left"/>
+      <w:pPr>
+        <w:tabs>
+          <w:tab w:val="num" w:pos="3600"/>
+        </w:tabs>
+        <w:ind w:left="3600" w:hanging="360"/>
+      </w:pPr>
+      <w:rPr>
+        <w:rFonts w:ascii="Symbol" w:hAnsi="Symbol" w:hint="default"/>
+        <w:sz w:val="20"/>
+      </w:rPr>
+    </w:lvl>
+    <w:lvl w:ilvl="5" w:tentative="1">
+      <w:start w:val="1"/>
+      <w:numFmt w:val="bullet"/>
+      <w:lvlText w:val=""/>
+      <w:lvlJc w:val="left"/>
+      <w:pPr>
+        <w:tabs>
+          <w:tab w:val="num" w:pos="4320"/>
+        </w:tabs>
+        <w:ind w:left="4320" w:hanging="360"/>
+      </w:pPr>
+      <w:rPr>
+        <w:rFonts w:ascii="Symbol" w:hAnsi="Symbol" w:hint="default"/>
+        <w:sz w:val="20"/>
+      </w:rPr>
+    </w:lvl>
+    <w:lvl w:ilvl="6" w:tentative="1">
+      <w:start w:val="1"/>
+      <w:numFmt w:val="bullet"/>
+      <w:lvlText w:val=""/>
+      <w:lvlJc w:val="left"/>
+      <w:pPr>
+        <w:tabs>
+          <w:tab w:val="num" w:pos="5040"/>
+        </w:tabs>
+        <w:ind w:left="5040" w:hanging="360"/>
+      </w:pPr>
+      <w:rPr>
+        <w:rFonts w:ascii="Symbol" w:hAnsi="Symbol" w:hint="default"/>
+        <w:sz w:val="20"/>
+      </w:rPr>
+    </w:lvl>
+    <w:lvl w:ilvl="7" w:tentative="1">
+      <w:start w:val="1"/>
+      <w:numFmt w:val="bullet"/>
+      <w:lvlText w:val=""/>
+      <w:lvlJc w:val="left"/>
+      <w:pPr>
+        <w:tabs>
+          <w:tab w:val="num" w:pos="5760"/>
+        </w:tabs>
+        <w:ind w:left="5760" w:hanging="360"/>
+      </w:pPr>
+      <w:rPr>
+        <w:rFonts w:ascii="Symbol" w:hAnsi="Symbol" w:hint="default"/>
+        <w:sz w:val="20"/>
+      </w:rPr>
+    </w:lvl>
+    <w:lvl w:ilvl="8" w:tentative="1">
+      <w:start w:val="1"/>
+      <w:numFmt w:val="bullet"/>
+      <w:lvlText w:val=""/>
+      <w:lvlJc w:val="left"/>
+      <w:pPr>
+        <w:tabs>
+          <w:tab w:val="num" w:pos="6480"/>
+        </w:tabs>
+        <w:ind w:left="6480" w:hanging="360"/>
+      </w:pPr>
+      <w:rPr>
+        <w:rFonts w:ascii="Symbol" w:hAnsi="Symbol" w:hint="default"/>
+        <w:sz w:val="20"/>
+      </w:rPr>
+    </w:lvl>
+  </w:abstractNum>
+  <w:abstractNum w:abstractNumId="24" w15:restartNumberingAfterBreak="0">
     <w:nsid w:val="365802AE"/>
     <w:multiLevelType w:val="multilevel"/>
     <w:tmpl w:val="1304CDDC"/>
@@ -6908,7 +8133,7 @@
       </w:rPr>
     </w:lvl>
   </w:abstractNum>
-  <w:abstractNum w:abstractNumId="20" w15:restartNumberingAfterBreak="0">
+  <w:abstractNum w:abstractNumId="25" w15:restartNumberingAfterBreak="0">
     <w:nsid w:val="39147671"/>
     <w:multiLevelType w:val="multilevel"/>
     <w:tmpl w:val="28FCAB92"/>
@@ -7057,7 +8282,7 @@
       </w:rPr>
     </w:lvl>
   </w:abstractNum>
-  <w:abstractNum w:abstractNumId="21" w15:restartNumberingAfterBreak="0">
+  <w:abstractNum w:abstractNumId="26" w15:restartNumberingAfterBreak="0">
     <w:nsid w:val="3EAB7134"/>
     <w:multiLevelType w:val="multilevel"/>
     <w:tmpl w:val="5F7A3DF4"/>
@@ -7206,7 +8431,7 @@
       </w:rPr>
     </w:lvl>
   </w:abstractNum>
-  <w:abstractNum w:abstractNumId="22" w15:restartNumberingAfterBreak="0">
+  <w:abstractNum w:abstractNumId="27" w15:restartNumberingAfterBreak="0">
     <w:nsid w:val="41CF68D1"/>
     <w:multiLevelType w:val="multilevel"/>
     <w:tmpl w:val="AD28734C"/>
@@ -7355,7 +8580,7 @@
       </w:rPr>
     </w:lvl>
   </w:abstractNum>
-  <w:abstractNum w:abstractNumId="23" w15:restartNumberingAfterBreak="0">
+  <w:abstractNum w:abstractNumId="28" w15:restartNumberingAfterBreak="0">
     <w:nsid w:val="43CC28C3"/>
     <w:multiLevelType w:val="multilevel"/>
     <w:tmpl w:val="DF7C2F76"/>
@@ -7504,7 +8729,7 @@
       </w:rPr>
     </w:lvl>
   </w:abstractNum>
-  <w:abstractNum w:abstractNumId="24" w15:restartNumberingAfterBreak="0">
+  <w:abstractNum w:abstractNumId="29" w15:restartNumberingAfterBreak="0">
     <w:nsid w:val="44677946"/>
     <w:multiLevelType w:val="multilevel"/>
     <w:tmpl w:val="7E4EEF24"/>
@@ -7653,7 +8878,120 @@
       </w:rPr>
     </w:lvl>
   </w:abstractNum>
-  <w:abstractNum w:abstractNumId="25" w15:restartNumberingAfterBreak="0">
+  <w:abstractNum w:abstractNumId="30" w15:restartNumberingAfterBreak="0">
+    <w:nsid w:val="44D55F31"/>
+    <w:multiLevelType w:val="multilevel"/>
+    <w:tmpl w:val="670000CA"/>
+    <w:lvl w:ilvl="0">
+      <w:start w:val="1"/>
+      <w:numFmt w:val="decimal"/>
+      <w:lvlText w:val="%1."/>
+      <w:lvlJc w:val="left"/>
+      <w:pPr>
+        <w:tabs>
+          <w:tab w:val="num" w:pos="720"/>
+        </w:tabs>
+        <w:ind w:left="720" w:hanging="360"/>
+      </w:pPr>
+    </w:lvl>
+    <w:lvl w:ilvl="1" w:tentative="1">
+      <w:start w:val="1"/>
+      <w:numFmt w:val="decimal"/>
+      <w:lvlText w:val="%2."/>
+      <w:lvlJc w:val="left"/>
+      <w:pPr>
+        <w:tabs>
+          <w:tab w:val="num" w:pos="1440"/>
+        </w:tabs>
+        <w:ind w:left="1440" w:hanging="360"/>
+      </w:pPr>
+    </w:lvl>
+    <w:lvl w:ilvl="2" w:tentative="1">
+      <w:start w:val="1"/>
+      <w:numFmt w:val="decimal"/>
+      <w:lvlText w:val="%3."/>
+      <w:lvlJc w:val="left"/>
+      <w:pPr>
+        <w:tabs>
+          <w:tab w:val="num" w:pos="2160"/>
+        </w:tabs>
+        <w:ind w:left="2160" w:hanging="360"/>
+      </w:pPr>
+    </w:lvl>
+    <w:lvl w:ilvl="3" w:tentative="1">
+      <w:start w:val="1"/>
+      <w:numFmt w:val="decimal"/>
+      <w:lvlText w:val="%4."/>
+      <w:lvlJc w:val="left"/>
+      <w:pPr>
+        <w:tabs>
+          <w:tab w:val="num" w:pos="2880"/>
+        </w:tabs>
+        <w:ind w:left="2880" w:hanging="360"/>
+      </w:pPr>
+    </w:lvl>
+    <w:lvl w:ilvl="4" w:tentative="1">
+      <w:start w:val="1"/>
+      <w:numFmt w:val="decimal"/>
+      <w:lvlText w:val="%5."/>
+      <w:lvlJc w:val="left"/>
+      <w:pPr>
+        <w:tabs>
+          <w:tab w:val="num" w:pos="3600"/>
+        </w:tabs>
+        <w:ind w:left="3600" w:hanging="360"/>
+      </w:pPr>
+    </w:lvl>
+    <w:lvl w:ilvl="5" w:tentative="1">
+      <w:start w:val="1"/>
+      <w:numFmt w:val="decimal"/>
+      <w:lvlText w:val="%6."/>
+      <w:lvlJc w:val="left"/>
+      <w:pPr>
+        <w:tabs>
+          <w:tab w:val="num" w:pos="4320"/>
+        </w:tabs>
+        <w:ind w:left="4320" w:hanging="360"/>
+      </w:pPr>
+    </w:lvl>
+    <w:lvl w:ilvl="6" w:tentative="1">
+      <w:start w:val="1"/>
+      <w:numFmt w:val="decimal"/>
+      <w:lvlText w:val="%7."/>
+      <w:lvlJc w:val="left"/>
+      <w:pPr>
+        <w:tabs>
+          <w:tab w:val="num" w:pos="5040"/>
+        </w:tabs>
+        <w:ind w:left="5040" w:hanging="360"/>
+      </w:pPr>
+    </w:lvl>
+    <w:lvl w:ilvl="7" w:tentative="1">
+      <w:start w:val="1"/>
+      <w:numFmt w:val="decimal"/>
+      <w:lvlText w:val="%8."/>
+      <w:lvlJc w:val="left"/>
+      <w:pPr>
+        <w:tabs>
+          <w:tab w:val="num" w:pos="5760"/>
+        </w:tabs>
+        <w:ind w:left="5760" w:hanging="360"/>
+      </w:pPr>
+    </w:lvl>
+    <w:lvl w:ilvl="8" w:tentative="1">
+      <w:start w:val="1"/>
+      <w:numFmt w:val="decimal"/>
+      <w:lvlText w:val="%9."/>
+      <w:lvlJc w:val="left"/>
+      <w:pPr>
+        <w:tabs>
+          <w:tab w:val="num" w:pos="6480"/>
+        </w:tabs>
+        <w:ind w:left="6480" w:hanging="360"/>
+      </w:pPr>
+    </w:lvl>
+  </w:abstractNum>
+  <w:abstractNum w:abstractNumId="31" w15:restartNumberingAfterBreak="0">
     <w:nsid w:val="4E402E0F"/>
     <w:multiLevelType w:val="multilevel"/>
     <w:tmpl w:val="6068E2C8"/>
@@ -7802,7 +9140,7 @@
       </w:rPr>
     </w:lvl>
   </w:abstractNum>
-  <w:abstractNum w:abstractNumId="26" w15:restartNumberingAfterBreak="0">
+  <w:abstractNum w:abstractNumId="32" w15:restartNumberingAfterBreak="0">
     <w:nsid w:val="4E49141C"/>
     <w:multiLevelType w:val="multilevel"/>
     <w:tmpl w:val="5A9CA2AE"/>
@@ -7951,7 +9289,7 @@
       </w:rPr>
     </w:lvl>
   </w:abstractNum>
-  <w:abstractNum w:abstractNumId="27" w15:restartNumberingAfterBreak="0">
+  <w:abstractNum w:abstractNumId="33" w15:restartNumberingAfterBreak="0">
     <w:nsid w:val="50B73CA5"/>
     <w:multiLevelType w:val="multilevel"/>
     <w:tmpl w:val="675CD15C"/>
@@ -8100,7 +9438,7 @@
       </w:rPr>
     </w:lvl>
   </w:abstractNum>
-  <w:abstractNum w:abstractNumId="28" w15:restartNumberingAfterBreak="0">
+  <w:abstractNum w:abstractNumId="34" w15:restartNumberingAfterBreak="0">
     <w:nsid w:val="51D222AC"/>
     <w:multiLevelType w:val="multilevel"/>
     <w:tmpl w:val="B3E25296"/>
@@ -8249,7 +9587,7 @@
       </w:rPr>
     </w:lvl>
   </w:abstractNum>
-  <w:abstractNum w:abstractNumId="29" w15:restartNumberingAfterBreak="0">
+  <w:abstractNum w:abstractNumId="35" w15:restartNumberingAfterBreak="0">
     <w:nsid w:val="531E76E5"/>
     <w:multiLevelType w:val="multilevel"/>
     <w:tmpl w:val="EDE02BC8"/>
@@ -8398,7 +9736,7 @@
       </w:rPr>
     </w:lvl>
   </w:abstractNum>
-  <w:abstractNum w:abstractNumId="30" w15:restartNumberingAfterBreak="0">
+  <w:abstractNum w:abstractNumId="36" w15:restartNumberingAfterBreak="0">
     <w:nsid w:val="533A324B"/>
     <w:multiLevelType w:val="multilevel"/>
     <w:tmpl w:val="56BCC45C"/>
@@ -8547,7 +9885,7 @@
       </w:rPr>
     </w:lvl>
   </w:abstractNum>
-  <w:abstractNum w:abstractNumId="31" w15:restartNumberingAfterBreak="0">
+  <w:abstractNum w:abstractNumId="37" w15:restartNumberingAfterBreak="0">
     <w:nsid w:val="540E6F18"/>
     <w:multiLevelType w:val="multilevel"/>
     <w:tmpl w:val="87DCA8E0"/>
@@ -8696,7 +10034,7 @@
       </w:rPr>
     </w:lvl>
   </w:abstractNum>
-  <w:abstractNum w:abstractNumId="32" w15:restartNumberingAfterBreak="0">
+  <w:abstractNum w:abstractNumId="38" w15:restartNumberingAfterBreak="0">
     <w:nsid w:val="59EA2C4A"/>
     <w:multiLevelType w:val="multilevel"/>
     <w:tmpl w:val="8BD26C36"/>
@@ -8845,7 +10183,7 @@
       </w:rPr>
     </w:lvl>
   </w:abstractNum>
-  <w:abstractNum w:abstractNumId="33" w15:restartNumberingAfterBreak="0">
+  <w:abstractNum w:abstractNumId="39" w15:restartNumberingAfterBreak="0">
     <w:nsid w:val="5A0E2298"/>
     <w:multiLevelType w:val="multilevel"/>
     <w:tmpl w:val="BB9612AC"/>
@@ -8990,7 +10328,7 @@
       </w:rPr>
     </w:lvl>
   </w:abstractNum>
-  <w:abstractNum w:abstractNumId="34" w15:restartNumberingAfterBreak="0">
+  <w:abstractNum w:abstractNumId="40" w15:restartNumberingAfterBreak="0">
     <w:nsid w:val="5BB16C30"/>
     <w:multiLevelType w:val="multilevel"/>
     <w:tmpl w:val="6DC0F07A"/>
@@ -9139,7 +10477,7 @@
       </w:rPr>
     </w:lvl>
   </w:abstractNum>
-  <w:abstractNum w:abstractNumId="35" w15:restartNumberingAfterBreak="0">
+  <w:abstractNum w:abstractNumId="41" w15:restartNumberingAfterBreak="0">
     <w:nsid w:val="61110AC8"/>
     <w:multiLevelType w:val="multilevel"/>
     <w:tmpl w:val="92320496"/>
@@ -9288,7 +10626,7 @@
       </w:rPr>
     </w:lvl>
   </w:abstractNum>
-  <w:abstractNum w:abstractNumId="36" w15:restartNumberingAfterBreak="0">
+  <w:abstractNum w:abstractNumId="42" w15:restartNumberingAfterBreak="0">
     <w:nsid w:val="623D0706"/>
     <w:multiLevelType w:val="multilevel"/>
     <w:tmpl w:val="3116859E"/>
@@ -9437,7 +10775,156 @@
       </w:rPr>
     </w:lvl>
   </w:abstractNum>
-  <w:abstractNum w:abstractNumId="37" w15:restartNumberingAfterBreak="0">
+  <w:abstractNum w:abstractNumId="43" w15:restartNumberingAfterBreak="0">
+    <w:nsid w:val="653604F0"/>
+    <w:multiLevelType w:val="multilevel"/>
+    <w:tmpl w:val="41C0D4D8"/>
+    <w:lvl w:ilvl="0">
+      <w:start w:val="1"/>
+      <w:numFmt w:val="bullet"/>
+      <w:lvlText w:val=""/>
+      <w:lvlJc w:val="left"/>
+      <w:pPr>
+        <w:tabs>
+          <w:tab w:val="num" w:pos="720"/>
+        </w:tabs>
+        <w:ind w:left="720" w:hanging="360"/>
+      </w:pPr>
+      <w:rPr>
+        <w:rFonts w:ascii="Symbol" w:hAnsi="Symbol" w:hint="default"/>
+        <w:sz w:val="20"/>
+      </w:rPr>
+    </w:lvl>
+    <w:lvl w:ilvl="1" w:tentative="1">
+      <w:start w:val="1"/>
+      <w:numFmt w:val="bullet"/>
+      <w:lvlText w:val=""/>
+      <w:lvlJc w:val="left"/>
+      <w:pPr>
+        <w:tabs>
+          <w:tab w:val="num" w:pos="1440"/>
+        </w:tabs>
+        <w:ind w:left="1440" w:hanging="360"/>
+      </w:pPr>
+      <w:rPr>
+        <w:rFonts w:ascii="Symbol" w:hAnsi="Symbol" w:hint="default"/>
+        <w:sz w:val="20"/>
+      </w:rPr>
+    </w:lvl>
+    <w:lvl w:ilvl="2" w:tentative="1">
+      <w:start w:val="1"/>
+      <w:numFmt w:val="bullet"/>
+      <w:lvlText w:val=""/>
+      <w:lvlJc w:val="left"/>
+      <w:pPr>
+        <w:tabs>
+          <w:tab w:val="num" w:pos="2160"/>
+        </w:tabs>
+        <w:ind w:left="2160" w:hanging="360"/>
+      </w:pPr>
+      <w:rPr>
+        <w:rFonts w:ascii="Symbol" w:hAnsi="Symbol" w:hint="default"/>
+        <w:sz w:val="20"/>
+      </w:rPr>
+    </w:lvl>
+    <w:lvl w:ilvl="3" w:tentative="1">
+      <w:start w:val="1"/>
+      <w:numFmt w:val="bullet"/>
+      <w:lvlText w:val=""/>
+      <w:lvlJc w:val="left"/>
+      <w:pPr>
+        <w:tabs>
+          <w:tab w:val="num" w:pos="2880"/>
+        </w:tabs>
+        <w:ind w:left="2880" w:hanging="360"/>
+      </w:pPr>
+      <w:rPr>
+        <w:rFonts w:ascii="Symbol" w:hAnsi="Symbol" w:hint="default"/>
+        <w:sz w:val="20"/>
+      </w:rPr>
+    </w:lvl>
+    <w:lvl w:ilvl="4" w:tentative="1">
+      <w:start w:val="1"/>
+      <w:numFmt w:val="bullet"/>
+      <w:lvlText w:val=""/>
+      <w:lvlJc w:val="left"/>
+      <w:pPr>
+        <w:tabs>
+          <w:tab w:val="num" w:pos="3600"/>
+        </w:tabs>
+        <w:ind w:left="3600" w:hanging="360"/>
+      </w:pPr>
+      <w:rPr>
+        <w:rFonts w:ascii="Symbol" w:hAnsi="Symbol" w:hint="default"/>
+        <w:sz w:val="20"/>
+      </w:rPr>
+    </w:lvl>
+    <w:lvl w:ilvl="5" w:tentative="1">
+      <w:start w:val="1"/>
+      <w:numFmt w:val="bullet"/>
+      <w:lvlText w:val=""/>
+      <w:lvlJc w:val="left"/>
+      <w:pPr>
+        <w:tabs>
+          <w:tab w:val="num" w:pos="4320"/>
+        </w:tabs>
+        <w:ind w:left="4320" w:hanging="360"/>
+      </w:pPr>
+      <w:rPr>
+        <w:rFonts w:ascii="Symbol" w:hAnsi="Symbol" w:hint="default"/>
+        <w:sz w:val="20"/>
+      </w:rPr>
+    </w:lvl>
+    <w:lvl w:ilvl="6" w:tentative="1">
+      <w:start w:val="1"/>
+      <w:numFmt w:val="bullet"/>
+      <w:lvlText w:val=""/>
+      <w:lvlJc w:val="left"/>
+      <w:pPr>
+        <w:tabs>
+          <w:tab w:val="num" w:pos="5040"/>
+        </w:tabs>
+        <w:ind w:left="5040" w:hanging="360"/>
+      </w:pPr>
+      <w:rPr>
+        <w:rFonts w:ascii="Symbol" w:hAnsi="Symbol" w:hint="default"/>
+        <w:sz w:val="20"/>
+      </w:rPr>
+    </w:lvl>
+    <w:lvl w:ilvl="7" w:tentative="1">
+      <w:start w:val="1"/>
+      <w:numFmt w:val="bullet"/>
+      <w:lvlText w:val=""/>
+      <w:lvlJc w:val="left"/>
+      <w:pPr>
+        <w:tabs>
+          <w:tab w:val="num" w:pos="5760"/>
+        </w:tabs>
+        <w:ind w:left="5760" w:hanging="360"/>
+      </w:pPr>
+      <w:rPr>
+        <w:rFonts w:ascii="Symbol" w:hAnsi="Symbol" w:hint="default"/>
+        <w:sz w:val="20"/>
+      </w:rPr>
+    </w:lvl>
+    <w:lvl w:ilvl="8" w:tentative="1">
+      <w:start w:val="1"/>
+      <w:numFmt w:val="bullet"/>
+      <w:lvlText w:val=""/>
+      <w:lvlJc w:val="left"/>
+      <w:pPr>
+        <w:tabs>
+          <w:tab w:val="num" w:pos="6480"/>
+        </w:tabs>
+        <w:ind w:left="6480" w:hanging="360"/>
+      </w:pPr>
+      <w:rPr>
+        <w:rFonts w:ascii="Symbol" w:hAnsi="Symbol" w:hint="default"/>
+        <w:sz w:val="20"/>
+      </w:rPr>
+    </w:lvl>
+  </w:abstractNum>
+  <w:abstractNum w:abstractNumId="44" w15:restartNumberingAfterBreak="0">
     <w:nsid w:val="69152890"/>
     <w:multiLevelType w:val="multilevel"/>
     <w:tmpl w:val="B8644AC8"/>
@@ -9586,7 +11073,7 @@
       </w:rPr>
     </w:lvl>
   </w:abstractNum>
-  <w:abstractNum w:abstractNumId="38" w15:restartNumberingAfterBreak="0">
+  <w:abstractNum w:abstractNumId="45" w15:restartNumberingAfterBreak="0">
     <w:nsid w:val="69E65E00"/>
     <w:multiLevelType w:val="multilevel"/>
     <w:tmpl w:val="04E893C4"/>
@@ -9699,7 +11186,7 @@
       </w:pPr>
     </w:lvl>
   </w:abstractNum>
-  <w:abstractNum w:abstractNumId="39" w15:restartNumberingAfterBreak="0">
+  <w:abstractNum w:abstractNumId="46" w15:restartNumberingAfterBreak="0">
     <w:nsid w:val="6BE86D99"/>
     <w:multiLevelType w:val="multilevel"/>
     <w:tmpl w:val="C2C6DE8C"/>
@@ -9848,7 +11335,7 @@
       </w:rPr>
     </w:lvl>
   </w:abstractNum>
-  <w:abstractNum w:abstractNumId="40" w15:restartNumberingAfterBreak="0">
+  <w:abstractNum w:abstractNumId="47" w15:restartNumberingAfterBreak="0">
     <w:nsid w:val="6CF83EE6"/>
     <w:multiLevelType w:val="multilevel"/>
     <w:tmpl w:val="70AA93B2"/>
@@ -9997,7 +11484,7 @@
       </w:rPr>
     </w:lvl>
   </w:abstractNum>
-  <w:abstractNum w:abstractNumId="41" w15:restartNumberingAfterBreak="0">
+  <w:abstractNum w:abstractNumId="48" w15:restartNumberingAfterBreak="0">
     <w:nsid w:val="743D265B"/>
     <w:multiLevelType w:val="multilevel"/>
     <w:tmpl w:val="3400487C"/>
@@ -10146,7 +11633,7 @@
       </w:rPr>
     </w:lvl>
   </w:abstractNum>
-  <w:abstractNum w:abstractNumId="42" w15:restartNumberingAfterBreak="0">
+  <w:abstractNum w:abstractNumId="49" w15:restartNumberingAfterBreak="0">
     <w:nsid w:val="748F6EEA"/>
     <w:multiLevelType w:val="multilevel"/>
     <w:tmpl w:val="9BA21E5C"/>
@@ -10295,7 +11782,7 @@
       </w:rPr>
     </w:lvl>
   </w:abstractNum>
-  <w:abstractNum w:abstractNumId="43" w15:restartNumberingAfterBreak="0">
+  <w:abstractNum w:abstractNumId="50" w15:restartNumberingAfterBreak="0">
     <w:nsid w:val="758A781F"/>
     <w:multiLevelType w:val="multilevel"/>
     <w:tmpl w:val="2E141854"/>
@@ -10444,7 +11931,156 @@
       </w:rPr>
     </w:lvl>
   </w:abstractNum>
-  <w:abstractNum w:abstractNumId="44" w15:restartNumberingAfterBreak="0">
+  <w:abstractNum w:abstractNumId="51" w15:restartNumberingAfterBreak="0">
+    <w:nsid w:val="79364EDD"/>
+    <w:multiLevelType w:val="multilevel"/>
+    <w:tmpl w:val="5A701138"/>
+    <w:lvl w:ilvl="0">
+      <w:start w:val="1"/>
+      <w:numFmt w:val="bullet"/>
+      <w:lvlText w:val=""/>
+      <w:lvlJc w:val="left"/>
+      <w:pPr>
+        <w:tabs>
+          <w:tab w:val="num" w:pos="720"/>
+        </w:tabs>
+        <w:ind w:left="720" w:hanging="360"/>
+      </w:pPr>
+      <w:rPr>
+        <w:rFonts w:ascii="Symbol" w:hAnsi="Symbol" w:hint="default"/>
+        <w:sz w:val="20"/>
+      </w:rPr>
+    </w:lvl>
+    <w:lvl w:ilvl="1" w:tentative="1">
+      <w:start w:val="1"/>
+      <w:numFmt w:val="bullet"/>
+      <w:lvlText w:val=""/>
+      <w:lvlJc w:val="left"/>
+      <w:pPr>
+        <w:tabs>
+          <w:tab w:val="num" w:pos="1440"/>
+        </w:tabs>
+        <w:ind w:left="1440" w:hanging="360"/>
+      </w:pPr>
+      <w:rPr>
+        <w:rFonts w:ascii="Symbol" w:hAnsi="Symbol" w:hint="default"/>
+        <w:sz w:val="20"/>
+      </w:rPr>
+    </w:lvl>
+    <w:lvl w:ilvl="2" w:tentative="1">
+      <w:start w:val="1"/>
+      <w:numFmt w:val="bullet"/>
+      <w:lvlText w:val=""/>
+      <w:lvlJc w:val="left"/>
+      <w:pPr>
+        <w:tabs>
+          <w:tab w:val="num" w:pos="2160"/>
+        </w:tabs>
+        <w:ind w:left="2160" w:hanging="360"/>
+      </w:pPr>
+      <w:rPr>
+        <w:rFonts w:ascii="Symbol" w:hAnsi="Symbol" w:hint="default"/>
+        <w:sz w:val="20"/>
+      </w:rPr>
+    </w:lvl>
+    <w:lvl w:ilvl="3" w:tentative="1">
+      <w:start w:val="1"/>
+      <w:numFmt w:val="bullet"/>
+      <w:lvlText w:val=""/>
+      <w:lvlJc w:val="left"/>
+      <w:pPr>
+        <w:tabs>
+          <w:tab w:val="num" w:pos="2880"/>
+        </w:tabs>
+        <w:ind w:left="2880" w:hanging="360"/>
+      </w:pPr>
+      <w:rPr>
+        <w:rFonts w:ascii="Symbol" w:hAnsi="Symbol" w:hint="default"/>
+        <w:sz w:val="20"/>
+      </w:rPr>
+    </w:lvl>
+    <w:lvl w:ilvl="4" w:tentative="1">
+      <w:start w:val="1"/>
+      <w:numFmt w:val="bullet"/>
+      <w:lvlText w:val=""/>
+      <w:lvlJc w:val="left"/>
+      <w:pPr>
+        <w:tabs>
+          <w:tab w:val="num" w:pos="3600"/>
+        </w:tabs>
+        <w:ind w:left="3600" w:hanging="360"/>
+      </w:pPr>
+      <w:rPr>
+        <w:rFonts w:ascii="Symbol" w:hAnsi="Symbol" w:hint="default"/>
+        <w:sz w:val="20"/>
+      </w:rPr>
+    </w:lvl>
+    <w:lvl w:ilvl="5" w:tentative="1">
+      <w:start w:val="1"/>
+      <w:numFmt w:val="bullet"/>
+      <w:lvlText w:val=""/>
+      <w:lvlJc w:val="left"/>
+      <w:pPr>
+        <w:tabs>
+          <w:tab w:val="num" w:pos="4320"/>
+        </w:tabs>
+        <w:ind w:left="4320" w:hanging="360"/>
+      </w:pPr>
+      <w:rPr>
+        <w:rFonts w:ascii="Symbol" w:hAnsi="Symbol" w:hint="default"/>
+        <w:sz w:val="20"/>
+      </w:rPr>
+    </w:lvl>
+    <w:lvl w:ilvl="6" w:tentative="1">
+      <w:start w:val="1"/>
+      <w:numFmt w:val="bullet"/>
+      <w:lvlText w:val=""/>
+      <w:lvlJc w:val="left"/>
+      <w:pPr>
+        <w:tabs>
+          <w:tab w:val="num" w:pos="5040"/>
+        </w:tabs>
+        <w:ind w:left="5040" w:hanging="360"/>
+      </w:pPr>
+      <w:rPr>
+        <w:rFonts w:ascii="Symbol" w:hAnsi="Symbol" w:hint="default"/>
+        <w:sz w:val="20"/>
+      </w:rPr>
+    </w:lvl>
+    <w:lvl w:ilvl="7" w:tentative="1">
+      <w:start w:val="1"/>
+      <w:numFmt w:val="bullet"/>
+      <w:lvlText w:val=""/>
+      <w:lvlJc w:val="left"/>
+      <w:pPr>
+        <w:tabs>
+          <w:tab w:val="num" w:pos="5760"/>
+        </w:tabs>
+        <w:ind w:left="5760" w:hanging="360"/>
+      </w:pPr>
+      <w:rPr>
+        <w:rFonts w:ascii="Symbol" w:hAnsi="Symbol" w:hint="default"/>
+        <w:sz w:val="20"/>
+      </w:rPr>
+    </w:lvl>
+    <w:lvl w:ilvl="8" w:tentative="1">
+      <w:start w:val="1"/>
+      <w:numFmt w:val="bullet"/>
+      <w:lvlText w:val=""/>
+      <w:lvlJc w:val="left"/>
+      <w:pPr>
+        <w:tabs>
+          <w:tab w:val="num" w:pos="6480"/>
+        </w:tabs>
+        <w:ind w:left="6480" w:hanging="360"/>
+      </w:pPr>
+      <w:rPr>
+        <w:rFonts w:ascii="Symbol" w:hAnsi="Symbol" w:hint="default"/>
+        <w:sz w:val="20"/>
+      </w:rPr>
+    </w:lvl>
+  </w:abstractNum>
+  <w:abstractNum w:abstractNumId="52" w15:restartNumberingAfterBreak="0">
     <w:nsid w:val="7E48662E"/>
     <w:multiLevelType w:val="multilevel"/>
     <w:tmpl w:val="7E2CF740"/>
@@ -10593,7 +12229,7 @@
       </w:rPr>
     </w:lvl>
   </w:abstractNum>
-  <w:abstractNum w:abstractNumId="45" w15:restartNumberingAfterBreak="0">
+  <w:abstractNum w:abstractNumId="53" w15:restartNumberingAfterBreak="0">
     <w:nsid w:val="7FA7012C"/>
     <w:multiLevelType w:val="multilevel"/>
     <w:tmpl w:val="3DF8D112"/>
@@ -10742,7 +12378,7 @@
       </w:rPr>
     </w:lvl>
   </w:abstractNum>
-  <w:abstractNum w:abstractNumId="46" w15:restartNumberingAfterBreak="0">
+  <w:abstractNum w:abstractNumId="54" w15:restartNumberingAfterBreak="0">
     <w:nsid w:val="7FBB780C"/>
     <w:multiLevelType w:val="multilevel"/>
     <w:tmpl w:val="902ECCD2"/>
@@ -10856,146 +12492,171 @@
     </w:lvl>
   </w:abstractNum>
   <w:num w:numId="1" w16cid:durableId="1961371284">
-    <w:abstractNumId w:val="11"/>
+    <w:abstractNumId w:val="13"/>
   </w:num>
   <w:num w:numId="2" w16cid:durableId="1367027804">
-    <w:abstractNumId w:val="40"/>
+    <w:abstractNumId w:val="47"/>
   </w:num>
   <w:num w:numId="3" w16cid:durableId="1668631311">
     <w:abstractNumId w:val="0"/>
   </w:num>
   <w:num w:numId="4" w16cid:durableId="1732652887">
-    <w:abstractNumId w:val="28"/>
+    <w:abstractNumId w:val="34"/>
   </w:num>
   <w:num w:numId="5" w16cid:durableId="956135389">
-    <w:abstractNumId w:val="30"/>
+    <w:abstractNumId w:val="36"/>
   </w:num>
   <w:num w:numId="6" w16cid:durableId="1789198818">
-    <w:abstractNumId w:val="12"/>
+    <w:abstractNumId w:val="14"/>
   </w:num>
   <w:num w:numId="7" w16cid:durableId="269972398">
-    <w:abstractNumId w:val="34"/>
+    <w:abstractNumId w:val="40"/>
   </w:num>
   <w:num w:numId="8" w16cid:durableId="817572598">
+    <w:abstractNumId w:val="11"/>
+  </w:num>
+  <w:num w:numId="9" w16cid:durableId="670715461">
+    <w:abstractNumId w:val="41"/>
+  </w:num>
+  <w:num w:numId="10" w16cid:durableId="1276332657">
+    <w:abstractNumId w:val="42"/>
+  </w:num>
+  <w:num w:numId="11" w16cid:durableId="1085541468">
+    <w:abstractNumId w:val="5"/>
+  </w:num>
+  <w:num w:numId="12" w16cid:durableId="729813302">
+    <w:abstractNumId w:val="45"/>
+  </w:num>
+  <w:num w:numId="13" w16cid:durableId="219287181">
+    <w:abstractNumId w:val="54"/>
+  </w:num>
+  <w:num w:numId="14" w16cid:durableId="1478569081">
+    <w:abstractNumId w:val="50"/>
+  </w:num>
+  <w:num w:numId="15" w16cid:durableId="1784617126">
+    <w:abstractNumId w:val="31"/>
+  </w:num>
+  <w:num w:numId="16" w16cid:durableId="488444713">
+    <w:abstractNumId w:val="33"/>
+  </w:num>
+  <w:num w:numId="17" w16cid:durableId="1473865838">
+    <w:abstractNumId w:val="25"/>
+  </w:num>
+  <w:num w:numId="18" w16cid:durableId="1131827971">
+    <w:abstractNumId w:val="7"/>
+  </w:num>
+  <w:num w:numId="19" w16cid:durableId="801387460">
+    <w:abstractNumId w:val="32"/>
+  </w:num>
+  <w:num w:numId="20" w16cid:durableId="219755788">
+    <w:abstractNumId w:val="18"/>
+  </w:num>
+  <w:num w:numId="21" w16cid:durableId="196814451">
+    <w:abstractNumId w:val="37"/>
+  </w:num>
+  <w:num w:numId="22" w16cid:durableId="166287831">
+    <w:abstractNumId w:val="22"/>
+  </w:num>
+  <w:num w:numId="23" w16cid:durableId="1636062703">
+    <w:abstractNumId w:val="29"/>
+  </w:num>
+  <w:num w:numId="24" w16cid:durableId="651569532">
+    <w:abstractNumId w:val="48"/>
+  </w:num>
+  <w:num w:numId="25" w16cid:durableId="1769961410">
+    <w:abstractNumId w:val="15"/>
+  </w:num>
+  <w:num w:numId="26" w16cid:durableId="1853033479">
     <w:abstractNumId w:val="9"/>
   </w:num>
-  <w:num w:numId="9" w16cid:durableId="670715461">
+  <w:num w:numId="27" w16cid:durableId="1389182724">
+    <w:abstractNumId w:val="19"/>
+  </w:num>
+  <w:num w:numId="28" w16cid:durableId="1210071178">
+    <w:abstractNumId w:val="21"/>
+  </w:num>
+  <w:num w:numId="29" w16cid:durableId="2055808716">
+    <w:abstractNumId w:val="24"/>
+  </w:num>
+  <w:num w:numId="30" w16cid:durableId="951592037">
+    <w:abstractNumId w:val="3"/>
+  </w:num>
+  <w:num w:numId="31" w16cid:durableId="1780370132">
+    <w:abstractNumId w:val="52"/>
+  </w:num>
+  <w:num w:numId="32" w16cid:durableId="1576473904">
+    <w:abstractNumId w:val="27"/>
+  </w:num>
+  <w:num w:numId="33" w16cid:durableId="681971854">
+    <w:abstractNumId w:val="53"/>
+  </w:num>
+  <w:num w:numId="34" w16cid:durableId="1310600430">
+    <w:abstractNumId w:val="39"/>
+  </w:num>
+  <w:num w:numId="35" w16cid:durableId="1824739748">
+    <w:abstractNumId w:val="38"/>
+  </w:num>
+  <w:num w:numId="36" w16cid:durableId="2028209590">
+    <w:abstractNumId w:val="49"/>
+  </w:num>
+  <w:num w:numId="37" w16cid:durableId="2099673263">
     <w:abstractNumId w:val="35"/>
   </w:num>
-  <w:num w:numId="10" w16cid:durableId="1276332657">
-    <w:abstractNumId w:val="36"/>
-  </w:num>
-  <w:num w:numId="11" w16cid:durableId="1085541468">
-    <w:abstractNumId w:val="4"/>
-  </w:num>
-  <w:num w:numId="12" w16cid:durableId="729813302">
-    <w:abstractNumId w:val="38"/>
-  </w:num>
-  <w:num w:numId="13" w16cid:durableId="219287181">
-    <w:abstractNumId w:val="46"/>
-  </w:num>
-  <w:num w:numId="14" w16cid:durableId="1478569081">
-    <w:abstractNumId w:val="43"/>
-  </w:num>
-  <w:num w:numId="15" w16cid:durableId="1784617126">
-    <w:abstractNumId w:val="25"/>
-  </w:num>
-  <w:num w:numId="16" w16cid:durableId="488444713">
-    <w:abstractNumId w:val="27"/>
-  </w:num>
-  <w:num w:numId="17" w16cid:durableId="1473865838">
-    <w:abstractNumId w:val="20"/>
-  </w:num>
-  <w:num w:numId="18" w16cid:durableId="1131827971">
-    <w:abstractNumId w:val="6"/>
-  </w:num>
-  <w:num w:numId="19" w16cid:durableId="801387460">
-    <w:abstractNumId w:val="26"/>
-  </w:num>
-  <w:num w:numId="20" w16cid:durableId="219755788">
-    <w:abstractNumId w:val="15"/>
-  </w:num>
-  <w:num w:numId="21" w16cid:durableId="196814451">
-    <w:abstractNumId w:val="31"/>
-  </w:num>
-  <w:num w:numId="22" w16cid:durableId="166287831">
-    <w:abstractNumId w:val="18"/>
-  </w:num>
-  <w:num w:numId="23" w16cid:durableId="1636062703">
-    <w:abstractNumId w:val="24"/>
-  </w:num>
-  <w:num w:numId="24" w16cid:durableId="651569532">
-    <w:abstractNumId w:val="41"/>
-  </w:num>
-  <w:num w:numId="25" w16cid:durableId="1769961410">
-    <w:abstractNumId w:val="13"/>
-  </w:num>
-  <w:num w:numId="26" w16cid:durableId="1853033479">
-    <w:abstractNumId w:val="7"/>
-  </w:num>
-  <w:num w:numId="27" w16cid:durableId="1389182724">
-    <w:abstractNumId w:val="16"/>
-  </w:num>
-  <w:num w:numId="28" w16cid:durableId="1210071178">
-    <w:abstractNumId w:val="17"/>
-  </w:num>
-  <w:num w:numId="29" w16cid:durableId="2055808716">
-    <w:abstractNumId w:val="19"/>
-  </w:num>
-  <w:num w:numId="30" w16cid:durableId="951592037">
-    <w:abstractNumId w:val="2"/>
-  </w:num>
-  <w:num w:numId="31" w16cid:durableId="1780370132">
-    <w:abstractNumId w:val="44"/>
-  </w:num>
-  <w:num w:numId="32" w16cid:durableId="1576473904">
-    <w:abstractNumId w:val="22"/>
-  </w:num>
-  <w:num w:numId="33" w16cid:durableId="681971854">
-    <w:abstractNumId w:val="45"/>
-  </w:num>
-  <w:num w:numId="34" w16cid:durableId="1310600430">
-    <w:abstractNumId w:val="33"/>
-  </w:num>
-  <w:num w:numId="35" w16cid:durableId="1824739748">
-    <w:abstractNumId w:val="32"/>
-  </w:num>
-  <w:num w:numId="36" w16cid:durableId="2028209590">
-    <w:abstractNumId w:val="42"/>
-  </w:num>
-  <w:num w:numId="37" w16cid:durableId="2099673263">
-    <w:abstractNumId w:val="29"/>
-  </w:num>
   <w:num w:numId="38" w16cid:durableId="839005494">
-    <w:abstractNumId w:val="8"/>
+    <w:abstractNumId w:val="10"/>
   </w:num>
   <w:num w:numId="39" w16cid:durableId="1280183906">
     <w:abstractNumId w:val="1"/>
   </w:num>
   <w:num w:numId="40" w16cid:durableId="948463993">
-    <w:abstractNumId w:val="37"/>
+    <w:abstractNumId w:val="44"/>
   </w:num>
   <w:num w:numId="41" w16cid:durableId="596405105">
-    <w:abstractNumId w:val="10"/>
+    <w:abstractNumId w:val="12"/>
   </w:num>
   <w:num w:numId="42" w16cid:durableId="499856645">
-    <w:abstractNumId w:val="14"/>
+    <w:abstractNumId w:val="17"/>
   </w:num>
   <w:num w:numId="43" w16cid:durableId="134107496">
-    <w:abstractNumId w:val="3"/>
+    <w:abstractNumId w:val="4"/>
   </w:num>
   <w:num w:numId="44" w16cid:durableId="682703799">
+    <w:abstractNumId w:val="28"/>
+  </w:num>
+  <w:num w:numId="45" w16cid:durableId="198863764">
+    <w:abstractNumId w:val="6"/>
+  </w:num>
+  <w:num w:numId="46" w16cid:durableId="754591814">
+    <w:abstractNumId w:val="46"/>
+  </w:num>
+  <w:num w:numId="47" w16cid:durableId="658388422">
+    <w:abstractNumId w:val="26"/>
+  </w:num>
+  <w:num w:numId="48" w16cid:durableId="2133279377">
+    <w:abstractNumId w:val="43"/>
+  </w:num>
+  <w:num w:numId="49" w16cid:durableId="1724139311">
+    <w:abstractNumId w:val="51"/>
+  </w:num>
+  <w:num w:numId="50" w16cid:durableId="1276209676">
+    <w:abstractNumId w:val="20"/>
+  </w:num>
+  <w:num w:numId="51" w16cid:durableId="1879856490">
+    <w:abstractNumId w:val="8"/>
+  </w:num>
+  <w:num w:numId="52" w16cid:durableId="372269720">
+    <w:abstractNumId w:val="2"/>
+  </w:num>
+  <w:num w:numId="53" w16cid:durableId="1761370469">
     <w:abstractNumId w:val="23"/>
   </w:num>
-  <w:num w:numId="45" w16cid:durableId="198863764">
-    <w:abstractNumId w:val="5"/>
+  <w:num w:numId="54" w16cid:durableId="5131567">
+    <w:abstractNumId w:val="16"/>
   </w:num>
-  <w:num w:numId="46" w16cid:durableId="754591814">
-    <w:abstractNumId w:val="39"/>
+  <w:num w:numId="55" w16cid:durableId="1149901951">
+    <w:abstractNumId w:val="30"/>
   </w:num>
-  <w:num w:numId="47" w16cid:durableId="658388422">
-    <w:abstractNumId w:val="21"/>
-  </w:num>
+  <w:numIdMacAtCleanup w:val="55"/>
 </w:numbering>
 </file>
 

</xml_diff>